<commit_message>
Add sample scripts, parser preamble fix, PLAN status section; rebuild docx/pdf
Co-Authored-By: Claude Sonnet 5 <noreply@anthropic.com>
</commit_message>
<xml_diff>
--- a/PLAN.docx
+++ b/PLAN.docx
@@ -2,7 +2,7 @@
 <file path=word/document.xml><?xml version="1.0" encoding="utf-8"?>
 <w:document xmlns:w="http://schemas.openxmlformats.org/wordprocessingml/2006/main" xmlns:m="http://schemas.openxmlformats.org/officeDocument/2006/math" xmlns:r="http://schemas.openxmlformats.org/officeDocument/2006/relationships" xmlns:o="urn:schemas-microsoft-com:office:office" xmlns:v="urn:schemas-microsoft-com:vml" xmlns:w10="urn:schemas-microsoft-com:office:word" xmlns:a="http://schemas.openxmlformats.org/drawingml/2006/main" xmlns:pic="http://schemas.openxmlformats.org/drawingml/2006/picture" xmlns:wp="http://schemas.openxmlformats.org/drawingml/2006/wordprocessingDrawing">
   <w:body>
-    <w:bookmarkStart w:id="41" w:name="X9c8c830ec4a0bd58ad601261317abf6bbfd8ccb"/>
+    <w:bookmarkStart w:id="42" w:name="X9c8c830ec4a0bd58ad601261317abf6bbfd8ccb"/>
     <w:p>
       <w:pPr>
         <w:pStyle w:val="Heading1"/>
@@ -5635,6 +5635,283 @@
         <w:t xml:space="preserve">Runbook + Prompt Templates đã bàn giao cho bộ phận sản xuất nội dung</w:t>
       </w:r>
     </w:p>
+    <w:bookmarkEnd w:id="40"/>
+    <w:bookmarkStart w:id="41" w:name="X7dd794b86571366241fe8bbb3cb0d090fbbb11e"/>
+    <w:p>
+      <w:pPr>
+        <w:pStyle w:val="Heading2"/>
+      </w:pPr>
+      <w:r>
+        <w:t xml:space="preserve">9. Trạng thái triển khai (cập nhật 2026-09-19)</w:t>
+      </w:r>
+    </w:p>
+    <w:p>
+      <w:pPr>
+        <w:pStyle w:val="FirstParagraph"/>
+      </w:pPr>
+      <w:r>
+        <w:rPr>
+          <w:b/>
+          <w:bCs/>
+        </w:rPr>
+        <w:t xml:space="preserve">Đã build (44 unit test pass, không cần API ngoài):</w:t>
+      </w:r>
+      <w:r>
+        <w:t xml:space="preserve"> </w:t>
+      </w:r>
+      <w:r>
+        <w:t xml:space="preserve">-</w:t>
+      </w:r>
+      <w:r>
+        <w:t xml:space="preserve"> </w:t>
+      </w:r>
+      <w:r>
+        <w:rPr>
+          <w:rStyle w:val="VerbatimChar"/>
+        </w:rPr>
+        <w:t xml:space="preserve">core/</w:t>
+      </w:r>
+      <w:r>
+        <w:t xml:space="preserve"> </w:t>
+      </w:r>
+      <w:r>
+        <w:t xml:space="preserve">— schema SQLite, state machine job, luồng QC</w:t>
+      </w:r>
+      <w:r>
+        <w:t xml:space="preserve"> </w:t>
+      </w:r>
+      <w:r>
+        <w:rPr>
+          <w:rStyle w:val="VerbatimChar"/>
+        </w:rPr>
+        <w:t xml:space="preserve">auto</w:t>
+      </w:r>
+      <w:r>
+        <w:t xml:space="preserve">/</w:t>
+      </w:r>
+      <w:r>
+        <w:rPr>
+          <w:rStyle w:val="VerbatimChar"/>
+        </w:rPr>
+        <w:t xml:space="preserve">human_qc</w:t>
+      </w:r>
+      <w:r>
+        <w:t xml:space="preserve">, retry/escalate, Pause/Resume/Cancel-all, script parser (docx → cảnh/nhân vật), validators + lưu JSON của Director/QC, Character Bible + khóa, Pre-flight IP check + blocklist seed, motion prompt (Bước 3), FFmpeg command builders, prompt bundles.</w:t>
+      </w:r>
+      <w:r>
+        <w:t xml:space="preserve"> </w:t>
+      </w:r>
+      <w:r>
+        <w:t xml:space="preserve">-</w:t>
+      </w:r>
+      <w:r>
+        <w:t xml:space="preserve"> </w:t>
+      </w:r>
+      <w:r>
+        <w:rPr>
+          <w:rStyle w:val="VerbatimChar"/>
+        </w:rPr>
+        <w:t xml:space="preserve">mcp_servers/</w:t>
+      </w:r>
+      <w:r>
+        <w:t xml:space="preserve"> </w:t>
+      </w:r>
+      <w:r>
+        <w:t xml:space="preserve">—</w:t>
+      </w:r>
+      <w:r>
+        <w:t xml:space="preserve"> </w:t>
+      </w:r>
+      <w:r>
+        <w:rPr>
+          <w:rStyle w:val="VerbatimChar"/>
+        </w:rPr>
+        <w:t xml:space="preserve">project-db</w:t>
+      </w:r>
+      <w:r>
+        <w:t xml:space="preserve">,</w:t>
+      </w:r>
+      <w:r>
+        <w:t xml:space="preserve"> </w:t>
+      </w:r>
+      <w:r>
+        <w:rPr>
+          <w:rStyle w:val="VerbatimChar"/>
+        </w:rPr>
+        <w:t xml:space="preserve">qc-agent</w:t>
+      </w:r>
+      <w:r>
+        <w:t xml:space="preserve">,</w:t>
+      </w:r>
+      <w:r>
+        <w:t xml:space="preserve"> </w:t>
+      </w:r>
+      <w:r>
+        <w:rPr>
+          <w:rStyle w:val="VerbatimChar"/>
+        </w:rPr>
+        <w:t xml:space="preserve">ffmpeg-studio</w:t>
+      </w:r>
+      <w:r>
+        <w:t xml:space="preserve"> </w:t>
+      </w:r>
+      <w:r>
+        <w:t xml:space="preserve">(vỏ mỏng bọc core); hướng dẫn</w:t>
+      </w:r>
+      <w:r>
+        <w:t xml:space="preserve"> </w:t>
+      </w:r>
+      <w:r>
+        <w:rPr>
+          <w:rStyle w:val="VerbatimChar"/>
+        </w:rPr>
+        <w:t xml:space="preserve">docs/V0_SETUP.md</w:t>
+      </w:r>
+      <w:r>
+        <w:t xml:space="preserve">.</w:t>
+      </w:r>
+      <w:r>
+        <w:t xml:space="preserve"> </w:t>
+      </w:r>
+      <w:r>
+        <w:t xml:space="preserve">-</w:t>
+      </w:r>
+      <w:r>
+        <w:t xml:space="preserve"> </w:t>
+      </w:r>
+      <w:r>
+        <w:rPr>
+          <w:rStyle w:val="VerbatimChar"/>
+        </w:rPr>
+        <w:t xml:space="preserve">dashboard/app.py</w:t>
+      </w:r>
+      <w:r>
+        <w:t xml:space="preserve"> </w:t>
+      </w:r>
+      <w:r>
+        <w:t xml:space="preserve">— Dashboard Streamlit skeleton: stepper 7 tab theo thứ tự bước, control bar toàn cục, nút điều khiển từng khâu, lịch sử; các bước cần Claude tạm dán JSON tay.</w:t>
+      </w:r>
+      <w:r>
+        <w:t xml:space="preserve"> </w:t>
+      </w:r>
+      <w:r>
+        <w:t xml:space="preserve">-</w:t>
+      </w:r>
+      <w:r>
+        <w:t xml:space="preserve"> </w:t>
+      </w:r>
+      <w:r>
+        <w:rPr>
+          <w:rStyle w:val="VerbatimChar"/>
+        </w:rPr>
+        <w:t xml:space="preserve">prompts/</w:t>
+      </w:r>
+      <w:r>
+        <w:t xml:space="preserve">,</w:t>
+      </w:r>
+      <w:r>
+        <w:t xml:space="preserve"> </w:t>
+      </w:r>
+      <w:r>
+        <w:rPr>
+          <w:rStyle w:val="VerbatimChar"/>
+        </w:rPr>
+        <w:t xml:space="preserve">knowledge/</w:t>
+      </w:r>
+      <w:r>
+        <w:t xml:space="preserve"> </w:t>
+      </w:r>
+      <w:r>
+        <w:t xml:space="preserve">(v0.1, cần chuyên gia miền duyệt),</w:t>
+      </w:r>
+      <w:r>
+        <w:t xml:space="preserve"> </w:t>
+      </w:r>
+      <w:r>
+        <w:rPr>
+          <w:rStyle w:val="VerbatimChar"/>
+        </w:rPr>
+        <w:t xml:space="preserve">data/qc_checklist.json</w:t>
+      </w:r>
+      <w:r>
+        <w:t xml:space="preserve">,</w:t>
+      </w:r>
+      <w:r>
+        <w:t xml:space="preserve"> </w:t>
+      </w:r>
+      <w:r>
+        <w:rPr>
+          <w:rStyle w:val="VerbatimChar"/>
+        </w:rPr>
+        <w:t xml:space="preserve">samples/</w:t>
+      </w:r>
+      <w:r>
+        <w:t xml:space="preserve"> </w:t>
+      </w:r>
+      <w:r>
+        <w:t xml:space="preserve">(2 kịch bản mẫu cho dry-run).</w:t>
+      </w:r>
+    </w:p>
+    <w:p>
+      <w:pPr>
+        <w:pStyle w:val="BodyText"/>
+      </w:pPr>
+      <w:r>
+        <w:rPr>
+          <w:b/>
+          <w:bCs/>
+        </w:rPr>
+        <w:t xml:space="preserve">Đang chờ điều kiện bên ngoài:</w:t>
+      </w:r>
+      <w:r>
+        <w:t xml:space="preserve"> </w:t>
+      </w:r>
+      <w:r>
+        <w:t xml:space="preserve">- Kết nối Deepix (Bước 2) và Clip AI/Kling (Bước 4, heartbeat polling) — tạm gác theo yêu cầu.</w:t>
+      </w:r>
+      <w:r>
+        <w:t xml:space="preserve"> </w:t>
+      </w:r>
+      <w:r>
+        <w:t xml:space="preserve">- Cài FFmpeg trên máy để render thật.</w:t>
+      </w:r>
+      <w:r>
+        <w:t xml:space="preserve"> </w:t>
+      </w:r>
+      <w:r>
+        <w:t xml:space="preserve">- API key Anthropic (V1) để thay</w:t>
+      </w:r>
+      <w:r>
+        <w:t xml:space="preserve"> </w:t>
+      </w:r>
+      <w:r>
+        <w:t xml:space="preserve">“dán JSON tay”</w:t>
+      </w:r>
+      <w:r>
+        <w:t xml:space="preserve"> </w:t>
+      </w:r>
+      <w:r>
+        <w:t xml:space="preserve">bằng LLM runner tự động.</w:t>
+      </w:r>
+      <w:r>
+        <w:t xml:space="preserve"> </w:t>
+      </w:r>
+      <w:r>
+        <w:t xml:space="preserve">-</w:t>
+      </w:r>
+      <w:r>
+        <w:t xml:space="preserve"> </w:t>
+      </w:r>
+      <w:r>
+        <w:rPr>
+          <w:rStyle w:val="VerbatimChar"/>
+        </w:rPr>
+        <w:t xml:space="preserve">music_provider</w:t>
+      </w:r>
+      <w:r>
+        <w:t xml:space="preserve">, chuyên gia miền duyệt Knowledge Base, chạy dry-run thật để hiệu chỉnh threshold.</w:t>
+      </w:r>
+    </w:p>
     <w:p>
       <w:r>
         <w:pict>
@@ -5683,8 +5960,8 @@
         <w:t xml:space="preserve">(kèm 4 comment góp ý, đã phân tích ở Mục 2).</w:t>
       </w:r>
     </w:p>
-    <w:bookmarkEnd w:id="40"/>
     <w:bookmarkEnd w:id="41"/>
+    <w:bookmarkEnd w:id="42"/>
     <w:sectPr>
       <w:footnotePr>
         <w:numRestart w:val="eachSect"/>

</xml_diff>

<commit_message>
Add Step 4 runner with provider interface and mock provider
VideoRunner handles submit, heartbeat polling, download, risk-control
logging (no auto-retry), transient retries, concurrency, pause and cancel.
Wired into the dashboard and a clipai MCP server; real Clip AI adapter
still pending. 53 tests pass; PLAN docx/pdf rebuilt.

Co-Authored-By: Claude Sonnet 5 <noreply@anthropic.com>
</commit_message>
<xml_diff>
--- a/PLAN.docx
+++ b/PLAN.docx
@@ -5654,7 +5654,7 @@
           <w:b/>
           <w:bCs/>
         </w:rPr>
-        <w:t xml:space="preserve">Đã build (44 unit test pass, không cần API ngoài):</w:t>
+        <w:t xml:space="preserve">Đã build (53 unit test pass, không cần API ngoài):</w:t>
       </w:r>
       <w:r>
         <w:t xml:space="preserve"> </w:t>
@@ -5753,10 +5753,37 @@
         <w:t xml:space="preserve">ffmpeg-studio</w:t>
       </w:r>
       <w:r>
-        <w:t xml:space="preserve"> </w:t>
-      </w:r>
-      <w:r>
-        <w:t xml:space="preserve">(vỏ mỏng bọc core); hướng dẫn</w:t>
+        <w:t xml:space="preserve">,</w:t>
+      </w:r>
+      <w:r>
+        <w:t xml:space="preserve"> </w:t>
+      </w:r>
+      <w:r>
+        <w:rPr>
+          <w:rStyle w:val="VerbatimChar"/>
+        </w:rPr>
+        <w:t xml:space="preserve">clipai</w:t>
+      </w:r>
+      <w:r>
+        <w:t xml:space="preserve"> </w:t>
+      </w:r>
+      <w:r>
+        <w:t xml:space="preserve">(vỏ mỏng bọc core;</w:t>
+      </w:r>
+      <w:r>
+        <w:t xml:space="preserve"> </w:t>
+      </w:r>
+      <w:r>
+        <w:rPr>
+          <w:rStyle w:val="VerbatimChar"/>
+        </w:rPr>
+        <w:t xml:space="preserve">clipai</w:t>
+      </w:r>
+      <w:r>
+        <w:t xml:space="preserve"> </w:t>
+      </w:r>
+      <w:r>
+        <w:t xml:space="preserve">mới chạy bản giả lập); hướng dẫn</w:t>
       </w:r>
       <w:r>
         <w:t xml:space="preserve"> </w:t>
@@ -5867,7 +5894,31 @@
         <w:t xml:space="preserve"> </w:t>
       </w:r>
       <w:r>
-        <w:t xml:space="preserve">- Kết nối Deepix (Bước 2) và Clip AI/Kling (Bước 4, heartbeat polling) — tạm gác theo yêu cầu.</w:t>
+        <w:t xml:space="preserve">- Adapter thật cho Deepix (Bước 2) và Clip AI/Kling (Bước 4) — tạm gác theo yêu cầu. Bộ chạy Bước 4 (</w:t>
+      </w:r>
+      <w:r>
+        <w:rPr>
+          <w:rStyle w:val="VerbatimChar"/>
+        </w:rPr>
+        <w:t xml:space="preserve">core/runner.py</w:t>
+      </w:r>
+      <w:r>
+        <w:t xml:space="preserve">: submit, heartbeat polling, tải video, log risk control, retry, concurrency, pause/cancel) đã xong và kiểm thử với provider giả lập; chỉ còn viết adapter theo interface</w:t>
+      </w:r>
+      <w:r>
+        <w:t xml:space="preserve"> </w:t>
+      </w:r>
+      <w:r>
+        <w:rPr>
+          <w:rStyle w:val="VerbatimChar"/>
+        </w:rPr>
+        <w:t xml:space="preserve">VideoProvider</w:t>
+      </w:r>
+      <w:r>
+        <w:t xml:space="preserve"> </w:t>
+      </w:r>
+      <w:r>
+        <w:t xml:space="preserve">khi có API.</w:t>
       </w:r>
       <w:r>
         <w:t xml:space="preserve"> </w:t>

</xml_diff>

<commit_message>
Generalize runner and add Step 2 image runner with mock provider
Shared heartbeat loop for image and video jobs; dashboard Step 2 wired via
IMAGE_PROVIDER=mock. 58 tests pass; PLAN docx/pdf rebuilt.

Co-Authored-By: Claude Sonnet 5 <noreply@anthropic.com>
</commit_message>
<xml_diff>
--- a/PLAN.docx
+++ b/PLAN.docx
@@ -5654,7 +5654,7 @@
           <w:b/>
           <w:bCs/>
         </w:rPr>
-        <w:t xml:space="preserve">Đã build (53 unit test pass, không cần API ngoài):</w:t>
+        <w:t xml:space="preserve">Đã build (58 unit test pass, không cần API ngoài):</w:t>
       </w:r>
       <w:r>
         <w:t xml:space="preserve"> </w:t>
@@ -5894,7 +5894,7 @@
         <w:t xml:space="preserve"> </w:t>
       </w:r>
       <w:r>
-        <w:t xml:space="preserve">- Adapter thật cho Deepix (Bước 2) và Clip AI/Kling (Bước 4) — tạm gác theo yêu cầu. Bộ chạy Bước 4 (</w:t>
+        <w:t xml:space="preserve">- Adapter thật cho Deepix (Bước 2) và Clip AI/Kling (Bước 4) — tạm gác theo yêu cầu. Bộ chạy Bước 2 và Bước 4 (</w:t>
       </w:r>
       <w:r>
         <w:rPr>
@@ -5903,7 +5903,7 @@
         <w:t xml:space="preserve">core/runner.py</w:t>
       </w:r>
       <w:r>
-        <w:t xml:space="preserve">: submit, heartbeat polling, tải video, log risk control, retry, concurrency, pause/cancel) đã xong và kiểm thử với provider giả lập; chỉ còn viết adapter theo interface</w:t>
+        <w:t xml:space="preserve">: submit, heartbeat polling, tải kết quả, log risk control, retry, concurrency, pause/cancel) đã xong và kiểm thử với provider giả lập; chỉ còn viết adapter theo interface</w:t>
       </w:r>
       <w:r>
         <w:t xml:space="preserve"> </w:t>
@@ -5913,6 +5913,15 @@
           <w:rStyle w:val="VerbatimChar"/>
         </w:rPr>
         <w:t xml:space="preserve">VideoProvider</w:t>
+      </w:r>
+      <w:r>
+        <w:t xml:space="preserve">/</w:t>
+      </w:r>
+      <w:r>
+        <w:rPr>
+          <w:rStyle w:val="VerbatimChar"/>
+        </w:rPr>
+        <w:t xml:space="preserve">ImageProvider</w:t>
       </w:r>
       <w:r>
         <w:t xml:space="preserve"> </w:t>

</xml_diff>

<commit_message>
Expand director knowledge base and add evaluation set with auto-scoring
Genre guides, AI image failure modes, few-shot examples, 12-case eval set
(3 golden, 9 held-out), automatic checks for objective criteria and a
human review sheet. Prompt bundles now include the new knowledge; MCP tool
get_motion_prompt_bundle added. 69 tests pass; PLAN docx/pdf rebuilt.

Co-Authored-By: Claude Sonnet 5 <noreply@anthropic.com>
</commit_message>
<xml_diff>
--- a/PLAN.docx
+++ b/PLAN.docx
@@ -5654,7 +5654,7 @@
           <w:b/>
           <w:bCs/>
         </w:rPr>
-        <w:t xml:space="preserve">Đã build (58 unit test pass, không cần API ngoài):</w:t>
+        <w:t xml:space="preserve">Đã build (69 unit test pass, không cần API ngoài):</w:t>
       </w:r>
       <w:r>
         <w:t xml:space="preserve"> </w:t>
@@ -5849,7 +5849,7 @@
         <w:t xml:space="preserve"> </w:t>
       </w:r>
       <w:r>
-        <w:t xml:space="preserve">(v0.1, cần chuyên gia miền duyệt),</w:t>
+        <w:t xml:space="preserve">(v0.2: nền tảng đạo diễn, hướng dẫn 7 thể loại, lỗi ảnh AI, từ vựng motion; người duyệt tạm là chủ dự án),</w:t>
       </w:r>
       <w:r>
         <w:t xml:space="preserve"> </w:t>
@@ -5878,6 +5878,54 @@
       <w:r>
         <w:t xml:space="preserve">(2 kịch bản mẫu cho dry-run).</w:t>
       </w:r>
+      <w:r>
+        <w:t xml:space="preserve"> </w:t>
+      </w:r>
+      <w:r>
+        <w:t xml:space="preserve">-</w:t>
+      </w:r>
+      <w:r>
+        <w:t xml:space="preserve"> </w:t>
+      </w:r>
+      <w:r>
+        <w:rPr>
+          <w:rStyle w:val="VerbatimChar"/>
+        </w:rPr>
+        <w:t xml:space="preserve">eval/</w:t>
+      </w:r>
+      <w:r>
+        <w:t xml:space="preserve"> </w:t>
+      </w:r>
+      <w:r>
+        <w:t xml:space="preserve">+</w:t>
+      </w:r>
+      <w:r>
+        <w:t xml:space="preserve"> </w:t>
+      </w:r>
+      <w:r>
+        <w:rPr>
+          <w:rStyle w:val="VerbatimChar"/>
+        </w:rPr>
+        <w:t xml:space="preserve">core/evalset.py</w:t>
+      </w:r>
+      <w:r>
+        <w:t xml:space="preserve"> </w:t>
+      </w:r>
+      <w:r>
+        <w:t xml:space="preserve">— bộ đánh giá Director: 12 mẫu (3 golden làm few-shot, 9 held-out), bộ chấm tự động phần khách quan, phiếu duyệt thẩm mỹ; hướng dẫn ở</w:t>
+      </w:r>
+      <w:r>
+        <w:t xml:space="preserve"> </w:t>
+      </w:r>
+      <w:r>
+        <w:rPr>
+          <w:rStyle w:val="VerbatimChar"/>
+        </w:rPr>
+        <w:t xml:space="preserve">eval/README.md</w:t>
+      </w:r>
+      <w:r>
+        <w:t xml:space="preserve">.</w:t>
+      </w:r>
     </w:p>
     <w:p>
       <w:pPr>
@@ -5969,7 +6017,7 @@
         <w:t xml:space="preserve">music_provider</w:t>
       </w:r>
       <w:r>
-        <w:t xml:space="preserve">, chuyên gia miền duyệt Knowledge Base, chạy dry-run thật để hiệu chỉnh threshold.</w:t>
+        <w:t xml:space="preserve">; chạy vòng đánh giá thật (người duyệt tạm = chủ dự án, sau này chuyên gia miền) và dry-run V0 để hiệu chỉnh prompt/threshold.</w:t>
       </w:r>
     </w:p>
     <w:p>

</xml_diff>

<commit_message>
Add vetted source list and research notes; record Clip AI as multi-model platform
- knowledge/sources.md: 10 vetted repos (stars, license, activity, use)
- knowledge/research_notes.md: distilled principles + 8-dimension taxonomy,
  wired into Director/motion prompts and an eval check for empty praise words
- Clip AI (Seedance/Kling/MiniMax, Seed Audio/ElevenLabs): per-project
  video_model in DB/runner/dashboard; PLAN 3.3b; music provider candidate
71 tests pass; PLAN docx/pdf rebuilt.

Co-Authored-By: Claude Sonnet 5 <noreply@anthropic.com>
</commit_message>
<xml_diff>
--- a/PLAN.docx
+++ b/PLAN.docx
@@ -2,7 +2,7 @@
 <file path=word/document.xml><?xml version="1.0" encoding="utf-8"?>
 <w:document xmlns:w="http://schemas.openxmlformats.org/wordprocessingml/2006/main" xmlns:m="http://schemas.openxmlformats.org/officeDocument/2006/math" xmlns:r="http://schemas.openxmlformats.org/officeDocument/2006/relationships" xmlns:o="urn:schemas-microsoft-com:office:office" xmlns:v="urn:schemas-microsoft-com:vml" xmlns:w10="urn:schemas-microsoft-com:office:word" xmlns:a="http://schemas.openxmlformats.org/drawingml/2006/main" xmlns:pic="http://schemas.openxmlformats.org/drawingml/2006/picture" xmlns:wp="http://schemas.openxmlformats.org/drawingml/2006/wordprocessingDrawing">
   <w:body>
-    <w:bookmarkStart w:id="42" w:name="X9c8c830ec4a0bd58ad601261317abf6bbfd8ccb"/>
+    <w:bookmarkStart w:id="43" w:name="X9c8c830ec4a0bd58ad601261317abf6bbfd8ccb"/>
     <w:p>
       <w:pPr>
         <w:pStyle w:val="Heading1"/>
@@ -1293,7 +1293,7 @@
     </w:p>
     <w:bookmarkEnd w:id="13"/>
     <w:bookmarkEnd w:id="14"/>
-    <w:bookmarkStart w:id="32" w:name="Xcd7cd861a7bec2f7c480708ab31acaf54a69d9b"/>
+    <w:bookmarkStart w:id="33" w:name="Xcd7cd861a7bec2f7c480708ab31acaf54a69d9b"/>
     <w:p>
       <w:pPr>
         <w:pStyle w:val="Heading2"/>
@@ -2410,18 +2410,27 @@
               <w:t xml:space="preserve"> </w:t>
             </w:r>
             <w:r>
-              <w:t xml:space="preserve">batch, parse lỗi risk-control (comment 4)</w:t>
-            </w:r>
-          </w:p>
-        </w:tc>
-        <w:tc>
-          <w:tcPr/>
-          <w:p>
-            <w:pPr>
-              <w:pStyle w:val="Compact"/>
-            </w:pPr>
-            <w:r>
-              <w:t xml:space="preserve">REST API (+webhook) Clip AI / Kling</w:t>
+              <w:t xml:space="preserve">batch, parse lỗi risk-control (comment 4); chọn model theo dự án (</w:t>
+            </w:r>
+            <w:r>
+              <w:rPr>
+                <w:rStyle w:val="VerbatimChar"/>
+              </w:rPr>
+              <w:t xml:space="preserve">video_model</w:t>
+            </w:r>
+            <w:r>
+              <w:t xml:space="preserve">: seedance / kling / minimax)</w:t>
+            </w:r>
+          </w:p>
+        </w:tc>
+        <w:tc>
+          <w:tcPr/>
+          <w:p>
+            <w:pPr>
+              <w:pStyle w:val="Compact"/>
+            </w:pPr>
+            <w:r>
+              <w:t xml:space="preserve">REST API (+webhook) Clip AI (nền tảng tích hợp nhiều model)</w:t>
             </w:r>
           </w:p>
         </w:tc>
@@ -2534,7 +2543,220 @@
       </w:r>
     </w:p>
     <w:bookmarkEnd w:id="18"/>
-    <w:bookmarkStart w:id="22" w:name="X6bbdb0224ca75ffd46f91658ec407370b6f711f"/>
+    <w:bookmarkStart w:id="19" w:name="X776b0d435c37aae2ce31d220540ded257a44043"/>
+    <w:p>
+      <w:pPr>
+        <w:pStyle w:val="Heading3"/>
+      </w:pPr>
+      <w:r>
+        <w:t xml:space="preserve">3.3b Thông tin về Clip AI (bổ sung 2026-09-19)</w:t>
+      </w:r>
+    </w:p>
+    <w:p>
+      <w:pPr>
+        <w:pStyle w:val="FirstParagraph"/>
+      </w:pPr>
+      <w:r>
+        <w:t xml:space="preserve">Clip AI là nền tảng tạo video và âm thanh AI tích hợp cho team (all-in-one), gộp nhiều model:</w:t>
+      </w:r>
+      <w:r>
+        <w:t xml:space="preserve"> </w:t>
+      </w:r>
+      <w:r>
+        <w:rPr>
+          <w:b/>
+          <w:bCs/>
+        </w:rPr>
+        <w:t xml:space="preserve">Seedance, Kling, MiniMax</w:t>
+      </w:r>
+      <w:r>
+        <w:t xml:space="preserve"> </w:t>
+      </w:r>
+      <w:r>
+        <w:t xml:space="preserve">(video),</w:t>
+      </w:r>
+      <w:r>
+        <w:t xml:space="preserve"> </w:t>
+      </w:r>
+      <w:r>
+        <w:rPr>
+          <w:b/>
+          <w:bCs/>
+        </w:rPr>
+        <w:t xml:space="preserve">Seed Audio, ElevenLabs</w:t>
+      </w:r>
+      <w:r>
+        <w:t xml:space="preserve"> </w:t>
+      </w:r>
+      <w:r>
+        <w:t xml:space="preserve">(âm thanh/giọng), kèm thư viện game asset. Tính năng: tạo/chỉnh video đa phương thức, đạo diễn 3D, thoại, âm thanh và nhạc, thiết kế và nhân bản giọng nói.</w:t>
+      </w:r>
+    </w:p>
+    <w:p>
+      <w:pPr>
+        <w:pStyle w:val="BodyText"/>
+      </w:pPr>
+      <w:r>
+        <w:t xml:space="preserve">Hệ quả cho thiết kế:</w:t>
+      </w:r>
+      <w:r>
+        <w:t xml:space="preserve"> </w:t>
+      </w:r>
+      <w:r>
+        <w:t xml:space="preserve">1.</w:t>
+      </w:r>
+      <w:r>
+        <w:t xml:space="preserve"> </w:t>
+      </w:r>
+      <w:r>
+        <w:rPr>
+          <w:b/>
+          <w:bCs/>
+        </w:rPr>
+        <w:t xml:space="preserve">Không chỉ Kling:</w:t>
+      </w:r>
+      <w:r>
+        <w:t xml:space="preserve"> </w:t>
+      </w:r>
+      <w:r>
+        <w:t xml:space="preserve">bộ chạy Bước 4 có cấu hình</w:t>
+      </w:r>
+      <w:r>
+        <w:t xml:space="preserve"> </w:t>
+      </w:r>
+      <w:r>
+        <w:rPr>
+          <w:rStyle w:val="VerbatimChar"/>
+        </w:rPr>
+        <w:t xml:space="preserve">video_model</w:t>
+      </w:r>
+      <w:r>
+        <w:t xml:space="preserve"> </w:t>
+      </w:r>
+      <w:r>
+        <w:t xml:space="preserve">theo dự án (seedance / kling / minimax), truyền vào provider. Bộ lọc kiểm duyệt (risk control) và cú pháp prompt khác nhau theo model → blocklist IP và</w:t>
+      </w:r>
+      <w:r>
+        <w:t xml:space="preserve"> </w:t>
+      </w:r>
+      <w:r>
+        <w:rPr>
+          <w:rStyle w:val="VerbatimChar"/>
+        </w:rPr>
+        <w:t xml:space="preserve">content_moderation_failures</w:t>
+      </w:r>
+      <w:r>
+        <w:t xml:space="preserve"> </w:t>
+      </w:r>
+      <w:r>
+        <w:t xml:space="preserve">nên ghi kèm model; bộ đánh giá</w:t>
+      </w:r>
+      <w:r>
+        <w:t xml:space="preserve"> </w:t>
+      </w:r>
+      <w:r>
+        <w:rPr>
+          <w:rStyle w:val="VerbatimChar"/>
+        </w:rPr>
+        <w:t xml:space="preserve">eval/</w:t>
+      </w:r>
+      <w:r>
+        <w:t xml:space="preserve"> </w:t>
+      </w:r>
+      <w:r>
+        <w:t xml:space="preserve">cần chạy lại khi đổi model.</w:t>
+      </w:r>
+      <w:r>
+        <w:t xml:space="preserve"> </w:t>
+      </w:r>
+      <w:r>
+        <w:t xml:space="preserve">2.</w:t>
+      </w:r>
+      <w:r>
+        <w:t xml:space="preserve"> </w:t>
+      </w:r>
+      <w:r>
+        <w:rPr>
+          <w:b/>
+          <w:bCs/>
+        </w:rPr>
+        <w:t xml:space="preserve">Âm thanh:</w:t>
+      </w:r>
+      <w:r>
+        <w:t xml:space="preserve"> </w:t>
+      </w:r>
+      <w:r>
+        <w:t xml:space="preserve">Bước 5a (nhạc) có thể dùng chính Clip AI (Seed Audio/ElevenLabs), giảm một nhà cung cấp. Cần xác nhận API có endpoint audio và điều khoản thương mại.</w:t>
+      </w:r>
+      <w:r>
+        <w:t xml:space="preserve"> </w:t>
+      </w:r>
+      <w:r>
+        <w:t xml:space="preserve">3.</w:t>
+      </w:r>
+      <w:r>
+        <w:t xml:space="preserve"> </w:t>
+      </w:r>
+      <w:r>
+        <w:rPr>
+          <w:b/>
+          <w:bCs/>
+        </w:rPr>
+        <w:t xml:space="preserve">Giọng/thoại:</w:t>
+      </w:r>
+      <w:r>
+        <w:t xml:space="preserve"> </w:t>
+      </w:r>
+      <w:r>
+        <w:t xml:space="preserve">tạo thoại, thiết kế/nhân bản giọng là tính năng có thể thêm ở giai đoạn sau (lồng tiếng nhân vật); chưa nằm trong V0/V1.</w:t>
+      </w:r>
+      <w:r>
+        <w:t xml:space="preserve"> </w:t>
+      </w:r>
+      <w:r>
+        <w:t xml:space="preserve">4.</w:t>
+      </w:r>
+      <w:r>
+        <w:t xml:space="preserve"> </w:t>
+      </w:r>
+      <w:r>
+        <w:rPr>
+          <w:b/>
+          <w:bCs/>
+        </w:rPr>
+        <w:t xml:space="preserve">Thư viện game asset:</w:t>
+      </w:r>
+      <w:r>
+        <w:t xml:space="preserve"> </w:t>
+      </w:r>
+      <w:r>
+        <w:t xml:space="preserve">phù hợp trailer game; xét dùng làm nguồn tham chiếu nhân vật/bối cảnh nhất quán khi API cho phép.</w:t>
+      </w:r>
+      <w:r>
+        <w:t xml:space="preserve"> </w:t>
+      </w:r>
+      <w:r>
+        <w:t xml:space="preserve">5.</w:t>
+      </w:r>
+      <w:r>
+        <w:t xml:space="preserve"> </w:t>
+      </w:r>
+      <w:r>
+        <w:rPr>
+          <w:b/>
+          <w:bCs/>
+        </w:rPr>
+        <w:t xml:space="preserve">Điểm cần hỏi khi xin API:</w:t>
+      </w:r>
+      <w:r>
+        <w:t xml:space="preserve"> </w:t>
+      </w:r>
+      <w:r>
+        <w:t xml:space="preserve">danh sách model và phiên bản có thể chọn qua API, tham số chọn model, endpoint audio, hạn mức/credit theo model, chính sách kiểm duyệt theo model.</w:t>
+      </w:r>
+    </w:p>
+    <w:bookmarkEnd w:id="19"/>
+    <w:bookmarkStart w:id="23" w:name="X6bbdb0224ca75ffd46f91658ec407370b6f711f"/>
     <w:p>
       <w:pPr>
         <w:pStyle w:val="Heading3"/>
@@ -3128,7 +3350,7 @@
       <w:r>
         <w:t xml:space="preserve"> </w:t>
       </w:r>
-      <w:hyperlink r:id="rId19">
+      <w:hyperlink r:id="rId20">
         <w:r>
           <w:rPr>
             <w:rStyle w:val="Hyperlink"/>
@@ -3173,7 +3395,7 @@
       <w:r>
         <w:t xml:space="preserve"> </w:t>
       </w:r>
-      <w:hyperlink r:id="rId20">
+      <w:hyperlink r:id="rId21">
         <w:r>
           <w:rPr>
             <w:rStyle w:val="Hyperlink"/>
@@ -3206,7 +3428,7 @@
       <w:r>
         <w:t xml:space="preserve"> </w:t>
       </w:r>
-      <w:hyperlink r:id="rId21">
+      <w:hyperlink r:id="rId22">
         <w:r>
           <w:rPr>
             <w:rStyle w:val="Hyperlink"/>
@@ -3238,8 +3460,8 @@
         <w:t xml:space="preserve">Lưu ý Streamlit khó khớp 100% pixel với Figma; nếu cần UI sát mockup thì cân nhắc frontend web riêng (quyết định mở).</w:t>
       </w:r>
     </w:p>
-    <w:bookmarkEnd w:id="22"/>
-    <w:bookmarkStart w:id="23" w:name="bước-5a-nhạc-nền"/>
+    <w:bookmarkEnd w:id="23"/>
+    <w:bookmarkStart w:id="24" w:name="bước-5a-nhạc-nền"/>
     <w:p>
       <w:pPr>
         <w:pStyle w:val="Heading3"/>
@@ -3340,17 +3562,33 @@
         <w:t xml:space="preserve"> </w:t>
       </w:r>
       <w:r>
-        <w:t xml:space="preserve">swap được; ứng viên có API + license thương mại rõ (vd ElevenLabs Music — cần xác minh).</w:t>
-      </w:r>
-      <w:r>
-        <w:t xml:space="preserve"> </w:t>
-      </w:r>
-      <w:r>
-        <w:rPr>
-          <w:b/>
-          <w:bCs/>
-        </w:rPr>
-        <w:t xml:space="preserve">Chọn provider sau</w:t>
+        <w:t xml:space="preserve">swap được.</w:t>
+      </w:r>
+      <w:r>
+        <w:t xml:space="preserve"> </w:t>
+      </w:r>
+      <w:r>
+        <w:rPr>
+          <w:b/>
+          <w:bCs/>
+        </w:rPr>
+        <w:t xml:space="preserve">Ứng viên số 1 nay là chính Clip AI</w:t>
+      </w:r>
+      <w:r>
+        <w:t xml:space="preserve"> </w:t>
+      </w:r>
+      <w:r>
+        <w:t xml:space="preserve">(nền tảng tích hợp ElevenLabs và Seed Audio, có tạo nhạc/âm thanh) — nếu API Clip AI mở phần audio thì dùng chung 1 nhà cung cấp, 1 hợp đồng, 1 API key; nếu không thì dùng nhà cung cấp riêng có license thương mại rõ.</w:t>
+      </w:r>
+      <w:r>
+        <w:t xml:space="preserve"> </w:t>
+      </w:r>
+      <w:r>
+        <w:rPr>
+          <w:b/>
+          <w:bCs/>
+        </w:rPr>
+        <w:t xml:space="preserve">Chọn sau khi xác nhận API Clip AI</w:t>
       </w:r>
       <w:r>
         <w:t xml:space="preserve"> </w:t>
@@ -3359,8 +3597,8 @@
         <w:t xml:space="preserve">(chưa chặn V0).</w:t>
       </w:r>
     </w:p>
-    <w:bookmarkEnd w:id="23"/>
-    <w:bookmarkStart w:id="31" w:name="Xbc82a203343a0bbbd8ca3bbdecc2b25a20da473"/>
+    <w:bookmarkEnd w:id="24"/>
+    <w:bookmarkStart w:id="32" w:name="Xbc82a203343a0bbbd8ca3bbdecc2b25a20da473"/>
     <w:p>
       <w:pPr>
         <w:pStyle w:val="Heading3"/>
@@ -3455,7 +3693,7 @@
       <w:r>
         <w:t xml:space="preserve"> </w:t>
       </w:r>
-      <w:hyperlink r:id="rId24">
+      <w:hyperlink r:id="rId25">
         <w:r>
           <w:rPr>
             <w:rStyle w:val="Hyperlink"/>
@@ -3469,7 +3707,7 @@
       <w:r>
         <w:t xml:space="preserve"> </w:t>
       </w:r>
-      <w:hyperlink r:id="rId25">
+      <w:hyperlink r:id="rId26">
         <w:r>
           <w:rPr>
             <w:rStyle w:val="Hyperlink"/>
@@ -3483,7 +3721,7 @@
       <w:r>
         <w:t xml:space="preserve"> </w:t>
       </w:r>
-      <w:hyperlink r:id="rId26">
+      <w:hyperlink r:id="rId27">
         <w:r>
           <w:rPr>
             <w:rStyle w:val="Hyperlink"/>
@@ -3497,7 +3735,7 @@
       <w:r>
         <w:t xml:space="preserve"> </w:t>
       </w:r>
-      <w:hyperlink r:id="rId27">
+      <w:hyperlink r:id="rId28">
         <w:r>
           <w:rPr>
             <w:rStyle w:val="Hyperlink"/>
@@ -3511,7 +3749,7 @@
       <w:r>
         <w:t xml:space="preserve"> </w:t>
       </w:r>
-      <w:hyperlink r:id="rId28">
+      <w:hyperlink r:id="rId29">
         <w:r>
           <w:rPr>
             <w:rStyle w:val="Hyperlink"/>
@@ -3525,7 +3763,7 @@
       <w:r>
         <w:t xml:space="preserve"> </w:t>
       </w:r>
-      <w:hyperlink r:id="rId29">
+      <w:hyperlink r:id="rId30">
         <w:r>
           <w:rPr>
             <w:rStyle w:val="Hyperlink"/>
@@ -3539,7 +3777,7 @@
       <w:r>
         <w:t xml:space="preserve"> </w:t>
       </w:r>
-      <w:hyperlink r:id="rId30">
+      <w:hyperlink r:id="rId31">
         <w:r>
           <w:rPr>
             <w:rStyle w:val="Hyperlink"/>
@@ -3601,9 +3839,9 @@
         <w:t xml:space="preserve">duyệt. Ước tính +8–12 ngày công, chạy song song với build MCP ở V0; bộ mẫu dùng luôn để hiệu chỉnh QC checklist (Bước 2).</w:t>
       </w:r>
     </w:p>
-    <w:bookmarkEnd w:id="31"/>
     <w:bookmarkEnd w:id="32"/>
-    <w:bookmarkStart w:id="33" w:name="rủi-ro-mitigation-tổng-hợp"/>
+    <w:bookmarkEnd w:id="33"/>
+    <w:bookmarkStart w:id="34" w:name="rủi-ro-mitigation-tổng-hợp"/>
     <w:p>
       <w:pPr>
         <w:pStyle w:val="Heading2"/>
@@ -3807,8 +4045,8 @@
         </w:tc>
       </w:tr>
     </w:tbl>
-    <w:bookmarkEnd w:id="33"/>
-    <w:bookmarkStart w:id="34" w:name="quyết-định-đã-chốt-còn-mở"/>
+    <w:bookmarkEnd w:id="34"/>
+    <w:bookmarkStart w:id="35" w:name="quyết-định-đã-chốt-còn-mở"/>
     <w:p>
       <w:pPr>
         <w:pStyle w:val="Heading2"/>
@@ -4135,7 +4373,7 @@
         <w:t xml:space="preserve"> </w:t>
       </w:r>
       <w:r>
-        <w:t xml:space="preserve">| Suno không có API chính thức; chọn nhà cung cấp có API + license thương mại rõ (vd ElevenLabs Music — cần xác minh). Xem 3.5 |</w:t>
+        <w:t xml:space="preserve">| Suno không có API chính thức. Ưu tiên dùng audio của Clip AI (ElevenLabs/Seed Audio tích hợp) nếu API cho phép; xác nhận license thương mại. Xem 3.5 |</w:t>
       </w:r>
       <w:r>
         <w:t xml:space="preserve"> </w:t>
@@ -4246,8 +4484,8 @@
         <w:t xml:space="preserve">| Ngân sách credit cho giai đoạn thử nghiệm (Deepix + Clip AI/Kling) | Dry-run + retry loop đều tốn credit thật; cần biết giới hạn trước khi chạy batch | Bạn / người giữ ngân sách |</w:t>
       </w:r>
     </w:p>
-    <w:bookmarkEnd w:id="34"/>
-    <w:bookmarkStart w:id="35" w:name="Xd77c4f47b903719b6fbd5f054853d76240e8579"/>
+    <w:bookmarkEnd w:id="35"/>
+    <w:bookmarkStart w:id="36" w:name="Xd77c4f47b903719b6fbd5f054853d76240e8579"/>
     <w:p>
       <w:pPr>
         <w:pStyle w:val="Heading2"/>
@@ -4667,8 +4905,8 @@
         <w:t xml:space="preserve">- [ ] Người giữ quan hệ với team dev nội bộ cấp API Deepix/Clip AI</w:t>
       </w:r>
     </w:p>
-    <w:bookmarkEnd w:id="35"/>
-    <w:bookmarkStart w:id="39" w:name="lộ-trình-triển-khai-v0-v1"/>
+    <w:bookmarkEnd w:id="36"/>
+    <w:bookmarkStart w:id="40" w:name="lộ-trình-triển-khai-v0-v1"/>
     <w:p>
       <w:pPr>
         <w:pStyle w:val="Heading2"/>
@@ -4677,7 +4915,7 @@
         <w:t xml:space="preserve">7. Lộ trình triển khai: V0 → V1</w:t>
       </w:r>
     </w:p>
-    <w:bookmarkStart w:id="36" w:name="X96af04f5f0dc0fae4ea4bac7edaf06b3f002467"/>
+    <w:bookmarkStart w:id="37" w:name="X96af04f5f0dc0fae4ea4bac7edaf06b3f002467"/>
     <w:p>
       <w:pPr>
         <w:pStyle w:val="Heading3"/>
@@ -5004,8 +5242,8 @@
         <w:t xml:space="preserve">≥1 video hoàn chỉnh end-to-end, threshold đã hiệu chỉnh bằng dữ liệu, prompt/checklist khóa version.</w:t>
       </w:r>
     </w:p>
-    <w:bookmarkEnd w:id="36"/>
-    <w:bookmarkStart w:id="37" w:name="X3d60c8a93cbf48f59874d7f70b2bf9f5f0f0b9b"/>
+    <w:bookmarkEnd w:id="37"/>
+    <w:bookmarkStart w:id="38" w:name="X3d60c8a93cbf48f59874d7f70b2bf9f5f0f0b9b"/>
     <w:p>
       <w:pPr>
         <w:pStyle w:val="Heading3"/>
@@ -5148,8 +5386,8 @@
         <w:t xml:space="preserve">hệ thống bàn giao vận hành được từ 1 giao diện duy nhất, có tài liệu.</w:t>
       </w:r>
     </w:p>
-    <w:bookmarkEnd w:id="37"/>
-    <w:bookmarkStart w:id="38" w:name="Xf17d03e65ff0af0f4b74d160622aac56e61b107"/>
+    <w:bookmarkEnd w:id="38"/>
+    <w:bookmarkStart w:id="39" w:name="Xf17d03e65ff0af0f4b74d160622aac56e61b107"/>
     <w:p>
       <w:pPr>
         <w:pStyle w:val="Heading3"/>
@@ -5516,9 +5754,9 @@
         <w:t xml:space="preserve">Rủi ro kéo dài: chờ API Deepix/Clip AI; Deepix/Clip AI chỉ có Web (Playwright, +1–2 tuần); hiệu chỉnh QC threshold cần nhiều vòng; chất lượng Knowledge Base phụ thuộc chuyên gia miền.</w:t>
       </w:r>
     </w:p>
-    <w:bookmarkEnd w:id="38"/>
     <w:bookmarkEnd w:id="39"/>
-    <w:bookmarkStart w:id="40" w:name="Xb786808859b2baa89401c26f99cf8f9fff113e4"/>
+    <w:bookmarkEnd w:id="40"/>
+    <w:bookmarkStart w:id="41" w:name="Xb786808859b2baa89401c26f99cf8f9fff113e4"/>
     <w:p>
       <w:pPr>
         <w:pStyle w:val="Heading2"/>
@@ -5635,8 +5873,8 @@
         <w:t xml:space="preserve">Runbook + Prompt Templates đã bàn giao cho bộ phận sản xuất nội dung</w:t>
       </w:r>
     </w:p>
-    <w:bookmarkEnd w:id="40"/>
-    <w:bookmarkStart w:id="41" w:name="X7dd794b86571366241fe8bbb3cb0d090fbbb11e"/>
+    <w:bookmarkEnd w:id="41"/>
+    <w:bookmarkStart w:id="42" w:name="X7dd794b86571366241fe8bbb3cb0d090fbbb11e"/>
     <w:p>
       <w:pPr>
         <w:pStyle w:val="Heading2"/>
@@ -6068,8 +6306,8 @@
         <w:t xml:space="preserve">(kèm 4 comment góp ý, đã phân tích ở Mục 2).</w:t>
       </w:r>
     </w:p>
-    <w:bookmarkEnd w:id="41"/>
     <w:bookmarkEnd w:id="42"/>
+    <w:bookmarkEnd w:id="43"/>
     <w:sectPr>
       <w:footnotePr>
         <w:numRestart w:val="eachSect"/>

</xml_diff>

<commit_message>
Update PLAN/TODO: Clip AI API is available; adapter is next step
Removes request-related items; the adapter needs the API documentation
(key stays in environment variables, not in the repo).

Co-Authored-By: Claude Sonnet 5 <noreply@anthropic.com>
</commit_message>
<xml_diff>
--- a/PLAN.docx
+++ b/PLAN.docx
@@ -2746,13 +2746,13 @@
           <w:b/>
           <w:bCs/>
         </w:rPr>
-        <w:t xml:space="preserve">Điểm cần hỏi khi xin API:</w:t>
-      </w:r>
-      <w:r>
-        <w:t xml:space="preserve"> </w:t>
-      </w:r>
-      <w:r>
-        <w:t xml:space="preserve">danh sách model và phiên bản có thể chọn qua API, tham số chọn model, endpoint audio, hạn mức/credit theo model, chính sách kiểm duyệt theo model.</w:t>
+        <w:t xml:space="preserve">Cần xác nhận từ tài liệu API Clip AI (đã có API, 2026-09-19):</w:t>
+      </w:r>
+      <w:r>
+        <w:t xml:space="preserve"> </w:t>
+      </w:r>
+      <w:r>
+        <w:t xml:space="preserve">danh sách model và phiên bản chọn được qua API, tham số chọn model, cách gửi ảnh (upload/base64/URL), endpoint audio, hạn mức/credit theo model, thời hạn link kết quả, chính sách kiểm duyệt theo model, và có endpoint truy vấn trạng thái (polling) hay chỉ webhook.</w:t>
       </w:r>
     </w:p>
     <w:bookmarkEnd w:id="19"/>
@@ -4294,35 +4294,38 @@
           <w:b/>
           <w:bCs/>
         </w:rPr>
-        <w:t xml:space="preserve">Clip AI/Kling:</w:t>
-      </w:r>
-      <w:r>
-        <w:t xml:space="preserve"> </w:t>
-      </w:r>
-      <w:r>
-        <w:rPr>
-          <w:b/>
-          <w:bCs/>
-        </w:rPr>
-        <w:t xml:space="preserve">chờ kiểm tra</w:t>
-      </w:r>
-      <w:r>
-        <w:t xml:space="preserve"> </w:t>
-      </w:r>
-      <w:r>
-        <w:t xml:space="preserve">(chưa xác nhận có REST/Webhook) — nếu chỉ có Web thì dùng Playwright (+1–2 tuần cho</w:t>
-      </w:r>
-      <w:r>
-        <w:t xml:space="preserve"> </w:t>
-      </w:r>
-      <w:r>
-        <w:rPr>
-          <w:rStyle w:val="VerbatimChar"/>
-        </w:rPr>
-        <w:t xml:space="preserve">mcp-server-clipai</w:t>
-      </w:r>
-      <w:r>
-        <w:t xml:space="preserve">). Việc cần làm: kiểm tra Clip AI, đồng thời nắm response schema lỗi risk-control.</w:t>
+        <w:t xml:space="preserve">Clip AI:</w:t>
+      </w:r>
+      <w:r>
+        <w:t xml:space="preserve"> </w:t>
+      </w:r>
+      <w:r>
+        <w:rPr>
+          <w:b/>
+          <w:bCs/>
+        </w:rPr>
+        <w:t xml:space="preserve">đã có API (2026-09-19)</w:t>
+      </w:r>
+      <w:r>
+        <w:t xml:space="preserve"> </w:t>
+      </w:r>
+      <w:r>
+        <w:t xml:space="preserve">— bước tiếp theo là đọc tài liệu API để viết adapter</w:t>
+      </w:r>
+      <w:r>
+        <w:t xml:space="preserve"> </w:t>
+      </w:r>
+      <w:r>
+        <w:rPr>
+          <w:rStyle w:val="VerbatimChar"/>
+        </w:rPr>
+        <w:t xml:space="preserve">VideoProvider</w:t>
+      </w:r>
+      <w:r>
+        <w:t xml:space="preserve"> </w:t>
+      </w:r>
+      <w:r>
+        <w:t xml:space="preserve">(và audio nếu có), nắm response schema lỗi risk-control. Nếu chỉ có webhook mà không có endpoint truy vấn trạng thái thì cần thêm điểm nhận callback.</w:t>
       </w:r>
     </w:p>
     <w:p>
@@ -4509,7 +4512,7 @@
         <w:t xml:space="preserve"> </w:t>
       </w:r>
       <w:r>
-        <w:t xml:space="preserve">- [ ] API endpoint + API Key/Authentication của</w:t>
+        <w:t xml:space="preserve">- [x] API endpoint + API Key/Authentication của</w:t>
       </w:r>
       <w:r>
         <w:t xml:space="preserve"> </w:t>
@@ -4525,29 +4528,42 @@
         <w:t xml:space="preserve"> </w:t>
       </w:r>
       <w:r>
-        <w:t xml:space="preserve">(REST)</w:t>
-      </w:r>
-      <w:r>
-        <w:t xml:space="preserve"> </w:t>
-      </w:r>
-      <w:r>
-        <w:t xml:space="preserve">- [ ] API endpoint + API Key/Authentication của</w:t>
-      </w:r>
-      <w:r>
-        <w:t xml:space="preserve"> </w:t>
-      </w:r>
-      <w:r>
-        <w:rPr>
-          <w:b/>
-          <w:bCs/>
-        </w:rPr>
-        <w:t xml:space="preserve">Clip AI / Kling AI</w:t>
-      </w:r>
-      <w:r>
-        <w:t xml:space="preserve"> </w:t>
-      </w:r>
-      <w:r>
-        <w:t xml:space="preserve">(REST + Webhook nếu có)</w:t>
+        <w:t xml:space="preserve">(REST): có API; cần tài liệu chi tiết để viết adapter</w:t>
+      </w:r>
+      <w:r>
+        <w:t xml:space="preserve"> </w:t>
+      </w:r>
+      <w:r>
+        <w:t xml:space="preserve">- [x] API của</w:t>
+      </w:r>
+      <w:r>
+        <w:t xml:space="preserve"> </w:t>
+      </w:r>
+      <w:r>
+        <w:rPr>
+          <w:b/>
+          <w:bCs/>
+        </w:rPr>
+        <w:t xml:space="preserve">Clip AI</w:t>
+      </w:r>
+      <w:r>
+        <w:t xml:space="preserve"> </w:t>
+      </w:r>
+      <w:r>
+        <w:t xml:space="preserve">(đa model):</w:t>
+      </w:r>
+      <w:r>
+        <w:t xml:space="preserve"> </w:t>
+      </w:r>
+      <w:r>
+        <w:rPr>
+          <w:b/>
+          <w:bCs/>
+        </w:rPr>
+        <w:t xml:space="preserve">đã có</w:t>
+      </w:r>
+      <w:r>
+        <w:t xml:space="preserve">; còn thiếu tài liệu endpoint/auth để viết adapter (key đặt trong biến môi trường, không đưa vào repo)</w:t>
       </w:r>
       <w:r>
         <w:t xml:space="preserve"> </w:t>
@@ -4947,7 +4963,7 @@
         <w:t xml:space="preserve"> </w:t>
       </w:r>
       <w:r>
-        <w:t xml:space="preserve">- Lấy API docs + key Deepix và Clip AI/Kling; xác nhận có REST/Webhook hay chỉ Web (nếu chỉ Web → Playwright, +1–2 tuần).</w:t>
+        <w:t xml:space="preserve">- Đã có API Deepix và Clip AI; đọc tài liệu API để viết adapter (nếu chỉ có Web thì Playwright, +1–2 tuần).</w:t>
       </w:r>
       <w:r>
         <w:t xml:space="preserve"> </w:t>

</xml_diff>

<commit_message>
Add real Deepix and Clip AI adapters from the vendor skills
- core/adapters: stdlib HTTP client (envelope rules, token never logged or
  sent to download hosts), Deepix Seedream text-to-image, Clip AI Kling Omni
  and Seedance image-to-video, env-based factory, read-only connectivity check
- runner tolerates network errors, logs risk-control failures (no retry)
- docs/api_notes.md summarizes the API contracts; vendor skill folder is
  git-ignored. MiniMax is not in the Clip AI API contract; audio endpoints are.
92 tests pass (fake transport, no live calls).

Co-Authored-By: Claude Sonnet 5 <noreply@anthropic.com>
</commit_message>
<xml_diff>
--- a/PLAN.docx
+++ b/PLAN.docx
@@ -2634,7 +2634,92 @@
         <w:t xml:space="preserve"> </w:t>
       </w:r>
       <w:r>
-        <w:t xml:space="preserve">theo dự án (seedance / kling / minimax), truyền vào provider. Bộ lọc kiểm duyệt (risk control) và cú pháp prompt khác nhau theo model → blocklist IP và</w:t>
+        <w:t xml:space="preserve">theo dự án (</w:t>
+      </w:r>
+      <w:r>
+        <w:rPr>
+          <w:rStyle w:val="VerbatimChar"/>
+        </w:rPr>
+        <w:t xml:space="preserve">kling</w:t>
+      </w:r>
+      <w:r>
+        <w:t xml:space="preserve">,</w:t>
+      </w:r>
+      <w:r>
+        <w:t xml:space="preserve"> </w:t>
+      </w:r>
+      <w:r>
+        <w:rPr>
+          <w:rStyle w:val="VerbatimChar"/>
+        </w:rPr>
+        <w:t xml:space="preserve">kling-o1</w:t>
+      </w:r>
+      <w:r>
+        <w:t xml:space="preserve">,</w:t>
+      </w:r>
+      <w:r>
+        <w:t xml:space="preserve"> </w:t>
+      </w:r>
+      <w:r>
+        <w:rPr>
+          <w:rStyle w:val="VerbatimChar"/>
+        </w:rPr>
+        <w:t xml:space="preserve">seedance</w:t>
+      </w:r>
+      <w:r>
+        <w:t xml:space="preserve">,</w:t>
+      </w:r>
+      <w:r>
+        <w:t xml:space="preserve"> </w:t>
+      </w:r>
+      <w:r>
+        <w:rPr>
+          <w:rStyle w:val="VerbatimChar"/>
+        </w:rPr>
+        <w:t xml:space="preserve">seedance-fast</w:t>
+      </w:r>
+      <w:r>
+        <w:t xml:space="preserve">,</w:t>
+      </w:r>
+      <w:r>
+        <w:t xml:space="preserve"> </w:t>
+      </w:r>
+      <w:r>
+        <w:rPr>
+          <w:rStyle w:val="VerbatimChar"/>
+        </w:rPr>
+        <w:t xml:space="preserve">seedance-2.5</w:t>
+      </w:r>
+      <w:r>
+        <w:t xml:space="preserve">), truyền vào provider.</w:t>
+      </w:r>
+      <w:r>
+        <w:t xml:space="preserve"> </w:t>
+      </w:r>
+      <w:r>
+        <w:rPr>
+          <w:b/>
+          <w:bCs/>
+        </w:rPr>
+        <w:t xml:space="preserve">Hợp đồng API thực tế chỉ có Kling Omni và Seedance; MiniMax không có trong API</w:t>
+      </w:r>
+      <w:r>
+        <w:t xml:space="preserve"> </w:t>
+      </w:r>
+      <w:r>
+        <w:t xml:space="preserve">(xem</w:t>
+      </w:r>
+      <w:r>
+        <w:t xml:space="preserve"> </w:t>
+      </w:r>
+      <w:r>
+        <w:rPr>
+          <w:rStyle w:val="VerbatimChar"/>
+        </w:rPr>
+        <w:t xml:space="preserve">docs/api_notes.md</w:t>
+      </w:r>
+      <w:r>
+        <w:t xml:space="preserve">). Bộ lọc kiểm duyệt (risk control) và cú pháp prompt khác nhau theo model → blocklist IP và</w:t>
       </w:r>
       <w:r>
         <w:t xml:space="preserve"> </w:t>
@@ -2680,13 +2765,50 @@
           <w:b/>
           <w:bCs/>
         </w:rPr>
-        <w:t xml:space="preserve">Âm thanh:</w:t>
-      </w:r>
-      <w:r>
-        <w:t xml:space="preserve"> </w:t>
-      </w:r>
-      <w:r>
-        <w:t xml:space="preserve">Bước 5a (nhạc) có thể dùng chính Clip AI (Seed Audio/ElevenLabs), giảm một nhà cung cấp. Cần xác nhận API có endpoint audio và điều khoản thương mại.</w:t>
+        <w:t xml:space="preserve">Âm thanh (đã xác nhận có endpoint):</w:t>
+      </w:r>
+      <w:r>
+        <w:t xml:space="preserve"> </w:t>
+      </w:r>
+      <w:r>
+        <w:t xml:space="preserve">API có tạo TTS, sound effect và</w:t>
+      </w:r>
+      <w:r>
+        <w:t xml:space="preserve"> </w:t>
+      </w:r>
+      <w:r>
+        <w:rPr>
+          <w:b/>
+          <w:bCs/>
+        </w:rPr>
+        <w:t xml:space="preserve">nhạc</w:t>
+      </w:r>
+      <w:r>
+        <w:t xml:space="preserve"> </w:t>
+      </w:r>
+      <w:r>
+        <w:t xml:space="preserve">(</w:t>
+      </w:r>
+      <w:r>
+        <w:rPr>
+          <w:rStyle w:val="VerbatimChar"/>
+        </w:rPr>
+        <w:t xml:space="preserve">music_v2</w:t>
+      </w:r>
+      <w:r>
+        <w:t xml:space="preserve">, dài 3–600 giây, có tùy chọn instrumental) qua</w:t>
+      </w:r>
+      <w:r>
+        <w:t xml:space="preserve"> </w:t>
+      </w:r>
+      <w:r>
+        <w:rPr>
+          <w:rStyle w:val="VerbatimChar"/>
+        </w:rPr>
+        <w:t xml:space="preserve">/api/sound/generate</w:t>
+      </w:r>
+      <w:r>
+        <w:t xml:space="preserve">, bất đồng bộ; Bước 5a dùng chính Clip AI, giảm một nhà cung cấp. Còn cần xác nhận điều khoản thương mại và viết adapter audio.</w:t>
       </w:r>
       <w:r>
         <w:t xml:space="preserve"> </w:t>
@@ -2746,13 +2868,78 @@
           <w:b/>
           <w:bCs/>
         </w:rPr>
-        <w:t xml:space="preserve">Cần xác nhận từ tài liệu API Clip AI (đã có API, 2026-09-19):</w:t>
-      </w:r>
-      <w:r>
-        <w:t xml:space="preserve"> </w:t>
-      </w:r>
-      <w:r>
-        <w:t xml:space="preserve">danh sách model và phiên bản chọn được qua API, tham số chọn model, cách gửi ảnh (upload/base64/URL), endpoint audio, hạn mức/credit theo model, thời hạn link kết quả, chính sách kiểm duyệt theo model, và có endpoint truy vấn trạng thái (polling) hay chỉ webhook.</w:t>
+        <w:t xml:space="preserve">Đã có trong tài liệu API (2026-09-19, xem</w:t>
+      </w:r>
+      <w:r>
+        <w:rPr>
+          <w:b/>
+          <w:bCs/>
+        </w:rPr>
+        <w:t xml:space="preserve"> </w:t>
+      </w:r>
+      <w:r>
+        <w:rPr>
+          <w:rStyle w:val="VerbatimChar"/>
+          <w:b/>
+          <w:bCs/>
+        </w:rPr>
+        <w:t xml:space="preserve">docs/api_notes.md</w:t>
+      </w:r>
+      <w:r>
+        <w:rPr>
+          <w:b/>
+          <w:bCs/>
+        </w:rPr>
+        <w:t xml:space="preserve">):</w:t>
+      </w:r>
+      <w:r>
+        <w:t xml:space="preserve"> </w:t>
+      </w:r>
+      <w:r>
+        <w:t xml:space="preserve">model chọn được, cách gửi ảnh (multipart cùng lệnh tạo), quét</w:t>
+      </w:r>
+      <w:r>
+        <w:t xml:space="preserve"> </w:t>
+      </w:r>
+      <w:r>
+        <w:rPr>
+          <w:rStyle w:val="VerbatimChar"/>
+        </w:rPr>
+        <w:t xml:space="preserve">video-list</w:t>
+      </w:r>
+      <w:r>
+        <w:t xml:space="preserve"> </w:t>
+      </w:r>
+      <w:r>
+        <w:t xml:space="preserve">để poll (không có endpoint 1 tác vụ), thời lượng/độ phân giải theo model, endpoint audio.</w:t>
+      </w:r>
+      <w:r>
+        <w:t xml:space="preserve"> </w:t>
+      </w:r>
+      <w:r>
+        <w:rPr>
+          <w:b/>
+          <w:bCs/>
+        </w:rPr>
+        <w:t xml:space="preserve">Còn cần xác nhận khi chạy thật:</w:t>
+      </w:r>
+      <w:r>
+        <w:t xml:space="preserve"> </w:t>
+      </w:r>
+      <w:r>
+        <w:t xml:space="preserve">hạn mức/credit theo model, thời hạn link</w:t>
+      </w:r>
+      <w:r>
+        <w:t xml:space="preserve"> </w:t>
+      </w:r>
+      <w:r>
+        <w:rPr>
+          <w:rStyle w:val="VerbatimChar"/>
+        </w:rPr>
+        <w:t xml:space="preserve">video_url</w:t>
+      </w:r>
+      <w:r>
+        <w:t xml:space="preserve">, cách API xử lý negative prompt (hiện không có trường riêng), và thông điệp lỗi risk control thực tế của từng model.</w:t>
       </w:r>
     </w:p>
     <w:bookmarkEnd w:id="19"/>
@@ -5902,6 +6089,51 @@
     <w:p>
       <w:pPr>
         <w:pStyle w:val="FirstParagraph"/>
+      </w:pPr>
+      <w:r>
+        <w:rPr>
+          <w:b/>
+          <w:bCs/>
+        </w:rPr>
+        <w:t xml:space="preserve">Adapter thật đã viết (</w:t>
+      </w:r>
+      <w:r>
+        <w:rPr>
+          <w:rStyle w:val="VerbatimChar"/>
+          <w:b/>
+          <w:bCs/>
+        </w:rPr>
+        <w:t xml:space="preserve">core/adapters/</w:t>
+      </w:r>
+      <w:r>
+        <w:rPr>
+          <w:b/>
+          <w:bCs/>
+        </w:rPr>
+        <w:t xml:space="preserve">):</w:t>
+      </w:r>
+      <w:r>
+        <w:t xml:space="preserve"> </w:t>
+      </w:r>
+      <w:r>
+        <w:t xml:space="preserve">Deepix (gen ảnh Seedream 5.0 Pro) và Clip AI (video Kling Omni + Seedance) theo hợp đồng API của skill chính thức; kiểm thử bằng giao thức giả (chưa gọi API thật vì token phải do bạn đặt trong biến môi trường). Kiểm tra kết nối chỉ đọc:</w:t>
+      </w:r>
+      <w:r>
+        <w:t xml:space="preserve"> </w:t>
+      </w:r>
+      <w:r>
+        <w:rPr>
+          <w:rStyle w:val="VerbatimChar"/>
+        </w:rPr>
+        <w:t xml:space="preserve">py -m core.adapters.check</w:t>
+      </w:r>
+      <w:r>
+        <w:t xml:space="preserve">.</w:t>
+      </w:r>
+    </w:p>
+    <w:p>
+      <w:pPr>
+        <w:pStyle w:val="BodyText"/>
       </w:pPr>
       <w:r>
         <w:rPr>

</xml_diff>

<commit_message>
Add cost estimation and usage ledger to the dashboard
Owner-declared price table (data/pricing.json, no invented prices), pre-run
estimates with min/max retry range, per-submission usage ledger, spend line,
and a confirmation gate for large real-provider batches. 108 tests pass.

Co-Authored-By: Claude Sonnet 5 <noreply@anthropic.com>
</commit_message>
<xml_diff>
--- a/PLAN.docx
+++ b/PLAN.docx
@@ -6128,7 +6128,46 @@
         <w:t xml:space="preserve">py -m core.adapters.check</w:t>
       </w:r>
       <w:r>
-        <w:t xml:space="preserve">.</w:t>
+        <w:t xml:space="preserve">. Chạy thử thật:</w:t>
+      </w:r>
+      <w:r>
+        <w:t xml:space="preserve"> </w:t>
+      </w:r>
+      <w:r>
+        <w:rPr>
+          <w:rStyle w:val="VerbatimChar"/>
+        </w:rPr>
+        <w:t xml:space="preserve">py -m core.adapters.trial --yes</w:t>
+      </w:r>
+      <w:r>
+        <w:t xml:space="preserve">. Chi phí: ước tính trước khi chạy + sổ mức dùng trong Dashboard theo bảng giá</w:t>
+      </w:r>
+      <w:r>
+        <w:t xml:space="preserve"> </w:t>
+      </w:r>
+      <w:r>
+        <w:rPr>
+          <w:rStyle w:val="VerbatimChar"/>
+        </w:rPr>
+        <w:t xml:space="preserve">data/pricing.json</w:t>
+      </w:r>
+      <w:r>
+        <w:t xml:space="preserve"> </w:t>
+      </w:r>
+      <w:r>
+        <w:t xml:space="preserve">(xem</w:t>
+      </w:r>
+      <w:r>
+        <w:t xml:space="preserve"> </w:t>
+      </w:r>
+      <w:r>
+        <w:rPr>
+          <w:rStyle w:val="VerbatimChar"/>
+        </w:rPr>
+        <w:t xml:space="preserve">docs/api_notes.md</w:t>
+      </w:r>
+      <w:r>
+        <w:t xml:space="preserve">).</w:t>
       </w:r>
     </w:p>
     <w:p>

</xml_diff>

<commit_message>
Add Clip AI audio adapter and music drafts in Dashboard step 5a; shelve MCP Claude
Co-Authored-By: Claude Sonnet 5 <noreply@anthropic.com>
</commit_message>
<xml_diff>
--- a/PLAN.docx
+++ b/PLAN.docx
@@ -6450,6 +6450,90 @@
       </w:r>
       <w:r>
         <w:t xml:space="preserve">.</w:t>
+      </w:r>
+    </w:p>
+    <w:p>
+      <w:pPr>
+        <w:pStyle w:val="BodyText"/>
+      </w:pPr>
+      <w:r>
+        <w:rPr>
+          <w:b/>
+          <w:bCs/>
+        </w:rPr>
+        <w:t xml:space="preserve">Audio (Bước 5a):</w:t>
+      </w:r>
+      <w:r>
+        <w:t xml:space="preserve"> </w:t>
+      </w:r>
+      <w:r>
+        <w:t xml:space="preserve">adapter Clip AI audio (</w:t>
+      </w:r>
+      <w:r>
+        <w:rPr>
+          <w:rStyle w:val="VerbatimChar"/>
+        </w:rPr>
+        <w:t xml:space="preserve">core/adapters/clipai_audio.py</w:t>
+      </w:r>
+      <w:r>
+        <w:t xml:space="preserve">: nhạc</w:t>
+      </w:r>
+      <w:r>
+        <w:t xml:space="preserve"> </w:t>
+      </w:r>
+      <w:r>
+        <w:rPr>
+          <w:rStyle w:val="VerbatimChar"/>
+        </w:rPr>
+        <w:t xml:space="preserve">music_v2</w:t>
+      </w:r>
+      <w:r>
+        <w:t xml:space="preserve">, SFX, TTS) +</w:t>
+      </w:r>
+      <w:r>
+        <w:t xml:space="preserve"> </w:t>
+      </w:r>
+      <w:r>
+        <w:rPr>
+          <w:rStyle w:val="VerbatimChar"/>
+        </w:rPr>
+        <w:t xml:space="preserve">core/music.py</w:t>
+      </w:r>
+      <w:r>
+        <w:t xml:space="preserve">; Dashboard Bước 5a tạo nhiều bản nháp từ Music Brief, nghe thử, chọn để mix.</w:t>
+      </w:r>
+      <w:r>
+        <w:t xml:space="preserve"> </w:t>
+      </w:r>
+      <w:r>
+        <w:rPr>
+          <w:rStyle w:val="VerbatimChar"/>
+        </w:rPr>
+        <w:t xml:space="preserve">music_provider</w:t>
+      </w:r>
+      <w:r>
+        <w:t xml:space="preserve"> </w:t>
+      </w:r>
+      <w:r>
+        <w:t xml:space="preserve">= Clip AI (đã chốt). Chưa xác nhận bằng API thật.</w:t>
+      </w:r>
+    </w:p>
+    <w:p>
+      <w:pPr>
+        <w:pStyle w:val="BodyText"/>
+      </w:pPr>
+      <w:r>
+        <w:rPr>
+          <w:b/>
+          <w:bCs/>
+        </w:rPr>
+        <w:t xml:space="preserve">Tạm gác (2026-09-19):</w:t>
+      </w:r>
+      <w:r>
+        <w:t xml:space="preserve"> </w:t>
+      </w:r>
+      <w:r>
+        <w:t xml:space="preserve">MCP Claude/V0 qua Claude Desktop; ưu tiên hoàn thiện Dashboard.</w:t>
       </w:r>
     </w:p>
     <w:p>

</xml_diff>

<commit_message>
Dashboard step 5b: auto-load clips, real durations, crossfade/volume controls, download; fix music shorter than video
Co-Authored-By: Claude Sonnet 5 <noreply@anthropic.com>
</commit_message>
<xml_diff>
--- a/PLAN.docx
+++ b/PLAN.docx
@@ -6516,6 +6516,33 @@
       </w:r>
       <w:r>
         <w:t xml:space="preserve">= Clip AI (đã chốt). Chưa xác nhận bằng API thật.</w:t>
+      </w:r>
+    </w:p>
+    <w:p>
+      <w:pPr>
+        <w:pStyle w:val="BodyText"/>
+      </w:pPr>
+      <w:r>
+        <w:rPr>
+          <w:b/>
+          <w:bCs/>
+        </w:rPr>
+        <w:t xml:space="preserve">Bước 5b (Ghép &amp; Render):</w:t>
+      </w:r>
+      <w:r>
+        <w:t xml:space="preserve"> </w:t>
+      </w:r>
+      <w:r>
+        <w:rPr>
+          <w:rStyle w:val="VerbatimChar"/>
+        </w:rPr>
+        <w:t xml:space="preserve">core/final_cut.py</w:t>
+      </w:r>
+      <w:r>
+        <w:t xml:space="preserve"> </w:t>
+      </w:r>
+      <w:r>
+        <w:t xml:space="preserve">— tự nạp clip theo thứ tự cảnh từ Bước 4, đọc độ dài thật bằng ffmpeg, cảnh báo cảnh thiếu, chọn clip/transition/âm lượng nhạc, kiểm tra trước khi render, xem và tải bản cuối. Đã render thử thật với ffmpeg.</w:t>
       </w:r>
     </w:p>
     <w:p>

</xml_diff>

<commit_message>
Dashboard UI follows mockup: theme, stepper checkmarks, image grid + QC detail panel, badges, progress; add demo seed tools
Co-Authored-By: Claude Sonnet 5 <noreply@anthropic.com>
</commit_message>
<xml_diff>
--- a/PLAN.docx
+++ b/PLAN.docx
@@ -6543,6 +6543,66 @@
       </w:r>
       <w:r>
         <w:t xml:space="preserve">— tự nạp clip theo thứ tự cảnh từ Bước 4, đọc độ dài thật bằng ffmpeg, cảnh báo cảnh thiếu, chọn clip/transition/âm lượng nhạc, kiểm tra trước khi render, xem và tải bản cuối. Đã render thử thật với ffmpeg.</w:t>
+      </w:r>
+    </w:p>
+    <w:p>
+      <w:pPr>
+        <w:pStyle w:val="BodyText"/>
+      </w:pPr>
+      <w:r>
+        <w:rPr>
+          <w:b/>
+          <w:bCs/>
+        </w:rPr>
+        <w:t xml:space="preserve">Giao diện Dashboard:</w:t>
+      </w:r>
+      <w:r>
+        <w:t xml:space="preserve"> </w:t>
+      </w:r>
+      <w:r>
+        <w:t xml:space="preserve">đã chỉnh theo</w:t>
+      </w:r>
+      <w:r>
+        <w:t xml:space="preserve"> </w:t>
+      </w:r>
+      <w:r>
+        <w:rPr>
+          <w:rStyle w:val="VerbatimChar"/>
+        </w:rPr>
+        <w:t xml:space="preserve">mockup/dashboard.html</w:t>
+      </w:r>
+      <w:r>
+        <w:t xml:space="preserve"> </w:t>
+      </w:r>
+      <w:r>
+        <w:t xml:space="preserve">(theme, stepper có ✓, lưới thẻ ảnh + panel QC, badge trạng thái, thanh tiến độ). Xem thử không tốn credit:</w:t>
+      </w:r>
+      <w:r>
+        <w:t xml:space="preserve"> </w:t>
+      </w:r>
+      <w:r>
+        <w:rPr>
+          <w:rStyle w:val="VerbatimChar"/>
+        </w:rPr>
+        <w:t xml:space="preserve">py tools/seed_demo.py</w:t>
+      </w:r>
+      <w:r>
+        <w:t xml:space="preserve"> </w:t>
+      </w:r>
+      <w:r>
+        <w:t xml:space="preserve">rồi</w:t>
+      </w:r>
+      <w:r>
+        <w:t xml:space="preserve"> </w:t>
+      </w:r>
+      <w:r>
+        <w:rPr>
+          <w:rStyle w:val="VerbatimChar"/>
+        </w:rPr>
+        <w:t xml:space="preserve">powershell -File tools/run_demo.ps1</w:t>
+      </w:r>
+      <w:r>
+        <w:t xml:space="preserve">.</w:t>
       </w:r>
     </w:p>
     <w:p>

</xml_diff>

<commit_message>
Seedance prompting guide wired into motion bundle; QC review zone; dip-to-black transition
Co-Authored-By: Claude Sonnet 5 <noreply@anthropic.com>
</commit_message>
<xml_diff>
--- a/PLAN.docx
+++ b/PLAN.docx
@@ -6603,6 +6603,42 @@
       </w:r>
       <w:r>
         <w:t xml:space="preserve">.</w:t>
+      </w:r>
+    </w:p>
+    <w:p>
+      <w:pPr>
+        <w:pStyle w:val="BodyText"/>
+      </w:pPr>
+      <w:r>
+        <w:rPr>
+          <w:b/>
+          <w:bCs/>
+        </w:rPr>
+        <w:t xml:space="preserve">Cập nhật 2026-09-20:</w:t>
+      </w:r>
+      <w:r>
+        <w:t xml:space="preserve"> </w:t>
+      </w:r>
+      <w:r>
+        <w:rPr>
+          <w:rStyle w:val="VerbatimChar"/>
+        </w:rPr>
+        <w:t xml:space="preserve">knowledge/seedance_prompting.md</w:t>
+      </w:r>
+      <w:r>
+        <w:t xml:space="preserve"> </w:t>
+      </w:r>
+      <w:r>
+        <w:t xml:space="preserve">(nối tự động vào motion prompt khi model là Seedance); vùng chờ review của QC ở auto mode (</w:t>
+      </w:r>
+      <w:r>
+        <w:rPr>
+          <w:rStyle w:val="VerbatimChar"/>
+        </w:rPr>
+        <w:t xml:space="preserve">qc_review_floor</w:t>
+      </w:r>
+      <w:r>
+        <w:t xml:space="preserve">); transition Dip to black.</w:t>
       </w:r>
     </w:p>
     <w:p>

</xml_diff>

<commit_message>
Add operations runbook; refresh TODO/PLAN status and hand-off; all self-serve items done
Co-Authored-By: Claude Sonnet 5 <noreply@anthropic.com>
</commit_message>
<xml_diff>
--- a/PLAN.docx
+++ b/PLAN.docx
@@ -6077,13 +6077,13 @@
       </w:r>
     </w:p>
     <w:bookmarkEnd w:id="41"/>
-    <w:bookmarkStart w:id="42" w:name="X7dd794b86571366241fe8bbb3cb0d090fbbb11e"/>
+    <w:bookmarkStart w:id="42" w:name="Xa8c20bcadf63636d70cdbd31f3500ce09019d73"/>
     <w:p>
       <w:pPr>
         <w:pStyle w:val="Heading2"/>
       </w:pPr>
       <w:r>
-        <w:t xml:space="preserve">9. Trạng thái triển khai (cập nhật 2026-09-19)</w:t>
+        <w:t xml:space="preserve">9. Trạng thái triển khai (cập nhật 2026-09-20)</w:t>
       </w:r>
     </w:p>
     <w:p>
@@ -6179,7 +6179,7 @@
           <w:b/>
           <w:bCs/>
         </w:rPr>
-        <w:t xml:space="preserve">Đã build (69 unit test pass, không cần API ngoài):</w:t>
+        <w:t xml:space="preserve">Đã build (168 unit test pass, không cần API ngoài):</w:t>
       </w:r>
       <w:r>
         <w:t xml:space="preserve"> </w:t>
@@ -6341,7 +6341,55 @@
         <w:t xml:space="preserve"> </w:t>
       </w:r>
       <w:r>
-        <w:t xml:space="preserve">— Dashboard Streamlit skeleton: stepper 7 tab theo thứ tự bước, control bar toàn cục, nút điều khiển từng khâu, lịch sử; các bước cần Claude tạm dán JSON tay.</w:t>
+        <w:t xml:space="preserve">+</w:t>
+      </w:r>
+      <w:r>
+        <w:t xml:space="preserve"> </w:t>
+      </w:r>
+      <w:r>
+        <w:rPr>
+          <w:rStyle w:val="VerbatimChar"/>
+        </w:rPr>
+        <w:t xml:space="preserve">dashboard/ui.py</w:t>
+      </w:r>
+      <w:r>
+        <w:t xml:space="preserve"> </w:t>
+      </w:r>
+      <w:r>
+        <w:t xml:space="preserve">— Dashboard Streamlit theo mockup: stepper 7 tab có dấu ✓, control bar toàn cục, nút điều khiển từng khâu, lịch sử; các bước cần Claude chạy bằng API (</w:t>
+      </w:r>
+      <w:r>
+        <w:rPr>
+          <w:rStyle w:val="VerbatimChar"/>
+        </w:rPr>
+        <w:t xml:space="preserve">core/llm_runner.py</w:t>
+      </w:r>
+      <w:r>
+        <w:t xml:space="preserve">) hoặc dán JSON tay khi chưa có key. Mở như phần mềm bằng</w:t>
+      </w:r>
+      <w:r>
+        <w:t xml:space="preserve"> </w:t>
+      </w:r>
+      <w:r>
+        <w:rPr>
+          <w:rStyle w:val="VerbatimChar"/>
+        </w:rPr>
+        <w:t xml:space="preserve">Start-Dashboard.bat</w:t>
+      </w:r>
+      <w:r>
+        <w:t xml:space="preserve">/shortcut Desktop; vận hành xem</w:t>
+      </w:r>
+      <w:r>
+        <w:t xml:space="preserve"> </w:t>
+      </w:r>
+      <w:r>
+        <w:rPr>
+          <w:rStyle w:val="VerbatimChar"/>
+        </w:rPr>
+        <w:t xml:space="preserve">docs/RUNBOOK.md</w:t>
+      </w:r>
+      <w:r>
+        <w:t xml:space="preserve">.</w:t>
       </w:r>
       <w:r>
         <w:t xml:space="preserve"> </w:t>
@@ -6668,88 +6716,79 @@
           <w:b/>
           <w:bCs/>
         </w:rPr>
-        <w:t xml:space="preserve">Đang chờ điều kiện bên ngoài:</w:t>
-      </w:r>
-      <w:r>
-        <w:t xml:space="preserve"> </w:t>
-      </w:r>
-      <w:r>
-        <w:t xml:space="preserve">- Adapter thật cho Deepix (Bước 2) và Clip AI/Kling (Bước 4) — tạm gác theo yêu cầu. Bộ chạy Bước 2 và Bước 4 (</w:t>
-      </w:r>
-      <w:r>
-        <w:rPr>
-          <w:rStyle w:val="VerbatimChar"/>
-        </w:rPr>
-        <w:t xml:space="preserve">core/runner.py</w:t>
-      </w:r>
-      <w:r>
-        <w:t xml:space="preserve">: submit, heartbeat polling, tải kết quả, log risk control, retry, concurrency, pause/cancel) đã xong và kiểm thử với provider giả lập; chỉ còn viết adapter theo interface</w:t>
-      </w:r>
-      <w:r>
-        <w:t xml:space="preserve"> </w:t>
-      </w:r>
-      <w:r>
-        <w:rPr>
-          <w:rStyle w:val="VerbatimChar"/>
-        </w:rPr>
-        <w:t xml:space="preserve">VideoProvider</w:t>
-      </w:r>
-      <w:r>
-        <w:t xml:space="preserve">/</w:t>
-      </w:r>
-      <w:r>
-        <w:rPr>
-          <w:rStyle w:val="VerbatimChar"/>
-        </w:rPr>
-        <w:t xml:space="preserve">ImageProvider</w:t>
-      </w:r>
-      <w:r>
-        <w:t xml:space="preserve"> </w:t>
-      </w:r>
-      <w:r>
-        <w:t xml:space="preserve">khi có API.</w:t>
-      </w:r>
-      <w:r>
-        <w:t xml:space="preserve"> </w:t>
-      </w:r>
-      <w:r>
-        <w:t xml:space="preserve">- Cài FFmpeg trên máy để render thật.</w:t>
-      </w:r>
-      <w:r>
-        <w:t xml:space="preserve"> </w:t>
-      </w:r>
-      <w:r>
-        <w:t xml:space="preserve">- API key Anthropic (V1) để thay</w:t>
-      </w:r>
-      <w:r>
-        <w:t xml:space="preserve"> </w:t>
-      </w:r>
-      <w:r>
-        <w:t xml:space="preserve">“dán JSON tay”</w:t>
-      </w:r>
-      <w:r>
-        <w:t xml:space="preserve"> </w:t>
-      </w:r>
-      <w:r>
-        <w:t xml:space="preserve">bằng LLM runner tự động.</w:t>
-      </w:r>
-      <w:r>
-        <w:t xml:space="preserve"> </w:t>
-      </w:r>
-      <w:r>
-        <w:t xml:space="preserve">-</w:t>
-      </w:r>
-      <w:r>
-        <w:t xml:space="preserve"> </w:t>
-      </w:r>
-      <w:r>
-        <w:rPr>
-          <w:rStyle w:val="VerbatimChar"/>
-        </w:rPr>
-        <w:t xml:space="preserve">music_provider</w:t>
-      </w:r>
-      <w:r>
-        <w:t xml:space="preserve">; chạy vòng đánh giá thật (người duyệt tạm = chủ dự án, sau này chuyên gia miền) và dry-run V0 để hiệu chỉnh prompt/threshold.</w:t>
+        <w:t xml:space="preserve">Đang chờ điều kiện bên ngoài (đều cần người dùng):</w:t>
+      </w:r>
+      <w:r>
+        <w:t xml:space="preserve"> </w:t>
+      </w:r>
+      <w:r>
+        <w:t xml:space="preserve">- Chạy thật các phần mới viết chỉ bằng giao thức giả: audio Clip AI, LLM runner (cần</w:t>
+      </w:r>
+      <w:r>
+        <w:t xml:space="preserve"> </w:t>
+      </w:r>
+      <w:r>
+        <w:rPr>
+          <w:rStyle w:val="VerbatimChar"/>
+        </w:rPr>
+        <w:t xml:space="preserve">ANTHROPIC_API_KEY</w:t>
+      </w:r>
+      <w:r>
+        <w:t xml:space="preserve">), một cảnh end-to-end qua Dashboard.</w:t>
+      </w:r>
+      <w:r>
+        <w:t xml:space="preserve"> </w:t>
+      </w:r>
+      <w:r>
+        <w:t xml:space="preserve">- Đo giá thật để điền</w:t>
+      </w:r>
+      <w:r>
+        <w:t xml:space="preserve"> </w:t>
+      </w:r>
+      <w:r>
+        <w:rPr>
+          <w:rStyle w:val="VerbatimChar"/>
+        </w:rPr>
+        <w:t xml:space="preserve">data/pricing.json</w:t>
+      </w:r>
+      <w:r>
+        <w:t xml:space="preserve">; chọn</w:t>
+      </w:r>
+      <w:r>
+        <w:t xml:space="preserve"> </w:t>
+      </w:r>
+      <w:r>
+        <w:rPr>
+          <w:rStyle w:val="VerbatimChar"/>
+        </w:rPr>
+        <w:t xml:space="preserve">video_model</w:t>
+      </w:r>
+      <w:r>
+        <w:t xml:space="preserve"> </w:t>
+      </w:r>
+      <w:r>
+        <w:t xml:space="preserve">mặc định sau khi so Kling và Seedance.</w:t>
+      </w:r>
+      <w:r>
+        <w:t xml:space="preserve"> </w:t>
+      </w:r>
+      <w:r>
+        <w:t xml:space="preserve">- Vòng đánh giá</w:t>
+      </w:r>
+      <w:r>
+        <w:t xml:space="preserve"> </w:t>
+      </w:r>
+      <w:r>
+        <w:rPr>
+          <w:rStyle w:val="VerbatimChar"/>
+        </w:rPr>
+        <w:t xml:space="preserve">eval/</w:t>
+      </w:r>
+      <w:r>
+        <w:t xml:space="preserve"> </w:t>
+      </w:r>
+      <w:r>
+        <w:t xml:space="preserve">(người duyệt tạm = chủ dự án) và dry-run 2 mode để hiệu chỉnh prompt/threshold.</w:t>
       </w:r>
     </w:p>
     <w:p>

</xml_diff>

<commit_message>
Price editor in dashboard: per-setup clip prices as shown on Clip AI web; per-clip estimates
Co-Authored-By: Claude Sonnet 5 <noreply@anthropic.com>
</commit_message>
<xml_diff>
--- a/PLAN.docx
+++ b/PLAN.docx
@@ -6687,6 +6687,24 @@
       </w:r>
       <w:r>
         <w:t xml:space="preserve">); transition Dip to black; sửa Character Bible trong Dashboard; sổ mức dùng có âm thanh; SFX + giọng đọc (TTS) trộn vào bản cuối (Bước 5a/5b); LLM runner gọi API Anthropic cho Director/QC/motion (code xong, chờ key thật); waveform nhạc.</w:t>
+      </w:r>
+    </w:p>
+    <w:p>
+      <w:pPr>
+        <w:pStyle w:val="BodyText"/>
+      </w:pPr>
+      <w:r>
+        <w:rPr>
+          <w:b/>
+          <w:bCs/>
+        </w:rPr>
+        <w:t xml:space="preserve">Chi phí &amp; ngân sách (2026-09-20):</w:t>
+      </w:r>
+      <w:r>
+        <w:t xml:space="preserve"> </w:t>
+      </w:r>
+      <w:r>
+        <w:t xml:space="preserve">Dashboard có 💲 Bảng giá để chép giá hiển thị trên web Clip AI (giá theo từng thiết lập model/mức/độ dài); ước tính từng clip theo giá riêng. Claude: gói doanh nghiệp có hạn mức cứng 400$/tháng do phía Anthropic dừng khi chạm.</w:t>
       </w:r>
     </w:p>
     <w:p>

</xml_diff>

<commit_message>
Confirm bulk approvals; auto-reject very low QC scores (both modes); trash for images/videos with 30-day purge
Co-Authored-By: Claude Sonnet 5 <noreply@anthropic.com>
</commit_message>
<xml_diff>
--- a/PLAN.docx
+++ b/PLAN.docx
@@ -6705,6 +6705,24 @@
       </w:r>
       <w:r>
         <w:t xml:space="preserve">Dashboard có 💲 Bảng giá để chép giá hiển thị trên web Clip AI (giá theo từng thiết lập model/mức/độ dài); ước tính từng clip theo giá riêng. Claude: gói doanh nghiệp có hạn mức cứng 400$/tháng cho Chat + Code của tài khoản cá nhân (không phải ngân sách API); LLM runner cần API key riêng, chưa có thì dán JSON tay.</w:t>
+      </w:r>
+    </w:p>
+    <w:p>
+      <w:pPr>
+        <w:pStyle w:val="BodyText"/>
+      </w:pPr>
+      <w:r>
+        <w:rPr>
+          <w:b/>
+          <w:bCs/>
+        </w:rPr>
+        <w:t xml:space="preserve">Duyệt và dọn dẹp (2026-09-20):</w:t>
+      </w:r>
+      <w:r>
+        <w:t xml:space="preserve"> </w:t>
+      </w:r>
+      <w:r>
+        <w:t xml:space="preserve">duyệt hàng loạt phải xác nhận; ảnh điểm thấp (mặc định &lt; 0,50) tự loại + xếp hàng gen mới ở cả hai chế độ; thùng rác tách ảnh/video, tự xóa sau 30 ngày, khôi phục được.</w:t>
       </w:r>
     </w:p>
     <w:p>

</xml_diff>

<commit_message>
Knowledge base settings: overview, preview and upload of documents for Director/QC/Motion prompts
Co-Authored-By: Claude Sonnet 5 <noreply@anthropic.com>
</commit_message>
<xml_diff>
--- a/PLAN.docx
+++ b/PLAN.docx
@@ -6723,6 +6723,36 @@
       </w:r>
       <w:r>
         <w:t xml:space="preserve">duyệt tất cả có hỏi Có/Không; ảnh điểm thấp (mặc định &lt; 0,50) tự loại + xếp hàng gen mới ở cả hai chế độ; thùng rác tách ảnh/video, tự xóa sau 30 ngày, khôi phục được.</w:t>
+      </w:r>
+    </w:p>
+    <w:p>
+      <w:pPr>
+        <w:pStyle w:val="BodyText"/>
+      </w:pPr>
+      <w:r>
+        <w:rPr>
+          <w:b/>
+          <w:bCs/>
+        </w:rPr>
+        <w:t xml:space="preserve">Kho kiến thức (2026-09-20):</w:t>
+      </w:r>
+      <w:r>
+        <w:t xml:space="preserve"> </w:t>
+      </w:r>
+      <w:r>
+        <w:t xml:space="preserve">tab</w:t>
+      </w:r>
+      <w:r>
+        <w:t xml:space="preserve"> </w:t>
+      </w:r>
+      <w:r>
+        <w:t xml:space="preserve">“Kho kiến thức”</w:t>
+      </w:r>
+      <w:r>
+        <w:t xml:space="preserve"> </w:t>
+      </w:r>
+      <w:r>
+        <w:t xml:space="preserve">trong Cài đặt: xem tổng quan và upload thêm tài liệu để nâng cấp Director/QC/Motion; tài liệu bật được nối vào prompt của bước tương ứng.</w:t>
       </w:r>
     </w:p>
     <w:p>

</xml_diff>

<commit_message>
Music as a side branch of render (AI first, library as support and fallback); background folder sync at start
Co-Authored-By: Claude Sonnet 5 <noreply@anthropic.com>
</commit_message>
<xml_diff>
--- a/PLAN.docx
+++ b/PLAN.docx
@@ -3729,6 +3729,125 @@
       </w:r>
       <w:r>
         <w:t xml:space="preserve">bên thứ ba là wrapper không chính thức → rủi ro ToS/ổn định/bản quyền, không đưa vào pipeline. Dùng Suno thủ công: tạo trên web rồi upload vào slot.</w:t>
+      </w:r>
+      <w:r>
+        <w:t xml:space="preserve"> </w:t>
+      </w:r>
+      <w:r>
+        <w:t xml:space="preserve">-</w:t>
+      </w:r>
+      <w:r>
+        <w:t xml:space="preserve"> </w:t>
+      </w:r>
+      <w:r>
+        <w:rPr>
+          <w:b/>
+          <w:bCs/>
+        </w:rPr>
+        <w:t xml:space="preserve">Cập nhật 2026-09-21:</w:t>
+      </w:r>
+      <w:r>
+        <w:t xml:space="preserve"> </w:t>
+      </w:r>
+      <w:r>
+        <w:t xml:space="preserve">nhạc nền là</w:t>
+      </w:r>
+      <w:r>
+        <w:t xml:space="preserve"> </w:t>
+      </w:r>
+      <w:r>
+        <w:rPr>
+          <w:b/>
+          <w:bCs/>
+        </w:rPr>
+        <w:t xml:space="preserve">nhánh phụ của Bước 5 (Ghép &amp; render)</w:t>
+      </w:r>
+      <w:r>
+        <w:t xml:space="preserve">, cùng cấp với phụ đề (không còn là khối riêng phía trên).</w:t>
+      </w:r>
+      <w:r>
+        <w:t xml:space="preserve"> </w:t>
+      </w:r>
+      <w:r>
+        <w:rPr>
+          <w:b/>
+          <w:bCs/>
+        </w:rPr>
+        <w:t xml:space="preserve">Nhạc chính do AI tạo</w:t>
+      </w:r>
+      <w:r>
+        <w:t xml:space="preserve"> </w:t>
+      </w:r>
+      <w:r>
+        <w:t xml:space="preserve">(Clip AI</w:t>
+      </w:r>
+      <w:r>
+        <w:t xml:space="preserve"> </w:t>
+      </w:r>
+      <w:r>
+        <w:rPr>
+          <w:rStyle w:val="VerbatimChar"/>
+        </w:rPr>
+        <w:t xml:space="preserve">music_v2</w:t>
+      </w:r>
+      <w:r>
+        <w:t xml:space="preserve">, nhà cung cấp ElevenLabs bên trong Clip AI, đã có endpoint</w:t>
+      </w:r>
+      <w:r>
+        <w:t xml:space="preserve"> </w:t>
+      </w:r>
+      <w:r>
+        <w:rPr>
+          <w:rStyle w:val="VerbatimChar"/>
+        </w:rPr>
+        <w:t xml:space="preserve">/api/sound/generate</w:t>
+      </w:r>
+      <w:r>
+        <w:t xml:space="preserve"> </w:t>
+      </w:r>
+      <w:r>
+        <w:t xml:space="preserve">type</w:t>
+      </w:r>
+      <w:r>
+        <w:t xml:space="preserve"> </w:t>
+      </w:r>
+      <w:r>
+        <w:rPr>
+          <w:rStyle w:val="VerbatimChar"/>
+        </w:rPr>
+        <w:t xml:space="preserve">music</w:t>
+      </w:r>
+      <w:r>
+        <w:t xml:space="preserve"> </w:t>
+      </w:r>
+      <w:r>
+        <w:t xml:space="preserve">nên</w:t>
+      </w:r>
+      <w:r>
+        <w:t xml:space="preserve"> </w:t>
+      </w:r>
+      <w:r>
+        <w:rPr>
+          <w:b/>
+          <w:bCs/>
+        </w:rPr>
+        <w:t xml:space="preserve">không cần tài khoản ElevenLabs riêng</w:t>
+      </w:r>
+      <w:r>
+        <w:t xml:space="preserve">; gói Free của ElevenLabs chỉ dùng phi thương mại nên không phù hợp video công ty). Kho nhạc/âm thanh của người dùng chỉ</w:t>
+      </w:r>
+      <w:r>
+        <w:t xml:space="preserve"> </w:t>
+      </w:r>
+      <w:r>
+        <w:rPr>
+          <w:b/>
+          <w:bCs/>
+        </w:rPr>
+        <w:t xml:space="preserve">hỗ trợ</w:t>
+      </w:r>
+      <w:r>
+        <w:t xml:space="preserve">: nghe thử, chọn tay, thêm hiệu ứng, và dự phòng tự động khi AI tạo nhạc lỗi hoặc chưa cấu hình; muốn ưu tiên kho thay AI thì bật riêng theo dự án.</w:t>
       </w:r>
       <w:r>
         <w:t xml:space="preserve"> </w:t>

</xml_diff>

<commit_message>
Finalize video_model default (kling-v3-omni); clarify Storyboard mode stays
User confirmed: default video_model = kling-v3-omni (matches
resolve_model(None) fallback already in code -- no code change
needed, just documenting the decision). Also clarified Storyboard
mode testing is unrelated to the Subject Library decision and should
still be tried.

Co-Authored-By: Claude Sonnet 5 <noreply@anthropic.com>
</commit_message>
<xml_diff>
--- a/PLAN.docx
+++ b/PLAN.docx
@@ -5020,6 +5020,188 @@
       <w:r>
         <w:t xml:space="preserve">).</w:t>
       </w:r>
+      <w:r>
+        <w:t xml:space="preserve"> </w:t>
+      </w:r>
+      <w:r>
+        <w:t xml:space="preserve">-</w:t>
+      </w:r>
+      <w:r>
+        <w:t xml:space="preserve"> </w:t>
+      </w:r>
+      <w:r>
+        <w:rPr>
+          <w:rStyle w:val="VerbatimChar"/>
+          <w:b/>
+          <w:bCs/>
+        </w:rPr>
+        <w:t xml:space="preserve">video_model</w:t>
+      </w:r>
+      <w:r>
+        <w:rPr>
+          <w:b/>
+          <w:bCs/>
+        </w:rPr>
+        <w:t xml:space="preserve"> </w:t>
+      </w:r>
+      <w:r>
+        <w:rPr>
+          <w:b/>
+          <w:bCs/>
+        </w:rPr>
+        <w:t xml:space="preserve">mặc định =</w:t>
+      </w:r>
+      <w:r>
+        <w:rPr>
+          <w:b/>
+          <w:bCs/>
+        </w:rPr>
+        <w:t xml:space="preserve"> </w:t>
+      </w:r>
+      <w:r>
+        <w:rPr>
+          <w:rStyle w:val="VerbatimChar"/>
+          <w:b/>
+          <w:bCs/>
+        </w:rPr>
+        <w:t xml:space="preserve">kling-v3-omni</w:t>
+      </w:r>
+      <w:r>
+        <w:rPr>
+          <w:b/>
+          <w:bCs/>
+        </w:rPr>
+        <w:t xml:space="preserve">.</w:t>
+      </w:r>
+      <w:r>
+        <w:t xml:space="preserve"> </w:t>
+      </w:r>
+      <w:r>
+        <w:t xml:space="preserve">Theo gợi ý chính thức của slide, Kling 3.0 Omni ghi rõ thế mạnh</w:t>
+      </w:r>
+      <w:r>
+        <w:t xml:space="preserve"> </w:t>
+      </w:r>
+      <w:r>
+        <w:t xml:space="preserve">“tái sử dụng nhân vật, đối thoại nhiều nhân vật”</w:t>
+      </w:r>
+      <w:r>
+        <w:t xml:space="preserve"> </w:t>
+      </w:r>
+      <w:r>
+        <w:t xml:space="preserve">— đúng nhu cầu dự án (nhân vật FF lặp lại nhiều cảnh, nhiều nhân vật đối thoại) và cũng rẻ nhất trong 2 model thật đang dùng (</w:t>
+      </w:r>
+      <w:r>
+        <w:rPr>
+          <w:rStyle w:val="VerbatimChar"/>
+        </w:rPr>
+        <w:t xml:space="preserve">$0.08/giây</w:t>
+      </w:r>
+      <w:r>
+        <w:t xml:space="preserve"> </w:t>
+      </w:r>
+      <w:r>
+        <w:t xml:space="preserve">so với Seedance</w:t>
+      </w:r>
+      <w:r>
+        <w:t xml:space="preserve"> </w:t>
+      </w:r>
+      <w:r>
+        <w:rPr>
+          <w:rStyle w:val="VerbatimChar"/>
+        </w:rPr>
+        <w:t xml:space="preserve">$0.15–0.23/giây</w:t>
+      </w:r>
+      <w:r>
+        <w:t xml:space="preserve">). Không cần sửa code —</w:t>
+      </w:r>
+      <w:r>
+        <w:t xml:space="preserve"> </w:t>
+      </w:r>
+      <w:r>
+        <w:rPr>
+          <w:rStyle w:val="VerbatimChar"/>
+        </w:rPr>
+        <w:t xml:space="preserve">resolve_model(None)</w:t>
+      </w:r>
+      <w:r>
+        <w:t xml:space="preserve"> </w:t>
+      </w:r>
+      <w:r>
+        <w:t xml:space="preserve">đã mặc định về</w:t>
+      </w:r>
+      <w:r>
+        <w:t xml:space="preserve"> </w:t>
+      </w:r>
+      <w:r>
+        <w:rPr>
+          <w:rStyle w:val="VerbatimChar"/>
+        </w:rPr>
+        <w:t xml:space="preserve">kling-v3-omni</w:t>
+      </w:r>
+      <w:r>
+        <w:t xml:space="preserve"> </w:t>
+      </w:r>
+      <w:r>
+        <w:t xml:space="preserve">từ trước.</w:t>
+      </w:r>
+      <w:r>
+        <w:t xml:space="preserve"> </w:t>
+      </w:r>
+      <w:r>
+        <w:rPr>
+          <w:rStyle w:val="VerbatimChar"/>
+        </w:rPr>
+        <w:t xml:space="preserve">seedance</w:t>
+      </w:r>
+      <w:r>
+        <w:t xml:space="preserve">/</w:t>
+      </w:r>
+      <w:r>
+        <w:rPr>
+          <w:rStyle w:val="VerbatimChar"/>
+        </w:rPr>
+        <w:t xml:space="preserve">seedance-2.5</w:t>
+      </w:r>
+      <w:r>
+        <w:t xml:space="preserve"> </w:t>
+      </w:r>
+      <w:r>
+        <w:t xml:space="preserve">vẫn chọn thủ công được cho cảnh cần chất lượng điện ảnh cao hơn.</w:t>
+      </w:r>
+      <w:r>
+        <w:t xml:space="preserve"> </w:t>
+      </w:r>
+      <w:r>
+        <w:t xml:space="preserve">-</w:t>
+      </w:r>
+      <w:r>
+        <w:t xml:space="preserve"> </w:t>
+      </w:r>
+      <w:r>
+        <w:rPr>
+          <w:b/>
+          <w:bCs/>
+        </w:rPr>
+        <w:t xml:space="preserve">“📽 Chế độ Storyboard”</w:t>
+      </w:r>
+      <w:r>
+        <w:rPr>
+          <w:b/>
+          <w:bCs/>
+        </w:rPr>
+        <w:t xml:space="preserve"> </w:t>
+      </w:r>
+      <w:r>
+        <w:rPr>
+          <w:b/>
+          <w:bCs/>
+        </w:rPr>
+        <w:t xml:space="preserve">(ảnh cảnh trước làm tham chiếu liên tục) — vẫn giữ trong kế hoạch thử nghiệm</w:t>
+      </w:r>
+      <w:r>
+        <w:t xml:space="preserve">, không gộp vào quyết định bỏ Kho chủ thể ở trên: đây là hai vấn đề khác nhau (Storyboard = liên tục phong cách/ánh sáng giữa các cảnh; Kho chủ thể = khoá nhận diện nhân vật).</w:t>
+      </w:r>
     </w:p>
     <w:p>
       <w:pPr>
@@ -7312,22 +7494,7 @@
         <w:t xml:space="preserve"> </w:t>
       </w:r>
       <w:r>
-        <w:t xml:space="preserve">- Đo giá thật để điền</w:t>
-      </w:r>
-      <w:r>
-        <w:t xml:space="preserve"> </w:t>
-      </w:r>
-      <w:r>
-        <w:rPr>
-          <w:rStyle w:val="VerbatimChar"/>
-        </w:rPr>
-        <w:t xml:space="preserve">data/pricing.json</w:t>
-      </w:r>
-      <w:r>
-        <w:t xml:space="preserve">; chọn</w:t>
-      </w:r>
-      <w:r>
-        <w:t xml:space="preserve"> </w:t>
+        <w:t xml:space="preserve">- Đo giá credit thật để đối chiếu với giá niêm yết đã điền (</w:t>
       </w:r>
       <w:r>
         <w:rPr>
@@ -7339,7 +7506,19 @@
         <w:t xml:space="preserve"> </w:t>
       </w:r>
       <w:r>
-        <w:t xml:space="preserve">mặc định sau khi so Kling và Seedance.</w:t>
+        <w:t xml:space="preserve">mặc định đã chốt</w:t>
+      </w:r>
+      <w:r>
+        <w:t xml:space="preserve"> </w:t>
+      </w:r>
+      <w:r>
+        <w:rPr>
+          <w:rStyle w:val="VerbatimChar"/>
+        </w:rPr>
+        <w:t xml:space="preserve">kling-v3-omni</w:t>
+      </w:r>
+      <w:r>
+        <w:t xml:space="preserve">, xem Mục 5).</w:t>
       </w:r>
       <w:r>
         <w:t xml:space="preserve"> </w:t>

</xml_diff>

<commit_message>
Review character/location consistency; plan 3D previz and P0-P5 roadmap
- PLAN.md 3.7: findings from code reading + simulation (location reference
  dropped at >=4 characters, name-based location match, one picture per
  location, no blocking, Kling gets first frame only) and the fix path
  (reference budget, location by id, blocking/sequence, model profiles,
  3D previz from FF map via Blender, extra QC criteria).
- PLAN.md 5/9: decisions and open questions; P0-P5 plan table.
- TODO.md: P0-P5 tasks and user tasks (download a 3D map, install Blender).
- Rebuilt PLAN.docx/PLAN.pdf; memory entry.

Co-Authored-By: Claude Opus 5.5 <noreply@anthropic.com>
Claude-Session: https://claude.ai/code/session_01AvRTz2SA1mPQzTR9dxmmVo
</commit_message>
<xml_diff>
--- a/PLAN.docx
+++ b/PLAN.docx
@@ -2,7 +2,7 @@
 <file path=word/document.xml><?xml version="1.0" encoding="utf-8"?>
 <w:document xmlns:w="http://schemas.openxmlformats.org/wordprocessingml/2006/main" xmlns:m="http://schemas.openxmlformats.org/officeDocument/2006/math" xmlns:r="http://schemas.openxmlformats.org/officeDocument/2006/relationships" xmlns:o="urn:schemas-microsoft-com:office:office" xmlns:v="urn:schemas-microsoft-com:vml" xmlns:w10="urn:schemas-microsoft-com:office:word" xmlns:a="http://schemas.openxmlformats.org/drawingml/2006/main" xmlns:pic="http://schemas.openxmlformats.org/drawingml/2006/picture" xmlns:wp="http://schemas.openxmlformats.org/drawingml/2006/wordprocessingDrawing">
   <w:body>
-    <w:bookmarkStart w:id="43" w:name="X9c8c830ec4a0bd58ad601261317abf6bbfd8ccb"/>
+    <w:bookmarkStart w:id="44" w:name="X9c8c830ec4a0bd58ad601261317abf6bbfd8ccb"/>
     <w:p>
       <w:pPr>
         <w:pStyle w:val="Heading1"/>
@@ -1293,7 +1293,7 @@
     </w:p>
     <w:bookmarkEnd w:id="13"/>
     <w:bookmarkEnd w:id="14"/>
-    <w:bookmarkStart w:id="33" w:name="Xcd7cd861a7bec2f7c480708ab31acaf54a69d9b"/>
+    <w:bookmarkStart w:id="34" w:name="Xcd7cd861a7bec2f7c480708ab31acaf54a69d9b"/>
     <w:p>
       <w:pPr>
         <w:pStyle w:val="Heading2"/>
@@ -4146,8 +4146,738 @@
       </w:r>
     </w:p>
     <w:bookmarkEnd w:id="32"/>
+    <w:bookmarkStart w:id="33" w:name="Xf2e455dc2459b836fb163f138377022543eda5f"/>
+    <w:p>
+      <w:pPr>
+        <w:pStyle w:val="Heading3"/>
+      </w:pPr>
+      <w:r>
+        <w:t xml:space="preserve">3.7 Nhất quán nhân vật – bối cảnh – bố cục (rà soát 2026-09-23)</w:t>
+      </w:r>
+    </w:p>
+    <w:p>
+      <w:pPr>
+        <w:pStyle w:val="FirstParagraph"/>
+      </w:pPr>
+      <w:r>
+        <w:t xml:space="preserve">Bối cảnh: kịch bản thật dài ~60 giây, 3–5 nhân vật, bối cảnh là map Free Fire. Hiện mỗi cảnh = 1 ảnh gen độc lập (không phải storyboard), nên cần biết video có giữ nhất quán nhân vật, bối cảnh và vị trí nhân vật giữa các cảnh không.</w:t>
+      </w:r>
+    </w:p>
+    <w:p>
+      <w:pPr>
+        <w:pStyle w:val="BodyText"/>
+      </w:pPr>
+      <w:r>
+        <w:rPr>
+          <w:b/>
+          <w:bCs/>
+        </w:rPr>
+        <w:t xml:space="preserve">Hiện trạng (đọc code + mô phỏng, không tốn credit):</w:t>
+      </w:r>
+    </w:p>
+    <w:p>
+      <w:pPr>
+        <w:pStyle w:val="Compact"/>
+        <w:numPr>
+          <w:ilvl w:val="0"/>
+          <w:numId w:val="1004"/>
+        </w:numPr>
+      </w:pPr>
+      <w:r>
+        <w:rPr>
+          <w:rStyle w:val="VerbatimChar"/>
+        </w:rPr>
+        <w:t xml:space="preserve">assets.scene_references</w:t>
+      </w:r>
+      <w:r>
+        <w:t xml:space="preserve"> </w:t>
+      </w:r>
+      <w:r>
+        <w:t xml:space="preserve">gửi tối đa 8 ảnh/cảnh,</w:t>
+      </w:r>
+      <w:r>
+        <w:t xml:space="preserve"> </w:t>
+      </w:r>
+      <w:r>
+        <w:rPr>
+          <w:b/>
+          <w:bCs/>
+        </w:rPr>
+        <w:t xml:space="preserve">nhân vật lấy trước (2 ảnh/người), bối cảnh xét sau</w:t>
+      </w:r>
+      <w:r>
+        <w:t xml:space="preserve">. Mô phỏng: 2–3 nhân vật → có ảnh bối cảnh;</w:t>
+      </w:r>
+      <w:r>
+        <w:t xml:space="preserve"> </w:t>
+      </w:r>
+      <w:r>
+        <w:rPr>
+          <w:b/>
+          <w:bCs/>
+        </w:rPr>
+        <w:t xml:space="preserve">4 nhân vật → mất ảnh bối cảnh; 5 nhân vật → mất bối cảnh và nhân vật thứ 5 không có ảnh</w:t>
+      </w:r>
+      <w:r>
+        <w:t xml:space="preserve">. Chế độ Storyboard cũng tự tắt khi hết chỗ.</w:t>
+      </w:r>
+    </w:p>
+    <w:p>
+      <w:pPr>
+        <w:pStyle w:val="Compact"/>
+        <w:numPr>
+          <w:ilvl w:val="0"/>
+          <w:numId w:val="1004"/>
+        </w:numPr>
+      </w:pPr>
+      <w:r>
+        <w:t xml:space="preserve">Ảnh bối cảnh chỉ được gửi khi tên tài nguyên nằm nguyên văn trong trường</w:t>
+      </w:r>
+      <w:r>
+        <w:t xml:space="preserve"> </w:t>
+      </w:r>
+      <w:r>
+        <w:rPr>
+          <w:rStyle w:val="VerbatimChar"/>
+        </w:rPr>
+        <w:t xml:space="preserve">location</w:t>
+      </w:r>
+      <w:r>
+        <w:t xml:space="preserve"> </w:t>
+      </w:r>
+      <w:r>
+        <w:t xml:space="preserve">do Director viết (ví dụ Director viết</w:t>
+      </w:r>
+      <w:r>
+        <w:t xml:space="preserve"> </w:t>
+      </w:r>
+      <w:r>
+        <w:t xml:space="preserve">“abandoned factory rooftop”</w:t>
+      </w:r>
+      <w:r>
+        <w:t xml:space="preserve"> </w:t>
+      </w:r>
+      <w:r>
+        <w:t xml:space="preserve">thay vì tên trong kho → không gửi) và tài nguyên phải được tick vào dự án.</w:t>
+      </w:r>
+    </w:p>
+    <w:p>
+      <w:pPr>
+        <w:pStyle w:val="Compact"/>
+        <w:numPr>
+          <w:ilvl w:val="0"/>
+          <w:numId w:val="1004"/>
+        </w:numPr>
+      </w:pPr>
+      <w:r>
+        <w:t xml:space="preserve">Mỗi bối cảnh chỉ dùng</w:t>
+      </w:r>
+      <w:r>
+        <w:t xml:space="preserve"> </w:t>
+      </w:r>
+      <w:r>
+        <w:rPr>
+          <w:b/>
+          <w:bCs/>
+        </w:rPr>
+        <w:t xml:space="preserve">1 ảnh ngang lớn nhất</w:t>
+      </w:r>
+      <w:r>
+        <w:t xml:space="preserve"> </w:t>
+      </w:r>
+      <w:r>
+        <w:t xml:space="preserve">cho mọi cảnh; các góc chụp khác trong kho không được dùng.</w:t>
+      </w:r>
+    </w:p>
+    <w:p>
+      <w:pPr>
+        <w:pStyle w:val="Compact"/>
+        <w:numPr>
+          <w:ilvl w:val="0"/>
+          <w:numId w:val="1004"/>
+        </w:numPr>
+      </w:pPr>
+      <w:r>
+        <w:t xml:space="preserve">Director không có trường</w:t>
+      </w:r>
+      <w:r>
+        <w:t xml:space="preserve"> </w:t>
+      </w:r>
+      <w:r>
+        <w:rPr>
+          <w:b/>
+          <w:bCs/>
+        </w:rPr>
+        <w:t xml:space="preserve">vị trí nhân vật</w:t>
+      </w:r>
+      <w:r>
+        <w:t xml:space="preserve"> </w:t>
+      </w:r>
+      <w:r>
+        <w:t xml:space="preserve">(trái/phải, hướng nhìn, tiền/hậu cảnh) → vị trí đứng ngẫu nhiên giữa các shot, trục 180° dễ bị đảo.</w:t>
+      </w:r>
+    </w:p>
+    <w:p>
+      <w:pPr>
+        <w:pStyle w:val="Compact"/>
+        <w:numPr>
+          <w:ilvl w:val="0"/>
+          <w:numId w:val="1004"/>
+        </w:numPr>
+      </w:pPr>
+      <w:r>
+        <w:t xml:space="preserve">Chế độ Storyboard nối với</w:t>
+      </w:r>
+      <w:r>
+        <w:t xml:space="preserve"> </w:t>
+      </w:r>
+      <w:r>
+        <w:rPr>
+          <w:b/>
+          <w:bCs/>
+        </w:rPr>
+        <w:t xml:space="preserve">cảnh liền trước theo số thứ tự</w:t>
+      </w:r>
+      <w:r>
+        <w:t xml:space="preserve">, không theo nhóm cùng bối cảnh.</w:t>
+      </w:r>
+    </w:p>
+    <w:p>
+      <w:pPr>
+        <w:pStyle w:val="Compact"/>
+        <w:numPr>
+          <w:ilvl w:val="0"/>
+          <w:numId w:val="1004"/>
+        </w:numPr>
+      </w:pPr>
+      <w:r>
+        <w:t xml:space="preserve">Bước 4:</w:t>
+      </w:r>
+      <w:r>
+        <w:t xml:space="preserve"> </w:t>
+      </w:r>
+      <w:r>
+        <w:rPr>
+          <w:b/>
+          <w:bCs/>
+        </w:rPr>
+        <w:t xml:space="preserve">Kling chỉ nhận ảnh khung đầu</w:t>
+      </w:r>
+      <w:r>
+        <w:t xml:space="preserve">; ảnh nhân vật/bối cảnh chỉ gửi kèm khi dùng Seedance.</w:t>
+      </w:r>
+    </w:p>
+    <w:p>
+      <w:pPr>
+        <w:pStyle w:val="Compact"/>
+        <w:numPr>
+          <w:ilvl w:val="0"/>
+          <w:numId w:val="1004"/>
+        </w:numPr>
+      </w:pPr>
+      <w:r>
+        <w:t xml:space="preserve">Bằng chứng tích cực (chạy thật 2026-09-23, dự án</w:t>
+      </w:r>
+      <w:r>
+        <w:t xml:space="preserve"> </w:t>
+      </w:r>
+      <w:r>
+        <w:t xml:space="preserve">“Kenta xuyên tường”</w:t>
+      </w:r>
+      <w:r>
+        <w:t xml:space="preserve">, 3 nhân vật): gắn tài nguyên địa điểm</w:t>
+      </w:r>
+      <w:r>
+        <w:t xml:space="preserve"> </w:t>
+      </w:r>
+      <w:r>
+        <w:t xml:space="preserve">“Đảo Quân Sự”</w:t>
+      </w:r>
+      <w:r>
+        <w:t xml:space="preserve"> </w:t>
+      </w:r>
+      <w:r>
+        <w:t xml:space="preserve">(6 ảnh in-game) → 5/6 cảnh gen lại đúng bối cảnh FF ngay; thêm</w:t>
+      </w:r>
+      <w:r>
+        <w:t xml:space="preserve"> </w:t>
+      </w:r>
+      <w:r>
+        <w:t xml:space="preserve">“đặc điểm neo tương phản”</w:t>
+      </w:r>
+      <w:r>
+        <w:t xml:space="preserve"> </w:t>
+      </w:r>
+      <w:r>
+        <w:t xml:space="preserve">cho mỗi người → hết nhầm Kelly/Maxim. Tức là cơ chế tham chiếu</w:t>
+      </w:r>
+      <w:r>
+        <w:t xml:space="preserve"> </w:t>
+      </w:r>
+      <w:r>
+        <w:rPr>
+          <w:b/>
+          <w:bCs/>
+        </w:rPr>
+        <w:t xml:space="preserve">có hiệu quả khi còn đủ chỗ</w:t>
+      </w:r>
+      <w:r>
+        <w:t xml:space="preserve"> </w:t>
+      </w:r>
+      <w:r>
+        <w:t xml:space="preserve">— vấn đề chính là cảnh đông người và chọn góc/bố cục.</w:t>
+      </w:r>
+    </w:p>
+    <w:p>
+      <w:pPr>
+        <w:pStyle w:val="FirstParagraph"/>
+      </w:pPr>
+      <w:r>
+        <w:rPr>
+          <w:b/>
+          <w:bCs/>
+        </w:rPr>
+        <w:t xml:space="preserve">Kết luận:</w:t>
+      </w:r>
+      <w:r>
+        <w:t xml:space="preserve"> </w:t>
+      </w:r>
+      <w:r>
+        <w:t xml:space="preserve">mỗi cảnh 1 ảnh giữ được mặt/trang phục (khi ≤3 người) nhưng</w:t>
+      </w:r>
+      <w:r>
+        <w:t xml:space="preserve"> </w:t>
+      </w:r>
+      <w:r>
+        <w:rPr>
+          <w:b/>
+          <w:bCs/>
+        </w:rPr>
+        <w:t xml:space="preserve">không giữ được không gian</w:t>
+      </w:r>
+      <w:r>
+        <w:t xml:space="preserve">: bối cảnh, vị trí đứng, tỉ lệ người/cảnh, hướng nhìn. AI vẽ lại toàn bộ khung hình nên dễ ra nhân vật quá to, đứng lơ lửng, bối cảnh lệch so với in-game.</w:t>
+      </w:r>
+    </w:p>
+    <w:p>
+      <w:pPr>
+        <w:pStyle w:val="BodyText"/>
+      </w:pPr>
+      <w:r>
+        <w:rPr>
+          <w:b/>
+          <w:bCs/>
+        </w:rPr>
+        <w:t xml:space="preserve">Hướng giải quyết (theo thứ tự):</w:t>
+      </w:r>
+    </w:p>
+    <w:p>
+      <w:pPr>
+        <w:pStyle w:val="Compact"/>
+        <w:numPr>
+          <w:ilvl w:val="0"/>
+          <w:numId w:val="1005"/>
+        </w:numPr>
+      </w:pPr>
+      <w:r>
+        <w:rPr>
+          <w:b/>
+          <w:bCs/>
+        </w:rPr>
+        <w:t xml:space="preserve">Sửa nhanh cách chọn ảnh tham chiếu (A):</w:t>
+      </w:r>
+      <w:r>
+        <w:t xml:space="preserve"> </w:t>
+      </w:r>
+      <w:r>
+        <w:t xml:space="preserve">luôn giữ 1 chỗ cho bối cảnh (và 1 cho Storyboard); cảnh ≥4 người → 1 ảnh/người.</w:t>
+      </w:r>
+    </w:p>
+    <w:p>
+      <w:pPr>
+        <w:pStyle w:val="Compact"/>
+        <w:numPr>
+          <w:ilvl w:val="0"/>
+          <w:numId w:val="1005"/>
+        </w:numPr>
+      </w:pPr>
+      <w:r>
+        <w:rPr>
+          <w:b/>
+          <w:bCs/>
+        </w:rPr>
+        <w:t xml:space="preserve">Chọn bối cảnh theo ID (B):</w:t>
+      </w:r>
+      <w:r>
+        <w:t xml:space="preserve"> </w:t>
+      </w:r>
+      <w:r>
+        <w:t xml:space="preserve">Director chọn</w:t>
+      </w:r>
+      <w:r>
+        <w:t xml:space="preserve"> </w:t>
+      </w:r>
+      <w:r>
+        <w:rPr>
+          <w:rStyle w:val="VerbatimChar"/>
+        </w:rPr>
+        <w:t xml:space="preserve">location_asset</w:t>
+      </w:r>
+      <w:r>
+        <w:t xml:space="preserve"> </w:t>
+      </w:r>
+      <w:r>
+        <w:t xml:space="preserve">từ danh sách tài nguyên của dự án; Bước 1 có ô chọn background từng cảnh để sửa tay.</w:t>
+      </w:r>
+    </w:p>
+    <w:p>
+      <w:pPr>
+        <w:pStyle w:val="Compact"/>
+        <w:numPr>
+          <w:ilvl w:val="0"/>
+          <w:numId w:val="1005"/>
+        </w:numPr>
+      </w:pPr>
+      <w:r>
+        <w:rPr>
+          <w:b/>
+          <w:bCs/>
+        </w:rPr>
+        <w:t xml:space="preserve">Blocking + nhóm cảnh (C):</w:t>
+      </w:r>
+      <w:r>
+        <w:t xml:space="preserve"> </w:t>
+      </w:r>
+      <w:r>
+        <w:t xml:space="preserve">Director thêm</w:t>
+      </w:r>
+      <w:r>
+        <w:t xml:space="preserve"> </w:t>
+      </w:r>
+      <w:r>
+        <w:rPr>
+          <w:rStyle w:val="VerbatimChar"/>
+        </w:rPr>
+        <w:t xml:space="preserve">blocking</w:t>
+      </w:r>
+      <w:r>
+        <w:t xml:space="preserve"> </w:t>
+      </w:r>
+      <w:r>
+        <w:t xml:space="preserve">(vị trí trái/giữa/phải, hướng nhìn, tiền/trung/hậu cảnh) và</w:t>
+      </w:r>
+      <w:r>
+        <w:t xml:space="preserve"> </w:t>
+      </w:r>
+      <w:r>
+        <w:rPr>
+          <w:rStyle w:val="VerbatimChar"/>
+        </w:rPr>
+        <w:t xml:space="preserve">sequence</w:t>
+      </w:r>
+      <w:r>
+        <w:t xml:space="preserve"> </w:t>
+      </w:r>
+      <w:r>
+        <w:t xml:space="preserve">(nhóm cảnh cùng bối cảnh liên tục, giữ trục 180°). Storyboard nối theo nhóm, không theo số thứ tự.</w:t>
+      </w:r>
+    </w:p>
+    <w:p>
+      <w:pPr>
+        <w:pStyle w:val="Compact"/>
+        <w:numPr>
+          <w:ilvl w:val="0"/>
+          <w:numId w:val="1005"/>
+        </w:numPr>
+      </w:pPr>
+      <w:r>
+        <w:rPr>
+          <w:b/>
+          <w:bCs/>
+        </w:rPr>
+        <w:t xml:space="preserve">Hồ sơ model video:</w:t>
+      </w:r>
+      <w:r>
+        <w:t xml:space="preserve"> </w:t>
+      </w:r>
+      <w:r>
+        <w:t xml:space="preserve">Bước 1–3 và 5 dùng chung cho mọi model; chỉ Bước 4 khác theo khả năng từng model (số ảnh tham chiếu, âm thanh, xung đột tùy chọn, giá). Mặc định Kling; tự đề xuất Seedance khi cảnh ≥3 người, có nhân vật đi vào khung hình giữa clip, hoặc hành động mạnh. Không cần dựng quy trình riêng cho từng model — chỉ cần bộ test cố định 3 cảnh chạy trên mỗi model.</w:t>
+      </w:r>
+    </w:p>
+    <w:p>
+      <w:pPr>
+        <w:pStyle w:val="Compact"/>
+        <w:numPr>
+          <w:ilvl w:val="0"/>
+          <w:numId w:val="1005"/>
+        </w:numPr>
+      </w:pPr>
+      <w:r>
+        <w:rPr>
+          <w:b/>
+          <w:bCs/>
+        </w:rPr>
+        <w:t xml:space="preserve">Previz 3D từ map Free Fire (D, hướng chính cho độ chân thực):</w:t>
+      </w:r>
+      <w:r>
+        <w:t xml:space="preserve"> </w:t>
+      </w:r>
+      <w:r>
+        <w:t xml:space="preserve">thay vì để AI vẽ lại toàn bộ khung hình, dựng bố cục bằng 3D trước rồi mới cho AI</w:t>
+      </w:r>
+      <w:r>
+        <w:t xml:space="preserve"> </w:t>
+      </w:r>
+      <w:r>
+        <w:t xml:space="preserve">“render đẹp”</w:t>
+      </w:r>
+      <w:r>
+        <w:t xml:space="preserve">:</w:t>
+      </w:r>
+    </w:p>
+    <w:p>
+      <w:pPr>
+        <w:pStyle w:val="Compact"/>
+        <w:numPr>
+          <w:ilvl w:val="1"/>
+          <w:numId w:val="1006"/>
+        </w:numPr>
+      </w:pPr>
+      <w:r>
+        <w:t xml:space="preserve">Nhập model 3D của map (GLB/FBX) vào</w:t>
+      </w:r>
+      <w:r>
+        <w:t xml:space="preserve"> </w:t>
+      </w:r>
+      <w:r>
+        <w:rPr>
+          <w:b/>
+          <w:bCs/>
+        </w:rPr>
+        <w:t xml:space="preserve">Blender chạy tự động bằng script</w:t>
+      </w:r>
+      <w:r>
+        <w:t xml:space="preserve"> </w:t>
+      </w:r>
+      <w:r>
+        <w:t xml:space="preserve">(miễn phí, chạy trên máy người dùng). Script tự đọc tên object, tự tìm mặt đất, tự kiểm tra đơn vị bằng vật mốc (cửa/xe/container), xuất bản đồ nhìn từ trên + danh sách khu vực —</w:t>
+      </w:r>
+      <w:r>
+        <w:t xml:space="preserve"> </w:t>
+      </w:r>
+      <w:r>
+        <w:rPr>
+          <w:b/>
+          <w:bCs/>
+        </w:rPr>
+        <w:t xml:space="preserve">người dùng không phải đánh dấu tay ảnh nào</w:t>
+      </w:r>
+      <w:r>
+        <w:t xml:space="preserve">.</w:t>
+      </w:r>
+    </w:p>
+    <w:p>
+      <w:pPr>
+        <w:pStyle w:val="Compact"/>
+        <w:numPr>
+          <w:ilvl w:val="1"/>
+          <w:numId w:val="1006"/>
+        </w:numPr>
+      </w:pPr>
+      <w:r>
+        <w:t xml:space="preserve">Director viết blocking bằng lời (khu vực, vị trí so với mốc, cỡ cảnh, độ cao camera) → code đặt</w:t>
+      </w:r>
+      <w:r>
+        <w:t xml:space="preserve"> </w:t>
+      </w:r>
+      <w:r>
+        <w:rPr>
+          <w:b/>
+          <w:bCs/>
+        </w:rPr>
+        <w:t xml:space="preserve">ma-nơ-canh cao ~1,75 m đúng trên mặt đất</w:t>
+      </w:r>
+      <w:r>
+        <w:t xml:space="preserve"> </w:t>
+      </w:r>
+      <w:r>
+        <w:t xml:space="preserve">(dò mặt đất bằng raycast → không lơ lửng, đúng tỉ lệ) và camera theo cỡ cảnh; góc cao/thấp/ngang mắt đều được, không cần ảnh chụp sẵn.</w:t>
+      </w:r>
+    </w:p>
+    <w:p>
+      <w:pPr>
+        <w:pStyle w:val="Compact"/>
+        <w:numPr>
+          <w:ilvl w:val="1"/>
+          <w:numId w:val="1006"/>
+        </w:numPr>
+      </w:pPr>
+      <w:r>
+        <w:t xml:space="preserve">Render ảnh layout (màu + độ sâu) → Deepix vẽ ảnh cuối từ layout + ảnh nhân vật trong kho. Vị trí nhân vật lưu trong 3D nên đổi góc máy vẫn nhất quán, shot ngược góc tự đúng.</w:t>
+      </w:r>
+    </w:p>
+    <w:p>
+      <w:pPr>
+        <w:pStyle w:val="Compact"/>
+        <w:numPr>
+          <w:ilvl w:val="1"/>
+          <w:numId w:val="1006"/>
+        </w:numPr>
+      </w:pPr>
+      <w:r>
+        <w:t xml:space="preserve">Video: ảnh cuối làm khung đầu; chuyển động camera render từ Blender làm video tham chiếu (</w:t>
+      </w:r>
+      <w:r>
+        <w:rPr>
+          <w:rStyle w:val="VerbatimChar"/>
+        </w:rPr>
+        <w:t xml:space="preserve">reference_video</w:t>
+      </w:r>
+      <w:r>
+        <w:t xml:space="preserve">) khi cần; nếu không, chỉ cho camera chuyển động nhỏ (push-in/pan/tilt) để model không phải bịa phần bối cảnh ngoài khung.</w:t>
+      </w:r>
+    </w:p>
+    <w:p>
+      <w:pPr>
+        <w:pStyle w:val="Compact"/>
+        <w:numPr>
+          <w:ilvl w:val="1"/>
+          <w:numId w:val="1006"/>
+        </w:numPr>
+      </w:pPr>
+      <w:r>
+        <w:t xml:space="preserve">Tạm dùng</w:t>
+      </w:r>
+      <w:r>
+        <w:t xml:space="preserve"> </w:t>
+      </w:r>
+      <w:r>
+        <w:rPr>
+          <w:b/>
+          <w:bCs/>
+        </w:rPr>
+        <w:t xml:space="preserve">map fan dựng trên mạng</w:t>
+      </w:r>
+      <w:r>
+        <w:t xml:space="preserve"> </w:t>
+      </w:r>
+      <w:r>
+        <w:t xml:space="preserve">(Sketchfab/CGTrader, vd</w:t>
+      </w:r>
+      <w:r>
+        <w:t xml:space="preserve"> </w:t>
+      </w:r>
+      <w:r>
+        <w:t xml:space="preserve">“Free Fire Old Bermuda Three 3D Places”</w:t>
+      </w:r>
+      <w:r>
+        <w:t xml:space="preserve">) để thử nội bộ; video phát hành nên chuyển sang asset chính thức từ team game. File map không đưa lên GitHub (để trong</w:t>
+      </w:r>
+      <w:r>
+        <w:t xml:space="preserve"> </w:t>
+      </w:r>
+      <w:r>
+        <w:rPr>
+          <w:rStyle w:val="VerbatimChar"/>
+        </w:rPr>
+        <w:t xml:space="preserve">data/</w:t>
+      </w:r>
+      <w:r>
+        <w:t xml:space="preserve">). Tải chỉ file model (</w:t>
+      </w:r>
+      <w:r>
+        <w:rPr>
+          <w:rStyle w:val="VerbatimChar"/>
+        </w:rPr>
+        <w:t xml:space="preserve">.glb/.gltf/.fbx/.obj</w:t>
+      </w:r>
+      <w:r>
+        <w:t xml:space="preserve">); mở</w:t>
+      </w:r>
+      <w:r>
+        <w:t xml:space="preserve"> </w:t>
+      </w:r>
+      <w:r>
+        <w:rPr>
+          <w:rStyle w:val="VerbatimChar"/>
+        </w:rPr>
+        <w:t xml:space="preserve">.blend</w:t>
+      </w:r>
+      <w:r>
+        <w:t xml:space="preserve"> </w:t>
+      </w:r>
+      <w:r>
+        <w:t xml:space="preserve">thì tắt</w:t>
+      </w:r>
+      <w:r>
+        <w:t xml:space="preserve"> </w:t>
+      </w:r>
+      <w:r>
+        <w:t xml:space="preserve">“Auto Run Python Scripts”</w:t>
+      </w:r>
+      <w:r>
+        <w:t xml:space="preserve">.</w:t>
+      </w:r>
+    </w:p>
+    <w:p>
+      <w:pPr>
+        <w:pStyle w:val="Compact"/>
+        <w:numPr>
+          <w:ilvl w:val="1"/>
+          <w:numId w:val="1006"/>
+        </w:numPr>
+      </w:pPr>
+      <w:r>
+        <w:t xml:space="preserve">Dự phòng khi không có 3D cho một map: ước lượng độ sâu từ 1 ảnh bằng model chạy cục bộ để tự tìm mặt đất/tỉ lệ (kém chính xác hơn).</w:t>
+      </w:r>
+    </w:p>
+    <w:p>
+      <w:pPr>
+        <w:pStyle w:val="Compact"/>
+        <w:numPr>
+          <w:ilvl w:val="1"/>
+          <w:numId w:val="1006"/>
+        </w:numPr>
+      </w:pPr>
+      <w:r>
+        <w:rPr>
+          <w:b/>
+          <w:bCs/>
+        </w:rPr>
+        <w:t xml:space="preserve">Rủi ro lớn nhất cần thử trước:</w:t>
+      </w:r>
+      <w:r>
+        <w:t xml:space="preserve"> </w:t>
+      </w:r>
+      <w:r>
+        <w:t xml:space="preserve">API Deepix không có tham số khoá bố cục (mask/strength/ControlNet) → phải thử 3–5 ảnh xem Deepix có bám layout không, trước khi đưa vào Dashboard.</w:t>
+      </w:r>
+    </w:p>
+    <w:p>
+      <w:pPr>
+        <w:pStyle w:val="Compact"/>
+        <w:numPr>
+          <w:ilvl w:val="0"/>
+          <w:numId w:val="1005"/>
+        </w:numPr>
+      </w:pPr>
+      <w:r>
+        <w:rPr>
+          <w:b/>
+          <w:bCs/>
+        </w:rPr>
+        <w:t xml:space="preserve">QC bổ sung 3 tiêu chí:</w:t>
+      </w:r>
+      <w:r>
+        <w:t xml:space="preserve"> </w:t>
+      </w:r>
+      <w:r>
+        <w:t xml:space="preserve">tỉ lệ người/cảnh, chân chạm đất/có bóng, độ lệch bối cảnh so với ảnh gốc (đo vùng ngoài nhân vật, không cần AI chấm).</w:t>
+      </w:r>
+    </w:p>
     <w:bookmarkEnd w:id="33"/>
-    <w:bookmarkStart w:id="34" w:name="rủi-ro-mitigation-tổng-hợp"/>
+    <w:bookmarkEnd w:id="34"/>
+    <w:bookmarkStart w:id="35" w:name="rủi-ro-mitigation-tổng-hợp"/>
     <w:p>
       <w:pPr>
         <w:pStyle w:val="Heading2"/>
@@ -4351,8 +5081,8 @@
         </w:tc>
       </w:tr>
     </w:tbl>
-    <w:bookmarkEnd w:id="34"/>
-    <w:bookmarkStart w:id="35" w:name="quyết-định-đã-chốt-còn-mở"/>
+    <w:bookmarkEnd w:id="35"/>
+    <w:bookmarkStart w:id="36" w:name="quyết-định-đã-chốt-còn-mở"/>
     <w:p>
       <w:pPr>
         <w:pStyle w:val="Heading2"/>
@@ -5212,935 +5942,7 @@
           <w:b/>
           <w:bCs/>
         </w:rPr>
-        <w:t xml:space="preserve">Còn mở, KHÔNG chặn V0 (chốt trước V1):</w:t>
-      </w:r>
-      <w:r>
-        <w:t xml:space="preserve"> </w:t>
-      </w:r>
-      <w:r>
-        <w:t xml:space="preserve">| Quyết định | Ghi chú |</w:t>
-      </w:r>
-      <w:r>
-        <w:t xml:space="preserve"> </w:t>
-      </w:r>
-      <w:r>
-        <w:t xml:space="preserve">|—|—|</w:t>
-      </w:r>
-      <w:r>
-        <w:t xml:space="preserve"> </w:t>
-      </w:r>
-      <w:r>
-        <w:t xml:space="preserve">| Nguồn truy cập Claude cho V1 | Gói Claude (seat Enterprise/Pro/Max) và Anthropic API (Console, API key, tính tiền theo token) là 2 sản phẩm/billing tách biệt; seat không tự sinh API key. Dashboard tự gọi Claude bằng code nên V1 cần API key từ Console org công ty (không nên dùng đăng nhập seat cho ứng dụng tự động — cần xác nhận với admin/điều khoản Anthropic). Việc cần làm: hỏi admin Enterprise (a) có Console org không, (b) hạn mức token, (c) chính sách data cho ảnh nhân vật. |</w:t>
-      </w:r>
-      <w:r>
-        <w:t xml:space="preserve"> </w:t>
-      </w:r>
-      <w:r>
-        <w:t xml:space="preserve">|</w:t>
-      </w:r>
-      <w:r>
-        <w:t xml:space="preserve"> </w:t>
-      </w:r>
-      <w:r>
-        <w:rPr>
-          <w:rStyle w:val="VerbatimChar"/>
-        </w:rPr>
-        <w:t xml:space="preserve">music_provider</w:t>
-      </w:r>
-      <w:r>
-        <w:t xml:space="preserve"> </w:t>
-      </w:r>
-      <w:r>
-        <w:t xml:space="preserve">| Suno không có API chính thức. Ưu tiên dùng audio của Clip AI (ElevenLabs/Seed Audio tích hợp) nếu API cho phép; xác nhận license thương mại. Xem 3.5 |</w:t>
-      </w:r>
-      <w:r>
-        <w:t xml:space="preserve"> </w:t>
-      </w:r>
-      <w:r>
-        <w:t xml:space="preserve">| Framework Dashboard | Streamlit (mặc định) hay web frontend riêng nếu cần UI sát mockup Figma |</w:t>
-      </w:r>
-    </w:p>
-    <w:p>
-      <w:pPr>
-        <w:pStyle w:val="BodyText"/>
-      </w:pPr>
-      <w:r>
-        <w:rPr>
-          <w:b/>
-          <w:bCs/>
-        </w:rPr>
-        <w:t xml:space="preserve">Còn mở — cần chốt trước khi code V0 (chặn Tuần 1-2):</w:t>
-      </w:r>
-      <w:r>
-        <w:t xml:space="preserve"> </w:t>
-      </w:r>
-      <w:r>
-        <w:t xml:space="preserve">| Quyết định | Vì sao cần | Ai chốt |</w:t>
-      </w:r>
-      <w:r>
-        <w:t xml:space="preserve"> </w:t>
-      </w:r>
-      <w:r>
-        <w:t xml:space="preserve">|—|—|—|</w:t>
-      </w:r>
-      <w:r>
-        <w:t xml:space="preserve"> </w:t>
-      </w:r>
-      <w:r>
-        <w:t xml:space="preserve">|</w:t>
-      </w:r>
-      <w:r>
-        <w:t xml:space="preserve"> </w:t>
-      </w:r>
-      <w:r>
-        <w:rPr>
-          <w:rStyle w:val="VerbatimChar"/>
-        </w:rPr>
-        <w:t xml:space="preserve">operating_mode</w:t>
-      </w:r>
-      <w:r>
-        <w:t xml:space="preserve"> </w:t>
-      </w:r>
-      <w:r>
-        <w:t xml:space="preserve">mặc định (</w:t>
-      </w:r>
-      <w:r>
-        <w:rPr>
-          <w:rStyle w:val="VerbatimChar"/>
-        </w:rPr>
-        <w:t xml:space="preserve">auto</w:t>
-      </w:r>
-      <w:r>
-        <w:t xml:space="preserve"> </w:t>
-      </w:r>
-      <w:r>
-        <w:t xml:space="preserve">hay</w:t>
-      </w:r>
-      <w:r>
-        <w:t xml:space="preserve"> </w:t>
-      </w:r>
-      <w:r>
-        <w:rPr>
-          <w:rStyle w:val="VerbatimChar"/>
-        </w:rPr>
-        <w:t xml:space="preserve">human_qc</w:t>
-      </w:r>
-      <w:r>
-        <w:t xml:space="preserve">) cho từng loại nội dung/dự án | Quyết định luồng review có block hay không — ảnh hưởng thiết kế Dashboard &amp; MCP QC Agent | Bạn + team sản xuất nội dung |</w:t>
-      </w:r>
-      <w:r>
-        <w:t xml:space="preserve"> </w:t>
-      </w:r>
-      <w:r>
-        <w:t xml:space="preserve">| Deepix và Clip AI/Kling có REST API + Webhook thật không, hay chỉ có giao diện Web | Nếu chỉ có Web, Bước 2 &amp; 4 phải dùng Playwright automation thay vì gọi API — kiến trúc MCP server khác hẳn (chậm hơn, dễ vỡ hơn khi UI đổi) | Team dev nội bộ giữ API Deepix/Clip AI |</w:t>
-      </w:r>
-      <w:r>
-        <w:t xml:space="preserve"> </w:t>
-      </w:r>
-      <w:r>
-        <w:t xml:space="preserve">|</w:t>
-      </w:r>
-      <w:r>
-        <w:t xml:space="preserve"> </w:t>
-      </w:r>
-      <w:r>
-        <w:rPr>
-          <w:rStyle w:val="VerbatimChar"/>
-        </w:rPr>
-        <w:t xml:space="preserve">qc_auto_pass_threshold</w:t>
-      </w:r>
-      <w:r>
-        <w:t xml:space="preserve"> </w:t>
-      </w:r>
-      <w:r>
-        <w:t xml:space="preserve">khởi điểm (0.85 là giả định, chưa có dữ liệu thật) | Threshold sai (quá lỏng/chặt) làm hỏng hiệu quả cả 2 mode ngay từ đầu | Chốt tạm ở dry-run, hiệu chỉnh bằng dữ liệu thật Tuần 3 |</w:t>
-      </w:r>
-      <w:r>
-        <w:t xml:space="preserve"> </w:t>
-      </w:r>
-      <w:r>
-        <w:t xml:space="preserve">| Ngân sách credit cho giai đoạn thử nghiệm (Deepix + Clip AI/Kling) | Dry-run + retry loop đều tốn credit thật; cần biết giới hạn trước khi chạy batch | Bạn / người giữ ngân sách |</w:t>
-      </w:r>
-    </w:p>
-    <w:bookmarkEnd w:id="35"/>
-    <w:bookmarkStart w:id="36" w:name="Xd77c4f47b903719b6fbd5f054853d76240e8579"/>
-    <w:p>
-      <w:pPr>
-        <w:pStyle w:val="Heading2"/>
-      </w:pPr>
-      <w:r>
-        <w:t xml:space="preserve">6. Checklist chuẩn bị — cần có gì trước khi bắt đầu Tuần 1</w:t>
-      </w:r>
-    </w:p>
-    <w:p>
-      <w:pPr>
-        <w:pStyle w:val="FirstParagraph"/>
-      </w:pPr>
-      <w:r>
-        <w:rPr>
-          <w:b/>
-          <w:bCs/>
-        </w:rPr>
-        <w:t xml:space="preserve">Truy cập &amp; tài liệu:</w:t>
-      </w:r>
-      <w:r>
-        <w:t xml:space="preserve"> </w:t>
-      </w:r>
-      <w:r>
-        <w:t xml:space="preserve">- [x] API endpoint + API Key/Authentication của</w:t>
-      </w:r>
-      <w:r>
-        <w:t xml:space="preserve"> </w:t>
-      </w:r>
-      <w:r>
-        <w:rPr>
-          <w:b/>
-          <w:bCs/>
-        </w:rPr>
-        <w:t xml:space="preserve">Deepix</w:t>
-      </w:r>
-      <w:r>
-        <w:t xml:space="preserve"> </w:t>
-      </w:r>
-      <w:r>
-        <w:t xml:space="preserve">(REST): có API; cần tài liệu chi tiết để viết adapter</w:t>
-      </w:r>
-      <w:r>
-        <w:t xml:space="preserve"> </w:t>
-      </w:r>
-      <w:r>
-        <w:t xml:space="preserve">- [x] API của</w:t>
-      </w:r>
-      <w:r>
-        <w:t xml:space="preserve"> </w:t>
-      </w:r>
-      <w:r>
-        <w:rPr>
-          <w:b/>
-          <w:bCs/>
-        </w:rPr>
-        <w:t xml:space="preserve">Clip AI</w:t>
-      </w:r>
-      <w:r>
-        <w:t xml:space="preserve"> </w:t>
-      </w:r>
-      <w:r>
-        <w:t xml:space="preserve">(đa model):</w:t>
-      </w:r>
-      <w:r>
-        <w:t xml:space="preserve"> </w:t>
-      </w:r>
-      <w:r>
-        <w:rPr>
-          <w:b/>
-          <w:bCs/>
-        </w:rPr>
-        <w:t xml:space="preserve">đã có</w:t>
-      </w:r>
-      <w:r>
-        <w:t xml:space="preserve">; còn thiếu tài liệu endpoint/auth để viết adapter (key đặt trong biến môi trường, không đưa vào repo)</w:t>
-      </w:r>
-      <w:r>
-        <w:t xml:space="preserve"> </w:t>
-      </w:r>
-      <w:r>
-        <w:t xml:space="preserve">- [ ] Xác nhận rate limit / quota của cả 2 API (ảnh hưởng trực tiếp</w:t>
-      </w:r>
-      <w:r>
-        <w:t xml:space="preserve"> </w:t>
-      </w:r>
-      <w:r>
-        <w:rPr>
-          <w:rStyle w:val="VerbatimChar"/>
-        </w:rPr>
-        <w:t xml:space="preserve">batch_poll_interval_seconds</w:t>
-      </w:r>
-      <w:r>
-        <w:t xml:space="preserve">)</w:t>
-      </w:r>
-      <w:r>
-        <w:t xml:space="preserve"> </w:t>
-      </w:r>
-      <w:r>
-        <w:t xml:space="preserve">- [ ] Tài liệu response schema của Kling AI khi bị content-moderation chặn (để</w:t>
-      </w:r>
-      <w:r>
-        <w:t xml:space="preserve"> </w:t>
-      </w:r>
-      <w:r>
-        <w:rPr>
-          <w:rStyle w:val="VerbatimChar"/>
-        </w:rPr>
-        <w:t xml:space="preserve">mcp-server-clipai</w:t>
-      </w:r>
-      <w:r>
-        <w:t xml:space="preserve"> </w:t>
-      </w:r>
-      <w:r>
-        <w:t xml:space="preserve">parse đúng lỗi</w:t>
-      </w:r>
-      <w:r>
-        <w:t xml:space="preserve"> </w:t>
-      </w:r>
-      <w:r>
-        <w:t xml:space="preserve">“Failure to pass the risk control system”</w:t>
-      </w:r>
-      <w:r>
-        <w:t xml:space="preserve"> </w:t>
-      </w:r>
-      <w:r>
-        <w:t xml:space="preserve">— Comment 4)</w:t>
-      </w:r>
-    </w:p>
-    <w:p>
-      <w:pPr>
-        <w:pStyle w:val="BodyText"/>
-      </w:pPr>
-      <w:r>
-        <w:rPr>
-          <w:b/>
-          <w:bCs/>
-        </w:rPr>
-        <w:t xml:space="preserve">Hạ tầng vận hành:</w:t>
-      </w:r>
-      <w:r>
-        <w:t xml:space="preserve"> </w:t>
-      </w:r>
-      <w:r>
-        <w:t xml:space="preserve">- [ ] Máy chạy pipeline (PC vận hành) cài</w:t>
-      </w:r>
-      <w:r>
-        <w:t xml:space="preserve"> </w:t>
-      </w:r>
-      <w:r>
-        <w:rPr>
-          <w:b/>
-          <w:bCs/>
-        </w:rPr>
-        <w:t xml:space="preserve">Claude Desktop App</w:t>
-      </w:r>
-      <w:r>
-        <w:t xml:space="preserve"> </w:t>
-      </w:r>
-      <w:r>
-        <w:t xml:space="preserve">+ Python runtime</w:t>
-      </w:r>
-      <w:r>
-        <w:t xml:space="preserve"> </w:t>
-      </w:r>
-      <w:r>
-        <w:t xml:space="preserve">- [ ] File</w:t>
-      </w:r>
-      <w:r>
-        <w:t xml:space="preserve"> </w:t>
-      </w:r>
-      <w:r>
-        <w:rPr>
-          <w:rStyle w:val="VerbatimChar"/>
-        </w:rPr>
-        <w:t xml:space="preserve">claude_desktop_config.json</w:t>
-      </w:r>
-      <w:r>
-        <w:t xml:space="preserve"> </w:t>
-      </w:r>
-      <w:r>
-        <w:t xml:space="preserve">trỏ tới các MCP servers local</w:t>
-      </w:r>
-      <w:r>
-        <w:t xml:space="preserve"> </w:t>
-      </w:r>
-      <w:r>
-        <w:t xml:space="preserve">- [ ] Môi trường Python cho lớp core + 6 MCP servers (</w:t>
-      </w:r>
-      <w:r>
-        <w:rPr>
-          <w:rStyle w:val="VerbatimChar"/>
-        </w:rPr>
-        <w:t xml:space="preserve">project-db</w:t>
-      </w:r>
-      <w:r>
-        <w:t xml:space="preserve">,</w:t>
-      </w:r>
-      <w:r>
-        <w:t xml:space="preserve"> </w:t>
-      </w:r>
-      <w:r>
-        <w:rPr>
-          <w:rStyle w:val="VerbatimChar"/>
-        </w:rPr>
-        <w:t xml:space="preserve">deepix</w:t>
-      </w:r>
-      <w:r>
-        <w:t xml:space="preserve">,</w:t>
-      </w:r>
-      <w:r>
-        <w:t xml:space="preserve"> </w:t>
-      </w:r>
-      <w:r>
-        <w:rPr>
-          <w:rStyle w:val="VerbatimChar"/>
-        </w:rPr>
-        <w:t xml:space="preserve">qc-agent</w:t>
-      </w:r>
-      <w:r>
-        <w:t xml:space="preserve">,</w:t>
-      </w:r>
-      <w:r>
-        <w:t xml:space="preserve"> </w:t>
-      </w:r>
-      <w:r>
-        <w:rPr>
-          <w:rStyle w:val="VerbatimChar"/>
-        </w:rPr>
-        <w:t xml:space="preserve">clipai</w:t>
-      </w:r>
-      <w:r>
-        <w:t xml:space="preserve">,</w:t>
-      </w:r>
-      <w:r>
-        <w:t xml:space="preserve"> </w:t>
-      </w:r>
-      <w:r>
-        <w:rPr>
-          <w:rStyle w:val="VerbatimChar"/>
-        </w:rPr>
-        <w:t xml:space="preserve">ffmpeg</w:t>
-      </w:r>
-      <w:r>
-        <w:t xml:space="preserve">,</w:t>
-      </w:r>
-      <w:r>
-        <w:t xml:space="preserve"> </w:t>
-      </w:r>
-      <w:r>
-        <w:rPr>
-          <w:rStyle w:val="VerbatimChar"/>
-        </w:rPr>
-        <w:t xml:space="preserve">music</w:t>
-      </w:r>
-      <w:r>
-        <w:t xml:space="preserve">) — venv/dependencies</w:t>
-      </w:r>
-      <w:r>
-        <w:t xml:space="preserve"> </w:t>
-      </w:r>
-      <w:r>
-        <w:t xml:space="preserve">- [ ] (V1) API key Anthropic Console cho Director/QC gọi bằng code — xem Mục 5</w:t>
-      </w:r>
-      <w:r>
-        <w:t xml:space="preserve"> </w:t>
-      </w:r>
-      <w:r>
-        <w:t xml:space="preserve">- [ ] FFmpeg cài local, kiểm tra version + codec cần dùng (transition, re-encode)</w:t>
-      </w:r>
-      <w:r>
-        <w:t xml:space="preserve"> </w:t>
-      </w:r>
-      <w:r>
-        <w:t xml:space="preserve">- [ ] Ổ đĩa đủ dung lượng cho</w:t>
-      </w:r>
-      <w:r>
-        <w:t xml:space="preserve"> </w:t>
-      </w:r>
-      <w:r>
-        <w:rPr>
-          <w:rStyle w:val="VerbatimChar"/>
-        </w:rPr>
-        <w:t xml:space="preserve">/images/</w:t>
-      </w:r>
-      <w:r>
-        <w:t xml:space="preserve">,</w:t>
-      </w:r>
-      <w:r>
-        <w:t xml:space="preserve"> </w:t>
-      </w:r>
-      <w:r>
-        <w:rPr>
-          <w:rStyle w:val="VerbatimChar"/>
-        </w:rPr>
-        <w:t xml:space="preserve">/videos/</w:t>
-      </w:r>
-      <w:r>
-        <w:t xml:space="preserve"> </w:t>
-      </w:r>
-      <w:r>
-        <w:t xml:space="preserve">khi chạy batch lớn</w:t>
-      </w:r>
-    </w:p>
-    <w:p>
-      <w:pPr>
-        <w:pStyle w:val="BodyText"/>
-      </w:pPr>
-      <w:r>
-        <w:rPr>
-          <w:b/>
-          <w:bCs/>
-        </w:rPr>
-        <w:t xml:space="preserve">Dữ liệu &amp; nội dung:</w:t>
-      </w:r>
-      <w:r>
-        <w:t xml:space="preserve"> </w:t>
-      </w:r>
-      <w:r>
-        <w:t xml:space="preserve">- [ ] 2 kịch bản mẫu (5-10 cảnh/kịch bản) để dry-run Tuần 3</w:t>
-      </w:r>
-      <w:r>
-        <w:t xml:space="preserve"> </w:t>
-      </w:r>
-      <w:r>
-        <w:t xml:space="preserve">- [ ] Danh sách IP/nhân vật dự kiến dùng trong dự án thật — để build blocklist ban đầu trước khi chạy batch thật (Comment 4)</w:t>
-      </w:r>
-      <w:r>
-        <w:t xml:space="preserve"> </w:t>
-      </w:r>
-      <w:r>
-        <w:t xml:space="preserve">- [ ] Bộ tiêu chí</w:t>
-      </w:r>
-      <w:r>
-        <w:t xml:space="preserve"> </w:t>
-      </w:r>
-      <w:r>
-        <w:rPr>
-          <w:rStyle w:val="VerbatimChar"/>
-        </w:rPr>
-        <w:t xml:space="preserve">qc_checklist</w:t>
-      </w:r>
-      <w:r>
-        <w:t xml:space="preserve"> </w:t>
-      </w:r>
-      <w:r>
-        <w:t xml:space="preserve">cụ thể (không chỉ</w:t>
-      </w:r>
-      <w:r>
-        <w:t xml:space="preserve"> </w:t>
-      </w:r>
-      <w:r>
-        <w:t xml:space="preserve">“đúng nhân vật”</w:t>
-      </w:r>
-      <w:r>
-        <w:t xml:space="preserve"> </w:t>
-      </w:r>
-      <w:r>
-        <w:t xml:space="preserve">chung chung — cần liệt kê rõ: góc mặt, trang phục, tỉ lệ khung hình, độ phân giải tối thiểu…) để Claude Vision QC Agent chấm điểm nhất quán</w:t>
-      </w:r>
-    </w:p>
-    <w:p>
-      <w:pPr>
-        <w:pStyle w:val="BodyText"/>
-      </w:pPr>
-      <w:r>
-        <w:rPr>
-          <w:b/>
-          <w:bCs/>
-        </w:rPr>
-        <w:t xml:space="preserve">Con người / vai trò:</w:t>
-      </w:r>
-      <w:r>
-        <w:t xml:space="preserve"> </w:t>
-      </w:r>
-      <w:r>
-        <w:t xml:space="preserve">- [ ] Người build 5 MCP servers (dev)</w:t>
-      </w:r>
-      <w:r>
-        <w:t xml:space="preserve"> </w:t>
-      </w:r>
-      <w:r>
-        <w:t xml:space="preserve">- [ ] Người thiết kế &amp; build Streamlit Dashboard</w:t>
-      </w:r>
-      <w:r>
-        <w:t xml:space="preserve"> </w:t>
-      </w:r>
-      <w:r>
-        <w:t xml:space="preserve">- [ ] Người review thẩm mỹ thật (đóng vai</w:t>
-      </w:r>
-      <w:r>
-        <w:t xml:space="preserve"> </w:t>
-      </w:r>
-      <w:r>
-        <w:t xml:space="preserve">“User”</w:t>
-      </w:r>
-      <w:r>
-        <w:t xml:space="preserve"> </w:t>
-      </w:r>
-      <w:r>
-        <w:t xml:space="preserve">ở 3 điểm kiểm duyệt) trong dry-run — cần người này để đo % Claude Vision QC Agent đúng/sai thực tế</w:t>
-      </w:r>
-      <w:r>
-        <w:t xml:space="preserve"> </w:t>
-      </w:r>
-      <w:r>
-        <w:t xml:space="preserve">- [ ]</w:t>
-      </w:r>
-      <w:r>
-        <w:t xml:space="preserve"> </w:t>
-      </w:r>
-      <w:r>
-        <w:t xml:space="preserve">“Chuyên gia miền”</w:t>
-      </w:r>
-      <w:r>
-        <w:t xml:space="preserve"> </w:t>
-      </w:r>
-      <w:r>
-        <w:t xml:space="preserve">biên kịch/đạo diễn để duyệt Knowledge Base và chấm eval set (Mục 3.6)</w:t>
-      </w:r>
-      <w:r>
-        <w:t xml:space="preserve"> </w:t>
-      </w:r>
-      <w:r>
-        <w:t xml:space="preserve">- [ ] Nguồn tri thức nền: sách/giáo trình biên kịch-đạo diễn-quay phim, kịch bản + storyboard các dự án cũ (Mục 3.6)</w:t>
-      </w:r>
-      <w:r>
-        <w:t xml:space="preserve"> </w:t>
-      </w:r>
-      <w:r>
-        <w:t xml:space="preserve">- [ ] Người giữ quan hệ với team dev nội bộ cấp API Deepix/Clip AI</w:t>
-      </w:r>
-    </w:p>
-    <w:bookmarkEnd w:id="36"/>
-    <w:bookmarkStart w:id="40" w:name="lộ-trình-triển-khai-v0-v1"/>
-    <w:p>
-      <w:pPr>
-        <w:pStyle w:val="Heading2"/>
-      </w:pPr>
-      <w:r>
-        <w:t xml:space="preserve">7. Lộ trình triển khai: V0 → V1</w:t>
-      </w:r>
-    </w:p>
-    <w:bookmarkStart w:id="37" w:name="X96af04f5f0dc0fae4ea4bac7edaf06b3f002467"/>
-    <w:p>
-      <w:pPr>
-        <w:pStyle w:val="Heading3"/>
-      </w:pPr>
-      <w:r>
-        <w:t xml:space="preserve">Giai đoạn V0 — Thử nghiệm (Claude Desktop + MCP, ≈ 3–4 tuần)</w:t>
-      </w:r>
-    </w:p>
-    <w:p>
-      <w:pPr>
-        <w:pStyle w:val="FirstParagraph"/>
-      </w:pPr>
-      <w:r>
-        <w:t xml:space="preserve">Mục tiêu: chứng minh pipeline end-to-end chạy được, đo chất lượng QC, hiệu chỉnh threshold, chốt Knowledge Base/prompt. Các bước cần Claude (Director Bước 1/3, QC Bước 2, Music Brief) chạy qua chat Claude Desktop với prompt template chuẩn; các thao tác còn lại gọi qua MCP tool. Dashboard V0 tối giản (xem trạng thái + duyệt ảnh) hoặc bỏ qua.</w:t>
-      </w:r>
-    </w:p>
-    <w:p>
-      <w:pPr>
-        <w:pStyle w:val="BodyText"/>
-      </w:pPr>
-      <w:r>
-        <w:rPr>
-          <w:b/>
-          <w:bCs/>
-        </w:rPr>
-        <w:t xml:space="preserve">Tuần 1 — Hạ tầng &amp; chốt quyết định mở</w:t>
-      </w:r>
-      <w:r>
-        <w:t xml:space="preserve"> </w:t>
-      </w:r>
-      <w:r>
-        <w:t xml:space="preserve">- Đã có API Deepix và Clip AI; đọc tài liệu API để viết adapter (nếu chỉ có Web thì Playwright, +1–2 tuần).</w:t>
-      </w:r>
-      <w:r>
-        <w:t xml:space="preserve"> </w:t>
-      </w:r>
-      <w:r>
-        <w:t xml:space="preserve">- Cài Claude Desktop + Python; test kết nối MCP cơ bản (</w:t>
-      </w:r>
-      <w:r>
-        <w:t xml:space="preserve">“hello world”</w:t>
-      </w:r>
-      <w:r>
-        <w:t xml:space="preserve">).</w:t>
-      </w:r>
-      <w:r>
-        <w:t xml:space="preserve"> </w:t>
-      </w:r>
-      <w:r>
-        <w:t xml:space="preserve">- Chốt</w:t>
-      </w:r>
-      <w:r>
-        <w:t xml:space="preserve"> </w:t>
-      </w:r>
-      <w:r>
-        <w:rPr>
-          <w:rStyle w:val="VerbatimChar"/>
-        </w:rPr>
-        <w:t xml:space="preserve">operating_mode</w:t>
-      </w:r>
-      <w:r>
-        <w:t xml:space="preserve"> </w:t>
-      </w:r>
-      <w:r>
-        <w:t xml:space="preserve">mặc định, ngân sách credit thử nghiệm.</w:t>
-      </w:r>
-      <w:r>
-        <w:t xml:space="preserve"> </w:t>
-      </w:r>
-      <w:r>
-        <w:t xml:space="preserve">- Khởi động Knowledge Base (Mục 3.6): thu thập + lọc nguồn, chọn chuyên gia miền.</w:t>
-      </w:r>
-      <w:r>
-        <w:t xml:space="preserve"> </w:t>
-      </w:r>
-      <w:r>
-        <w:t xml:space="preserve">-</w:t>
-      </w:r>
-      <w:r>
-        <w:t xml:space="preserve"> </w:t>
-      </w:r>
-      <w:r>
-        <w:rPr>
-          <w:b/>
-          <w:bCs/>
-        </w:rPr>
-        <w:t xml:space="preserve">Deliverable:</w:t>
-      </w:r>
-      <w:r>
-        <w:t xml:space="preserve"> </w:t>
-      </w:r>
-      <w:r>
-        <w:t xml:space="preserve">API access hoạt động, môi trường sẵn sàng, các quyết định chặn V0 đã chốt.</w:t>
-      </w:r>
-    </w:p>
-    <w:p>
-      <w:pPr>
-        <w:pStyle w:val="BodyText"/>
-      </w:pPr>
-      <w:r>
-        <w:rPr>
-          <w:b/>
-          <w:bCs/>
-        </w:rPr>
-        <w:t xml:space="preserve">Tuần 2 — Core + MCP servers</w:t>
-      </w:r>
-      <w:r>
-        <w:t xml:space="preserve"> </w:t>
-      </w:r>
-      <w:r>
-        <w:t xml:space="preserve">- Implement schema SQLite + state machine</w:t>
-      </w:r>
-      <w:r>
-        <w:t xml:space="preserve"> </w:t>
-      </w:r>
-      <w:r>
-        <w:rPr>
-          <w:b/>
-          <w:bCs/>
-        </w:rPr>
-        <w:t xml:space="preserve">trước tiên</w:t>
-      </w:r>
-      <w:r>
-        <w:t xml:space="preserve"> </w:t>
-      </w:r>
-      <w:r>
-        <w:t xml:space="preserve">trong lớp core dùng chung.</w:t>
-      </w:r>
-      <w:r>
-        <w:t xml:space="preserve"> </w:t>
-      </w:r>
-      <w:r>
-        <w:t xml:space="preserve">- Build MCP</w:t>
-      </w:r>
-      <w:r>
-        <w:t xml:space="preserve"> </w:t>
-      </w:r>
-      <w:r>
-        <w:rPr>
-          <w:rStyle w:val="VerbatimChar"/>
-        </w:rPr>
-        <w:t xml:space="preserve">project-db</w:t>
-      </w:r>
-      <w:r>
-        <w:t xml:space="preserve">,</w:t>
-      </w:r>
-      <w:r>
-        <w:t xml:space="preserve"> </w:t>
-      </w:r>
-      <w:r>
-        <w:rPr>
-          <w:rStyle w:val="VerbatimChar"/>
-        </w:rPr>
-        <w:t xml:space="preserve">deepix</w:t>
-      </w:r>
-      <w:r>
-        <w:t xml:space="preserve">,</w:t>
-      </w:r>
-      <w:r>
-        <w:t xml:space="preserve"> </w:t>
-      </w:r>
-      <w:r>
-        <w:rPr>
-          <w:rStyle w:val="VerbatimChar"/>
-        </w:rPr>
-        <w:t xml:space="preserve">qc-agent</w:t>
-      </w:r>
-      <w:r>
-        <w:t xml:space="preserve"> </w:t>
-      </w:r>
-      <w:r>
-        <w:t xml:space="preserve">(cả 2 nhánh</w:t>
-      </w:r>
-      <w:r>
-        <w:t xml:space="preserve"> </w:t>
-      </w:r>
-      <w:r>
-        <w:rPr>
-          <w:rStyle w:val="VerbatimChar"/>
-        </w:rPr>
-        <w:t xml:space="preserve">auto</w:t>
-      </w:r>
-      <w:r>
-        <w:t xml:space="preserve">/</w:t>
-      </w:r>
-      <w:r>
-        <w:rPr>
-          <w:rStyle w:val="VerbatimChar"/>
-        </w:rPr>
-        <w:t xml:space="preserve">human_qc</w:t>
-      </w:r>
-      <w:r>
-        <w:t xml:space="preserve">),</w:t>
-      </w:r>
-      <w:r>
-        <w:t xml:space="preserve"> </w:t>
-      </w:r>
-      <w:r>
-        <w:rPr>
-          <w:rStyle w:val="VerbatimChar"/>
-        </w:rPr>
-        <w:t xml:space="preserve">clipai</w:t>
-      </w:r>
-      <w:r>
-        <w:t xml:space="preserve"> </w:t>
-      </w:r>
-      <w:r>
-        <w:t xml:space="preserve">(heartbeat polling, parse lỗi moderation),</w:t>
-      </w:r>
-      <w:r>
-        <w:t xml:space="preserve"> </w:t>
-      </w:r>
-      <w:r>
-        <w:rPr>
-          <w:rStyle w:val="VerbatimChar"/>
-        </w:rPr>
-        <w:t xml:space="preserve">ffmpeg</w:t>
-      </w:r>
-      <w:r>
-        <w:t xml:space="preserve">;</w:t>
-      </w:r>
-      <w:r>
-        <w:t xml:space="preserve"> </w:t>
-      </w:r>
-      <w:r>
-        <w:rPr>
-          <w:rStyle w:val="VerbatimChar"/>
-        </w:rPr>
-        <w:t xml:space="preserve">music</w:t>
-      </w:r>
-      <w:r>
-        <w:t xml:space="preserve"> </w:t>
-      </w:r>
-      <w:r>
-        <w:t xml:space="preserve">có thể để sau (upload nhạc thủ công ở V0).</w:t>
-      </w:r>
-      <w:r>
-        <w:t xml:space="preserve"> </w:t>
-      </w:r>
-      <w:r>
-        <w:t xml:space="preserve">- Song song: viết system prompt + JSON schema cho Director/QC, tạo eval set.</w:t>
-      </w:r>
-      <w:r>
-        <w:t xml:space="preserve"> </w:t>
-      </w:r>
-      <w:r>
-        <w:t xml:space="preserve">-</w:t>
-      </w:r>
-      <w:r>
-        <w:t xml:space="preserve"> </w:t>
-      </w:r>
-      <w:r>
-        <w:rPr>
-          <w:b/>
-          <w:bCs/>
-        </w:rPr>
-        <w:t xml:space="preserve">Deliverable:</w:t>
-      </w:r>
-      <w:r>
-        <w:t xml:space="preserve"> </w:t>
-      </w:r>
-      <w:r>
-        <w:t xml:space="preserve">chạy được end-to-end 1 cảnh qua 5 bước bằng tool call.</w:t>
-      </w:r>
-    </w:p>
-    <w:p>
-      <w:pPr>
-        <w:pStyle w:val="BodyText"/>
-      </w:pPr>
-      <w:r>
-        <w:rPr>
-          <w:b/>
-          <w:bCs/>
-        </w:rPr>
-        <w:t xml:space="preserve">Tuần 3–4 — Dry-run &amp; hiệu chỉnh</w:t>
-      </w:r>
-      <w:r>
-        <w:t xml:space="preserve"> </w:t>
-      </w:r>
-      <w:r>
-        <w:t xml:space="preserve">- Dry-run 2 kịch bản mẫu (5–10 cảnh) ở cả 2 mode; người review thật chấm song song với QC Agent → tính % đồng thuận → hiệu chỉnh</w:t>
-      </w:r>
-      <w:r>
-        <w:t xml:space="preserve"> </w:t>
-      </w:r>
-      <w:r>
-        <w:rPr>
-          <w:rStyle w:val="VerbatimChar"/>
-        </w:rPr>
-        <w:t xml:space="preserve">qc_auto_pass_threshold</w:t>
-      </w:r>
-      <w:r>
-        <w:t xml:space="preserve"> </w:t>
-      </w:r>
-      <w:r>
-        <w:t xml:space="preserve">(0.85 chỉ là giả định).</w:t>
-      </w:r>
-      <w:r>
-        <w:t xml:space="preserve"> </w:t>
-      </w:r>
-      <w:r>
-        <w:t xml:space="preserve">- Lặp cải thiện prompt theo eval set; build blocklist IP v1 (case Wonder Woman + danh sách nhân vật dự kiến).</w:t>
-      </w:r>
-      <w:r>
-        <w:t xml:space="preserve"> </w:t>
-      </w:r>
-      <w:r>
-        <w:t xml:space="preserve">-</w:t>
-      </w:r>
-      <w:r>
-        <w:t xml:space="preserve"> </w:t>
-      </w:r>
-      <w:r>
-        <w:rPr>
-          <w:b/>
-          <w:bCs/>
-        </w:rPr>
-        <w:t xml:space="preserve">Cổng chuyển V1:</w:t>
-      </w:r>
-      <w:r>
-        <w:t xml:space="preserve"> </w:t>
-      </w:r>
-      <w:r>
-        <w:t xml:space="preserve">≥1 video hoàn chỉnh end-to-end, threshold đã hiệu chỉnh bằng dữ liệu, prompt/checklist khóa version.</w:t>
-      </w:r>
-    </w:p>
-    <w:bookmarkEnd w:id="37"/>
-    <w:bookmarkStart w:id="38" w:name="X3d60c8a93cbf48f59874d7f70b2bf9f5f0f0b9b"/>
-    <w:p>
-      <w:pPr>
-        <w:pStyle w:val="Heading3"/>
-      </w:pPr>
-      <w:r>
-        <w:t xml:space="preserve">Giai đoạn V1 — Hợp nhất trên 1 Dashboard (≈ +3–4 tuần, cần API key Anthropic)</w:t>
+        <w:t xml:space="preserve">Đã chốt hướng (2026-09-23, rà soát nhất quán — xem 3.7):</w:t>
       </w:r>
     </w:p>
     <w:p>
@@ -6148,21 +5950,52 @@
         <w:pStyle w:val="Compact"/>
         <w:numPr>
           <w:ilvl w:val="0"/>
-          <w:numId w:val="1004"/>
+          <w:numId w:val="1007"/>
         </w:numPr>
       </w:pPr>
       <w:r>
-        <w:rPr>
-          <w:b/>
-          <w:bCs/>
-        </w:rPr>
-        <w:t xml:space="preserve">Song song đầu V1:</w:t>
-      </w:r>
-      <w:r>
-        <w:t xml:space="preserve"> </w:t>
-      </w:r>
-      <w:r>
-        <w:t xml:space="preserve">Figma mockup chi tiết (Mục 3.4) → user duyệt trước khi build.</w:t>
+        <w:t xml:space="preserve">Workflow hiện</w:t>
+      </w:r>
+      <w:r>
+        <w:t xml:space="preserve"> </w:t>
+      </w:r>
+      <w:r>
+        <w:rPr>
+          <w:b/>
+          <w:bCs/>
+        </w:rPr>
+        <w:t xml:space="preserve">chạy được</w:t>
+      </w:r>
+      <w:r>
+        <w:t xml:space="preserve"> </w:t>
+      </w:r>
+      <w:r>
+        <w:t xml:space="preserve">(đã ra video 8 cảnh ~46 giây) nhưng</w:t>
+      </w:r>
+      <w:r>
+        <w:t xml:space="preserve"> </w:t>
+      </w:r>
+      <w:r>
+        <w:rPr>
+          <w:b/>
+          <w:bCs/>
+        </w:rPr>
+        <w:t xml:space="preserve">chưa chứng minh hiệu quả</w:t>
+      </w:r>
+      <w:r>
+        <w:t xml:space="preserve">: chưa đạt cổng chuyển V1 (threshold QC chưa hiệu chỉnh bằng dữ liệu, prompt chưa khóa version qua</w:t>
+      </w:r>
+      <w:r>
+        <w:t xml:space="preserve"> </w:t>
+      </w:r>
+      <w:r>
+        <w:rPr>
+          <w:rStyle w:val="VerbatimChar"/>
+        </w:rPr>
+        <w:t xml:space="preserve">eval/</w:t>
+      </w:r>
+      <w:r>
+        <w:t xml:space="preserve">), chưa có số liệu so với làm tay. Cần báo cáo 5 chỉ số: thời gian/giây video, chi phí/giây video, tỉ lệ đạt lần đầu, đồng thuận QC–người, số lần can thiệp tay/cảnh.</w:t>
       </w:r>
     </w:p>
     <w:p>
@@ -6170,11 +6003,11 @@
         <w:pStyle w:val="Compact"/>
         <w:numPr>
           <w:ilvl w:val="0"/>
-          <w:numId w:val="1004"/>
+          <w:numId w:val="1007"/>
         </w:numPr>
       </w:pPr>
       <w:r>
-        <w:t xml:space="preserve">Build Dashboard theo Mục 3.4 (stepper 5 bước, control bar toàn cục, nút điều khiển từng khâu, Kanban, tab Lịch sử, cảnh báo IP, tiến độ heartbeat) gọi lớp core.</w:t>
+        <w:t xml:space="preserve">Không dựng quy trình riêng cho từng model video; chỉ có hồ sơ khả năng từng model ở Bước 4 + bộ test cố định 3 cảnh.</w:t>
       </w:r>
     </w:p>
     <w:p>
@@ -6182,11 +6015,27 @@
         <w:pStyle w:val="Compact"/>
         <w:numPr>
           <w:ilvl w:val="0"/>
-          <w:numId w:val="1004"/>
+          <w:numId w:val="1007"/>
         </w:numPr>
       </w:pPr>
       <w:r>
-        <w:t xml:space="preserve">Thay LLM runner từ chat thủ công sang Anthropic API (cùng prompt template + schema).</w:t>
+        <w:t xml:space="preserve">Hướng chính cho bối cảnh chân thực =</w:t>
+      </w:r>
+      <w:r>
+        <w:t xml:space="preserve"> </w:t>
+      </w:r>
+      <w:r>
+        <w:rPr>
+          <w:b/>
+          <w:bCs/>
+        </w:rPr>
+        <w:t xml:space="preserve">previz 3D từ map FF</w:t>
+      </w:r>
+      <w:r>
+        <w:t xml:space="preserve"> </w:t>
+      </w:r>
+      <w:r>
+        <w:t xml:space="preserve">(Blender tự động), thử trước bằng map fan trên mạng; không yêu cầu người dùng đánh dấu tay ảnh.</w:t>
       </w:r>
     </w:p>
     <w:p>
@@ -6194,26 +6043,170 @@
         <w:pStyle w:val="Compact"/>
         <w:numPr>
           <w:ilvl w:val="0"/>
-          <w:numId w:val="1004"/>
+          <w:numId w:val="1007"/>
         </w:numPr>
       </w:pPr>
       <w:r>
-        <w:t xml:space="preserve">Build</w:t>
-      </w:r>
-      <w:r>
-        <w:t xml:space="preserve"> </w:t>
-      </w:r>
-      <w:r>
-        <w:rPr>
-          <w:rStyle w:val="VerbatimChar"/>
-        </w:rPr>
-        <w:t xml:space="preserve">mcp-server-music</w:t>
-      </w:r>
-      <w:r>
-        <w:t xml:space="preserve"> </w:t>
-      </w:r>
-      <w:r>
-        <w:t xml:space="preserve">+ Bước 5a (Music Brief, 3 bản nháp) sau khi chọn</w:t>
+        <w:t xml:space="preserve">Thứ tự: sửa chọn ảnh tham chiếu/bối cảnh/blocking (A–C) → thử previz 3D + Deepix bám layout (cổng quyết định) → tích hợp Dashboard → test so model.</w:t>
+      </w:r>
+    </w:p>
+    <w:p>
+      <w:pPr>
+        <w:pStyle w:val="FirstParagraph"/>
+      </w:pPr>
+      <w:r>
+        <w:rPr>
+          <w:b/>
+          <w:bCs/>
+        </w:rPr>
+        <w:t xml:space="preserve">Còn mở (2026-09-23):</w:t>
+      </w:r>
+    </w:p>
+    <w:tbl>
+      <w:tblPr>
+        <w:tblStyle w:val="Table"/>
+        <w:tblW w:type="pct" w:w="5000"/>
+        <w:tblLayout w:type="fixed"/>
+        <w:tblLook w:firstRow="1" w:lastRow="0" w:firstColumn="0" w:lastColumn="0" w:noHBand="0" w:noVBand="0" w:val="0020"/>
+      </w:tblPr>
+      <w:tblGrid>
+        <w:gridCol w:w="3960"/>
+        <w:gridCol w:w="3960"/>
+      </w:tblGrid>
+      <w:tr>
+        <w:trPr>
+          <w:tblHeader w:val="on"/>
+        </w:trPr>
+        <w:tc>
+          <w:tcPr/>
+          <w:p>
+            <w:pPr>
+              <w:pStyle w:val="Compact"/>
+            </w:pPr>
+            <w:r>
+              <w:t xml:space="preserve">Quyết định</w:t>
+            </w:r>
+          </w:p>
+        </w:tc>
+        <w:tc>
+          <w:tcPr/>
+          <w:p>
+            <w:pPr>
+              <w:pStyle w:val="Compact"/>
+            </w:pPr>
+            <w:r>
+              <w:t xml:space="preserve">Ghi chú</w:t>
+            </w:r>
+          </w:p>
+        </w:tc>
+      </w:tr>
+      <w:tr>
+        <w:tc>
+          <w:tcPr/>
+          <w:p>
+            <w:pPr>
+              <w:pStyle w:val="Compact"/>
+            </w:pPr>
+            <w:r>
+              <w:t xml:space="preserve">Deepix có bám ảnh layout từ 3D không</w:t>
+            </w:r>
+          </w:p>
+        </w:tc>
+        <w:tc>
+          <w:tcPr/>
+          <w:p>
+            <w:pPr>
+              <w:pStyle w:val="Compact"/>
+            </w:pPr>
+            <w:r>
+              <w:t xml:space="preserve">Quyết định có đưa previz 3D vào Dashboard hay không; cần thử 3–5 ảnh</w:t>
+            </w:r>
+          </w:p>
+        </w:tc>
+      </w:tr>
+      <w:tr>
+        <w:tc>
+          <w:tcPr/>
+          <w:p>
+            <w:pPr>
+              <w:pStyle w:val="Compact"/>
+            </w:pPr>
+            <w:r>
+              <w:t xml:space="preserve">Nguồn map 3D</w:t>
+            </w:r>
+          </w:p>
+        </w:tc>
+        <w:tc>
+          <w:tcPr/>
+          <w:p>
+            <w:pPr>
+              <w:pStyle w:val="Compact"/>
+            </w:pPr>
+            <w:r>
+              <w:t xml:space="preserve">Tạm dùng map fan để thử; bản phát hành cần asset chính thức từ team game (định dạng, texture, quyền dùng)</w:t>
+            </w:r>
+          </w:p>
+        </w:tc>
+      </w:tr>
+      <w:tr>
+        <w:tc>
+          <w:tcPr/>
+          <w:p>
+            <w:pPr>
+              <w:pStyle w:val="Compact"/>
+            </w:pPr>
+            <w:r>
+              <w:t xml:space="preserve">Model 3D nhân vật FF</w:t>
+            </w:r>
+          </w:p>
+        </w:tc>
+        <w:tc>
+          <w:tcPr/>
+          <w:p>
+            <w:pPr>
+              <w:pStyle w:val="Compact"/>
+            </w:pPr>
+            <w:r>
+              <w:t xml:space="preserve">Nếu có thì thay ma-nơ-canh, tư thế/tỉ lệ chuẩn hơn</w:t>
+            </w:r>
+          </w:p>
+        </w:tc>
+      </w:tr>
+    </w:tbl>
+    <w:p>
+      <w:pPr>
+        <w:pStyle w:val="BodyText"/>
+      </w:pPr>
+      <w:r>
+        <w:rPr>
+          <w:b/>
+          <w:bCs/>
+        </w:rPr>
+        <w:t xml:space="preserve">Còn mở, KHÔNG chặn V0 (chốt trước V1):</w:t>
+      </w:r>
+      <w:r>
+        <w:t xml:space="preserve"> </w:t>
+      </w:r>
+      <w:r>
+        <w:t xml:space="preserve">| Quyết định | Ghi chú |</w:t>
+      </w:r>
+      <w:r>
+        <w:t xml:space="preserve"> </w:t>
+      </w:r>
+      <w:r>
+        <w:t xml:space="preserve">|—|—|</w:t>
+      </w:r>
+      <w:r>
+        <w:t xml:space="preserve"> </w:t>
+      </w:r>
+      <w:r>
+        <w:t xml:space="preserve">| Nguồn truy cập Claude cho V1 | Gói Claude (seat Enterprise/Pro/Max) và Anthropic API (Console, API key, tính tiền theo token) là 2 sản phẩm/billing tách biệt; seat không tự sinh API key. Dashboard tự gọi Claude bằng code nên V1 cần API key từ Console org công ty (không nên dùng đăng nhập seat cho ứng dụng tự động — cần xác nhận với admin/điều khoản Anthropic). Việc cần làm: hỏi admin Enterprise (a) có Console org không, (b) hạn mức token, (c) chính sách data cho ảnh nhân vật. |</w:t>
+      </w:r>
+      <w:r>
+        <w:t xml:space="preserve"> </w:t>
+      </w:r>
+      <w:r>
+        <w:t xml:space="preserve">|</w:t>
       </w:r>
       <w:r>
         <w:t xml:space="preserve"> </w:t>
@@ -6225,7 +6218,899 @@
         <w:t xml:space="preserve">music_provider</w:t>
       </w:r>
       <w:r>
-        <w:t xml:space="preserve">.</w:t>
+        <w:t xml:space="preserve"> </w:t>
+      </w:r>
+      <w:r>
+        <w:t xml:space="preserve">| Suno không có API chính thức. Ưu tiên dùng audio của Clip AI (ElevenLabs/Seed Audio tích hợp) nếu API cho phép; xác nhận license thương mại. Xem 3.5 |</w:t>
+      </w:r>
+      <w:r>
+        <w:t xml:space="preserve"> </w:t>
+      </w:r>
+      <w:r>
+        <w:t xml:space="preserve">| Framework Dashboard | Streamlit (mặc định) hay web frontend riêng nếu cần UI sát mockup Figma |</w:t>
+      </w:r>
+    </w:p>
+    <w:p>
+      <w:pPr>
+        <w:pStyle w:val="BodyText"/>
+      </w:pPr>
+      <w:r>
+        <w:rPr>
+          <w:b/>
+          <w:bCs/>
+        </w:rPr>
+        <w:t xml:space="preserve">Còn mở — cần chốt trước khi code V0 (chặn Tuần 1-2):</w:t>
+      </w:r>
+      <w:r>
+        <w:t xml:space="preserve"> </w:t>
+      </w:r>
+      <w:r>
+        <w:t xml:space="preserve">| Quyết định | Vì sao cần | Ai chốt |</w:t>
+      </w:r>
+      <w:r>
+        <w:t xml:space="preserve"> </w:t>
+      </w:r>
+      <w:r>
+        <w:t xml:space="preserve">|—|—|—|</w:t>
+      </w:r>
+      <w:r>
+        <w:t xml:space="preserve"> </w:t>
+      </w:r>
+      <w:r>
+        <w:t xml:space="preserve">|</w:t>
+      </w:r>
+      <w:r>
+        <w:t xml:space="preserve"> </w:t>
+      </w:r>
+      <w:r>
+        <w:rPr>
+          <w:rStyle w:val="VerbatimChar"/>
+        </w:rPr>
+        <w:t xml:space="preserve">operating_mode</w:t>
+      </w:r>
+      <w:r>
+        <w:t xml:space="preserve"> </w:t>
+      </w:r>
+      <w:r>
+        <w:t xml:space="preserve">mặc định (</w:t>
+      </w:r>
+      <w:r>
+        <w:rPr>
+          <w:rStyle w:val="VerbatimChar"/>
+        </w:rPr>
+        <w:t xml:space="preserve">auto</w:t>
+      </w:r>
+      <w:r>
+        <w:t xml:space="preserve"> </w:t>
+      </w:r>
+      <w:r>
+        <w:t xml:space="preserve">hay</w:t>
+      </w:r>
+      <w:r>
+        <w:t xml:space="preserve"> </w:t>
+      </w:r>
+      <w:r>
+        <w:rPr>
+          <w:rStyle w:val="VerbatimChar"/>
+        </w:rPr>
+        <w:t xml:space="preserve">human_qc</w:t>
+      </w:r>
+      <w:r>
+        <w:t xml:space="preserve">) cho từng loại nội dung/dự án | Quyết định luồng review có block hay không — ảnh hưởng thiết kế Dashboard &amp; MCP QC Agent | Bạn + team sản xuất nội dung |</w:t>
+      </w:r>
+      <w:r>
+        <w:t xml:space="preserve"> </w:t>
+      </w:r>
+      <w:r>
+        <w:t xml:space="preserve">| Deepix và Clip AI/Kling có REST API + Webhook thật không, hay chỉ có giao diện Web | Nếu chỉ có Web, Bước 2 &amp; 4 phải dùng Playwright automation thay vì gọi API — kiến trúc MCP server khác hẳn (chậm hơn, dễ vỡ hơn khi UI đổi) | Team dev nội bộ giữ API Deepix/Clip AI |</w:t>
+      </w:r>
+      <w:r>
+        <w:t xml:space="preserve"> </w:t>
+      </w:r>
+      <w:r>
+        <w:t xml:space="preserve">|</w:t>
+      </w:r>
+      <w:r>
+        <w:t xml:space="preserve"> </w:t>
+      </w:r>
+      <w:r>
+        <w:rPr>
+          <w:rStyle w:val="VerbatimChar"/>
+        </w:rPr>
+        <w:t xml:space="preserve">qc_auto_pass_threshold</w:t>
+      </w:r>
+      <w:r>
+        <w:t xml:space="preserve"> </w:t>
+      </w:r>
+      <w:r>
+        <w:t xml:space="preserve">khởi điểm (0.85 là giả định, chưa có dữ liệu thật) | Threshold sai (quá lỏng/chặt) làm hỏng hiệu quả cả 2 mode ngay từ đầu | Chốt tạm ở dry-run, hiệu chỉnh bằng dữ liệu thật Tuần 3 |</w:t>
+      </w:r>
+      <w:r>
+        <w:t xml:space="preserve"> </w:t>
+      </w:r>
+      <w:r>
+        <w:t xml:space="preserve">| Ngân sách credit cho giai đoạn thử nghiệm (Deepix + Clip AI/Kling) | Dry-run + retry loop đều tốn credit thật; cần biết giới hạn trước khi chạy batch | Bạn / người giữ ngân sách |</w:t>
+      </w:r>
+    </w:p>
+    <w:bookmarkEnd w:id="36"/>
+    <w:bookmarkStart w:id="37" w:name="Xd77c4f47b903719b6fbd5f054853d76240e8579"/>
+    <w:p>
+      <w:pPr>
+        <w:pStyle w:val="Heading2"/>
+      </w:pPr>
+      <w:r>
+        <w:t xml:space="preserve">6. Checklist chuẩn bị — cần có gì trước khi bắt đầu Tuần 1</w:t>
+      </w:r>
+    </w:p>
+    <w:p>
+      <w:pPr>
+        <w:pStyle w:val="FirstParagraph"/>
+      </w:pPr>
+      <w:r>
+        <w:rPr>
+          <w:b/>
+          <w:bCs/>
+        </w:rPr>
+        <w:t xml:space="preserve">Truy cập &amp; tài liệu:</w:t>
+      </w:r>
+      <w:r>
+        <w:t xml:space="preserve"> </w:t>
+      </w:r>
+      <w:r>
+        <w:t xml:space="preserve">- [x] API endpoint + API Key/Authentication của</w:t>
+      </w:r>
+      <w:r>
+        <w:t xml:space="preserve"> </w:t>
+      </w:r>
+      <w:r>
+        <w:rPr>
+          <w:b/>
+          <w:bCs/>
+        </w:rPr>
+        <w:t xml:space="preserve">Deepix</w:t>
+      </w:r>
+      <w:r>
+        <w:t xml:space="preserve"> </w:t>
+      </w:r>
+      <w:r>
+        <w:t xml:space="preserve">(REST): có API; cần tài liệu chi tiết để viết adapter</w:t>
+      </w:r>
+      <w:r>
+        <w:t xml:space="preserve"> </w:t>
+      </w:r>
+      <w:r>
+        <w:t xml:space="preserve">- [x] API của</w:t>
+      </w:r>
+      <w:r>
+        <w:t xml:space="preserve"> </w:t>
+      </w:r>
+      <w:r>
+        <w:rPr>
+          <w:b/>
+          <w:bCs/>
+        </w:rPr>
+        <w:t xml:space="preserve">Clip AI</w:t>
+      </w:r>
+      <w:r>
+        <w:t xml:space="preserve"> </w:t>
+      </w:r>
+      <w:r>
+        <w:t xml:space="preserve">(đa model):</w:t>
+      </w:r>
+      <w:r>
+        <w:t xml:space="preserve"> </w:t>
+      </w:r>
+      <w:r>
+        <w:rPr>
+          <w:b/>
+          <w:bCs/>
+        </w:rPr>
+        <w:t xml:space="preserve">đã có</w:t>
+      </w:r>
+      <w:r>
+        <w:t xml:space="preserve">; còn thiếu tài liệu endpoint/auth để viết adapter (key đặt trong biến môi trường, không đưa vào repo)</w:t>
+      </w:r>
+      <w:r>
+        <w:t xml:space="preserve"> </w:t>
+      </w:r>
+      <w:r>
+        <w:t xml:space="preserve">- [ ] Xác nhận rate limit / quota của cả 2 API (ảnh hưởng trực tiếp</w:t>
+      </w:r>
+      <w:r>
+        <w:t xml:space="preserve"> </w:t>
+      </w:r>
+      <w:r>
+        <w:rPr>
+          <w:rStyle w:val="VerbatimChar"/>
+        </w:rPr>
+        <w:t xml:space="preserve">batch_poll_interval_seconds</w:t>
+      </w:r>
+      <w:r>
+        <w:t xml:space="preserve">)</w:t>
+      </w:r>
+      <w:r>
+        <w:t xml:space="preserve"> </w:t>
+      </w:r>
+      <w:r>
+        <w:t xml:space="preserve">- [ ] Tài liệu response schema của Kling AI khi bị content-moderation chặn (để</w:t>
+      </w:r>
+      <w:r>
+        <w:t xml:space="preserve"> </w:t>
+      </w:r>
+      <w:r>
+        <w:rPr>
+          <w:rStyle w:val="VerbatimChar"/>
+        </w:rPr>
+        <w:t xml:space="preserve">mcp-server-clipai</w:t>
+      </w:r>
+      <w:r>
+        <w:t xml:space="preserve"> </w:t>
+      </w:r>
+      <w:r>
+        <w:t xml:space="preserve">parse đúng lỗi</w:t>
+      </w:r>
+      <w:r>
+        <w:t xml:space="preserve"> </w:t>
+      </w:r>
+      <w:r>
+        <w:t xml:space="preserve">“Failure to pass the risk control system”</w:t>
+      </w:r>
+      <w:r>
+        <w:t xml:space="preserve"> </w:t>
+      </w:r>
+      <w:r>
+        <w:t xml:space="preserve">— Comment 4)</w:t>
+      </w:r>
+    </w:p>
+    <w:p>
+      <w:pPr>
+        <w:pStyle w:val="BodyText"/>
+      </w:pPr>
+      <w:r>
+        <w:rPr>
+          <w:b/>
+          <w:bCs/>
+        </w:rPr>
+        <w:t xml:space="preserve">Hạ tầng vận hành:</w:t>
+      </w:r>
+      <w:r>
+        <w:t xml:space="preserve"> </w:t>
+      </w:r>
+      <w:r>
+        <w:t xml:space="preserve">- [ ] Máy chạy pipeline (PC vận hành) cài</w:t>
+      </w:r>
+      <w:r>
+        <w:t xml:space="preserve"> </w:t>
+      </w:r>
+      <w:r>
+        <w:rPr>
+          <w:b/>
+          <w:bCs/>
+        </w:rPr>
+        <w:t xml:space="preserve">Claude Desktop App</w:t>
+      </w:r>
+      <w:r>
+        <w:t xml:space="preserve"> </w:t>
+      </w:r>
+      <w:r>
+        <w:t xml:space="preserve">+ Python runtime</w:t>
+      </w:r>
+      <w:r>
+        <w:t xml:space="preserve"> </w:t>
+      </w:r>
+      <w:r>
+        <w:t xml:space="preserve">- [ ] File</w:t>
+      </w:r>
+      <w:r>
+        <w:t xml:space="preserve"> </w:t>
+      </w:r>
+      <w:r>
+        <w:rPr>
+          <w:rStyle w:val="VerbatimChar"/>
+        </w:rPr>
+        <w:t xml:space="preserve">claude_desktop_config.json</w:t>
+      </w:r>
+      <w:r>
+        <w:t xml:space="preserve"> </w:t>
+      </w:r>
+      <w:r>
+        <w:t xml:space="preserve">trỏ tới các MCP servers local</w:t>
+      </w:r>
+      <w:r>
+        <w:t xml:space="preserve"> </w:t>
+      </w:r>
+      <w:r>
+        <w:t xml:space="preserve">- [ ] Môi trường Python cho lớp core + 6 MCP servers (</w:t>
+      </w:r>
+      <w:r>
+        <w:rPr>
+          <w:rStyle w:val="VerbatimChar"/>
+        </w:rPr>
+        <w:t xml:space="preserve">project-db</w:t>
+      </w:r>
+      <w:r>
+        <w:t xml:space="preserve">,</w:t>
+      </w:r>
+      <w:r>
+        <w:t xml:space="preserve"> </w:t>
+      </w:r>
+      <w:r>
+        <w:rPr>
+          <w:rStyle w:val="VerbatimChar"/>
+        </w:rPr>
+        <w:t xml:space="preserve">deepix</w:t>
+      </w:r>
+      <w:r>
+        <w:t xml:space="preserve">,</w:t>
+      </w:r>
+      <w:r>
+        <w:t xml:space="preserve"> </w:t>
+      </w:r>
+      <w:r>
+        <w:rPr>
+          <w:rStyle w:val="VerbatimChar"/>
+        </w:rPr>
+        <w:t xml:space="preserve">qc-agent</w:t>
+      </w:r>
+      <w:r>
+        <w:t xml:space="preserve">,</w:t>
+      </w:r>
+      <w:r>
+        <w:t xml:space="preserve"> </w:t>
+      </w:r>
+      <w:r>
+        <w:rPr>
+          <w:rStyle w:val="VerbatimChar"/>
+        </w:rPr>
+        <w:t xml:space="preserve">clipai</w:t>
+      </w:r>
+      <w:r>
+        <w:t xml:space="preserve">,</w:t>
+      </w:r>
+      <w:r>
+        <w:t xml:space="preserve"> </w:t>
+      </w:r>
+      <w:r>
+        <w:rPr>
+          <w:rStyle w:val="VerbatimChar"/>
+        </w:rPr>
+        <w:t xml:space="preserve">ffmpeg</w:t>
+      </w:r>
+      <w:r>
+        <w:t xml:space="preserve">,</w:t>
+      </w:r>
+      <w:r>
+        <w:t xml:space="preserve"> </w:t>
+      </w:r>
+      <w:r>
+        <w:rPr>
+          <w:rStyle w:val="VerbatimChar"/>
+        </w:rPr>
+        <w:t xml:space="preserve">music</w:t>
+      </w:r>
+      <w:r>
+        <w:t xml:space="preserve">) — venv/dependencies</w:t>
+      </w:r>
+      <w:r>
+        <w:t xml:space="preserve"> </w:t>
+      </w:r>
+      <w:r>
+        <w:t xml:space="preserve">- [ ] (V1) API key Anthropic Console cho Director/QC gọi bằng code — xem Mục 5</w:t>
+      </w:r>
+      <w:r>
+        <w:t xml:space="preserve"> </w:t>
+      </w:r>
+      <w:r>
+        <w:t xml:space="preserve">- [ ] FFmpeg cài local, kiểm tra version + codec cần dùng (transition, re-encode)</w:t>
+      </w:r>
+      <w:r>
+        <w:t xml:space="preserve"> </w:t>
+      </w:r>
+      <w:r>
+        <w:t xml:space="preserve">- [ ] Ổ đĩa đủ dung lượng cho</w:t>
+      </w:r>
+      <w:r>
+        <w:t xml:space="preserve"> </w:t>
+      </w:r>
+      <w:r>
+        <w:rPr>
+          <w:rStyle w:val="VerbatimChar"/>
+        </w:rPr>
+        <w:t xml:space="preserve">/images/</w:t>
+      </w:r>
+      <w:r>
+        <w:t xml:space="preserve">,</w:t>
+      </w:r>
+      <w:r>
+        <w:t xml:space="preserve"> </w:t>
+      </w:r>
+      <w:r>
+        <w:rPr>
+          <w:rStyle w:val="VerbatimChar"/>
+        </w:rPr>
+        <w:t xml:space="preserve">/videos/</w:t>
+      </w:r>
+      <w:r>
+        <w:t xml:space="preserve"> </w:t>
+      </w:r>
+      <w:r>
+        <w:t xml:space="preserve">khi chạy batch lớn</w:t>
+      </w:r>
+    </w:p>
+    <w:p>
+      <w:pPr>
+        <w:pStyle w:val="BodyText"/>
+      </w:pPr>
+      <w:r>
+        <w:rPr>
+          <w:b/>
+          <w:bCs/>
+        </w:rPr>
+        <w:t xml:space="preserve">Dữ liệu &amp; nội dung:</w:t>
+      </w:r>
+      <w:r>
+        <w:t xml:space="preserve"> </w:t>
+      </w:r>
+      <w:r>
+        <w:t xml:space="preserve">- [ ] 2 kịch bản mẫu (5-10 cảnh/kịch bản) để dry-run Tuần 3</w:t>
+      </w:r>
+      <w:r>
+        <w:t xml:space="preserve"> </w:t>
+      </w:r>
+      <w:r>
+        <w:t xml:space="preserve">- [ ] Danh sách IP/nhân vật dự kiến dùng trong dự án thật — để build blocklist ban đầu trước khi chạy batch thật (Comment 4)</w:t>
+      </w:r>
+      <w:r>
+        <w:t xml:space="preserve"> </w:t>
+      </w:r>
+      <w:r>
+        <w:t xml:space="preserve">- [ ] Bộ tiêu chí</w:t>
+      </w:r>
+      <w:r>
+        <w:t xml:space="preserve"> </w:t>
+      </w:r>
+      <w:r>
+        <w:rPr>
+          <w:rStyle w:val="VerbatimChar"/>
+        </w:rPr>
+        <w:t xml:space="preserve">qc_checklist</w:t>
+      </w:r>
+      <w:r>
+        <w:t xml:space="preserve"> </w:t>
+      </w:r>
+      <w:r>
+        <w:t xml:space="preserve">cụ thể (không chỉ</w:t>
+      </w:r>
+      <w:r>
+        <w:t xml:space="preserve"> </w:t>
+      </w:r>
+      <w:r>
+        <w:t xml:space="preserve">“đúng nhân vật”</w:t>
+      </w:r>
+      <w:r>
+        <w:t xml:space="preserve"> </w:t>
+      </w:r>
+      <w:r>
+        <w:t xml:space="preserve">chung chung — cần liệt kê rõ: góc mặt, trang phục, tỉ lệ khung hình, độ phân giải tối thiểu…) để Claude Vision QC Agent chấm điểm nhất quán</w:t>
+      </w:r>
+    </w:p>
+    <w:p>
+      <w:pPr>
+        <w:pStyle w:val="BodyText"/>
+      </w:pPr>
+      <w:r>
+        <w:rPr>
+          <w:b/>
+          <w:bCs/>
+        </w:rPr>
+        <w:t xml:space="preserve">Con người / vai trò:</w:t>
+      </w:r>
+      <w:r>
+        <w:t xml:space="preserve"> </w:t>
+      </w:r>
+      <w:r>
+        <w:t xml:space="preserve">- [ ] Người build 5 MCP servers (dev)</w:t>
+      </w:r>
+      <w:r>
+        <w:t xml:space="preserve"> </w:t>
+      </w:r>
+      <w:r>
+        <w:t xml:space="preserve">- [ ] Người thiết kế &amp; build Streamlit Dashboard</w:t>
+      </w:r>
+      <w:r>
+        <w:t xml:space="preserve"> </w:t>
+      </w:r>
+      <w:r>
+        <w:t xml:space="preserve">- [ ] Người review thẩm mỹ thật (đóng vai</w:t>
+      </w:r>
+      <w:r>
+        <w:t xml:space="preserve"> </w:t>
+      </w:r>
+      <w:r>
+        <w:t xml:space="preserve">“User”</w:t>
+      </w:r>
+      <w:r>
+        <w:t xml:space="preserve"> </w:t>
+      </w:r>
+      <w:r>
+        <w:t xml:space="preserve">ở 3 điểm kiểm duyệt) trong dry-run — cần người này để đo % Claude Vision QC Agent đúng/sai thực tế</w:t>
+      </w:r>
+      <w:r>
+        <w:t xml:space="preserve"> </w:t>
+      </w:r>
+      <w:r>
+        <w:t xml:space="preserve">- [ ]</w:t>
+      </w:r>
+      <w:r>
+        <w:t xml:space="preserve"> </w:t>
+      </w:r>
+      <w:r>
+        <w:t xml:space="preserve">“Chuyên gia miền”</w:t>
+      </w:r>
+      <w:r>
+        <w:t xml:space="preserve"> </w:t>
+      </w:r>
+      <w:r>
+        <w:t xml:space="preserve">biên kịch/đạo diễn để duyệt Knowledge Base và chấm eval set (Mục 3.6)</w:t>
+      </w:r>
+      <w:r>
+        <w:t xml:space="preserve"> </w:t>
+      </w:r>
+      <w:r>
+        <w:t xml:space="preserve">- [ ] Nguồn tri thức nền: sách/giáo trình biên kịch-đạo diễn-quay phim, kịch bản + storyboard các dự án cũ (Mục 3.6)</w:t>
+      </w:r>
+      <w:r>
+        <w:t xml:space="preserve"> </w:t>
+      </w:r>
+      <w:r>
+        <w:t xml:space="preserve">- [ ] Người giữ quan hệ với team dev nội bộ cấp API Deepix/Clip AI</w:t>
+      </w:r>
+    </w:p>
+    <w:bookmarkEnd w:id="37"/>
+    <w:bookmarkStart w:id="41" w:name="lộ-trình-triển-khai-v0-v1"/>
+    <w:p>
+      <w:pPr>
+        <w:pStyle w:val="Heading2"/>
+      </w:pPr>
+      <w:r>
+        <w:t xml:space="preserve">7. Lộ trình triển khai: V0 → V1</w:t>
+      </w:r>
+    </w:p>
+    <w:bookmarkStart w:id="38" w:name="X96af04f5f0dc0fae4ea4bac7edaf06b3f002467"/>
+    <w:p>
+      <w:pPr>
+        <w:pStyle w:val="Heading3"/>
+      </w:pPr>
+      <w:r>
+        <w:t xml:space="preserve">Giai đoạn V0 — Thử nghiệm (Claude Desktop + MCP, ≈ 3–4 tuần)</w:t>
+      </w:r>
+    </w:p>
+    <w:p>
+      <w:pPr>
+        <w:pStyle w:val="FirstParagraph"/>
+      </w:pPr>
+      <w:r>
+        <w:t xml:space="preserve">Mục tiêu: chứng minh pipeline end-to-end chạy được, đo chất lượng QC, hiệu chỉnh threshold, chốt Knowledge Base/prompt. Các bước cần Claude (Director Bước 1/3, QC Bước 2, Music Brief) chạy qua chat Claude Desktop với prompt template chuẩn; các thao tác còn lại gọi qua MCP tool. Dashboard V0 tối giản (xem trạng thái + duyệt ảnh) hoặc bỏ qua.</w:t>
+      </w:r>
+    </w:p>
+    <w:p>
+      <w:pPr>
+        <w:pStyle w:val="BodyText"/>
+      </w:pPr>
+      <w:r>
+        <w:rPr>
+          <w:b/>
+          <w:bCs/>
+        </w:rPr>
+        <w:t xml:space="preserve">Tuần 1 — Hạ tầng &amp; chốt quyết định mở</w:t>
+      </w:r>
+      <w:r>
+        <w:t xml:space="preserve"> </w:t>
+      </w:r>
+      <w:r>
+        <w:t xml:space="preserve">- Đã có API Deepix và Clip AI; đọc tài liệu API để viết adapter (nếu chỉ có Web thì Playwright, +1–2 tuần).</w:t>
+      </w:r>
+      <w:r>
+        <w:t xml:space="preserve"> </w:t>
+      </w:r>
+      <w:r>
+        <w:t xml:space="preserve">- Cài Claude Desktop + Python; test kết nối MCP cơ bản (</w:t>
+      </w:r>
+      <w:r>
+        <w:t xml:space="preserve">“hello world”</w:t>
+      </w:r>
+      <w:r>
+        <w:t xml:space="preserve">).</w:t>
+      </w:r>
+      <w:r>
+        <w:t xml:space="preserve"> </w:t>
+      </w:r>
+      <w:r>
+        <w:t xml:space="preserve">- Chốt</w:t>
+      </w:r>
+      <w:r>
+        <w:t xml:space="preserve"> </w:t>
+      </w:r>
+      <w:r>
+        <w:rPr>
+          <w:rStyle w:val="VerbatimChar"/>
+        </w:rPr>
+        <w:t xml:space="preserve">operating_mode</w:t>
+      </w:r>
+      <w:r>
+        <w:t xml:space="preserve"> </w:t>
+      </w:r>
+      <w:r>
+        <w:t xml:space="preserve">mặc định, ngân sách credit thử nghiệm.</w:t>
+      </w:r>
+      <w:r>
+        <w:t xml:space="preserve"> </w:t>
+      </w:r>
+      <w:r>
+        <w:t xml:space="preserve">- Khởi động Knowledge Base (Mục 3.6): thu thập + lọc nguồn, chọn chuyên gia miền.</w:t>
+      </w:r>
+      <w:r>
+        <w:t xml:space="preserve"> </w:t>
+      </w:r>
+      <w:r>
+        <w:t xml:space="preserve">-</w:t>
+      </w:r>
+      <w:r>
+        <w:t xml:space="preserve"> </w:t>
+      </w:r>
+      <w:r>
+        <w:rPr>
+          <w:b/>
+          <w:bCs/>
+        </w:rPr>
+        <w:t xml:space="preserve">Deliverable:</w:t>
+      </w:r>
+      <w:r>
+        <w:t xml:space="preserve"> </w:t>
+      </w:r>
+      <w:r>
+        <w:t xml:space="preserve">API access hoạt động, môi trường sẵn sàng, các quyết định chặn V0 đã chốt.</w:t>
+      </w:r>
+    </w:p>
+    <w:p>
+      <w:pPr>
+        <w:pStyle w:val="BodyText"/>
+      </w:pPr>
+      <w:r>
+        <w:rPr>
+          <w:b/>
+          <w:bCs/>
+        </w:rPr>
+        <w:t xml:space="preserve">Tuần 2 — Core + MCP servers</w:t>
+      </w:r>
+      <w:r>
+        <w:t xml:space="preserve"> </w:t>
+      </w:r>
+      <w:r>
+        <w:t xml:space="preserve">- Implement schema SQLite + state machine</w:t>
+      </w:r>
+      <w:r>
+        <w:t xml:space="preserve"> </w:t>
+      </w:r>
+      <w:r>
+        <w:rPr>
+          <w:b/>
+          <w:bCs/>
+        </w:rPr>
+        <w:t xml:space="preserve">trước tiên</w:t>
+      </w:r>
+      <w:r>
+        <w:t xml:space="preserve"> </w:t>
+      </w:r>
+      <w:r>
+        <w:t xml:space="preserve">trong lớp core dùng chung.</w:t>
+      </w:r>
+      <w:r>
+        <w:t xml:space="preserve"> </w:t>
+      </w:r>
+      <w:r>
+        <w:t xml:space="preserve">- Build MCP</w:t>
+      </w:r>
+      <w:r>
+        <w:t xml:space="preserve"> </w:t>
+      </w:r>
+      <w:r>
+        <w:rPr>
+          <w:rStyle w:val="VerbatimChar"/>
+        </w:rPr>
+        <w:t xml:space="preserve">project-db</w:t>
+      </w:r>
+      <w:r>
+        <w:t xml:space="preserve">,</w:t>
+      </w:r>
+      <w:r>
+        <w:t xml:space="preserve"> </w:t>
+      </w:r>
+      <w:r>
+        <w:rPr>
+          <w:rStyle w:val="VerbatimChar"/>
+        </w:rPr>
+        <w:t xml:space="preserve">deepix</w:t>
+      </w:r>
+      <w:r>
+        <w:t xml:space="preserve">,</w:t>
+      </w:r>
+      <w:r>
+        <w:t xml:space="preserve"> </w:t>
+      </w:r>
+      <w:r>
+        <w:rPr>
+          <w:rStyle w:val="VerbatimChar"/>
+        </w:rPr>
+        <w:t xml:space="preserve">qc-agent</w:t>
+      </w:r>
+      <w:r>
+        <w:t xml:space="preserve"> </w:t>
+      </w:r>
+      <w:r>
+        <w:t xml:space="preserve">(cả 2 nhánh</w:t>
+      </w:r>
+      <w:r>
+        <w:t xml:space="preserve"> </w:t>
+      </w:r>
+      <w:r>
+        <w:rPr>
+          <w:rStyle w:val="VerbatimChar"/>
+        </w:rPr>
+        <w:t xml:space="preserve">auto</w:t>
+      </w:r>
+      <w:r>
+        <w:t xml:space="preserve">/</w:t>
+      </w:r>
+      <w:r>
+        <w:rPr>
+          <w:rStyle w:val="VerbatimChar"/>
+        </w:rPr>
+        <w:t xml:space="preserve">human_qc</w:t>
+      </w:r>
+      <w:r>
+        <w:t xml:space="preserve">),</w:t>
+      </w:r>
+      <w:r>
+        <w:t xml:space="preserve"> </w:t>
+      </w:r>
+      <w:r>
+        <w:rPr>
+          <w:rStyle w:val="VerbatimChar"/>
+        </w:rPr>
+        <w:t xml:space="preserve">clipai</w:t>
+      </w:r>
+      <w:r>
+        <w:t xml:space="preserve"> </w:t>
+      </w:r>
+      <w:r>
+        <w:t xml:space="preserve">(heartbeat polling, parse lỗi moderation),</w:t>
+      </w:r>
+      <w:r>
+        <w:t xml:space="preserve"> </w:t>
+      </w:r>
+      <w:r>
+        <w:rPr>
+          <w:rStyle w:val="VerbatimChar"/>
+        </w:rPr>
+        <w:t xml:space="preserve">ffmpeg</w:t>
+      </w:r>
+      <w:r>
+        <w:t xml:space="preserve">;</w:t>
+      </w:r>
+      <w:r>
+        <w:t xml:space="preserve"> </w:t>
+      </w:r>
+      <w:r>
+        <w:rPr>
+          <w:rStyle w:val="VerbatimChar"/>
+        </w:rPr>
+        <w:t xml:space="preserve">music</w:t>
+      </w:r>
+      <w:r>
+        <w:t xml:space="preserve"> </w:t>
+      </w:r>
+      <w:r>
+        <w:t xml:space="preserve">có thể để sau (upload nhạc thủ công ở V0).</w:t>
+      </w:r>
+      <w:r>
+        <w:t xml:space="preserve"> </w:t>
+      </w:r>
+      <w:r>
+        <w:t xml:space="preserve">- Song song: viết system prompt + JSON schema cho Director/QC, tạo eval set.</w:t>
+      </w:r>
+      <w:r>
+        <w:t xml:space="preserve"> </w:t>
+      </w:r>
+      <w:r>
+        <w:t xml:space="preserve">-</w:t>
+      </w:r>
+      <w:r>
+        <w:t xml:space="preserve"> </w:t>
+      </w:r>
+      <w:r>
+        <w:rPr>
+          <w:b/>
+          <w:bCs/>
+        </w:rPr>
+        <w:t xml:space="preserve">Deliverable:</w:t>
+      </w:r>
+      <w:r>
+        <w:t xml:space="preserve"> </w:t>
+      </w:r>
+      <w:r>
+        <w:t xml:space="preserve">chạy được end-to-end 1 cảnh qua 5 bước bằng tool call.</w:t>
+      </w:r>
+    </w:p>
+    <w:p>
+      <w:pPr>
+        <w:pStyle w:val="BodyText"/>
+      </w:pPr>
+      <w:r>
+        <w:rPr>
+          <w:b/>
+          <w:bCs/>
+        </w:rPr>
+        <w:t xml:space="preserve">Tuần 3–4 — Dry-run &amp; hiệu chỉnh</w:t>
+      </w:r>
+      <w:r>
+        <w:t xml:space="preserve"> </w:t>
+      </w:r>
+      <w:r>
+        <w:t xml:space="preserve">- Dry-run 2 kịch bản mẫu (5–10 cảnh) ở cả 2 mode; người review thật chấm song song với QC Agent → tính % đồng thuận → hiệu chỉnh</w:t>
+      </w:r>
+      <w:r>
+        <w:t xml:space="preserve"> </w:t>
+      </w:r>
+      <w:r>
+        <w:rPr>
+          <w:rStyle w:val="VerbatimChar"/>
+        </w:rPr>
+        <w:t xml:space="preserve">qc_auto_pass_threshold</w:t>
+      </w:r>
+      <w:r>
+        <w:t xml:space="preserve"> </w:t>
+      </w:r>
+      <w:r>
+        <w:t xml:space="preserve">(0.85 chỉ là giả định).</w:t>
+      </w:r>
+      <w:r>
+        <w:t xml:space="preserve"> </w:t>
+      </w:r>
+      <w:r>
+        <w:t xml:space="preserve">- Lặp cải thiện prompt theo eval set; build blocklist IP v1 (case Wonder Woman + danh sách nhân vật dự kiến).</w:t>
+      </w:r>
+      <w:r>
+        <w:t xml:space="preserve"> </w:t>
+      </w:r>
+      <w:r>
+        <w:t xml:space="preserve">-</w:t>
+      </w:r>
+      <w:r>
+        <w:t xml:space="preserve"> </w:t>
+      </w:r>
+      <w:r>
+        <w:rPr>
+          <w:b/>
+          <w:bCs/>
+        </w:rPr>
+        <w:t xml:space="preserve">Cổng chuyển V1:</w:t>
+      </w:r>
+      <w:r>
+        <w:t xml:space="preserve"> </w:t>
+      </w:r>
+      <w:r>
+        <w:t xml:space="preserve">≥1 video hoàn chỉnh end-to-end, threshold đã hiệu chỉnh bằng dữ liệu, prompt/checklist khóa version.</w:t>
+      </w:r>
+    </w:p>
+    <w:bookmarkEnd w:id="38"/>
+    <w:bookmarkStart w:id="39" w:name="X3d60c8a93cbf48f59874d7f70b2bf9f5f0f0b9b"/>
+    <w:p>
+      <w:pPr>
+        <w:pStyle w:val="Heading3"/>
+      </w:pPr>
+      <w:r>
+        <w:t xml:space="preserve">Giai đoạn V1 — Hợp nhất trên 1 Dashboard (≈ +3–4 tuần, cần API key Anthropic)</w:t>
       </w:r>
     </w:p>
     <w:p>
@@ -6233,26 +7118,21 @@
         <w:pStyle w:val="Compact"/>
         <w:numPr>
           <w:ilvl w:val="0"/>
-          <w:numId w:val="1004"/>
+          <w:numId w:val="1008"/>
         </w:numPr>
       </w:pPr>
       <w:r>
-        <w:t xml:space="preserve">Đóng gói 1-Click Startup, runbook (xử lý job</w:t>
-      </w:r>
-      <w:r>
-        <w:t xml:space="preserve"> </w:t>
-      </w:r>
-      <w:r>
-        <w:rPr>
-          <w:rStyle w:val="VerbatimChar"/>
-        </w:rPr>
-        <w:t xml:space="preserve">failed</w:t>
-      </w:r>
-      <w:r>
-        <w:t xml:space="preserve"> </w:t>
-      </w:r>
-      <w:r>
-        <w:t xml:space="preserve">bị escalate, chỉnh threshold an toàn), Prompt Templates bàn giao.</w:t>
+        <w:rPr>
+          <w:b/>
+          <w:bCs/>
+        </w:rPr>
+        <w:t xml:space="preserve">Song song đầu V1:</w:t>
+      </w:r>
+      <w:r>
+        <w:t xml:space="preserve"> </w:t>
+      </w:r>
+      <w:r>
+        <w:t xml:space="preserve">Figma mockup chi tiết (Mục 3.4) → user duyệt trước khi build.</w:t>
       </w:r>
     </w:p>
     <w:p>
@@ -6260,10 +7140,100 @@
         <w:pStyle w:val="Compact"/>
         <w:numPr>
           <w:ilvl w:val="0"/>
-          <w:numId w:val="1004"/>
+          <w:numId w:val="1008"/>
         </w:numPr>
       </w:pPr>
       <w:r>
+        <w:t xml:space="preserve">Build Dashboard theo Mục 3.4 (stepper 5 bước, control bar toàn cục, nút điều khiển từng khâu, Kanban, tab Lịch sử, cảnh báo IP, tiến độ heartbeat) gọi lớp core.</w:t>
+      </w:r>
+    </w:p>
+    <w:p>
+      <w:pPr>
+        <w:pStyle w:val="Compact"/>
+        <w:numPr>
+          <w:ilvl w:val="0"/>
+          <w:numId w:val="1008"/>
+        </w:numPr>
+      </w:pPr>
+      <w:r>
+        <w:t xml:space="preserve">Thay LLM runner từ chat thủ công sang Anthropic API (cùng prompt template + schema).</w:t>
+      </w:r>
+    </w:p>
+    <w:p>
+      <w:pPr>
+        <w:pStyle w:val="Compact"/>
+        <w:numPr>
+          <w:ilvl w:val="0"/>
+          <w:numId w:val="1008"/>
+        </w:numPr>
+      </w:pPr>
+      <w:r>
+        <w:t xml:space="preserve">Build</w:t>
+      </w:r>
+      <w:r>
+        <w:t xml:space="preserve"> </w:t>
+      </w:r>
+      <w:r>
+        <w:rPr>
+          <w:rStyle w:val="VerbatimChar"/>
+        </w:rPr>
+        <w:t xml:space="preserve">mcp-server-music</w:t>
+      </w:r>
+      <w:r>
+        <w:t xml:space="preserve"> </w:t>
+      </w:r>
+      <w:r>
+        <w:t xml:space="preserve">+ Bước 5a (Music Brief, 3 bản nháp) sau khi chọn</w:t>
+      </w:r>
+      <w:r>
+        <w:t xml:space="preserve"> </w:t>
+      </w:r>
+      <w:r>
+        <w:rPr>
+          <w:rStyle w:val="VerbatimChar"/>
+        </w:rPr>
+        <w:t xml:space="preserve">music_provider</w:t>
+      </w:r>
+      <w:r>
+        <w:t xml:space="preserve">.</w:t>
+      </w:r>
+    </w:p>
+    <w:p>
+      <w:pPr>
+        <w:pStyle w:val="Compact"/>
+        <w:numPr>
+          <w:ilvl w:val="0"/>
+          <w:numId w:val="1008"/>
+        </w:numPr>
+      </w:pPr>
+      <w:r>
+        <w:t xml:space="preserve">Đóng gói 1-Click Startup, runbook (xử lý job</w:t>
+      </w:r>
+      <w:r>
+        <w:t xml:space="preserve"> </w:t>
+      </w:r>
+      <w:r>
+        <w:rPr>
+          <w:rStyle w:val="VerbatimChar"/>
+        </w:rPr>
+        <w:t xml:space="preserve">failed</w:t>
+      </w:r>
+      <w:r>
+        <w:t xml:space="preserve"> </w:t>
+      </w:r>
+      <w:r>
+        <w:t xml:space="preserve">bị escalate, chỉnh threshold an toàn), Prompt Templates bàn giao.</w:t>
+      </w:r>
+    </w:p>
+    <w:p>
+      <w:pPr>
+        <w:pStyle w:val="Compact"/>
+        <w:numPr>
+          <w:ilvl w:val="0"/>
+          <w:numId w:val="1008"/>
+        </w:numPr>
+      </w:pPr>
+      <w:r>
         <w:rPr>
           <w:b/>
           <w:bCs/>
@@ -6277,8 +7247,8 @@
         <w:t xml:space="preserve">hệ thống bàn giao vận hành được từ 1 giao diện duy nhất, có tài liệu.</w:t>
       </w:r>
     </w:p>
-    <w:bookmarkEnd w:id="38"/>
-    <w:bookmarkStart w:id="39" w:name="Xf17d03e65ff0af0f4b74d160622aac56e61b107"/>
+    <w:bookmarkEnd w:id="39"/>
+    <w:bookmarkStart w:id="40" w:name="Xf17d03e65ff0af0f4b74d160622aac56e61b107"/>
     <w:p>
       <w:pPr>
         <w:pStyle w:val="Heading3"/>
@@ -6645,9 +7615,9 @@
         <w:t xml:space="preserve">Rủi ro kéo dài: chờ API Deepix/Clip AI; Deepix/Clip AI chỉ có Web (Playwright, +1–2 tuần); hiệu chỉnh QC threshold cần nhiều vòng; chất lượng Knowledge Base phụ thuộc chuyên gia miền.</w:t>
       </w:r>
     </w:p>
-    <w:bookmarkEnd w:id="39"/>
     <w:bookmarkEnd w:id="40"/>
-    <w:bookmarkStart w:id="41" w:name="Xb786808859b2baa89401c26f99cf8f9fff113e4"/>
+    <w:bookmarkEnd w:id="41"/>
+    <w:bookmarkStart w:id="42" w:name="Xb786808859b2baa89401c26f99cf8f9fff113e4"/>
     <w:p>
       <w:pPr>
         <w:pStyle w:val="Heading2"/>
@@ -6666,78 +7636,6 @@
       </w:r>
       <w:r>
         <w:t xml:space="preserve">(Definition of Done) cho toàn dự án</w:t>
-      </w:r>
-    </w:p>
-    <w:p>
-      <w:pPr>
-        <w:pStyle w:val="Compact"/>
-        <w:numPr>
-          <w:ilvl w:val="0"/>
-          <w:numId w:val="1005"/>
-        </w:numPr>
-      </w:pPr>
-      <w:r>
-        <w:t xml:space="preserve">Chạy được ít nhất 1 video hoàn chỉnh end-to-end từ script.docx đến FINAL_VIDEO.mp4 qua Dashboard (V1), không cần chỉnh code tay</w:t>
-      </w:r>
-    </w:p>
-    <w:p>
-      <w:pPr>
-        <w:pStyle w:val="Compact"/>
-        <w:numPr>
-          <w:ilvl w:val="0"/>
-          <w:numId w:val="1006"/>
-        </w:numPr>
-      </w:pPr>
-      <w:r>
-        <w:t xml:space="preserve">Cả 2</w:t>
-      </w:r>
-      <w:r>
-        <w:t xml:space="preserve"> </w:t>
-      </w:r>
-      <w:r>
-        <w:rPr>
-          <w:rStyle w:val="VerbatimChar"/>
-        </w:rPr>
-        <w:t xml:space="preserve">operating_mode</w:t>
-      </w:r>
-      <w:r>
-        <w:t xml:space="preserve"> </w:t>
-      </w:r>
-      <w:r>
-        <w:t xml:space="preserve">đều test được và cho kết quả đúng như thiết kế ở Mục 3.2</w:t>
-      </w:r>
-    </w:p>
-    <w:p>
-      <w:pPr>
-        <w:pStyle w:val="Compact"/>
-        <w:numPr>
-          <w:ilvl w:val="0"/>
-          <w:numId w:val="1007"/>
-        </w:numPr>
-      </w:pPr>
-      <w:r>
-        <w:rPr>
-          <w:rStyle w:val="VerbatimChar"/>
-        </w:rPr>
-        <w:t xml:space="preserve">max_retry_count</w:t>
-      </w:r>
-      <w:r>
-        <w:t xml:space="preserve"> </w:t>
-      </w:r>
-      <w:r>
-        <w:t xml:space="preserve">+ escalate hoạt động đúng khi cố tình cho 1 job fail liên tục</w:t>
-      </w:r>
-    </w:p>
-    <w:p>
-      <w:pPr>
-        <w:pStyle w:val="Compact"/>
-        <w:numPr>
-          <w:ilvl w:val="0"/>
-          <w:numId w:val="1008"/>
-        </w:numPr>
-      </w:pPr>
-      <w:r>
-        <w:t xml:space="preserve">Pre-flight IP check cảnh báo đúng với ít nhất 1 case đã biết (Wonder Woman) trước khi chạy batch thật</w:t>
       </w:r>
     </w:p>
     <w:p>
@@ -6749,7 +7647,7 @@
         </w:numPr>
       </w:pPr>
       <w:r>
-        <w:t xml:space="preserve">Batch &gt;100 video chạy được qua heartbeat polling mà không cần user approve từng cái</w:t>
+        <w:t xml:space="preserve">Chạy được ít nhất 1 video hoàn chỉnh end-to-end từ script.docx đến FINAL_VIDEO.mp4 qua Dashboard (V1), không cần chỉnh code tay</w:t>
       </w:r>
     </w:p>
     <w:p>
@@ -6761,17 +7659,89 @@
         </w:numPr>
       </w:pPr>
       <w:r>
+        <w:t xml:space="preserve">Cả 2</w:t>
+      </w:r>
+      <w:r>
+        <w:t xml:space="preserve"> </w:t>
+      </w:r>
+      <w:r>
+        <w:rPr>
+          <w:rStyle w:val="VerbatimChar"/>
+        </w:rPr>
+        <w:t xml:space="preserve">operating_mode</w:t>
+      </w:r>
+      <w:r>
+        <w:t xml:space="preserve"> </w:t>
+      </w:r>
+      <w:r>
+        <w:t xml:space="preserve">đều test được và cho kết quả đúng như thiết kế ở Mục 3.2</w:t>
+      </w:r>
+    </w:p>
+    <w:p>
+      <w:pPr>
+        <w:pStyle w:val="Compact"/>
+        <w:numPr>
+          <w:ilvl w:val="0"/>
+          <w:numId w:val="1011"/>
+        </w:numPr>
+      </w:pPr>
+      <w:r>
+        <w:rPr>
+          <w:rStyle w:val="VerbatimChar"/>
+        </w:rPr>
+        <w:t xml:space="preserve">max_retry_count</w:t>
+      </w:r>
+      <w:r>
+        <w:t xml:space="preserve"> </w:t>
+      </w:r>
+      <w:r>
+        <w:t xml:space="preserve">+ escalate hoạt động đúng khi cố tình cho 1 job fail liên tục</w:t>
+      </w:r>
+    </w:p>
+    <w:p>
+      <w:pPr>
+        <w:pStyle w:val="Compact"/>
+        <w:numPr>
+          <w:ilvl w:val="0"/>
+          <w:numId w:val="1012"/>
+        </w:numPr>
+      </w:pPr>
+      <w:r>
+        <w:t xml:space="preserve">Pre-flight IP check cảnh báo đúng với ít nhất 1 case đã biết (Wonder Woman) trước khi chạy batch thật</w:t>
+      </w:r>
+    </w:p>
+    <w:p>
+      <w:pPr>
+        <w:pStyle w:val="Compact"/>
+        <w:numPr>
+          <w:ilvl w:val="0"/>
+          <w:numId w:val="1013"/>
+        </w:numPr>
+      </w:pPr>
+      <w:r>
+        <w:t xml:space="preserve">Batch &gt;100 video chạy được qua heartbeat polling mà không cần user approve từng cái</w:t>
+      </w:r>
+    </w:p>
+    <w:p>
+      <w:pPr>
+        <w:pStyle w:val="Compact"/>
+        <w:numPr>
+          <w:ilvl w:val="0"/>
+          <w:numId w:val="1014"/>
+        </w:numPr>
+      </w:pPr>
+      <w:r>
         <w:t xml:space="preserve">Runbook + Prompt Templates đã bàn giao cho bộ phận sản xuất nội dung</w:t>
       </w:r>
     </w:p>
-    <w:bookmarkEnd w:id="41"/>
-    <w:bookmarkStart w:id="42" w:name="Xa8c20bcadf63636d70cdbd31f3500ce09019d73"/>
+    <w:bookmarkEnd w:id="42"/>
+    <w:bookmarkStart w:id="43" w:name="Xc1c5ea74472944d9adc5cc28f2fd787bdd9587a"/>
     <w:p>
       <w:pPr>
         <w:pStyle w:val="Heading2"/>
       </w:pPr>
       <w:r>
-        <w:t xml:space="preserve">9. Trạng thái triển khai (cập nhật 2026-09-20)</w:t>
+        <w:t xml:space="preserve">9. Trạng thái triển khai (cập nhật 2026-09-23)</w:t>
       </w:r>
     </w:p>
     <w:p>
@@ -7708,6 +8678,229 @@
       </w:r>
       <w:r>
         <w:t xml:space="preserve">.</w:t>
+      </w:r>
+    </w:p>
+    <w:p>
+      <w:pPr>
+        <w:pStyle w:val="BodyText"/>
+      </w:pPr>
+      <w:r>
+        <w:rPr>
+          <w:b/>
+          <w:bCs/>
+        </w:rPr>
+        <w:t xml:space="preserve">Cập nhật 2026-09-23:</w:t>
+      </w:r>
+      <w:r>
+        <w:t xml:space="preserve"> </w:t>
+      </w:r>
+      <w:r>
+        <w:t xml:space="preserve">đã chạy thật 1 video hoàn chỉnh 8 cảnh (~46 giây, 3 nhân vật, thoại TTS + phụ đề + nhạc + card cuối) qua Dashboard; sửa lỗi rate-limit bị hiểu là lỗi vĩnh viễn và job kẹt do</w:t>
+      </w:r>
+      <w:r>
+        <w:t xml:space="preserve"> </w:t>
+      </w:r>
+      <w:r>
+        <w:rPr>
+          <w:rStyle w:val="VerbatimChar"/>
+        </w:rPr>
+        <w:t xml:space="preserve">external_id</w:t>
+      </w:r>
+      <w:r>
+        <w:t xml:space="preserve"> </w:t>
+      </w:r>
+      <w:r>
+        <w:t xml:space="preserve">lệch; thêm</w:t>
+      </w:r>
+      <w:r>
+        <w:t xml:space="preserve"> </w:t>
+      </w:r>
+      <w:r>
+        <w:t xml:space="preserve">“đặc điểm neo”</w:t>
+      </w:r>
+      <w:r>
+        <w:t xml:space="preserve"> </w:t>
+      </w:r>
+      <w:r>
+        <w:t xml:space="preserve">chống nhầm nhân vật; 548 test pass. Rà soát nhất quán nhân vật/bối cảnh/bố cục và lên kế hoạch previz 3D — xem 3.7 và Mục 5.</w:t>
+      </w:r>
+    </w:p>
+    <w:p>
+      <w:pPr>
+        <w:pStyle w:val="BodyText"/>
+      </w:pPr>
+      <w:r>
+        <w:rPr>
+          <w:b/>
+          <w:bCs/>
+        </w:rPr>
+        <w:t xml:space="preserve">Kế hoạch tiếp theo (2026-09-23, chi tiết từng việc ở</w:t>
+      </w:r>
+      <w:r>
+        <w:rPr>
+          <w:b/>
+          <w:bCs/>
+        </w:rPr>
+        <w:t xml:space="preserve"> </w:t>
+      </w:r>
+      <w:r>
+        <w:rPr>
+          <w:rStyle w:val="VerbatimChar"/>
+          <w:b/>
+          <w:bCs/>
+        </w:rPr>
+        <w:t xml:space="preserve">TODO.md</w:t>
+      </w:r>
+      <w:r>
+        <w:rPr>
+          <w:b/>
+          <w:bCs/>
+        </w:rPr>
+        <w:t xml:space="preserve">):</w:t>
+      </w:r>
+      <w:r>
+        <w:t xml:space="preserve"> </w:t>
+      </w:r>
+      <w:r>
+        <w:t xml:space="preserve">| Giai đoạn | Việc | Ai | Credit |</w:t>
+      </w:r>
+      <w:r>
+        <w:t xml:space="preserve"> </w:t>
+      </w:r>
+      <w:r>
+        <w:t xml:space="preserve">|—|—|—|—|</w:t>
+      </w:r>
+      <w:r>
+        <w:t xml:space="preserve"> </w:t>
+      </w:r>
+      <w:r>
+        <w:t xml:space="preserve">| P0 | (A) giữ chỗ ảnh bối cảnh/Storyboard; (B) chọn bối cảnh theo ID + ô chọn ở Bước 1; (C)</w:t>
+      </w:r>
+      <w:r>
+        <w:t xml:space="preserve"> </w:t>
+      </w:r>
+      <w:r>
+        <w:rPr>
+          <w:rStyle w:val="VerbatimChar"/>
+        </w:rPr>
+        <w:t xml:space="preserve">blocking</w:t>
+      </w:r>
+      <w:r>
+        <w:t xml:space="preserve"> </w:t>
+      </w:r>
+      <w:r>
+        <w:t xml:space="preserve">+</w:t>
+      </w:r>
+      <w:r>
+        <w:t xml:space="preserve"> </w:t>
+      </w:r>
+      <w:r>
+        <w:rPr>
+          <w:rStyle w:val="VerbatimChar"/>
+        </w:rPr>
+        <w:t xml:space="preserve">sequence</w:t>
+      </w:r>
+      <w:r>
+        <w:t xml:space="preserve"> </w:t>
+      </w:r>
+      <w:r>
+        <w:t xml:space="preserve">trong Director, Storyboard nối theo nhóm; skip 3 test</w:t>
+      </w:r>
+      <w:r>
+        <w:t xml:space="preserve"> </w:t>
+      </w:r>
+      <w:r>
+        <w:rPr>
+          <w:rStyle w:val="VerbatimChar"/>
+        </w:rPr>
+        <w:t xml:space="preserve">sound_lib</w:t>
+      </w:r>
+      <w:r>
+        <w:t xml:space="preserve"> </w:t>
+      </w:r>
+      <w:r>
+        <w:t xml:space="preserve">khi thiếu ffmpeg | Claude | Không |</w:t>
+      </w:r>
+      <w:r>
+        <w:t xml:space="preserve"> </w:t>
+      </w:r>
+      <w:r>
+        <w:t xml:space="preserve">| P0 | Báo cáo</w:t>
+      </w:r>
+      <w:r>
+        <w:t xml:space="preserve"> </w:t>
+      </w:r>
+      <w:r>
+        <w:t xml:space="preserve">“Hiệu quả workflow”</w:t>
+      </w:r>
+      <w:r>
+        <w:t xml:space="preserve"> </w:t>
+      </w:r>
+      <w:r>
+        <w:t xml:space="preserve">5 chỉ số từ</w:t>
+      </w:r>
+      <w:r>
+        <w:t xml:space="preserve"> </w:t>
+      </w:r>
+      <w:r>
+        <w:rPr>
+          <w:rStyle w:val="VerbatimChar"/>
+        </w:rPr>
+        <w:t xml:space="preserve">manifest.sqlite</w:t>
+      </w:r>
+      <w:r>
+        <w:t xml:space="preserve"> </w:t>
+      </w:r>
+      <w:r>
+        <w:t xml:space="preserve">| Claude | Không |</w:t>
+      </w:r>
+      <w:r>
+        <w:t xml:space="preserve"> </w:t>
+      </w:r>
+      <w:r>
+        <w:t xml:space="preserve">| P1 | Script Blender</w:t>
+      </w:r>
+      <w:r>
+        <w:t xml:space="preserve"> </w:t>
+      </w:r>
+      <w:r>
+        <w:rPr>
+          <w:rStyle w:val="VerbatimChar"/>
+        </w:rPr>
+        <w:t xml:space="preserve">tools/previz/</w:t>
+      </w:r>
+      <w:r>
+        <w:t xml:space="preserve">: nhập map, tìm mặt đất, kiểm tra tỉ lệ, bản đồ từ trên, đặt ma-nơ-canh + 3 camera, render layout + độ sâu (thử bằng map giả trên cloud) | Claude | Không |</w:t>
+      </w:r>
+      <w:r>
+        <w:t xml:space="preserve"> </w:t>
+      </w:r>
+      <w:r>
+        <w:t xml:space="preserve">| P1 | Tải 1 map FF (GLB/FBX có texture), cài Blender, chạy script | Người dùng | Không |</w:t>
+      </w:r>
+      <w:r>
+        <w:t xml:space="preserve"> </w:t>
+      </w:r>
+      <w:r>
+        <w:t xml:space="preserve">| P2 (cổng) | Gửi 3–5 ảnh layout qua Deepix, so với cách hiện tại → quyết định có tích hợp | Người dùng + Claude | ~5 ảnh |</w:t>
+      </w:r>
+      <w:r>
+        <w:t xml:space="preserve"> </w:t>
+      </w:r>
+      <w:r>
+        <w:t xml:space="preserve">| P3 | Tích hợp previz vào Dashboard (khu vực từ map, blocking → 3D, render từng shot, QC 3 tiêu chí mới, video tham chiếu camera) | Claude | Không |</w:t>
+      </w:r>
+      <w:r>
+        <w:t xml:space="preserve"> </w:t>
+      </w:r>
+      <w:r>
+        <w:t xml:space="preserve">| P4 | Hồ sơ model + tự đề xuất model từng cảnh; bộ test 3 cảnh × Kling/Seedance | Claude + người dùng | ~$3,5 |</w:t>
+      </w:r>
+      <w:r>
+        <w:t xml:space="preserve"> </w:t>
+      </w:r>
+      <w:r>
+        <w:t xml:space="preserve">| P5 | Chạy lại 1 kịch bản 60 giây, đo 5 chỉ số, so với làm tay | Người dùng | Theo kịch bản |</w:t>
       </w:r>
     </w:p>
     <w:p>
@@ -7857,8 +9050,8 @@
         <w:t xml:space="preserve">(kèm 4 comment góp ý, đã phân tích ở Mục 2).</w:t>
       </w:r>
     </w:p>
-    <w:bookmarkEnd w:id="42"/>
     <w:bookmarkEnd w:id="43"/>
+    <w:bookmarkEnd w:id="44"/>
     <w:sectPr>
       <w:footnotePr>
         <w:numRestart w:val="eachSect"/>
@@ -8070,6 +9263,91 @@
       <w:rPr>
         <w:rFonts w:ascii="Wingdings" w:hAnsi="Wingdings" w:cs="Wingdings" w:hint="default"/>
       </w:rPr>
+    </w:lvl>
+  </w:abstractNum>
+  <w:abstractNum w:abstractNumId="99411">
+    <w:nsid w:val="00A99411"/>
+    <w:multiLevelType w:val="multilevel"/>
+    <w:lvl w:ilvl="0">
+      <w:start w:val="1"/>
+      <w:numFmt w:val="decimal"/>
+      <w:lvlText w:val="%1."/>
+      <w:lvlJc w:val="left"/>
+      <w:pPr>
+        <w:ind w:left="720" w:hanging="360"/>
+      </w:pPr>
+    </w:lvl>
+    <w:lvl w:ilvl="1">
+      <w:start w:val="1"/>
+      <w:numFmt w:val="decimal"/>
+      <w:lvlText w:val="%2."/>
+      <w:lvlJc w:val="left"/>
+      <w:pPr>
+        <w:ind w:left="1440" w:hanging="360"/>
+      </w:pPr>
+    </w:lvl>
+    <w:lvl w:ilvl="2">
+      <w:start w:val="1"/>
+      <w:numFmt w:val="decimal"/>
+      <w:lvlText w:val="%3."/>
+      <w:lvlJc w:val="left"/>
+      <w:pPr>
+        <w:ind w:left="2160" w:hanging="360"/>
+      </w:pPr>
+    </w:lvl>
+    <w:lvl w:ilvl="3">
+      <w:start w:val="1"/>
+      <w:numFmt w:val="decimal"/>
+      <w:lvlText w:val="%4."/>
+      <w:lvlJc w:val="left"/>
+      <w:pPr>
+        <w:ind w:left="2880" w:hanging="360"/>
+      </w:pPr>
+    </w:lvl>
+    <w:lvl w:ilvl="4">
+      <w:start w:val="1"/>
+      <w:numFmt w:val="decimal"/>
+      <w:lvlText w:val="%5."/>
+      <w:lvlJc w:val="left"/>
+      <w:pPr>
+        <w:ind w:left="3600" w:hanging="360"/>
+      </w:pPr>
+    </w:lvl>
+    <w:lvl w:ilvl="5">
+      <w:start w:val="1"/>
+      <w:numFmt w:val="decimal"/>
+      <w:lvlText w:val="%6."/>
+      <w:lvlJc w:val="left"/>
+      <w:pPr>
+        <w:ind w:left="4320" w:hanging="360"/>
+      </w:pPr>
+    </w:lvl>
+    <w:lvl w:ilvl="6">
+      <w:start w:val="1"/>
+      <w:numFmt w:val="decimal"/>
+      <w:lvlText w:val="%7."/>
+      <w:lvlJc w:val="left"/>
+      <w:pPr>
+        <w:ind w:left="5040" w:hanging="360"/>
+      </w:pPr>
+    </w:lvl>
+    <w:lvl w:ilvl="7">
+      <w:start w:val="1"/>
+      <w:numFmt w:val="decimal"/>
+      <w:lvlText w:val="%8."/>
+      <w:lvlJc w:val="left"/>
+      <w:pPr>
+        <w:ind w:left="5760" w:hanging="360"/>
+      </w:pPr>
+    </w:lvl>
+    <w:lvl w:ilvl="8">
+      <w:start w:val="1"/>
+      <w:numFmt w:val="decimal"/>
+      <w:lvlText w:val="%9."/>
+      <w:lvlJc w:val="left"/>
+      <w:pPr>
+        <w:ind w:left="6480" w:hanging="360"/>
+      </w:pPr>
     </w:lvl>
   </w:abstractNum>
   <w:abstractNum w:abstractNumId="992">
@@ -8164,21 +9442,60 @@
     <w:abstractNumId w:val="991"/>
   </w:num>
   <w:num w:numId="1005">
-    <w:abstractNumId w:val="992"/>
+    <w:abstractNumId w:val="99411"/>
+    <w:lvlOverride w:ilvl="0">
+      <w:startOverride w:val="1"/>
+    </w:lvlOverride>
+    <w:lvlOverride w:ilvl="1">
+      <w:startOverride w:val="1"/>
+    </w:lvlOverride>
+    <w:lvlOverride w:ilvl="2">
+      <w:startOverride w:val="1"/>
+    </w:lvlOverride>
+    <w:lvlOverride w:ilvl="3">
+      <w:startOverride w:val="1"/>
+    </w:lvlOverride>
+    <w:lvlOverride w:ilvl="4">
+      <w:startOverride w:val="1"/>
+    </w:lvlOverride>
+    <w:lvlOverride w:ilvl="5">
+      <w:startOverride w:val="1"/>
+    </w:lvlOverride>
+    <w:lvlOverride w:ilvl="6">
+      <w:startOverride w:val="1"/>
+    </w:lvlOverride>
+    <w:lvlOverride w:ilvl="7">
+      <w:startOverride w:val="1"/>
+    </w:lvlOverride>
+    <w:lvlOverride w:ilvl="8">
+      <w:startOverride w:val="1"/>
+    </w:lvlOverride>
   </w:num>
   <w:num w:numId="1006">
-    <w:abstractNumId w:val="992"/>
+    <w:abstractNumId w:val="991"/>
   </w:num>
   <w:num w:numId="1007">
-    <w:abstractNumId w:val="992"/>
+    <w:abstractNumId w:val="991"/>
   </w:num>
   <w:num w:numId="1008">
-    <w:abstractNumId w:val="992"/>
+    <w:abstractNumId w:val="991"/>
   </w:num>
   <w:num w:numId="1009">
     <w:abstractNumId w:val="992"/>
   </w:num>
   <w:num w:numId="1010">
+    <w:abstractNumId w:val="992"/>
+  </w:num>
+  <w:num w:numId="1011">
+    <w:abstractNumId w:val="992"/>
+  </w:num>
+  <w:num w:numId="1012">
+    <w:abstractNumId w:val="992"/>
+  </w:num>
+  <w:num w:numId="1013">
+    <w:abstractNumId w:val="992"/>
+  </w:num>
+  <w:num w:numId="1014">
     <w:abstractNumId w:val="992"/>
   </w:num>
 </w:numbering>

</xml_diff>

<commit_message>
Lock in three directions: image+text first, director desk on next API pass, 3D previz as research
- PLAN.md 3.7/5/9: priority order decided by the user; plan table regrouped by direction.
- TODO.md: P0 extended (shared background plate per sequence, auto angle tags for
  location pictures, face/outfit reference roles + character sheet on outfit change,
  3 new QC criteria); director-desk checklist for the next Clip AI API session;
  3D previz moved to a research track.
- docs/CLIPAI_FEATURES.md: director desk findings (likely a white-model previs stage
  feeding Seedance 2.5 reference video) and the next-API-session checklist.
- docs/RESEARCH_3D_PREVIZ.md: new research log for Deepix + Blender + Meshy + Clip AI.
- Rebuilt PLAN.docx/PLAN.pdf; memory entry.

Co-Authored-By: Claude Opus 5.5 <noreply@anthropic.com>
Claude-Session: https://claude.ai/code/session_01AvRTz2SA1mPQzTR9dxmmVo
</commit_message>
<xml_diff>
--- a/PLAN.docx
+++ b/PLAN.docx
@@ -4468,6 +4468,74 @@
           <w:b/>
           <w:bCs/>
         </w:rPr>
+        <w:t xml:space="preserve">Ưu tiên đã chốt (2026-09-23):</w:t>
+      </w:r>
+      <w:r>
+        <w:t xml:space="preserve"> </w:t>
+      </w:r>
+      <w:r>
+        <w:t xml:space="preserve">mục 1–4 và 6 dưới đây thuộc</w:t>
+      </w:r>
+      <w:r>
+        <w:t xml:space="preserve"> </w:t>
+      </w:r>
+      <w:r>
+        <w:rPr>
+          <w:b/>
+          <w:bCs/>
+        </w:rPr>
+        <w:t xml:space="preserve">hướng chính (ảnh + text)</w:t>
+      </w:r>
+      <w:r>
+        <w:t xml:space="preserve">, làm ngay. Mục 5 (previz 3D) là</w:t>
+      </w:r>
+      <w:r>
+        <w:t xml:space="preserve"> </w:t>
+      </w:r>
+      <w:r>
+        <w:rPr>
+          <w:b/>
+          <w:bCs/>
+        </w:rPr>
+        <w:t xml:space="preserve">hướng nghiên cứu cho tương lai</w:t>
+      </w:r>
+      <w:r>
+        <w:t xml:space="preserve"> </w:t>
+      </w:r>
+      <w:r>
+        <w:t xml:space="preserve">(xem</w:t>
+      </w:r>
+      <w:r>
+        <w:t xml:space="preserve"> </w:t>
+      </w:r>
+      <w:r>
+        <w:rPr>
+          <w:rStyle w:val="VerbatimChar"/>
+        </w:rPr>
+        <w:t xml:space="preserve">docs/RESEARCH_3D_PREVIZ.md</w:t>
+      </w:r>
+      <w:r>
+        <w:t xml:space="preserve">). Bàn đạo diễn Clip AI là hướng 2, dò lại ở lần dùng API tiếp theo (</w:t>
+      </w:r>
+      <w:r>
+        <w:rPr>
+          <w:rStyle w:val="VerbatimChar"/>
+        </w:rPr>
+        <w:t xml:space="preserve">docs/CLIPAI_FEATURES.md</w:t>
+      </w:r>
+      <w:r>
+        <w:t xml:space="preserve">). Bổ sung cho hướng chính: ảnh nền chung cho mỗi nhóm cảnh (gen 1 ảnh bối cảnh trống từ ảnh in-game, duyệt 1 lần, mọi shot trong nhóm dùng lại), tự gắn nhãn góc/cỡ cảnh/mốc cho ảnh bối cảnh bằng Claude Vision để chọn đúng ảnh góc theo shot, tách vai trò ảnh tham chiếu mặt/tóc và trang phục + gen bảng nhân vật (trước/nghiêng/sau) khi đổi trang phục.</w:t>
+      </w:r>
+    </w:p>
+    <w:p>
+      <w:pPr>
+        <w:pStyle w:val="BodyText"/>
+      </w:pPr>
+      <w:r>
+        <w:rPr>
+          <w:b/>
+          <w:bCs/>
+        </w:rPr>
         <w:t xml:space="preserve">Hướng giải quyết (theo thứ tự):</w:t>
       </w:r>
     </w:p>
@@ -5403,13 +5471,20 @@
           <w:b/>
           <w:bCs/>
         </w:rPr>
-        <w:t xml:space="preserve">(ClipAI 3D director’s desk) — tạm gác.</w:t>
-      </w:r>
-      <w:r>
-        <w:t xml:space="preserve"> </w:t>
-      </w:r>
-      <w:r>
-        <w:t xml:space="preserve">Không phải sản phẩm giả — có thật trên web ClipAI — nhưng không dò được endpoint qua các đường dẫn đoán mù; không đầu tư thêm thời gian trừ khi có URL/payload thật từ tab Network.</w:t>
+        <w:t xml:space="preserve">(ClipAI 3D director’s desk) — tạm gác</w:t>
+      </w:r>
+      <w:r>
+        <w:t xml:space="preserve"> </w:t>
+      </w:r>
+      <w:r>
+        <w:rPr>
+          <w:i/>
+          <w:iCs/>
+        </w:rPr>
+        <w:t xml:space="preserve">(cập nhật 2026-09-23: chuyển thành hướng 2 — dò lại ở lần dùng API tiếp theo, xem bên dưới)</w:t>
+      </w:r>
+      <w:r>
+        <w:t xml:space="preserve">. Không phải sản phẩm giả — có thật trên web ClipAI — nhưng không dò được endpoint qua các đường dẫn đoán mù; không đầu tư thêm thời gian trừ khi có URL/payload thật từ tab Network.</w:t>
       </w:r>
       <w:r>
         <w:t xml:space="preserve"> </w:t>
@@ -6019,35 +6094,125 @@
         </w:numPr>
       </w:pPr>
       <w:r>
-        <w:t xml:space="preserve">Hướng chính cho bối cảnh chân thực =</w:t>
-      </w:r>
-      <w:r>
-        <w:t xml:space="preserve"> </w:t>
-      </w:r>
-      <w:r>
-        <w:rPr>
-          <w:b/>
-          <w:bCs/>
-        </w:rPr>
-        <w:t xml:space="preserve">previz 3D từ map FF</w:t>
-      </w:r>
-      <w:r>
-        <w:t xml:space="preserve"> </w:t>
-      </w:r>
-      <w:r>
-        <w:t xml:space="preserve">(Blender tự động), thử trước bằng map fan trên mạng; không yêu cầu người dùng đánh dấu tay ảnh.</w:t>
+        <w:rPr>
+          <w:b/>
+          <w:bCs/>
+        </w:rPr>
+        <w:t xml:space="preserve">CHỐT 3 hướng theo thứ tự ưu tiên (người dùng, 2026-09-23):</w:t>
       </w:r>
     </w:p>
     <w:p>
       <w:pPr>
         <w:pStyle w:val="Compact"/>
         <w:numPr>
-          <w:ilvl w:val="0"/>
-          <w:numId w:val="1007"/>
+          <w:ilvl w:val="1"/>
+          <w:numId w:val="1008"/>
         </w:numPr>
       </w:pPr>
       <w:r>
-        <w:t xml:space="preserve">Thứ tự: sửa chọn ảnh tham chiếu/bối cảnh/blocking (A–C) → thử previz 3D + Deepix bám layout (cổng quyết định) → tích hợp Dashboard → test so model.</w:t>
+        <w:rPr>
+          <w:b/>
+          <w:bCs/>
+        </w:rPr>
+        <w:t xml:space="preserve">Hướng chính — tối ưu cách dùng ảnh + text</w:t>
+      </w:r>
+      <w:r>
+        <w:t xml:space="preserve"> </w:t>
+      </w:r>
+      <w:r>
+        <w:t xml:space="preserve">(đơn giản nhất, giữ linh hoạt thay trang phục khi không có file 3D). Làm ngay: sửa chọn ảnh tham chiếu (A), chọn bối cảnh theo ID (B), blocking + nhóm cảnh (C), ảnh nền chung cho mỗi nhóm cảnh, tự gắn nhãn góc ảnh bối cảnh bằng Claude Vision, tách ảnh tham chiếu mặt/trang phục + bảng nhân vật khi đổi trang phục, QC 3 tiêu chí mới, báo cáo 5 chỉ số.</w:t>
+      </w:r>
+    </w:p>
+    <w:p>
+      <w:pPr>
+        <w:pStyle w:val="Compact"/>
+        <w:numPr>
+          <w:ilvl w:val="1"/>
+          <w:numId w:val="1008"/>
+        </w:numPr>
+      </w:pPr>
+      <w:r>
+        <w:rPr>
+          <w:b/>
+          <w:bCs/>
+        </w:rPr>
+        <w:t xml:space="preserve">Bàn đạo diễn của Clip AI — dò lại ở lần dùng API tiếp theo, để build sau.</w:t>
+      </w:r>
+      <w:r>
+        <w:t xml:space="preserve"> </w:t>
+      </w:r>
+      <w:r>
+        <w:t xml:space="preserve">Lần tới làm việc với API Clip AI: đọc kỹ toàn bộ tính năng API cho phép (gói skill mới nhất nếu có, danh sách video/</w:t>
+      </w:r>
+      <w:r>
+        <w:rPr>
+          <w:rStyle w:val="VerbatimChar"/>
+        </w:rPr>
+        <w:t xml:space="preserve">task_type</w:t>
+      </w:r>
+      <w:r>
+        <w:t xml:space="preserve">, trường mới), kiểm tra video lưu từ Bàn đạo diễn có hiện trong API không, hỏi team Clip AI. Kết quả của nó (video white model) đã dùng được qua</w:t>
+      </w:r>
+      <w:r>
+        <w:t xml:space="preserve"> </w:t>
+      </w:r>
+      <w:r>
+        <w:rPr>
+          <w:rStyle w:val="VerbatimChar"/>
+        </w:rPr>
+        <w:t xml:space="preserve">reference_video</w:t>
+      </w:r>
+      <w:r>
+        <w:t xml:space="preserve"> </w:t>
+      </w:r>
+      <w:r>
+        <w:t xml:space="preserve">của Seedance theo tài liệu API. Xem</w:t>
+      </w:r>
+      <w:r>
+        <w:t xml:space="preserve"> </w:t>
+      </w:r>
+      <w:r>
+        <w:rPr>
+          <w:rStyle w:val="VerbatimChar"/>
+        </w:rPr>
+        <w:t xml:space="preserve">docs/CLIPAI_FEATURES.md</w:t>
+      </w:r>
+      <w:r>
+        <w:t xml:space="preserve">.</w:t>
+      </w:r>
+    </w:p>
+    <w:p>
+      <w:pPr>
+        <w:pStyle w:val="Compact"/>
+        <w:numPr>
+          <w:ilvl w:val="1"/>
+          <w:numId w:val="1008"/>
+        </w:numPr>
+      </w:pPr>
+      <w:r>
+        <w:rPr>
+          <w:b/>
+          <w:bCs/>
+        </w:rPr>
+        <w:t xml:space="preserve">Combo Deepix + Blender + Meshy + Clip AI (previz 3D) — nghiên cứu dần, dùng trong tương lai.</w:t>
+      </w:r>
+      <w:r>
+        <w:t xml:space="preserve"> </w:t>
+      </w:r>
+      <w:r>
+        <w:t xml:space="preserve">Mới và khó; ghi chép nghiên cứu ở</w:t>
+      </w:r>
+      <w:r>
+        <w:t xml:space="preserve"> </w:t>
+      </w:r>
+      <w:r>
+        <w:rPr>
+          <w:rStyle w:val="VerbatimChar"/>
+        </w:rPr>
+        <w:t xml:space="preserve">docs/RESEARCH_3D_PREVIZ.md</w:t>
+      </w:r>
+      <w:r>
+        <w:t xml:space="preserve">, không chặn hướng 1.</w:t>
       </w:r>
     </w:p>
     <w:p>
@@ -6108,18 +6273,18 @@
               <w:pStyle w:val="Compact"/>
             </w:pPr>
             <w:r>
-              <w:t xml:space="preserve">Deepix có bám ảnh layout từ 3D không</w:t>
-            </w:r>
-          </w:p>
-        </w:tc>
-        <w:tc>
-          <w:tcPr/>
-          <w:p>
-            <w:pPr>
-              <w:pStyle w:val="Compact"/>
-            </w:pPr>
-            <w:r>
-              <w:t xml:space="preserve">Quyết định có đưa previz 3D vào Dashboard hay không; cần thử 3–5 ảnh</w:t>
+              <w:t xml:space="preserve">API Clip AI có cho dùng Bàn đạo diễn không</w:t>
+            </w:r>
+          </w:p>
+        </w:tc>
+        <w:tc>
+          <w:tcPr/>
+          <w:p>
+            <w:pPr>
+              <w:pStyle w:val="Compact"/>
+            </w:pPr>
+            <w:r>
+              <w:t xml:space="preserve">Hướng 2 — kiểm tra ở lần dùng API tiếp theo; hỏi team Clip AI gói skill mới hơn 1.3.1</w:t>
             </w:r>
           </w:p>
         </w:tc>
@@ -6132,18 +6297,18 @@
               <w:pStyle w:val="Compact"/>
             </w:pPr>
             <w:r>
-              <w:t xml:space="preserve">Nguồn map 3D</w:t>
-            </w:r>
-          </w:p>
-        </w:tc>
-        <w:tc>
-          <w:tcPr/>
-          <w:p>
-            <w:pPr>
-              <w:pStyle w:val="Compact"/>
-            </w:pPr>
-            <w:r>
-              <w:t xml:space="preserve">Tạm dùng map fan để thử; bản phát hành cần asset chính thức từ team game (định dạng, texture, quyền dùng)</w:t>
+              <w:t xml:space="preserve">Deepix có bám ảnh layout từ 3D không</w:t>
+            </w:r>
+          </w:p>
+        </w:tc>
+        <w:tc>
+          <w:tcPr/>
+          <w:p>
+            <w:pPr>
+              <w:pStyle w:val="Compact"/>
+            </w:pPr>
+            <w:r>
+              <w:t xml:space="preserve">Hướng 3 (nghiên cứu) — cổng quyết định trước khi đầu tư previz 3D</w:t>
             </w:r>
           </w:p>
         </w:tc>
@@ -6156,18 +6321,18 @@
               <w:pStyle w:val="Compact"/>
             </w:pPr>
             <w:r>
-              <w:t xml:space="preserve">Model 3D nhân vật FF</w:t>
-            </w:r>
-          </w:p>
-        </w:tc>
-        <w:tc>
-          <w:tcPr/>
-          <w:p>
-            <w:pPr>
-              <w:pStyle w:val="Compact"/>
-            </w:pPr>
-            <w:r>
-              <w:t xml:space="preserve">Nếu có thì thay ma-nơ-canh, tư thế/tỉ lệ chuẩn hơn</w:t>
+              <w:t xml:space="preserve">Nguồn map 3D / model 3D nhân vật FF</w:t>
+            </w:r>
+          </w:p>
+        </w:tc>
+        <w:tc>
+          <w:tcPr/>
+          <w:p>
+            <w:pPr>
+              <w:pStyle w:val="Compact"/>
+            </w:pPr>
+            <w:r>
+              <w:t xml:space="preserve">Hướng 3 — map fan chỉ để thử nội bộ; bản phát hành cần asset chính thức</w:t>
             </w:r>
           </w:p>
         </w:tc>
@@ -7118,7 +7283,7 @@
         <w:pStyle w:val="Compact"/>
         <w:numPr>
           <w:ilvl w:val="0"/>
-          <w:numId w:val="1008"/>
+          <w:numId w:val="1009"/>
         </w:numPr>
       </w:pPr>
       <w:r>
@@ -7140,7 +7305,7 @@
         <w:pStyle w:val="Compact"/>
         <w:numPr>
           <w:ilvl w:val="0"/>
-          <w:numId w:val="1008"/>
+          <w:numId w:val="1009"/>
         </w:numPr>
       </w:pPr>
       <w:r>
@@ -7152,7 +7317,7 @@
         <w:pStyle w:val="Compact"/>
         <w:numPr>
           <w:ilvl w:val="0"/>
-          <w:numId w:val="1008"/>
+          <w:numId w:val="1009"/>
         </w:numPr>
       </w:pPr>
       <w:r>
@@ -7164,7 +7329,7 @@
         <w:pStyle w:val="Compact"/>
         <w:numPr>
           <w:ilvl w:val="0"/>
-          <w:numId w:val="1008"/>
+          <w:numId w:val="1009"/>
         </w:numPr>
       </w:pPr>
       <w:r>
@@ -7203,7 +7368,7 @@
         <w:pStyle w:val="Compact"/>
         <w:numPr>
           <w:ilvl w:val="0"/>
-          <w:numId w:val="1008"/>
+          <w:numId w:val="1009"/>
         </w:numPr>
       </w:pPr>
       <w:r>
@@ -7230,7 +7395,7 @@
         <w:pStyle w:val="Compact"/>
         <w:numPr>
           <w:ilvl w:val="0"/>
-          <w:numId w:val="1008"/>
+          <w:numId w:val="1009"/>
         </w:numPr>
       </w:pPr>
       <w:r>
@@ -7643,38 +7808,11 @@
         <w:pStyle w:val="Compact"/>
         <w:numPr>
           <w:ilvl w:val="0"/>
-          <w:numId w:val="1009"/>
-        </w:numPr>
-      </w:pPr>
-      <w:r>
-        <w:t xml:space="preserve">Chạy được ít nhất 1 video hoàn chỉnh end-to-end từ script.docx đến FINAL_VIDEO.mp4 qua Dashboard (V1), không cần chỉnh code tay</w:t>
-      </w:r>
-    </w:p>
-    <w:p>
-      <w:pPr>
-        <w:pStyle w:val="Compact"/>
-        <w:numPr>
-          <w:ilvl w:val="0"/>
           <w:numId w:val="1010"/>
         </w:numPr>
       </w:pPr>
       <w:r>
-        <w:t xml:space="preserve">Cả 2</w:t>
-      </w:r>
-      <w:r>
-        <w:t xml:space="preserve"> </w:t>
-      </w:r>
-      <w:r>
-        <w:rPr>
-          <w:rStyle w:val="VerbatimChar"/>
-        </w:rPr>
-        <w:t xml:space="preserve">operating_mode</w:t>
-      </w:r>
-      <w:r>
-        <w:t xml:space="preserve"> </w:t>
-      </w:r>
-      <w:r>
-        <w:t xml:space="preserve">đều test được và cho kết quả đúng như thiết kế ở Mục 3.2</w:t>
+        <w:t xml:space="preserve">Chạy được ít nhất 1 video hoàn chỉnh end-to-end từ script.docx đến FINAL_VIDEO.mp4 qua Dashboard (V1), không cần chỉnh code tay</w:t>
       </w:r>
     </w:p>
     <w:p>
@@ -7686,16 +7824,22 @@
         </w:numPr>
       </w:pPr>
       <w:r>
-        <w:rPr>
-          <w:rStyle w:val="VerbatimChar"/>
-        </w:rPr>
-        <w:t xml:space="preserve">max_retry_count</w:t>
-      </w:r>
-      <w:r>
-        <w:t xml:space="preserve"> </w:t>
-      </w:r>
-      <w:r>
-        <w:t xml:space="preserve">+ escalate hoạt động đúng khi cố tình cho 1 job fail liên tục</w:t>
+        <w:t xml:space="preserve">Cả 2</w:t>
+      </w:r>
+      <w:r>
+        <w:t xml:space="preserve"> </w:t>
+      </w:r>
+      <w:r>
+        <w:rPr>
+          <w:rStyle w:val="VerbatimChar"/>
+        </w:rPr>
+        <w:t xml:space="preserve">operating_mode</w:t>
+      </w:r>
+      <w:r>
+        <w:t xml:space="preserve"> </w:t>
+      </w:r>
+      <w:r>
+        <w:t xml:space="preserve">đều test được và cho kết quả đúng như thiết kế ở Mục 3.2</w:t>
       </w:r>
     </w:p>
     <w:p>
@@ -7707,7 +7851,16 @@
         </w:numPr>
       </w:pPr>
       <w:r>
-        <w:t xml:space="preserve">Pre-flight IP check cảnh báo đúng với ít nhất 1 case đã biết (Wonder Woman) trước khi chạy batch thật</w:t>
+        <w:rPr>
+          <w:rStyle w:val="VerbatimChar"/>
+        </w:rPr>
+        <w:t xml:space="preserve">max_retry_count</w:t>
+      </w:r>
+      <w:r>
+        <w:t xml:space="preserve"> </w:t>
+      </w:r>
+      <w:r>
+        <w:t xml:space="preserve">+ escalate hoạt động đúng khi cố tình cho 1 job fail liên tục</w:t>
       </w:r>
     </w:p>
     <w:p>
@@ -7719,7 +7872,7 @@
         </w:numPr>
       </w:pPr>
       <w:r>
-        <w:t xml:space="preserve">Batch &gt;100 video chạy được qua heartbeat polling mà không cần user approve từng cái</w:t>
+        <w:t xml:space="preserve">Pre-flight IP check cảnh báo đúng với ít nhất 1 case đã biết (Wonder Woman) trước khi chạy batch thật</w:t>
       </w:r>
     </w:p>
     <w:p>
@@ -7731,6 +7884,18 @@
         </w:numPr>
       </w:pPr>
       <w:r>
+        <w:t xml:space="preserve">Batch &gt;100 video chạy được qua heartbeat polling mà không cần user approve từng cái</w:t>
+      </w:r>
+    </w:p>
+    <w:p>
+      <w:pPr>
+        <w:pStyle w:val="Compact"/>
+        <w:numPr>
+          <w:ilvl w:val="0"/>
+          <w:numId w:val="1015"/>
+        </w:numPr>
+      </w:pPr>
+      <w:r>
         <w:t xml:space="preserve">Runbook + Prompt Templates đã bàn giao cho bộ phận sản xuất nội dung</w:t>
       </w:r>
     </w:p>
@@ -8734,7 +8899,7 @@
           <w:b/>
           <w:bCs/>
         </w:rPr>
-        <w:t xml:space="preserve">Kế hoạch tiếp theo (2026-09-23, chi tiết từng việc ở</w:t>
+        <w:t xml:space="preserve">Kế hoạch tiếp theo (chốt 2026-09-23, chi tiết từng việc ở</w:t>
       </w:r>
       <w:r>
         <w:rPr>
@@ -8758,151 +8923,568 @@
         </w:rPr>
         <w:t xml:space="preserve">):</w:t>
       </w:r>
-      <w:r>
-        <w:t xml:space="preserve"> </w:t>
-      </w:r>
-      <w:r>
-        <w:t xml:space="preserve">| Giai đoạn | Việc | Ai | Credit |</w:t>
-      </w:r>
-      <w:r>
-        <w:t xml:space="preserve"> </w:t>
-      </w:r>
-      <w:r>
-        <w:t xml:space="preserve">|—|—|—|—|</w:t>
-      </w:r>
-      <w:r>
-        <w:t xml:space="preserve"> </w:t>
-      </w:r>
-      <w:r>
-        <w:t xml:space="preserve">| P0 | (A) giữ chỗ ảnh bối cảnh/Storyboard; (B) chọn bối cảnh theo ID + ô chọn ở Bước 1; (C)</w:t>
-      </w:r>
-      <w:r>
-        <w:t xml:space="preserve"> </w:t>
-      </w:r>
-      <w:r>
-        <w:rPr>
-          <w:rStyle w:val="VerbatimChar"/>
-        </w:rPr>
-        <w:t xml:space="preserve">blocking</w:t>
-      </w:r>
-      <w:r>
-        <w:t xml:space="preserve"> </w:t>
-      </w:r>
-      <w:r>
-        <w:t xml:space="preserve">+</w:t>
-      </w:r>
-      <w:r>
-        <w:t xml:space="preserve"> </w:t>
-      </w:r>
-      <w:r>
-        <w:rPr>
-          <w:rStyle w:val="VerbatimChar"/>
-        </w:rPr>
-        <w:t xml:space="preserve">sequence</w:t>
-      </w:r>
-      <w:r>
-        <w:t xml:space="preserve"> </w:t>
-      </w:r>
-      <w:r>
-        <w:t xml:space="preserve">trong Director, Storyboard nối theo nhóm; skip 3 test</w:t>
-      </w:r>
-      <w:r>
-        <w:t xml:space="preserve"> </w:t>
-      </w:r>
-      <w:r>
-        <w:rPr>
-          <w:rStyle w:val="VerbatimChar"/>
-        </w:rPr>
-        <w:t xml:space="preserve">sound_lib</w:t>
-      </w:r>
-      <w:r>
-        <w:t xml:space="preserve"> </w:t>
-      </w:r>
-      <w:r>
-        <w:t xml:space="preserve">khi thiếu ffmpeg | Claude | Không |</w:t>
-      </w:r>
-      <w:r>
-        <w:t xml:space="preserve"> </w:t>
-      </w:r>
-      <w:r>
-        <w:t xml:space="preserve">| P0 | Báo cáo</w:t>
-      </w:r>
-      <w:r>
-        <w:t xml:space="preserve"> </w:t>
-      </w:r>
-      <w:r>
-        <w:t xml:space="preserve">“Hiệu quả workflow”</w:t>
-      </w:r>
-      <w:r>
-        <w:t xml:space="preserve"> </w:t>
-      </w:r>
-      <w:r>
-        <w:t xml:space="preserve">5 chỉ số từ</w:t>
-      </w:r>
-      <w:r>
-        <w:t xml:space="preserve"> </w:t>
-      </w:r>
-      <w:r>
-        <w:rPr>
-          <w:rStyle w:val="VerbatimChar"/>
-        </w:rPr>
-        <w:t xml:space="preserve">manifest.sqlite</w:t>
-      </w:r>
-      <w:r>
-        <w:t xml:space="preserve"> </w:t>
-      </w:r>
-      <w:r>
-        <w:t xml:space="preserve">| Claude | Không |</w:t>
-      </w:r>
-      <w:r>
-        <w:t xml:space="preserve"> </w:t>
-      </w:r>
-      <w:r>
-        <w:t xml:space="preserve">| P1 | Script Blender</w:t>
-      </w:r>
-      <w:r>
-        <w:t xml:space="preserve"> </w:t>
-      </w:r>
-      <w:r>
-        <w:rPr>
-          <w:rStyle w:val="VerbatimChar"/>
-        </w:rPr>
-        <w:t xml:space="preserve">tools/previz/</w:t>
-      </w:r>
-      <w:r>
-        <w:t xml:space="preserve">: nhập map, tìm mặt đất, kiểm tra tỉ lệ, bản đồ từ trên, đặt ma-nơ-canh + 3 camera, render layout + độ sâu (thử bằng map giả trên cloud) | Claude | Không |</w:t>
-      </w:r>
-      <w:r>
-        <w:t xml:space="preserve"> </w:t>
-      </w:r>
-      <w:r>
-        <w:t xml:space="preserve">| P1 | Tải 1 map FF (GLB/FBX có texture), cài Blender, chạy script | Người dùng | Không |</w:t>
-      </w:r>
-      <w:r>
-        <w:t xml:space="preserve"> </w:t>
-      </w:r>
-      <w:r>
-        <w:t xml:space="preserve">| P2 (cổng) | Gửi 3–5 ảnh layout qua Deepix, so với cách hiện tại → quyết định có tích hợp | Người dùng + Claude | ~5 ảnh |</w:t>
-      </w:r>
-      <w:r>
-        <w:t xml:space="preserve"> </w:t>
-      </w:r>
-      <w:r>
-        <w:t xml:space="preserve">| P3 | Tích hợp previz vào Dashboard (khu vực từ map, blocking → 3D, render từng shot, QC 3 tiêu chí mới, video tham chiếu camera) | Claude | Không |</w:t>
-      </w:r>
-      <w:r>
-        <w:t xml:space="preserve"> </w:t>
-      </w:r>
-      <w:r>
-        <w:t xml:space="preserve">| P4 | Hồ sơ model + tự đề xuất model từng cảnh; bộ test 3 cảnh × Kling/Seedance | Claude + người dùng | ~$3,5 |</w:t>
-      </w:r>
-      <w:r>
-        <w:t xml:space="preserve"> </w:t>
-      </w:r>
-      <w:r>
-        <w:t xml:space="preserve">| P5 | Chạy lại 1 kịch bản 60 giây, đo 5 chỉ số, so với làm tay | Người dùng | Theo kịch bản |</w:t>
-      </w:r>
-    </w:p>
+    </w:p>
+    <w:tbl>
+      <w:tblPr>
+        <w:tblStyle w:val="Table"/>
+        <w:tblW w:type="pct" w:w="5000"/>
+        <w:tblLayout w:type="fixed"/>
+        <w:tblLook w:firstRow="1" w:lastRow="0" w:firstColumn="0" w:lastColumn="0" w:noHBand="0" w:noVBand="0" w:val="0020"/>
+      </w:tblPr>
+      <w:tblGrid>
+        <w:gridCol w:w="1584"/>
+        <w:gridCol w:w="1584"/>
+        <w:gridCol w:w="1584"/>
+        <w:gridCol w:w="1584"/>
+        <w:gridCol w:w="1584"/>
+      </w:tblGrid>
+      <w:tr>
+        <w:trPr>
+          <w:tblHeader w:val="on"/>
+        </w:trPr>
+        <w:tc>
+          <w:tcPr/>
+          <w:p>
+            <w:pPr>
+              <w:pStyle w:val="Compact"/>
+            </w:pPr>
+            <w:r>
+              <w:t xml:space="preserve">Hướng</w:t>
+            </w:r>
+          </w:p>
+        </w:tc>
+        <w:tc>
+          <w:tcPr/>
+          <w:p>
+            <w:pPr>
+              <w:pStyle w:val="Compact"/>
+            </w:pPr>
+            <w:r>
+              <w:t xml:space="preserve">Giai đoạn</w:t>
+            </w:r>
+          </w:p>
+        </w:tc>
+        <w:tc>
+          <w:tcPr/>
+          <w:p>
+            <w:pPr>
+              <w:pStyle w:val="Compact"/>
+            </w:pPr>
+            <w:r>
+              <w:t xml:space="preserve">Việc</w:t>
+            </w:r>
+          </w:p>
+        </w:tc>
+        <w:tc>
+          <w:tcPr/>
+          <w:p>
+            <w:pPr>
+              <w:pStyle w:val="Compact"/>
+            </w:pPr>
+            <w:r>
+              <w:t xml:space="preserve">Ai</w:t>
+            </w:r>
+          </w:p>
+        </w:tc>
+        <w:tc>
+          <w:tcPr/>
+          <w:p>
+            <w:pPr>
+              <w:pStyle w:val="Compact"/>
+            </w:pPr>
+            <w:r>
+              <w:t xml:space="preserve">Credit</w:t>
+            </w:r>
+          </w:p>
+        </w:tc>
+      </w:tr>
+      <w:tr>
+        <w:tc>
+          <w:tcPr/>
+          <w:p>
+            <w:pPr>
+              <w:pStyle w:val="Compact"/>
+            </w:pPr>
+            <w:r>
+              <w:t xml:space="preserve">1 — Ảnh + text (chính)</w:t>
+            </w:r>
+          </w:p>
+        </w:tc>
+        <w:tc>
+          <w:tcPr/>
+          <w:p>
+            <w:pPr>
+              <w:pStyle w:val="Compact"/>
+            </w:pPr>
+            <w:r>
+              <w:t xml:space="preserve">P0</w:t>
+            </w:r>
+          </w:p>
+        </w:tc>
+        <w:tc>
+          <w:tcPr/>
+          <w:p>
+            <w:pPr>
+              <w:pStyle w:val="Compact"/>
+            </w:pPr>
+            <w:r>
+              <w:t xml:space="preserve">(A) giữ chỗ ảnh bối cảnh/Storyboard; (B) chọn bối cảnh theo ID + ô chọn ở Bước 1; (C)</w:t>
+            </w:r>
+            <w:r>
+              <w:t xml:space="preserve"> </w:t>
+            </w:r>
+            <w:r>
+              <w:rPr>
+                <w:rStyle w:val="VerbatimChar"/>
+              </w:rPr>
+              <w:t xml:space="preserve">blocking</w:t>
+            </w:r>
+            <w:r>
+              <w:t xml:space="preserve"> </w:t>
+            </w:r>
+            <w:r>
+              <w:t xml:space="preserve">+</w:t>
+            </w:r>
+            <w:r>
+              <w:t xml:space="preserve"> </w:t>
+            </w:r>
+            <w:r>
+              <w:rPr>
+                <w:rStyle w:val="VerbatimChar"/>
+              </w:rPr>
+              <w:t xml:space="preserve">sequence</w:t>
+            </w:r>
+            <w:r>
+              <w:t xml:space="preserve">, Storyboard nối theo nhóm; skip 3 test</w:t>
+            </w:r>
+            <w:r>
+              <w:t xml:space="preserve"> </w:t>
+            </w:r>
+            <w:r>
+              <w:rPr>
+                <w:rStyle w:val="VerbatimChar"/>
+              </w:rPr>
+              <w:t xml:space="preserve">sound_lib</w:t>
+            </w:r>
+            <w:r>
+              <w:t xml:space="preserve"> </w:t>
+            </w:r>
+            <w:r>
+              <w:t xml:space="preserve">khi thiếu ffmpeg</w:t>
+            </w:r>
+          </w:p>
+        </w:tc>
+        <w:tc>
+          <w:tcPr/>
+          <w:p>
+            <w:pPr>
+              <w:pStyle w:val="Compact"/>
+            </w:pPr>
+            <w:r>
+              <w:t xml:space="preserve">Claude</w:t>
+            </w:r>
+          </w:p>
+        </w:tc>
+        <w:tc>
+          <w:tcPr/>
+          <w:p>
+            <w:pPr>
+              <w:pStyle w:val="Compact"/>
+            </w:pPr>
+            <w:r>
+              <w:t xml:space="preserve">Không</w:t>
+            </w:r>
+          </w:p>
+        </w:tc>
+      </w:tr>
+      <w:tr>
+        <w:tc>
+          <w:tcPr/>
+          <w:p>
+            <w:pPr>
+              <w:pStyle w:val="Compact"/>
+            </w:pPr>
+            <w:r>
+              <w:t xml:space="preserve">1</w:t>
+            </w:r>
+          </w:p>
+        </w:tc>
+        <w:tc>
+          <w:tcPr/>
+          <w:p>
+            <w:pPr>
+              <w:pStyle w:val="Compact"/>
+            </w:pPr>
+            <w:r>
+              <w:t xml:space="preserve">P0</w:t>
+            </w:r>
+          </w:p>
+        </w:tc>
+        <w:tc>
+          <w:tcPr/>
+          <w:p>
+            <w:pPr>
+              <w:pStyle w:val="Compact"/>
+            </w:pPr>
+            <w:r>
+              <w:t xml:space="preserve">Ảnh nền chung mỗi nhóm cảnh; tự gắn nhãn góc ảnh bối cảnh (Claude Vision); ảnh tham chiếu mặt/trang phục + bảng nhân vật khi đổi trang phục; QC 3 tiêu chí (tỉ lệ, chân chạm đất, lệch bối cảnh)</w:t>
+            </w:r>
+          </w:p>
+        </w:tc>
+        <w:tc>
+          <w:tcPr/>
+          <w:p>
+            <w:pPr>
+              <w:pStyle w:val="Compact"/>
+            </w:pPr>
+            <w:r>
+              <w:t xml:space="preserve">Claude</w:t>
+            </w:r>
+          </w:p>
+        </w:tc>
+        <w:tc>
+          <w:tcPr/>
+          <w:p>
+            <w:pPr>
+              <w:pStyle w:val="Compact"/>
+            </w:pPr>
+            <w:r>
+              <w:t xml:space="preserve">Không (gắn nhãn cần Claude)</w:t>
+            </w:r>
+          </w:p>
+        </w:tc>
+      </w:tr>
+      <w:tr>
+        <w:tc>
+          <w:tcPr/>
+          <w:p>
+            <w:pPr>
+              <w:pStyle w:val="Compact"/>
+            </w:pPr>
+            <w:r>
+              <w:t xml:space="preserve">1</w:t>
+            </w:r>
+          </w:p>
+        </w:tc>
+        <w:tc>
+          <w:tcPr/>
+          <w:p>
+            <w:pPr>
+              <w:pStyle w:val="Compact"/>
+            </w:pPr>
+            <w:r>
+              <w:t xml:space="preserve">P0</w:t>
+            </w:r>
+          </w:p>
+        </w:tc>
+        <w:tc>
+          <w:tcPr/>
+          <w:p>
+            <w:pPr>
+              <w:pStyle w:val="Compact"/>
+            </w:pPr>
+            <w:r>
+              <w:t xml:space="preserve">Báo cáo</w:t>
+            </w:r>
+            <w:r>
+              <w:t xml:space="preserve"> </w:t>
+            </w:r>
+            <w:r>
+              <w:t xml:space="preserve">“Hiệu quả workflow”</w:t>
+            </w:r>
+            <w:r>
+              <w:t xml:space="preserve"> </w:t>
+            </w:r>
+            <w:r>
+              <w:t xml:space="preserve">5 chỉ số từ</w:t>
+            </w:r>
+            <w:r>
+              <w:t xml:space="preserve"> </w:t>
+            </w:r>
+            <w:r>
+              <w:rPr>
+                <w:rStyle w:val="VerbatimChar"/>
+              </w:rPr>
+              <w:t xml:space="preserve">manifest.sqlite</w:t>
+            </w:r>
+          </w:p>
+        </w:tc>
+        <w:tc>
+          <w:tcPr/>
+          <w:p>
+            <w:pPr>
+              <w:pStyle w:val="Compact"/>
+            </w:pPr>
+            <w:r>
+              <w:t xml:space="preserve">Claude</w:t>
+            </w:r>
+          </w:p>
+        </w:tc>
+        <w:tc>
+          <w:tcPr/>
+          <w:p>
+            <w:pPr>
+              <w:pStyle w:val="Compact"/>
+            </w:pPr>
+            <w:r>
+              <w:t xml:space="preserve">Không</w:t>
+            </w:r>
+          </w:p>
+        </w:tc>
+      </w:tr>
+      <w:tr>
+        <w:tc>
+          <w:tcPr/>
+          <w:p>
+            <w:pPr>
+              <w:pStyle w:val="Compact"/>
+            </w:pPr>
+            <w:r>
+              <w:t xml:space="preserve">1</w:t>
+            </w:r>
+          </w:p>
+        </w:tc>
+        <w:tc>
+          <w:tcPr/>
+          <w:p>
+            <w:pPr>
+              <w:pStyle w:val="Compact"/>
+            </w:pPr>
+            <w:r>
+              <w:t xml:space="preserve">P1</w:t>
+            </w:r>
+          </w:p>
+        </w:tc>
+        <w:tc>
+          <w:tcPr/>
+          <w:p>
+            <w:pPr>
+              <w:pStyle w:val="Compact"/>
+            </w:pPr>
+            <w:r>
+              <w:t xml:space="preserve">Hồ sơ model video + tự đề xuất model từng cảnh; bộ test 3 cảnh × Kling/Seedance</w:t>
+            </w:r>
+          </w:p>
+        </w:tc>
+        <w:tc>
+          <w:tcPr/>
+          <w:p>
+            <w:pPr>
+              <w:pStyle w:val="Compact"/>
+            </w:pPr>
+            <w:r>
+              <w:t xml:space="preserve">Claude + người dùng</w:t>
+            </w:r>
+          </w:p>
+        </w:tc>
+        <w:tc>
+          <w:tcPr/>
+          <w:p>
+            <w:pPr>
+              <w:pStyle w:val="Compact"/>
+            </w:pPr>
+            <w:r>
+              <w:t xml:space="preserve">~$3,5</w:t>
+            </w:r>
+          </w:p>
+        </w:tc>
+      </w:tr>
+      <w:tr>
+        <w:tc>
+          <w:tcPr/>
+          <w:p>
+            <w:pPr>
+              <w:pStyle w:val="Compact"/>
+            </w:pPr>
+            <w:r>
+              <w:t xml:space="preserve">1</w:t>
+            </w:r>
+          </w:p>
+        </w:tc>
+        <w:tc>
+          <w:tcPr/>
+          <w:p>
+            <w:pPr>
+              <w:pStyle w:val="Compact"/>
+            </w:pPr>
+            <w:r>
+              <w:t xml:space="preserve">P2</w:t>
+            </w:r>
+          </w:p>
+        </w:tc>
+        <w:tc>
+          <w:tcPr/>
+          <w:p>
+            <w:pPr>
+              <w:pStyle w:val="Compact"/>
+            </w:pPr>
+            <w:r>
+              <w:t xml:space="preserve">Chạy lại 1 kịch bản 60 giây, đo 5 chỉ số, so với làm tay</w:t>
+            </w:r>
+          </w:p>
+        </w:tc>
+        <w:tc>
+          <w:tcPr/>
+          <w:p>
+            <w:pPr>
+              <w:pStyle w:val="Compact"/>
+            </w:pPr>
+            <w:r>
+              <w:t xml:space="preserve">Người dùng</w:t>
+            </w:r>
+          </w:p>
+        </w:tc>
+        <w:tc>
+          <w:tcPr/>
+          <w:p>
+            <w:pPr>
+              <w:pStyle w:val="Compact"/>
+            </w:pPr>
+            <w:r>
+              <w:t xml:space="preserve">Theo kịch bản</w:t>
+            </w:r>
+          </w:p>
+        </w:tc>
+      </w:tr>
+      <w:tr>
+        <w:tc>
+          <w:tcPr/>
+          <w:p>
+            <w:pPr>
+              <w:pStyle w:val="Compact"/>
+            </w:pPr>
+            <w:r>
+              <w:t xml:space="preserve">2 — Bàn đạo diễn</w:t>
+            </w:r>
+          </w:p>
+        </w:tc>
+        <w:tc>
+          <w:tcPr/>
+          <w:p>
+            <w:pPr>
+              <w:pStyle w:val="Compact"/>
+            </w:pPr>
+            <w:r>
+              <w:t xml:space="preserve">Lần dùng API tới</w:t>
+            </w:r>
+          </w:p>
+        </w:tc>
+        <w:tc>
+          <w:tcPr/>
+          <w:p>
+            <w:pPr>
+              <w:pStyle w:val="Compact"/>
+            </w:pPr>
+            <w:r>
+              <w:t xml:space="preserve">Đọc kỹ toàn bộ tính năng API; kiểm tra video Bàn đạo diễn có trong API không; hỏi team Clip AI; thử</w:t>
+            </w:r>
+            <w:r>
+              <w:t xml:space="preserve"> </w:t>
+            </w:r>
+            <w:r>
+              <w:rPr>
+                <w:rStyle w:val="VerbatimChar"/>
+              </w:rPr>
+              <w:t xml:space="preserve">reference_video</w:t>
+            </w:r>
+            <w:r>
+              <w:t xml:space="preserve"> </w:t>
+            </w:r>
+            <w:r>
+              <w:t xml:space="preserve">Seedance thật (~$1–2)</w:t>
+            </w:r>
+          </w:p>
+        </w:tc>
+        <w:tc>
+          <w:tcPr/>
+          <w:p>
+            <w:pPr>
+              <w:pStyle w:val="Compact"/>
+            </w:pPr>
+            <w:r>
+              <w:t xml:space="preserve">Claude + người dùng</w:t>
+            </w:r>
+          </w:p>
+        </w:tc>
+        <w:tc>
+          <w:tcPr/>
+          <w:p>
+            <w:pPr>
+              <w:pStyle w:val="Compact"/>
+            </w:pPr>
+            <w:r>
+              <w:t xml:space="preserve">~$2</w:t>
+            </w:r>
+          </w:p>
+        </w:tc>
+      </w:tr>
+      <w:tr>
+        <w:tc>
+          <w:tcPr/>
+          <w:p>
+            <w:pPr>
+              <w:pStyle w:val="Compact"/>
+            </w:pPr>
+            <w:r>
+              <w:t xml:space="preserve">3 — Previz 3D</w:t>
+            </w:r>
+          </w:p>
+        </w:tc>
+        <w:tc>
+          <w:tcPr/>
+          <w:p>
+            <w:pPr>
+              <w:pStyle w:val="Compact"/>
+            </w:pPr>
+            <w:r>
+              <w:t xml:space="preserve">Nghiên cứu dần</w:t>
+            </w:r>
+          </w:p>
+        </w:tc>
+        <w:tc>
+          <w:tcPr/>
+          <w:p>
+            <w:pPr>
+              <w:pStyle w:val="Compact"/>
+            </w:pPr>
+            <w:r>
+              <w:t xml:space="preserve">Blender + map FF + Meshy (rig/tư thế) + Deepix/Clip AI; ghi ở</w:t>
+            </w:r>
+            <w:r>
+              <w:t xml:space="preserve"> </w:t>
+            </w:r>
+            <w:r>
+              <w:rPr>
+                <w:rStyle w:val="VerbatimChar"/>
+              </w:rPr>
+              <w:t xml:space="preserve">docs/RESEARCH_3D_PREVIZ.md</w:t>
+            </w:r>
+          </w:p>
+        </w:tc>
+        <w:tc>
+          <w:tcPr/>
+          <w:p>
+            <w:pPr>
+              <w:pStyle w:val="Compact"/>
+            </w:pPr>
+            <w:r>
+              <w:t xml:space="preserve">Khi có thời gian</w:t>
+            </w:r>
+          </w:p>
+        </w:tc>
+        <w:tc>
+          <w:tcPr/>
+          <w:p>
+            <w:pPr>
+              <w:pStyle w:val="Compact"/>
+            </w:pPr>
+            <w:r>
+              <w:t xml:space="preserve">—</w:t>
+            </w:r>
+          </w:p>
+        </w:tc>
+      </w:tr>
+    </w:tbl>
     <w:p>
       <w:pPr>
         <w:pStyle w:val="BodyText"/>
@@ -9478,10 +10060,37 @@
     <w:abstractNumId w:val="991"/>
   </w:num>
   <w:num w:numId="1008">
-    <w:abstractNumId w:val="991"/>
+    <w:abstractNumId w:val="99411"/>
+    <w:lvlOverride w:ilvl="0">
+      <w:startOverride w:val="1"/>
+    </w:lvlOverride>
+    <w:lvlOverride w:ilvl="1">
+      <w:startOverride w:val="1"/>
+    </w:lvlOverride>
+    <w:lvlOverride w:ilvl="2">
+      <w:startOverride w:val="1"/>
+    </w:lvlOverride>
+    <w:lvlOverride w:ilvl="3">
+      <w:startOverride w:val="1"/>
+    </w:lvlOverride>
+    <w:lvlOverride w:ilvl="4">
+      <w:startOverride w:val="1"/>
+    </w:lvlOverride>
+    <w:lvlOverride w:ilvl="5">
+      <w:startOverride w:val="1"/>
+    </w:lvlOverride>
+    <w:lvlOverride w:ilvl="6">
+      <w:startOverride w:val="1"/>
+    </w:lvlOverride>
+    <w:lvlOverride w:ilvl="7">
+      <w:startOverride w:val="1"/>
+    </w:lvlOverride>
+    <w:lvlOverride w:ilvl="8">
+      <w:startOverride w:val="1"/>
+    </w:lvlOverride>
   </w:num>
   <w:num w:numId="1009">
-    <w:abstractNumId w:val="992"/>
+    <w:abstractNumId w:val="991"/>
   </w:num>
   <w:num w:numId="1010">
     <w:abstractNumId w:val="992"/>
@@ -9496,6 +10105,9 @@
     <w:abstractNumId w:val="992"/>
   </w:num>
   <w:num w:numId="1014">
+    <w:abstractNumId w:val="992"/>
+  </w:num>
+  <w:num w:numId="1015">
     <w:abstractNumId w:val="992"/>
   </w:num>
 </w:numbering>

</xml_diff>

<commit_message>
Add the workflow effectiveness report (5 figures per project)
- core/effectiveness.py reads what the pipeline already records: minutes
  per second of finished video (wall clock and generation time), cost per
  second (declared prices x recorded submissions), first-pass rate and
  tries per scene for pictures and clips, QC agent vs person agreement
  (with too-strict / too-lenient counts, for tuning the threshold), and
  manual touches per scene. Missing data reads "not enough data", not 0.
- Monitor tab: "Hieu qua workflow" card for the project in view, an input
  for the manual-editing baseline, and a copyable summary.
- PLAN.md 9 / TODO.md: P0 code for direction 1 is done; next is the real
  run on the user's machine. Rebuilt PLAN.docx/pdf; memory updated.
- 588 tests pass (tests/test_effectiveness.py).

Co-Authored-By: Claude Opus 5.5 <noreply@anthropic.com>
Claude-Session: https://claude.ai/code/session_01AvRTz2SA1mPQzTR9dxmmVo
</commit_message>
<xml_diff>
--- a/PLAN.docx
+++ b/PLAN.docx
@@ -9079,6 +9079,152 @@
       </w:r>
       <w:r>
         <w:t xml:space="preserve">chống nhầm nhân vật; 548 test pass. Rà soát nhất quán nhân vật/bối cảnh/bố cục và lên kế hoạch previz 3D — xem 3.7 và Mục 5.</w:t>
+      </w:r>
+    </w:p>
+    <w:p>
+      <w:pPr>
+        <w:pStyle w:val="BodyText"/>
+      </w:pPr>
+      <w:r>
+        <w:rPr>
+          <w:b/>
+          <w:bCs/>
+        </w:rPr>
+        <w:t xml:space="preserve">Cập nhật 2026-09-23 (cuối ngày):</w:t>
+      </w:r>
+      <w:r>
+        <w:t xml:space="preserve"> </w:t>
+      </w:r>
+      <w:r>
+        <w:t xml:space="preserve">xong phần code P0 của hướng 1 — giữ chỗ ảnh bối cảnh + bối cảnh theo ID + ô Background; blocking + nhóm cảnh (Storyboard nối theo nhóm);</w:t>
+      </w:r>
+      <w:r>
+        <w:t xml:space="preserve"> </w:t>
+      </w:r>
+      <w:r>
+        <w:rPr>
+          <w:b/>
+          <w:bCs/>
+        </w:rPr>
+        <w:t xml:space="preserve">Previz 2D</w:t>
+      </w:r>
+      <w:r>
+        <w:t xml:space="preserve"> </w:t>
+      </w:r>
+      <w:r>
+        <w:t xml:space="preserve">(</w:t>
+      </w:r>
+      <w:r>
+        <w:rPr>
+          <w:rStyle w:val="VerbatimChar"/>
+        </w:rPr>
+        <w:t xml:space="preserve">core/layout.py</w:t>
+      </w:r>
+      <w:r>
+        <w:t xml:space="preserve">,</w:t>
+      </w:r>
+      <w:r>
+        <w:t xml:space="preserve"> </w:t>
+      </w:r>
+      <w:r>
+        <w:rPr>
+          <w:rStyle w:val="VerbatimChar"/>
+        </w:rPr>
+        <w:t xml:space="preserve">core/previz.py</w:t>
+      </w:r>
+      <w:r>
+        <w:t xml:space="preserve">: Claude đọc ảnh nền 1 lần, dựng layout cả kịch bản 1 lần, code đặt người theo phối cảnh, storyboard + Claude rà; Bước 2 gen theo layout; chạy bằng</w:t>
+      </w:r>
+      <w:r>
+        <w:t xml:space="preserve"> </w:t>
+      </w:r>
+      <w:r>
+        <w:rPr>
+          <w:rStyle w:val="VerbatimChar"/>
+        </w:rPr>
+        <w:t xml:space="preserve">claude_cli</w:t>
+      </w:r>
+      <w:r>
+        <w:t xml:space="preserve">); QC thêm</w:t>
+      </w:r>
+      <w:r>
+        <w:t xml:space="preserve"> </w:t>
+      </w:r>
+      <w:r>
+        <w:rPr>
+          <w:rStyle w:val="VerbatimChar"/>
+        </w:rPr>
+        <w:t xml:space="preserve">scale</w:t>
+      </w:r>
+      <w:r>
+        <w:t xml:space="preserve">/</w:t>
+      </w:r>
+      <w:r>
+        <w:rPr>
+          <w:rStyle w:val="VerbatimChar"/>
+        </w:rPr>
+        <w:t xml:space="preserve">grounding</w:t>
+      </w:r>
+      <w:r>
+        <w:t xml:space="preserve">/</w:t>
+      </w:r>
+      <w:r>
+        <w:rPr>
+          <w:rStyle w:val="VerbatimChar"/>
+        </w:rPr>
+        <w:t xml:space="preserve">set_match</w:t>
+      </w:r>
+      <w:r>
+        <w:t xml:space="preserve"> </w:t>
+      </w:r>
+      <w:r>
+        <w:t xml:space="preserve">và so với layout; thay trang phục bằng ảnh + bộ ảnh nhân vật 2 ảnh (</w:t>
+      </w:r>
+      <w:r>
+        <w:rPr>
+          <w:rStyle w:val="VerbatimChar"/>
+        </w:rPr>
+        <w:t xml:space="preserve">core/costume.py</w:t>
+      </w:r>
+      <w:r>
+        <w:t xml:space="preserve">); báo cáo 5 chỉ số hiệu quả (</w:t>
+      </w:r>
+      <w:r>
+        <w:rPr>
+          <w:rStyle w:val="VerbatimChar"/>
+        </w:rPr>
+        <w:t xml:space="preserve">core/effectiveness.py</w:t>
+      </w:r>
+      <w:r>
+        <w:t xml:space="preserve">, tab 📊). 588 test pass.</w:t>
+      </w:r>
+      <w:r>
+        <w:t xml:space="preserve"> </w:t>
+      </w:r>
+      <w:r>
+        <w:rPr>
+          <w:b/>
+          <w:bCs/>
+        </w:rPr>
+        <w:t xml:space="preserve">Chưa kiểm chứng thật</w:t>
+      </w:r>
+      <w:r>
+        <w:t xml:space="preserve"> </w:t>
+      </w:r>
+      <w:r>
+        <w:t xml:space="preserve">— bước tiếp theo là người dùng thử trên máy (Deepix +</w:t>
+      </w:r>
+      <w:r>
+        <w:t xml:space="preserve"> </w:t>
+      </w:r>
+      <w:r>
+        <w:rPr>
+          <w:rStyle w:val="VerbatimChar"/>
+        </w:rPr>
+        <w:t xml:space="preserve">claude_cli</w:t>
+      </w:r>
+      <w:r>
+        <w:t xml:space="preserve">), rồi P2 chạy kịch bản 60 giây và đọc báo cáo hiệu quả. Lưu ý: điểm QC tổng giờ là trung bình 8 tiêu chí, có thể phải chỉnh ngưỡng.</w:t>
       </w:r>
     </w:p>
     <w:p>

</xml_diff>

<commit_message>
v2 GĐ9: test một lượt (unit test + chạy thử kịch bản Kenta qua trình duyệt), sửa 29 lỗi
- Thanh bước không còn nhảy về Bước 1 khi nhãn tiến độ đổi
- Bảng trộn âm Bước 5 không còn tắt giọng thoại vừa xếp khi dựng
- Bản xuất cắt khung khác tỉ lệ dựng lại phụ đề + card cho khung mới
- Tự tăng thời lượng theo thoại chạy được trước khi có motion prompt
- Kịch bản có thoại bật phụ đề mặc định; nhạc phủ cả phim
- Giả lập ghi ảnh/clip thật khi MOCK_REAL_MEDIA=1 (bật trong run_demo)
- Báo cáo: docs/V2_TEST_REPORT.md; 632 test pass

Co-Authored-By: Claude Opus 5.5 <noreply@anthropic.com>
</commit_message>
<xml_diff>
--- a/PLAN.docx
+++ b/PLAN.docx
@@ -2,7 +2,7 @@
 <file path=word/document.xml><?xml version="1.0" encoding="utf-8"?>
 <w:document xmlns:w="http://schemas.openxmlformats.org/wordprocessingml/2006/main" xmlns:m="http://schemas.openxmlformats.org/officeDocument/2006/math" xmlns:r="http://schemas.openxmlformats.org/officeDocument/2006/relationships" xmlns:o="urn:schemas-microsoft-com:office:office" xmlns:v="urn:schemas-microsoft-com:vml" xmlns:w10="urn:schemas-microsoft-com:office:word" xmlns:a="http://schemas.openxmlformats.org/drawingml/2006/main" xmlns:pic="http://schemas.openxmlformats.org/drawingml/2006/picture" xmlns:wp="http://schemas.openxmlformats.org/drawingml/2006/wordprocessingDrawing">
   <w:body>
-    <w:bookmarkStart w:id="45" w:name="X9c8c830ec4a0bd58ad601261317abf6bbfd8ccb"/>
+    <w:bookmarkStart w:id="46" w:name="X9c8c830ec4a0bd58ad601261317abf6bbfd8ccb"/>
     <w:p>
       <w:pPr>
         <w:pStyle w:val="Heading1"/>
@@ -1293,7 +1293,7 @@
     </w:p>
     <w:bookmarkEnd w:id="13"/>
     <w:bookmarkEnd w:id="14"/>
-    <w:bookmarkStart w:id="35" w:name="Xcd7cd861a7bec2f7c480708ab31acaf54a69d9b"/>
+    <w:bookmarkStart w:id="36" w:name="Xcd7cd861a7bec2f7c480708ab31acaf54a69d9b"/>
     <w:p>
       <w:pPr>
         <w:pStyle w:val="Heading2"/>
@@ -5640,8 +5640,705 @@
       </w:r>
     </w:p>
     <w:bookmarkEnd w:id="34"/>
+    <w:bookmarkStart w:id="35" w:name="X6027e250f65ea4c3c10a4eb2ac7f62888cb0d83"/>
+    <w:p>
+      <w:pPr>
+        <w:pStyle w:val="Heading3"/>
+      </w:pPr>
+      <w:r>
+        <w:t xml:space="preserve">3.8 Dashboard v2 (2026-09-23) — nhất quán giữa các bước + kho kỹ năng thành luật trong code</w:t>
+      </w:r>
+    </w:p>
+    <w:p>
+      <w:pPr>
+        <w:pStyle w:val="FirstParagraph"/>
+      </w:pPr>
+      <w:r>
+        <w:t xml:space="preserve">Nguồn: báo cáo rà soát</w:t>
+      </w:r>
+      <w:r>
+        <w:t xml:space="preserve"> </w:t>
+      </w:r>
+      <w:r>
+        <w:rPr>
+          <w:rStyle w:val="VerbatimChar"/>
+        </w:rPr>
+        <w:t xml:space="preserve">docs/DASHBOARD_REVIEW_2026-09-23.md</w:t>
+      </w:r>
+      <w:r>
+        <w:t xml:space="preserve"> </w:t>
+      </w:r>
+      <w:r>
+        <w:t xml:space="preserve">và kiểm kê kho kỹ năng</w:t>
+      </w:r>
+      <w:r>
+        <w:t xml:space="preserve"> </w:t>
+      </w:r>
+      <w:r>
+        <w:rPr>
+          <w:rStyle w:val="VerbatimChar"/>
+        </w:rPr>
+        <w:t xml:space="preserve">Get this Skill to Claude/</w:t>
+      </w:r>
+      <w:r>
+        <w:t xml:space="preserve"> </w:t>
+      </w:r>
+      <w:r>
+        <w:t xml:space="preserve">(mới dùng ~50%, chủ yếu dán tài liệu vào prompt). Quyết định của người dùng: tỉ lệ khung theo dự án (mặc định 9:16), thoại tiếng Việt bằng TTS là chính, kho kỹ năng → luật + cổng kiểm tra trong code,</w:t>
+      </w:r>
+      <w:r>
+        <w:t xml:space="preserve"> </w:t>
+      </w:r>
+      <w:r>
+        <w:rPr>
+          <w:b/>
+          <w:bCs/>
+        </w:rPr>
+        <w:t xml:space="preserve">model video chọn theo từng cảnh</w:t>
+      </w:r>
+      <w:r>
+        <w:t xml:space="preserve"> </w:t>
+      </w:r>
+      <w:r>
+        <w:t xml:space="preserve">theo slide ClipAI (bỏ Kling mặc định), làm hết rồi test 1 lượt.</w:t>
+      </w:r>
+    </w:p>
+    <w:tbl>
+      <w:tblPr>
+        <w:tblStyle w:val="Table"/>
+        <w:tblW w:type="pct" w:w="5000"/>
+        <w:tblLayout w:type="fixed"/>
+        <w:tblLook w:firstRow="1" w:lastRow="0" w:firstColumn="0" w:lastColumn="0" w:noHBand="0" w:noVBand="0" w:val="0020"/>
+      </w:tblPr>
+      <w:tblGrid>
+        <w:gridCol w:w="2640"/>
+        <w:gridCol w:w="2640"/>
+        <w:gridCol w:w="2640"/>
+      </w:tblGrid>
+      <w:tr>
+        <w:trPr>
+          <w:tblHeader w:val="on"/>
+        </w:trPr>
+        <w:tc>
+          <w:tcPr/>
+          <w:p>
+            <w:pPr>
+              <w:pStyle w:val="Compact"/>
+            </w:pPr>
+            <w:r>
+              <w:t xml:space="preserve">Nền tảng</w:t>
+            </w:r>
+          </w:p>
+        </w:tc>
+        <w:tc>
+          <w:tcPr/>
+          <w:p>
+            <w:pPr>
+              <w:pStyle w:val="Compact"/>
+            </w:pPr>
+            <w:r>
+              <w:t xml:space="preserve">Làm gì</w:t>
+            </w:r>
+          </w:p>
+        </w:tc>
+        <w:tc>
+          <w:tcPr/>
+          <w:p>
+            <w:pPr>
+              <w:pStyle w:val="Compact"/>
+            </w:pPr>
+            <w:r>
+              <w:t xml:space="preserve">File</w:t>
+            </w:r>
+          </w:p>
+        </w:tc>
+      </w:tr>
+      <w:tr>
+        <w:tc>
+          <w:tcPr/>
+          <w:p>
+            <w:pPr>
+              <w:pStyle w:val="Compact"/>
+            </w:pPr>
+            <w:r>
+              <w:t xml:space="preserve">“⚠ cũ”</w:t>
+            </w:r>
+            <w:r>
+              <w:t xml:space="preserve"> </w:t>
+            </w:r>
+            <w:r>
+              <w:t xml:space="preserve">(lineage)</w:t>
+            </w:r>
+          </w:p>
+        </w:tc>
+        <w:tc>
+          <w:tcPr/>
+          <w:p>
+            <w:pPr>
+              <w:pStyle w:val="Compact"/>
+            </w:pPr>
+            <w:r>
+              <w:t xml:space="preserve">ảnh/motion/video/bản giao lưu dấu vân tay đầu vào; sửa cảnh, bỏ duyệt ảnh, đổi tỉ lệ khung → phần làm từ đầu vào cũ hiện ⚠ và có nút làm lại đúng phần đó; video không gen từ prompt cũ</w:t>
+            </w:r>
+          </w:p>
+        </w:tc>
+        <w:tc>
+          <w:tcPr/>
+          <w:p>
+            <w:pPr>
+              <w:pStyle w:val="Compact"/>
+            </w:pPr>
+            <w:r>
+              <w:rPr>
+                <w:rStyle w:val="VerbatimChar"/>
+              </w:rPr>
+              <w:t xml:space="preserve">core/lineage.py</w:t>
+            </w:r>
+            <w:r>
+              <w:t xml:space="preserve">,</w:t>
+            </w:r>
+            <w:r>
+              <w:t xml:space="preserve"> </w:t>
+            </w:r>
+            <w:r>
+              <w:rPr>
+                <w:rStyle w:val="VerbatimChar"/>
+              </w:rPr>
+              <w:t xml:space="preserve">core/batch.py</w:t>
+            </w:r>
+          </w:p>
+        </w:tc>
+      </w:tr>
+      <w:tr>
+        <w:tc>
+          <w:tcPr/>
+          <w:p>
+            <w:pPr>
+              <w:pStyle w:val="Compact"/>
+            </w:pPr>
+            <w:r>
+              <w:t xml:space="preserve">Director JSON v2</w:t>
+            </w:r>
+          </w:p>
+        </w:tc>
+        <w:tc>
+          <w:tcPr/>
+          <w:p>
+            <w:pPr>
+              <w:pStyle w:val="Compact"/>
+            </w:pPr>
+            <w:r>
+              <w:t xml:space="preserve">thể loại, Character Lock, ý đồ cảm xúc, beat, độ phức tạp máy, vai trò cảnh (then chốt/chuyển tiếp), thoại có cấu trúc, thời lượng; chạy lại không ghi đè trường sửa tay (🔒), null không xóa Background</w:t>
+            </w:r>
+          </w:p>
+        </w:tc>
+        <w:tc>
+          <w:tcPr/>
+          <w:p>
+            <w:pPr>
+              <w:pStyle w:val="Compact"/>
+            </w:pPr>
+            <w:r>
+              <w:rPr>
+                <w:rStyle w:val="VerbatimChar"/>
+              </w:rPr>
+              <w:t xml:space="preserve">core/llm_io.py</w:t>
+            </w:r>
+            <w:r>
+              <w:t xml:space="preserve">,</w:t>
+            </w:r>
+            <w:r>
+              <w:t xml:space="preserve"> </w:t>
+            </w:r>
+            <w:r>
+              <w:rPr>
+                <w:rStyle w:val="VerbatimChar"/>
+              </w:rPr>
+              <w:t xml:space="preserve">prompts/01</w:t>
+            </w:r>
+          </w:p>
+        </w:tc>
+      </w:tr>
+      <w:tr>
+        <w:tc>
+          <w:tcPr/>
+          <w:p>
+            <w:pPr>
+              <w:pStyle w:val="Compact"/>
+            </w:pPr>
+            <w:r>
+              <w:t xml:space="preserve">Tỉ lệ khung</w:t>
+            </w:r>
+          </w:p>
+        </w:tc>
+        <w:tc>
+          <w:tcPr/>
+          <w:p>
+            <w:pPr>
+              <w:pStyle w:val="Compact"/>
+            </w:pPr>
+            <w:r>
+              <w:t xml:space="preserve">16:9 / 9:16 / 1:1 → kích thước Deepix, ratio Clip AI, khung layout, render, xuất bản (cắt khung thay viền đen)</w:t>
+            </w:r>
+          </w:p>
+        </w:tc>
+        <w:tc>
+          <w:tcPr/>
+          <w:p>
+            <w:pPr>
+              <w:pStyle w:val="Compact"/>
+            </w:pPr>
+            <w:r>
+              <w:rPr>
+                <w:rStyle w:val="VerbatimChar"/>
+              </w:rPr>
+              <w:t xml:space="preserve">core/formats.py</w:t>
+            </w:r>
+          </w:p>
+        </w:tc>
+      </w:tr>
+      <w:tr>
+        <w:tc>
+          <w:tcPr/>
+          <w:p>
+            <w:pPr>
+              <w:pStyle w:val="Compact"/>
+            </w:pPr>
+            <w:r>
+              <w:t xml:space="preserve">Model theo cảnh</w:t>
+            </w:r>
+          </w:p>
+        </w:tc>
+        <w:tc>
+          <w:tcPr/>
+          <w:p>
+            <w:pPr>
+              <w:pStyle w:val="Compact"/>
+            </w:pPr>
+            <w:r>
+              <w:t xml:space="preserve">3 mức ưu tiên (Chất lượng / Cân bằng / Tiết kiệm) = 2 thang của slide; luật: then chốt/phức tạp/video tham chiếu → Seedance 2.5, ≥3 nhân vật → Seedance, đối thoại nhiều người/chuyển tiếp → Kling, cảnh thường → Seedance 2.0 / Fast; đổi được từng cảnh; MiniMax H3 và Seedance Mini chỉ có trên web</w:t>
+            </w:r>
+          </w:p>
+        </w:tc>
+        <w:tc>
+          <w:tcPr/>
+          <w:p>
+            <w:pPr>
+              <w:pStyle w:val="Compact"/>
+            </w:pPr>
+            <w:r>
+              <w:rPr>
+                <w:rStyle w:val="VerbatimChar"/>
+              </w:rPr>
+              <w:t xml:space="preserve">core/model_router.py</w:t>
+            </w:r>
+            <w:r>
+              <w:t xml:space="preserve">,</w:t>
+            </w:r>
+            <w:r>
+              <w:t xml:space="preserve"> </w:t>
+            </w:r>
+            <w:r>
+              <w:rPr>
+                <w:rStyle w:val="VerbatimChar"/>
+              </w:rPr>
+              <w:t xml:space="preserve">data/video_models.json</w:t>
+            </w:r>
+          </w:p>
+        </w:tc>
+      </w:tr>
+      <w:tr>
+        <w:tc>
+          <w:tcPr/>
+          <w:p>
+            <w:pPr>
+              <w:pStyle w:val="Compact"/>
+            </w:pPr>
+            <w:r>
+              <w:t xml:space="preserve">Giọng thoại</w:t>
+            </w:r>
+          </w:p>
+        </w:tc>
+        <w:tc>
+          <w:tcPr/>
+          <w:p>
+            <w:pPr>
+              <w:pStyle w:val="Compact"/>
+            </w:pPr>
+            <w:r>
+              <w:t xml:space="preserve">giọng từng nhân vật (Character Bible), TTS mỗi câu, độ dài giọng thật đặt thời lượng clip, xếp không chồng tiếng, phụ đề lấy giờ từ giọng</w:t>
+            </w:r>
+          </w:p>
+        </w:tc>
+        <w:tc>
+          <w:tcPr/>
+          <w:p>
+            <w:pPr>
+              <w:pStyle w:val="Compact"/>
+            </w:pPr>
+            <w:r>
+              <w:rPr>
+                <w:rStyle w:val="VerbatimChar"/>
+              </w:rPr>
+              <w:t xml:space="preserve">core/voice.py</w:t>
+            </w:r>
+          </w:p>
+        </w:tc>
+      </w:tr>
+      <w:tr>
+        <w:tc>
+          <w:tcPr/>
+          <w:p>
+            <w:pPr>
+              <w:pStyle w:val="Compact"/>
+            </w:pPr>
+            <w:r>
+              <w:t xml:space="preserve">Bản giao</w:t>
+            </w:r>
+          </w:p>
+        </w:tc>
+        <w:tc>
+          <w:tcPr/>
+          <w:p>
+            <w:pPr>
+              <w:pStyle w:val="Compact"/>
+            </w:pPr>
+            <w:r>
+              <w:t xml:space="preserve">dựng (thiết lập lưu theo dự án) → phụ đề (màu theo nhân vật, kiểm mật độ, .xlsx) → card cuối → các kích thước; animatic trước khi gen video</w:t>
+            </w:r>
+          </w:p>
+        </w:tc>
+        <w:tc>
+          <w:tcPr/>
+          <w:p>
+            <w:pPr>
+              <w:pStyle w:val="Compact"/>
+            </w:pPr>
+            <w:r>
+              <w:rPr>
+                <w:rStyle w:val="VerbatimChar"/>
+              </w:rPr>
+              <w:t xml:space="preserve">core/delivery.py</w:t>
+            </w:r>
+          </w:p>
+        </w:tc>
+      </w:tr>
+      <w:tr>
+        <w:tc>
+          <w:tcPr/>
+          <w:p>
+            <w:pPr>
+              <w:pStyle w:val="Compact"/>
+            </w:pPr>
+            <w:r>
+              <w:t xml:space="preserve">QC</w:t>
+            </w:r>
+          </w:p>
+        </w:tc>
+        <w:tc>
+          <w:tcPr/>
+          <w:p>
+            <w:pPr>
+              <w:pStyle w:val="Compact"/>
+            </w:pPr>
+            <w:r>
+              <w:t xml:space="preserve">chính sách 3 mức; tiêu chí chặn cứng; QC video tự động (4 tiêu chí); QC đồng bộ cả bộ ảnh; gen thử trước lô</w:t>
+            </w:r>
+          </w:p>
+        </w:tc>
+        <w:tc>
+          <w:tcPr/>
+          <w:p>
+            <w:pPr>
+              <w:pStyle w:val="Compact"/>
+            </w:pPr>
+            <w:r>
+              <w:rPr>
+                <w:rStyle w:val="VerbatimChar"/>
+              </w:rPr>
+              <w:t xml:space="preserve">core/qc_policy.py</w:t>
+            </w:r>
+            <w:r>
+              <w:t xml:space="preserve">,</w:t>
+            </w:r>
+            <w:r>
+              <w:t xml:space="preserve"> </w:t>
+            </w:r>
+            <w:r>
+              <w:rPr>
+                <w:rStyle w:val="VerbatimChar"/>
+              </w:rPr>
+              <w:t xml:space="preserve">core/claude_tasks.py</w:t>
+            </w:r>
+            <w:r>
+              <w:t xml:space="preserve">,</w:t>
+            </w:r>
+            <w:r>
+              <w:t xml:space="preserve"> </w:t>
+            </w:r>
+            <w:r>
+              <w:rPr>
+                <w:rStyle w:val="VerbatimChar"/>
+              </w:rPr>
+              <w:t xml:space="preserve">core/pilot.py</w:t>
+            </w:r>
+            <w:r>
+              <w:t xml:space="preserve">,</w:t>
+            </w:r>
+            <w:r>
+              <w:t xml:space="preserve"> </w:t>
+            </w:r>
+            <w:r>
+              <w:rPr>
+                <w:rStyle w:val="VerbatimChar"/>
+              </w:rPr>
+              <w:t xml:space="preserve">core/autoqc.py</w:t>
+            </w:r>
+          </w:p>
+        </w:tc>
+      </w:tr>
+      <w:tr>
+        <w:tc>
+          <w:tcPr/>
+          <w:p>
+            <w:pPr>
+              <w:pStyle w:val="Compact"/>
+            </w:pPr>
+            <w:r>
+              <w:t xml:space="preserve">Kho kỹ năng → luật</w:t>
+            </w:r>
+          </w:p>
+        </w:tc>
+        <w:tc>
+          <w:tcPr/>
+          <w:p>
+            <w:pPr>
+              <w:pStyle w:val="Compact"/>
+            </w:pPr>
+            <w:r>
+              <w:t xml:space="preserve">film-director (thể loại, JSON), narration-writer (rà thoại, persona), consistency designer (Character Lock, ảnh mốc), asset-set (pilot, QC đồng bộ), seedance25 (rà motion prompt + 4 kiểm tra mơ hồ của slide), style-analyst (mẫu phong cách), auto-dialogue (phụ đề); chỉ gửi mục kỹ năng FF của nhân vật có trong dự án</w:t>
+            </w:r>
+          </w:p>
+        </w:tc>
+        <w:tc>
+          <w:tcPr/>
+          <w:p>
+            <w:pPr>
+              <w:pStyle w:val="Compact"/>
+            </w:pPr>
+            <w:r>
+              <w:rPr>
+                <w:rStyle w:val="VerbatimChar"/>
+              </w:rPr>
+              <w:t xml:space="preserve">knowledge/genre/*</w:t>
+            </w:r>
+            <w:r>
+              <w:t xml:space="preserve">,</w:t>
+            </w:r>
+            <w:r>
+              <w:t xml:space="preserve"> </w:t>
+            </w:r>
+            <w:r>
+              <w:rPr>
+                <w:rStyle w:val="VerbatimChar"/>
+              </w:rPr>
+              <w:t xml:space="preserve">knowledge/*.md</w:t>
+            </w:r>
+            <w:r>
+              <w:t xml:space="preserve">,</w:t>
+            </w:r>
+            <w:r>
+              <w:t xml:space="preserve"> </w:t>
+            </w:r>
+            <w:r>
+              <w:rPr>
+                <w:rStyle w:val="VerbatimChar"/>
+              </w:rPr>
+              <w:t xml:space="preserve">prompts/10-15</w:t>
+            </w:r>
+          </w:p>
+        </w:tc>
+      </w:tr>
+      <w:tr>
+        <w:tc>
+          <w:tcPr/>
+          <w:p>
+            <w:pPr>
+              <w:pStyle w:val="Compact"/>
+            </w:pPr>
+            <w:r>
+              <w:t xml:space="preserve">Giao diện</w:t>
+            </w:r>
+          </w:p>
+        </w:tc>
+        <w:tc>
+          <w:tcPr/>
+          <w:p>
+            <w:pPr>
+              <w:pStyle w:val="Compact"/>
+            </w:pPr>
+            <w:r>
+              <w:t xml:space="preserve">tách</w:t>
+            </w:r>
+            <w:r>
+              <w:t xml:space="preserve"> </w:t>
+            </w:r>
+            <w:r>
+              <w:rPr>
+                <w:rStyle w:val="VerbatimChar"/>
+              </w:rPr>
+              <w:t xml:space="preserve">app.py</w:t>
+            </w:r>
+            <w:r>
+              <w:t xml:space="preserve"> </w:t>
+            </w:r>
+            <w:r>
+              <w:t xml:space="preserve">thành module; 1 thanh đầu trang, 1 nút ⚙; mỗi bước có đầu bước; nhãn tiếng Việt thống nhất; Bước 1 sắp theo thứ tự dữ liệu cần; Bước 5 thành</w:t>
+            </w:r>
+            <w:r>
+              <w:t xml:space="preserve"> </w:t>
+            </w:r>
+            <w:r>
+              <w:t xml:space="preserve">“Âm thanh &amp; xuất bản”</w:t>
+            </w:r>
+          </w:p>
+        </w:tc>
+        <w:tc>
+          <w:tcPr/>
+          <w:p>
+            <w:pPr>
+              <w:pStyle w:val="Compact"/>
+            </w:pPr>
+            <w:r>
+              <w:rPr>
+                <w:rStyle w:val="VerbatimChar"/>
+              </w:rPr>
+              <w:t xml:space="preserve">dashboard/*</w:t>
+            </w:r>
+          </w:p>
+        </w:tc>
+      </w:tr>
+      <w:tr>
+        <w:tc>
+          <w:tcPr/>
+          <w:p>
+            <w:pPr>
+              <w:pStyle w:val="Compact"/>
+            </w:pPr>
+            <w:r>
+              <w:t xml:space="preserve">Chế độ tự động</w:t>
+            </w:r>
+          </w:p>
+        </w:tc>
+        <w:tc>
+          <w:tcPr/>
+          <w:p>
+            <w:pPr>
+              <w:pStyle w:val="Compact"/>
+            </w:pPr>
+            <w:r>
+              <w:t xml:space="preserve">cổng duyệt Character Bible (mặc định bật), gen thử trước lô, rà storyboard, QC đồng bộ, rà prompt, giọng thoại, QC video, brief nhạc, bản giao; trả lại cách duyệt khi dừng</w:t>
+            </w:r>
+          </w:p>
+        </w:tc>
+        <w:tc>
+          <w:tcPr/>
+          <w:p>
+            <w:pPr>
+              <w:pStyle w:val="Compact"/>
+            </w:pPr>
+            <w:r>
+              <w:rPr>
+                <w:rStyle w:val="VerbatimChar"/>
+              </w:rPr>
+              <w:t xml:space="preserve">core/autopilot.py</w:t>
+            </w:r>
+          </w:p>
+        </w:tc>
+      </w:tr>
+      <w:tr>
+        <w:tc>
+          <w:tcPr/>
+          <w:p>
+            <w:pPr>
+              <w:pStyle w:val="Compact"/>
+            </w:pPr>
+            <w:r>
+              <w:t xml:space="preserve">Thử nghiệm (tắt mặc định)</w:t>
+            </w:r>
+          </w:p>
+        </w:tc>
+        <w:tc>
+          <w:tcPr/>
+          <w:p>
+            <w:pPr>
+              <w:pStyle w:val="Compact"/>
+            </w:pPr>
+            <w:r>
+              <w:t xml:space="preserve">Deepix cutout cho layout (</w:t>
+            </w:r>
+            <w:r>
+              <w:rPr>
+                <w:rStyle w:val="VerbatimChar"/>
+              </w:rPr>
+              <w:t xml:space="preserve">PREVIZ_CUTOUT=1</w:t>
+            </w:r>
+            <w:r>
+              <w:t xml:space="preserve">); Kling multi-shot cho một nhóm cảnh (không vào bản ghép)</w:t>
+            </w:r>
+          </w:p>
+        </w:tc>
+        <w:tc>
+          <w:tcPr/>
+          <w:p>
+            <w:pPr>
+              <w:pStyle w:val="Compact"/>
+            </w:pPr>
+            <w:r>
+              <w:rPr>
+                <w:rStyle w:val="VerbatimChar"/>
+              </w:rPr>
+              <w:t xml:space="preserve">core/previz.py</w:t>
+            </w:r>
+            <w:r>
+              <w:t xml:space="preserve">,</w:t>
+            </w:r>
+            <w:r>
+              <w:t xml:space="preserve"> </w:t>
+            </w:r>
+            <w:r>
+              <w:rPr>
+                <w:rStyle w:val="VerbatimChar"/>
+              </w:rPr>
+              <w:t xml:space="preserve">core/experiments.py</w:t>
+            </w:r>
+          </w:p>
+        </w:tc>
+      </w:tr>
+    </w:tbl>
+    <w:p>
+      <w:pPr>
+        <w:pStyle w:val="BodyText"/>
+      </w:pPr>
+      <w:r>
+        <w:t xml:space="preserve">Kết quả test và danh sách lỗi:</w:t>
+      </w:r>
+      <w:r>
+        <w:t xml:space="preserve"> </w:t>
+      </w:r>
+      <w:r>
+        <w:rPr>
+          <w:rStyle w:val="VerbatimChar"/>
+        </w:rPr>
+        <w:t xml:space="preserve">docs/V2_TEST_REPORT.md</w:t>
+      </w:r>
+      <w:r>
+        <w:t xml:space="preserve">.</w:t>
+      </w:r>
+    </w:p>
     <w:bookmarkEnd w:id="35"/>
-    <w:bookmarkStart w:id="36" w:name="rủi-ro-mitigation-tổng-hợp"/>
+    <w:bookmarkEnd w:id="36"/>
+    <w:bookmarkStart w:id="37" w:name="rủi-ro-mitigation-tổng-hợp"/>
     <w:p>
       <w:pPr>
         <w:pStyle w:val="Heading2"/>
@@ -5845,8 +6542,8 @@
         </w:tc>
       </w:tr>
     </w:tbl>
-    <w:bookmarkEnd w:id="36"/>
-    <w:bookmarkStart w:id="37" w:name="quyết-định-đã-chốt-còn-mở"/>
+    <w:bookmarkEnd w:id="37"/>
+    <w:bookmarkStart w:id="38" w:name="quyết-định-đã-chốt-còn-mở"/>
     <w:p>
       <w:pPr>
         <w:pStyle w:val="Heading2"/>
@@ -6535,6 +7232,7 @@
           <w:rStyle w:val="VerbatimChar"/>
           <w:b/>
           <w:bCs/>
+          <w:strike/>
         </w:rPr>
         <w:t xml:space="preserve">video_model</w:t>
       </w:r>
@@ -6542,13 +7240,15 @@
         <w:rPr>
           <w:b/>
           <w:bCs/>
-        </w:rPr>
-        <w:t xml:space="preserve"> </w:t>
-      </w:r>
-      <w:r>
-        <w:rPr>
-          <w:b/>
-          <w:bCs/>
+          <w:strike/>
+        </w:rPr>
+        <w:t xml:space="preserve"> </w:t>
+      </w:r>
+      <w:r>
+        <w:rPr>
+          <w:b/>
+          <w:bCs/>
+          <w:strike/>
         </w:rPr>
         <w:t xml:space="preserve">mặc định =</w:t>
       </w:r>
@@ -6556,14 +7256,16 @@
         <w:rPr>
           <w:b/>
           <w:bCs/>
-        </w:rPr>
-        <w:t xml:space="preserve"> </w:t>
-      </w:r>
-      <w:r>
-        <w:rPr>
-          <w:rStyle w:val="VerbatimChar"/>
-          <w:b/>
-          <w:bCs/>
+          <w:strike/>
+        </w:rPr>
+        <w:t xml:space="preserve"> </w:t>
+      </w:r>
+      <w:r>
+        <w:rPr>
+          <w:rStyle w:val="VerbatimChar"/>
+          <w:b/>
+          <w:bCs/>
+          <w:strike/>
         </w:rPr>
         <w:t xml:space="preserve">kling-v3-omni</w:t>
       </w:r>
@@ -6571,6 +7273,7 @@
         <w:rPr>
           <w:b/>
           <w:bCs/>
+          <w:strike/>
         </w:rPr>
         <w:t xml:space="preserve">.</w:t>
       </w:r>
@@ -6578,7 +7281,45 @@
         <w:t xml:space="preserve"> </w:t>
       </w:r>
       <w:r>
-        <w:t xml:space="preserve">Theo gợi ý chính thức của slide, Kling 3.0 Omni ghi rõ thế mạnh</w:t>
+        <w:rPr>
+          <w:b/>
+          <w:bCs/>
+        </w:rPr>
+        <w:t xml:space="preserve">Thay bằng quyết định 2026-09-23 (Dashboard v2): chọn model THEO TỪNG CẢNH dựa trên slide</w:t>
+      </w:r>
+      <w:r>
+        <w:rPr>
+          <w:b/>
+          <w:bCs/>
+        </w:rPr>
+        <w:t xml:space="preserve"> </w:t>
+      </w:r>
+      <w:r>
+        <w:rPr>
+          <w:b/>
+          <w:bCs/>
+        </w:rPr>
+        <w:t xml:space="preserve">“Hôm nay tôi chọn mô hình video như thế nào”</w:t>
+      </w:r>
+      <w:r>
+        <w:rPr>
+          <w:b/>
+          <w:bCs/>
+        </w:rPr>
+        <w:t xml:space="preserve"> </w:t>
+      </w:r>
+      <w:r>
+        <w:rPr>
+          <w:b/>
+          <w:bCs/>
+        </w:rPr>
+        <w:t xml:space="preserve">— xem 3.8.</w:t>
+      </w:r>
+      <w:r>
+        <w:t xml:space="preserve"> </w:t>
+      </w:r>
+      <w:r>
+        <w:t xml:space="preserve">Lý do cũ (giữ để tham khảo): theo gợi ý chính thức của slide, Kling 3.0 Omni ghi rõ thế mạnh</w:t>
       </w:r>
       <w:r>
         <w:t xml:space="preserve"> </w:t>
@@ -7193,8 +7934,8 @@
         <w:t xml:space="preserve">| Ngân sách credit cho giai đoạn thử nghiệm (Deepix + Clip AI/Kling) | Dry-run + retry loop đều tốn credit thật; cần biết giới hạn trước khi chạy batch | Bạn / người giữ ngân sách |</w:t>
       </w:r>
     </w:p>
-    <w:bookmarkEnd w:id="37"/>
-    <w:bookmarkStart w:id="38" w:name="Xd77c4f47b903719b6fbd5f054853d76240e8579"/>
+    <w:bookmarkEnd w:id="38"/>
+    <w:bookmarkStart w:id="39" w:name="Xd77c4f47b903719b6fbd5f054853d76240e8579"/>
     <w:p>
       <w:pPr>
         <w:pStyle w:val="Heading2"/>
@@ -7627,8 +8368,8 @@
         <w:t xml:space="preserve">- [ ] Người giữ quan hệ với team dev nội bộ cấp API Deepix/Clip AI</w:t>
       </w:r>
     </w:p>
-    <w:bookmarkEnd w:id="38"/>
-    <w:bookmarkStart w:id="42" w:name="lộ-trình-triển-khai-v0-v1"/>
+    <w:bookmarkEnd w:id="39"/>
+    <w:bookmarkStart w:id="43" w:name="lộ-trình-triển-khai-v0-v1"/>
     <w:p>
       <w:pPr>
         <w:pStyle w:val="Heading2"/>
@@ -7637,7 +8378,7 @@
         <w:t xml:space="preserve">7. Lộ trình triển khai: V0 → V1</w:t>
       </w:r>
     </w:p>
-    <w:bookmarkStart w:id="39" w:name="X96af04f5f0dc0fae4ea4bac7edaf06b3f002467"/>
+    <w:bookmarkStart w:id="40" w:name="X96af04f5f0dc0fae4ea4bac7edaf06b3f002467"/>
     <w:p>
       <w:pPr>
         <w:pStyle w:val="Heading3"/>
@@ -7964,8 +8705,8 @@
         <w:t xml:space="preserve">≥1 video hoàn chỉnh end-to-end, threshold đã hiệu chỉnh bằng dữ liệu, prompt/checklist khóa version.</w:t>
       </w:r>
     </w:p>
-    <w:bookmarkEnd w:id="39"/>
-    <w:bookmarkStart w:id="40" w:name="X3d60c8a93cbf48f59874d7f70b2bf9f5f0f0b9b"/>
+    <w:bookmarkEnd w:id="40"/>
+    <w:bookmarkStart w:id="41" w:name="X3d60c8a93cbf48f59874d7f70b2bf9f5f0f0b9b"/>
     <w:p>
       <w:pPr>
         <w:pStyle w:val="Heading3"/>
@@ -8108,8 +8849,8 @@
         <w:t xml:space="preserve">hệ thống bàn giao vận hành được từ 1 giao diện duy nhất, có tài liệu.</w:t>
       </w:r>
     </w:p>
-    <w:bookmarkEnd w:id="40"/>
-    <w:bookmarkStart w:id="41" w:name="Xf17d03e65ff0af0f4b74d160622aac56e61b107"/>
+    <w:bookmarkEnd w:id="41"/>
+    <w:bookmarkStart w:id="42" w:name="Xf17d03e65ff0af0f4b74d160622aac56e61b107"/>
     <w:p>
       <w:pPr>
         <w:pStyle w:val="Heading3"/>
@@ -8476,9 +9217,9 @@
         <w:t xml:space="preserve">Rủi ro kéo dài: chờ API Deepix/Clip AI; Deepix/Clip AI chỉ có Web (Playwright, +1–2 tuần); hiệu chỉnh QC threshold cần nhiều vòng; chất lượng Knowledge Base phụ thuộc chuyên gia miền.</w:t>
       </w:r>
     </w:p>
-    <w:bookmarkEnd w:id="41"/>
     <w:bookmarkEnd w:id="42"/>
-    <w:bookmarkStart w:id="43" w:name="Xb786808859b2baa89401c26f99cf8f9fff113e4"/>
+    <w:bookmarkEnd w:id="43"/>
+    <w:bookmarkStart w:id="44" w:name="Xb786808859b2baa89401c26f99cf8f9fff113e4"/>
     <w:p>
       <w:pPr>
         <w:pStyle w:val="Heading2"/>
@@ -8595,14 +9336,14 @@
         <w:t xml:space="preserve">Runbook + Prompt Templates đã bàn giao cho bộ phận sản xuất nội dung</w:t>
       </w:r>
     </w:p>
-    <w:bookmarkEnd w:id="43"/>
-    <w:bookmarkStart w:id="44" w:name="Xc1c5ea74472944d9adc5cc28f2fd787bdd9587a"/>
+    <w:bookmarkEnd w:id="44"/>
+    <w:bookmarkStart w:id="45" w:name="X3d83f13eb288e7e0fe426ee3840d7740f3f3c0e"/>
     <w:p>
       <w:pPr>
         <w:pStyle w:val="Heading2"/>
       </w:pPr>
       <w:r>
-        <w:t xml:space="preserve">9. Trạng thái triển khai (cập nhật 2026-09-23)</w:t>
+        <w:t xml:space="preserve">9. Trạng thái triển khai (cập nhật 2026-09-23, khuya)</w:t>
       </w:r>
     </w:p>
     <w:p>
@@ -9730,6 +10471,64 @@
       </w:r>
       <w:r>
         <w:t xml:space="preserve">), rồi P2 chạy kịch bản 60 giây và đọc báo cáo hiệu quả. Lưu ý: điểm QC tổng giờ là trung bình 8 tiêu chí, có thể phải chỉnh ngưỡng.</w:t>
+      </w:r>
+    </w:p>
+    <w:p>
+      <w:pPr>
+        <w:pStyle w:val="BodyText"/>
+      </w:pPr>
+      <w:r>
+        <w:rPr>
+          <w:b/>
+          <w:bCs/>
+        </w:rPr>
+        <w:t xml:space="preserve">Cập nhật 2026-09-23 (khuya) — Dashboard v2 xong và đã test một lượt:</w:t>
+      </w:r>
+      <w:r>
+        <w:t xml:space="preserve"> </w:t>
+      </w:r>
+      <w:r>
+        <w:t xml:space="preserve">làm hết GĐ0–8 theo 3.8 trên nhánh</w:t>
+      </w:r>
+      <w:r>
+        <w:t xml:space="preserve"> </w:t>
+      </w:r>
+      <w:r>
+        <w:rPr>
+          <w:rStyle w:val="VerbatimChar"/>
+        </w:rPr>
+        <w:t xml:space="preserve">dashboard-v2</w:t>
+      </w:r>
+      <w:r>
+        <w:t xml:space="preserve">, rồi test một lượt: toàn bộ unit test (lần đầu 66 lỗi) + chạy thử qua trình duyệt bằng kịch bản Kenta của người dùng (3 cảnh, 9:16, nhà cung cấp giả lập) từ tách cảnh đến bản giao (dựng 56s có 14 câu thoại → phụ đề → card cuối → bản vuông). Tìm và sửa 29 lỗi, trong đó 3 lỗi nặng: thanh bước nhảy về Bước 1 khi nhãn tiến độ đổi, bảng trộn âm tắt mất giọng thoại vừa xếp, bản xuất cắt khung mất phụ đề. 632 test pass. Chi tiết:</w:t>
+      </w:r>
+      <w:r>
+        <w:t xml:space="preserve"> </w:t>
+      </w:r>
+      <w:r>
+        <w:rPr>
+          <w:rStyle w:val="VerbatimChar"/>
+        </w:rPr>
+        <w:t xml:space="preserve">docs/V2_TEST_REPORT.md</w:t>
+      </w:r>
+      <w:r>
+        <w:t xml:space="preserve">.</w:t>
+      </w:r>
+      <w:r>
+        <w:t xml:space="preserve"> </w:t>
+      </w:r>
+      <w:r>
+        <w:rPr>
+          <w:b/>
+          <w:bCs/>
+        </w:rPr>
+        <w:t xml:space="preserve">Chưa chạy API thật</w:t>
+      </w:r>
+      <w:r>
+        <w:t xml:space="preserve"> </w:t>
+      </w:r>
+      <w:r>
+        <w:t xml:space="preserve">— bước tiếp theo cần người dùng đồng ý (tốn credit): 1 dự án 2–3 cảnh với Deepix 9:16, Clip AI theo model từng cảnh, TTS tiếng Việt.</w:t>
       </w:r>
     </w:p>
     <w:p>
@@ -10457,31 +11256,7 @@
         <w:t xml:space="preserve"> </w:t>
       </w:r>
       <w:r>
-        <w:t xml:space="preserve">- Đo giá credit thật để đối chiếu với giá ước tính đã điền (</w:t>
-      </w:r>
-      <w:r>
-        <w:rPr>
-          <w:rStyle w:val="VerbatimChar"/>
-        </w:rPr>
-        <w:t xml:space="preserve">video_model</w:t>
-      </w:r>
-      <w:r>
-        <w:t xml:space="preserve"> </w:t>
-      </w:r>
-      <w:r>
-        <w:t xml:space="preserve">mặc định đã chốt</w:t>
-      </w:r>
-      <w:r>
-        <w:t xml:space="preserve"> </w:t>
-      </w:r>
-      <w:r>
-        <w:rPr>
-          <w:rStyle w:val="VerbatimChar"/>
-        </w:rPr>
-        <w:t xml:space="preserve">kling-v3-omni</w:t>
-      </w:r>
-      <w:r>
-        <w:t xml:space="preserve">, xem Mục 5).</w:t>
+        <w:t xml:space="preserve">- Đo giá credit thật để đối chiếu với giá ước tính đã điền (model video chọn theo từng cảnh từ Dashboard v2, xem 3.8 và Mục 5).</w:t>
       </w:r>
       <w:r>
         <w:t xml:space="preserve"> </w:t>
@@ -10571,8 +11346,8 @@
         <w:t xml:space="preserve">(kèm 4 comment góp ý, đã phân tích ở Mục 2).</w:t>
       </w:r>
     </w:p>
-    <w:bookmarkEnd w:id="44"/>
     <w:bookmarkEnd w:id="45"/>
+    <w:bookmarkEnd w:id="46"/>
     <w:sectPr>
       <w:footnotePr>
         <w:numRestart w:val="eachSect"/>

</xml_diff>

<commit_message>
PLAN 3.9: kế hoạch v3 — tổng hợp mọi đề xuất, chỉ dùng tính năng có API, phân shot + Director học dựng Free Fire
Co-Authored-By: Claude Opus 5.5 <noreply@anthropic.com>
</commit_message>
<xml_diff>
--- a/PLAN.docx
+++ b/PLAN.docx
@@ -2,7 +2,7 @@
 <file path=word/document.xml><?xml version="1.0" encoding="utf-8"?>
 <w:document xmlns:w="http://schemas.openxmlformats.org/wordprocessingml/2006/main" xmlns:m="http://schemas.openxmlformats.org/officeDocument/2006/math" xmlns:r="http://schemas.openxmlformats.org/officeDocument/2006/relationships" xmlns:o="urn:schemas-microsoft-com:office:office" xmlns:v="urn:schemas-microsoft-com:vml" xmlns:w10="urn:schemas-microsoft-com:office:word" xmlns:a="http://schemas.openxmlformats.org/drawingml/2006/main" xmlns:pic="http://schemas.openxmlformats.org/drawingml/2006/picture" xmlns:wp="http://schemas.openxmlformats.org/drawingml/2006/wordprocessingDrawing">
   <w:body>
-    <w:bookmarkStart w:id="46" w:name="X9c8c830ec4a0bd58ad601261317abf6bbfd8ccb"/>
+    <w:bookmarkStart w:id="48" w:name="X9c8c830ec4a0bd58ad601261317abf6bbfd8ccb"/>
     <w:p>
       <w:pPr>
         <w:pStyle w:val="Heading1"/>
@@ -1293,7 +1293,7 @@
     </w:p>
     <w:bookmarkEnd w:id="13"/>
     <w:bookmarkEnd w:id="14"/>
-    <w:bookmarkStart w:id="36" w:name="Xcd7cd861a7bec2f7c480708ab31acaf54a69d9b"/>
+    <w:bookmarkStart w:id="38" w:name="Xcd7cd861a7bec2f7c480708ab31acaf54a69d9b"/>
     <w:p>
       <w:pPr>
         <w:pStyle w:val="Heading2"/>
@@ -6337,8 +6337,1297 @@
       </w:r>
     </w:p>
     <w:bookmarkEnd w:id="35"/>
-    <w:bookmarkEnd w:id="36"/>
-    <w:bookmarkStart w:id="37" w:name="rủi-ro-mitigation-tổng-hợp"/>
+    <w:bookmarkStart w:id="37" w:name="X50ea36151d15e277fd294b438c43ea572f4c6f5"/>
+    <w:p>
+      <w:pPr>
+        <w:pStyle w:val="Heading3"/>
+      </w:pPr>
+      <w:r>
+        <w:t xml:space="preserve">3.9 Kế hoạch v3 — tổng hợp mọi đề xuất, chốt việc cần làm (2026-09-23)</w:t>
+      </w:r>
+    </w:p>
+    <w:p>
+      <w:pPr>
+        <w:pStyle w:val="FirstParagraph"/>
+      </w:pPr>
+      <w:r>
+        <w:t xml:space="preserve">Tổng hợp từ: báo cáo rà soát</w:t>
+      </w:r>
+      <w:r>
+        <w:t xml:space="preserve"> </w:t>
+      </w:r>
+      <w:r>
+        <w:rPr>
+          <w:rStyle w:val="VerbatimChar"/>
+        </w:rPr>
+        <w:t xml:space="preserve">docs/DASHBOARD_REVIEW_2026-09-23.md</w:t>
+      </w:r>
+      <w:r>
+        <w:t xml:space="preserve">, kế hoạch/kết quả v2 (3.8,</w:t>
+      </w:r>
+      <w:r>
+        <w:t xml:space="preserve"> </w:t>
+      </w:r>
+      <w:r>
+        <w:rPr>
+          <w:rStyle w:val="VerbatimChar"/>
+        </w:rPr>
+        <w:t xml:space="preserve">docs/V2_TEST_REPORT.md</w:t>
+      </w:r>
+      <w:r>
+        <w:t xml:space="preserve">), câu trả lời 4 câu hỏi về nhất quán/Director/giọng/storyboard, và phân tích</w:t>
+      </w:r>
+      <w:r>
+        <w:t xml:space="preserve"> </w:t>
+      </w:r>
+      <w:r>
+        <w:rPr>
+          <w:rStyle w:val="VerbatimChar"/>
+        </w:rPr>
+        <w:t xml:space="preserve">docs/PHAN_TICH_2026-09-23_NHAT_QUAN_DIRECTOR_LIPSYNC_STORYBOARD.md</w:t>
+      </w:r>
+      <w:r>
+        <w:t xml:space="preserve">.</w:t>
+      </w:r>
+      <w:r>
+        <w:t xml:space="preserve"> </w:t>
+      </w:r>
+      <w:r>
+        <w:rPr>
+          <w:b/>
+          <w:bCs/>
+        </w:rPr>
+        <w:t xml:space="preserve">Nguyên tắc người dùng chốt: tính năng nào API chưa có thì tạm bỏ qua.</w:t>
+      </w:r>
+    </w:p>
+    <w:p>
+      <w:pPr>
+        <w:pStyle w:val="BodyText"/>
+      </w:pPr>
+      <w:r>
+        <w:rPr>
+          <w:b/>
+          <w:bCs/>
+        </w:rPr>
+        <w:t xml:space="preserve">Bảng đối chiếu tính năng (tra tài liệu skill + API thật, chỉ đọc):</w:t>
+      </w:r>
+    </w:p>
+    <w:tbl>
+      <w:tblPr>
+        <w:tblStyle w:val="Table"/>
+        <w:tblW w:type="pct" w:w="5000"/>
+        <w:tblLayout w:type="fixed"/>
+        <w:tblLook w:firstRow="1" w:lastRow="0" w:firstColumn="0" w:lastColumn="0" w:noHBand="0" w:noVBand="0" w:val="0020"/>
+      </w:tblPr>
+      <w:tblGrid>
+        <w:gridCol w:w="2640"/>
+        <w:gridCol w:w="2640"/>
+        <w:gridCol w:w="2640"/>
+      </w:tblGrid>
+      <w:tr>
+        <w:trPr>
+          <w:tblHeader w:val="on"/>
+        </w:trPr>
+        <w:tc>
+          <w:tcPr/>
+          <w:p>
+            <w:pPr>
+              <w:pStyle w:val="Compact"/>
+            </w:pPr>
+            <w:r>
+              <w:t xml:space="preserve">Tính năng</w:t>
+            </w:r>
+          </w:p>
+        </w:tc>
+        <w:tc>
+          <w:tcPr/>
+          <w:p>
+            <w:pPr>
+              <w:pStyle w:val="Compact"/>
+            </w:pPr>
+            <w:r>
+              <w:t xml:space="preserve">API (token)</w:t>
+            </w:r>
+          </w:p>
+        </w:tc>
+        <w:tc>
+          <w:tcPr/>
+          <w:p>
+            <w:pPr>
+              <w:pStyle w:val="Compact"/>
+            </w:pPr>
+            <w:r>
+              <w:t xml:space="preserve">Dùng trong v3</w:t>
+            </w:r>
+          </w:p>
+        </w:tc>
+      </w:tr>
+      <w:tr>
+        <w:tc>
+          <w:tcPr/>
+          <w:p>
+            <w:pPr>
+              <w:pStyle w:val="Compact"/>
+            </w:pPr>
+            <w:r>
+              <w:t xml:space="preserve">Kling 3.0 Omni multi-shot (</w:t>
+            </w:r>
+            <w:r>
+              <w:rPr>
+                <w:rStyle w:val="VerbatimChar"/>
+              </w:rPr>
+              <w:t xml:space="preserve">multi_shot</w:t>
+            </w:r>
+            <w:r>
+              <w:t xml:space="preserve"> </w:t>
+            </w:r>
+            <w:r>
+              <w:t xml:space="preserve">+</w:t>
+            </w:r>
+            <w:r>
+              <w:t xml:space="preserve"> </w:t>
+            </w:r>
+            <w:r>
+              <w:rPr>
+                <w:rStyle w:val="VerbatimChar"/>
+              </w:rPr>
+              <w:t xml:space="preserve">multi_prompt</w:t>
+            </w:r>
+            <w:r>
+              <w:t xml:space="preserve">, mỗi shot 1 prompt + thời lượng)</w:t>
+            </w:r>
+          </w:p>
+        </w:tc>
+        <w:tc>
+          <w:tcPr/>
+          <w:p>
+            <w:pPr>
+              <w:pStyle w:val="Compact"/>
+            </w:pPr>
+            <w:r>
+              <w:t xml:space="preserve">Có</w:t>
+            </w:r>
+          </w:p>
+        </w:tc>
+        <w:tc>
+          <w:tcPr/>
+          <w:p>
+            <w:pPr>
+              <w:pStyle w:val="Compact"/>
+            </w:pPr>
+            <w:r>
+              <w:rPr>
+                <w:b/>
+                <w:bCs/>
+              </w:rPr>
+              <w:t xml:space="preserve">Có</w:t>
+            </w:r>
+          </w:p>
+        </w:tc>
+      </w:tr>
+      <w:tr>
+        <w:tc>
+          <w:tcPr/>
+          <w:p>
+            <w:pPr>
+              <w:pStyle w:val="Compact"/>
+            </w:pPr>
+            <w:r>
+              <w:t xml:space="preserve">Seedance khung đầu +</w:t>
+            </w:r>
+            <w:r>
+              <w:t xml:space="preserve"> </w:t>
+            </w:r>
+            <w:r>
+              <w:rPr>
+                <w:b/>
+                <w:bCs/>
+              </w:rPr>
+              <w:t xml:space="preserve">khung cuối</w:t>
+            </w:r>
+            <w:r>
+              <w:t xml:space="preserve"> </w:t>
+            </w:r>
+            <w:r>
+              <w:t xml:space="preserve">(</w:t>
+            </w:r>
+            <w:r>
+              <w:rPr>
+                <w:rStyle w:val="VerbatimChar"/>
+              </w:rPr>
+              <w:t xml:space="preserve">first_frame</w:t>
+            </w:r>
+            <w:r>
+              <w:t xml:space="preserve"> </w:t>
+            </w:r>
+            <w:r>
+              <w:t xml:space="preserve">/</w:t>
+            </w:r>
+            <w:r>
+              <w:t xml:space="preserve"> </w:t>
+            </w:r>
+            <w:r>
+              <w:rPr>
+                <w:rStyle w:val="VerbatimChar"/>
+              </w:rPr>
+              <w:t xml:space="preserve">last_frame</w:t>
+            </w:r>
+            <w:r>
+              <w:t xml:space="preserve">), ảnh tham chiếu, video tham chiếu, âm thanh tham chiếu</w:t>
+            </w:r>
+          </w:p>
+        </w:tc>
+        <w:tc>
+          <w:tcPr/>
+          <w:p>
+            <w:pPr>
+              <w:pStyle w:val="Compact"/>
+            </w:pPr>
+            <w:r>
+              <w:t xml:space="preserve">Có</w:t>
+            </w:r>
+          </w:p>
+        </w:tc>
+        <w:tc>
+          <w:tcPr/>
+          <w:p>
+            <w:pPr>
+              <w:pStyle w:val="Compact"/>
+            </w:pPr>
+            <w:r>
+              <w:rPr>
+                <w:b/>
+                <w:bCs/>
+              </w:rPr>
+              <w:t xml:space="preserve">Có</w:t>
+            </w:r>
+            <w:r>
+              <w:t xml:space="preserve"> </w:t>
+            </w:r>
+            <w:r>
+              <w:t xml:space="preserve">(âm thanh tham chiếu: chỉ thử nghiệm)</w:t>
+            </w:r>
+          </w:p>
+        </w:tc>
+      </w:tr>
+      <w:tr>
+        <w:tc>
+          <w:tcPr/>
+          <w:p>
+            <w:pPr>
+              <w:pStyle w:val="Compact"/>
+            </w:pPr>
+            <w:r>
+              <w:t xml:space="preserve">TTS ElevenLabs (</w:t>
+            </w:r>
+            <w:r>
+              <w:rPr>
+                <w:rStyle w:val="VerbatimChar"/>
+              </w:rPr>
+              <w:t xml:space="preserve">eleven_v3</w:t>
+            </w:r>
+            <w:r>
+              <w:t xml:space="preserve">,</w:t>
+            </w:r>
+            <w:r>
+              <w:t xml:space="preserve"> </w:t>
+            </w:r>
+            <w:r>
+              <w:rPr>
+                <w:rStyle w:val="VerbatimChar"/>
+              </w:rPr>
+              <w:t xml:space="preserve">eleven_multilingual_v2</w:t>
+            </w:r>
+            <w:r>
+              <w:t xml:space="preserve">), danh sách giọng có trường</w:t>
+            </w:r>
+            <w:r>
+              <w:t xml:space="preserve"> </w:t>
+            </w:r>
+            <w:r>
+              <w:rPr>
+                <w:rStyle w:val="VerbatimChar"/>
+              </w:rPr>
+              <w:t xml:space="preserve">languages</w:t>
+            </w:r>
+          </w:p>
+        </w:tc>
+        <w:tc>
+          <w:tcPr/>
+          <w:p>
+            <w:pPr>
+              <w:pStyle w:val="Compact"/>
+            </w:pPr>
+            <w:r>
+              <w:t xml:space="preserve">Có</w:t>
+            </w:r>
+          </w:p>
+        </w:tc>
+        <w:tc>
+          <w:tcPr/>
+          <w:p>
+            <w:pPr>
+              <w:pStyle w:val="Compact"/>
+            </w:pPr>
+            <w:r>
+              <w:rPr>
+                <w:b/>
+                <w:bCs/>
+              </w:rPr>
+              <w:t xml:space="preserve">Có</w:t>
+            </w:r>
+            <w:r>
+              <w:t xml:space="preserve"> </w:t>
+            </w:r>
+            <w:r>
+              <w:t xml:space="preserve">— chỉ 5 giọng ghi hỗ trợ</w:t>
+            </w:r>
+            <w:r>
+              <w:t xml:space="preserve"> </w:t>
+            </w:r>
+            <w:r>
+              <w:rPr>
+                <w:rStyle w:val="VerbatimChar"/>
+              </w:rPr>
+              <w:t xml:space="preserve">vi</w:t>
+            </w:r>
+            <w:r>
+              <w:t xml:space="preserve"> </w:t>
+            </w:r>
+            <w:r>
+              <w:t xml:space="preserve">(4 nam, 1 nữ)</w:t>
+            </w:r>
+          </w:p>
+        </w:tc>
+      </w:tr>
+      <w:tr>
+        <w:tc>
+          <w:tcPr/>
+          <w:p>
+            <w:pPr>
+              <w:pStyle w:val="Compact"/>
+            </w:pPr>
+            <w:r>
+              <w:t xml:space="preserve">Kling Elements (</w:t>
+            </w:r>
+            <w:r>
+              <w:rPr>
+                <w:rStyle w:val="VerbatimChar"/>
+              </w:rPr>
+              <w:t xml:space="preserve">element_list</w:t>
+            </w:r>
+            <w:r>
+              <w:t xml:space="preserve"> </w:t>
+            </w:r>
+            <w:r>
+              <w:t xml:space="preserve">có trong lệnh gen, nhưng</w:t>
+            </w:r>
+            <w:r>
+              <w:t xml:space="preserve"> </w:t>
+            </w:r>
+            <w:r>
+              <w:rPr>
+                <w:b/>
+                <w:bCs/>
+              </w:rPr>
+              <w:t xml:space="preserve">tạo</w:t>
+            </w:r>
+            <w:r>
+              <w:t xml:space="preserve"> </w:t>
+            </w:r>
+            <w:r>
+              <w:t xml:space="preserve">Element chỉ trên web)</w:t>
+            </w:r>
+          </w:p>
+        </w:tc>
+        <w:tc>
+          <w:tcPr/>
+          <w:p>
+            <w:pPr>
+              <w:pStyle w:val="Compact"/>
+            </w:pPr>
+            <w:r>
+              <w:t xml:space="preserve">Không đủ</w:t>
+            </w:r>
+          </w:p>
+        </w:tc>
+        <w:tc>
+          <w:tcPr/>
+          <w:p>
+            <w:pPr>
+              <w:pStyle w:val="Compact"/>
+            </w:pPr>
+            <w:r>
+              <w:t xml:space="preserve">Bỏ qua</w:t>
+            </w:r>
+          </w:p>
+        </w:tc>
+      </w:tr>
+      <w:tr>
+        <w:tc>
+          <w:tcPr/>
+          <w:p>
+            <w:pPr>
+              <w:pStyle w:val="Compact"/>
+            </w:pPr>
+            <w:r>
+              <w:t xml:space="preserve">Lip Sync, Voice Design / Clone, Director Workspace (3D), Motion Control, Storyboard của Deepix</w:t>
+            </w:r>
+          </w:p>
+        </w:tc>
+        <w:tc>
+          <w:tcPr/>
+          <w:p>
+            <w:pPr>
+              <w:pStyle w:val="Compact"/>
+            </w:pPr>
+            <w:r>
+              <w:t xml:space="preserve">Không (web; token bị</w:t>
+            </w:r>
+            <w:r>
+              <w:t xml:space="preserve"> </w:t>
+            </w:r>
+            <w:r>
+              <w:rPr>
+                <w:rStyle w:val="VerbatimChar"/>
+              </w:rPr>
+              <w:t xml:space="preserve">LoginErr</w:t>
+            </w:r>
+            <w:r>
+              <w:t xml:space="preserve">)</w:t>
+            </w:r>
+          </w:p>
+        </w:tc>
+        <w:tc>
+          <w:tcPr/>
+          <w:p>
+            <w:pPr>
+              <w:pStyle w:val="Compact"/>
+            </w:pPr>
+            <w:r>
+              <w:t xml:space="preserve">Bỏ qua</w:t>
+            </w:r>
+          </w:p>
+        </w:tc>
+      </w:tr>
+    </w:tbl>
+    <w:p>
+      <w:pPr>
+        <w:pStyle w:val="BodyText"/>
+      </w:pPr>
+      <w:r>
+        <w:rPr>
+          <w:b/>
+          <w:bCs/>
+        </w:rPr>
+        <w:t xml:space="preserve">Vấn đề gốc phải giải (từ bản chạy thử kịch bản Kenta):</w:t>
+      </w:r>
+      <w:r>
+        <w:t xml:space="preserve"> </w:t>
+      </w:r>
+      <w:r>
+        <w:t xml:space="preserve">1 cảnh = 1 shot = 1 ảnh = 1 clip → 56 giây chỉ có 3 shot (15/15/26s), trong khi video Free Fire chính thức: phim ngắn</w:t>
+      </w:r>
+      <w:r>
+        <w:t xml:space="preserve"> </w:t>
+      </w:r>
+      <w:r>
+        <w:t xml:space="preserve">“Kenta’s Obsession”</w:t>
+      </w:r>
+      <w:r>
+        <w:t xml:space="preserve"> </w:t>
+      </w:r>
+      <w:r>
+        <w:t xml:space="preserve">75,7s ≈ 43 shot (~1,8s/shot), video kỹ năng Kenta OB55 38,8s ≈ 12 shot (1–5s/shot). Ảnh chỉ là trạng thái đầu của một cảnh dài nên nhân vật/vị trí trôi; prompt ảnh và prompt video viết ở hai lúc; Kling chỉ nhận khung đầu.</w:t>
+      </w:r>
+    </w:p>
+    <w:p>
+      <w:pPr>
+        <w:pStyle w:val="BodyText"/>
+      </w:pPr>
+      <w:r>
+        <w:rPr>
+          <w:b/>
+          <w:bCs/>
+        </w:rPr>
+        <w:t xml:space="preserve">Việc cần làm — theo thứ tự:</w:t>
+      </w:r>
+    </w:p>
+    <w:tbl>
+      <w:tblPr>
+        <w:tblStyle w:val="Table"/>
+        <w:tblW w:type="pct" w:w="5000"/>
+        <w:tblLayout w:type="fixed"/>
+        <w:tblLook w:firstRow="1" w:lastRow="0" w:firstColumn="0" w:lastColumn="0" w:noHBand="0" w:noVBand="0" w:val="0020"/>
+      </w:tblPr>
+      <w:tblGrid>
+        <w:gridCol w:w="1980"/>
+        <w:gridCol w:w="1980"/>
+        <w:gridCol w:w="1980"/>
+        <w:gridCol w:w="1980"/>
+      </w:tblGrid>
+      <w:tr>
+        <w:trPr>
+          <w:tblHeader w:val="on"/>
+        </w:trPr>
+        <w:tc>
+          <w:tcPr/>
+          <w:p>
+            <w:pPr>
+              <w:pStyle w:val="Compact"/>
+            </w:pPr>
+            <w:r>
+              <w:t xml:space="preserve">GĐ</w:t>
+            </w:r>
+          </w:p>
+        </w:tc>
+        <w:tc>
+          <w:tcPr/>
+          <w:p>
+            <w:pPr>
+              <w:pStyle w:val="Compact"/>
+            </w:pPr>
+            <w:r>
+              <w:t xml:space="preserve">Việc</w:t>
+            </w:r>
+          </w:p>
+        </w:tc>
+        <w:tc>
+          <w:tcPr/>
+          <w:p>
+            <w:pPr>
+              <w:pStyle w:val="Compact"/>
+            </w:pPr>
+            <w:r>
+              <w:t xml:space="preserve">Chi tiết</w:t>
+            </w:r>
+          </w:p>
+        </w:tc>
+        <w:tc>
+          <w:tcPr/>
+          <w:p>
+            <w:pPr>
+              <w:pStyle w:val="Compact"/>
+            </w:pPr>
+            <w:r>
+              <w:t xml:space="preserve">Credit</w:t>
+            </w:r>
+          </w:p>
+        </w:tc>
+      </w:tr>
+      <w:tr>
+        <w:tc>
+          <w:tcPr/>
+          <w:p>
+            <w:pPr>
+              <w:pStyle w:val="Compact"/>
+            </w:pPr>
+            <w:r>
+              <w:rPr>
+                <w:b/>
+                <w:bCs/>
+              </w:rPr>
+              <w:t xml:space="preserve">C</w:t>
+            </w:r>
+            <w:r>
+              <w:t xml:space="preserve"> </w:t>
+            </w:r>
+            <w:r>
+              <w:t xml:space="preserve">(làm trước, ngắn)</w:t>
+            </w:r>
+          </w:p>
+        </w:tc>
+        <w:tc>
+          <w:tcPr/>
+          <w:p>
+            <w:pPr>
+              <w:pStyle w:val="Compact"/>
+            </w:pPr>
+            <w:r>
+              <w:rPr>
+                <w:b/>
+                <w:bCs/>
+              </w:rPr>
+              <w:t xml:space="preserve">Director hiểu Free Fire</w:t>
+            </w:r>
+          </w:p>
+        </w:tc>
+        <w:tc>
+          <w:tcPr/>
+          <w:p>
+            <w:pPr>
+              <w:pStyle w:val="Compact"/>
+            </w:pPr>
+            <w:r>
+              <w:t xml:space="preserve">Công cụ phân tích video tham khảo (cắt shot + Claude gắn nhãn cỡ cảnh/góc/chuyển động/vai trò; đã thử được ngay trong trình duyệt với kênh</w:t>
+            </w:r>
+            <w:r>
+              <w:t xml:space="preserve"> </w:t>
+            </w:r>
+            <w:hyperlink r:id="rId36">
+              <w:r>
+                <w:rPr>
+                  <w:rStyle w:val="Hyperlink"/>
+                </w:rPr>
+                <w:t xml:space="preserve">Garena Free Fire VN</w:t>
+              </w:r>
+            </w:hyperlink>
+            <w:r>
+              <w:t xml:space="preserve">); bộ 10–20 video: phim ngắn CGI (Kenta’s Obsession, Eclipse Rises, Free Fire x Gintama, Pitch Party, Thánh Nữ Tái Sinh), tiểu phẩm</w:t>
+            </w:r>
+            <w:r>
+              <w:t xml:space="preserve"> </w:t>
+            </w:r>
+            <w:r>
+              <w:rPr>
+                <w:b/>
+                <w:bCs/>
+              </w:rPr>
+              <w:t xml:space="preserve">Kelly Show</w:t>
+            </w:r>
+            <w:r>
+              <w:t xml:space="preserve">, video kỹ năng (Kenta Rework OB55), VFX; ra</w:t>
+            </w:r>
+            <w:r>
+              <w:t xml:space="preserve"> </w:t>
+            </w:r>
+            <w:r>
+              <w:rPr>
+                <w:rStyle w:val="VerbatimChar"/>
+              </w:rPr>
+              <w:t xml:space="preserve">knowledge/ff_directing.md</w:t>
+            </w:r>
+            <w:r>
+              <w:t xml:space="preserve"> </w:t>
+            </w:r>
+            <w:r>
+              <w:t xml:space="preserve">+ 3 khuôn mẫu:</w:t>
+            </w:r>
+            <w:r>
+              <w:t xml:space="preserve"> </w:t>
+            </w:r>
+            <w:r>
+              <w:rPr>
+                <w:b/>
+                <w:bCs/>
+              </w:rPr>
+              <w:t xml:space="preserve">video kỹ năng</w:t>
+            </w:r>
+            <w:r>
+              <w:t xml:space="preserve">,</w:t>
+            </w:r>
+            <w:r>
+              <w:t xml:space="preserve"> </w:t>
+            </w:r>
+            <w:r>
+              <w:rPr>
+                <w:b/>
+                <w:bCs/>
+              </w:rPr>
+              <w:t xml:space="preserve">tiểu phẩm hài</w:t>
+            </w:r>
+            <w:r>
+              <w:t xml:space="preserve">,</w:t>
+            </w:r>
+            <w:r>
+              <w:t xml:space="preserve"> </w:t>
+            </w:r>
+            <w:r>
+              <w:rPr>
+                <w:b/>
+                <w:bCs/>
+              </w:rPr>
+              <w:t xml:space="preserve">phim ngắn CGI</w:t>
+            </w:r>
+            <w:r>
+              <w:t xml:space="preserve">; thêm cỡ cảnh</w:t>
+            </w:r>
+            <w:r>
+              <w:t xml:space="preserve"> </w:t>
+            </w:r>
+            <w:r>
+              <w:t xml:space="preserve">“camera game”</w:t>
+            </w:r>
+            <w:r>
+              <w:t xml:space="preserve"> </w:t>
+            </w:r>
+            <w:r>
+              <w:t xml:space="preserve">(góc thứ ba sau lưng) và lựa chọn</w:t>
+            </w:r>
+            <w:r>
+              <w:t xml:space="preserve"> </w:t>
+            </w:r>
+            <w:r>
+              <w:t xml:space="preserve">“look”</w:t>
+            </w:r>
+            <w:r>
+              <w:t xml:space="preserve"> </w:t>
+            </w:r>
+            <w:r>
+              <w:t xml:space="preserve">dự án (trong game / anime CGI / CGI thực)</w:t>
+            </w:r>
+          </w:p>
+        </w:tc>
+        <w:tc>
+          <w:tcPr/>
+          <w:p>
+            <w:pPr>
+              <w:pStyle w:val="Compact"/>
+            </w:pPr>
+            <w:r>
+              <w:t xml:space="preserve">Không (chỉ hạn mức Claude)</w:t>
+            </w:r>
+          </w:p>
+        </w:tc>
+      </w:tr>
+      <w:tr>
+        <w:tc>
+          <w:tcPr/>
+          <w:p>
+            <w:pPr>
+              <w:pStyle w:val="Compact"/>
+            </w:pPr>
+            <w:r>
+              <w:rPr>
+                <w:b/>
+                <w:bCs/>
+              </w:rPr>
+              <w:t xml:space="preserve">A</w:t>
+            </w:r>
+            <w:r>
+              <w:t xml:space="preserve"> </w:t>
+            </w:r>
+            <w:r>
+              <w:t xml:space="preserve">(lớn nhất)</w:t>
+            </w:r>
+          </w:p>
+        </w:tc>
+        <w:tc>
+          <w:tcPr/>
+          <w:p>
+            <w:pPr>
+              <w:pStyle w:val="Compact"/>
+            </w:pPr>
+            <w:r>
+              <w:rPr>
+                <w:b/>
+                <w:bCs/>
+              </w:rPr>
+              <w:t xml:space="preserve">Phân shot +</w:t>
+            </w:r>
+            <w:r>
+              <w:rPr>
+                <w:b/>
+                <w:bCs/>
+              </w:rPr>
+              <w:t xml:space="preserve"> </w:t>
+            </w:r>
+            <w:r>
+              <w:rPr>
+                <w:b/>
+                <w:bCs/>
+              </w:rPr>
+              <w:t xml:space="preserve">“hợp đồng shot”</w:t>
+            </w:r>
+          </w:p>
+        </w:tc>
+        <w:tc>
+          <w:tcPr/>
+          <w:p>
+            <w:pPr>
+              <w:pStyle w:val="Compact"/>
+            </w:pPr>
+            <w:r>
+              <w:t xml:space="preserve">Director chia mỗi cảnh thành shot 1,5–6s theo khuôn mẫu thể loại; mỗi shot một bản ghi: cỡ cảnh, góc, chuyển động máy, thời lượng, vai trò (hook/hành động/phản ứng/chèn/thoại/chuyển), khung đầu, khung cuối (nếu đổi trạng thái), 1 hành động chính, người nói + câu thoại, tài nguyên + vai trò (</w:t>
+            </w:r>
+            <w:r>
+              <w:t xml:space="preserve">@Hình</w:t>
+            </w:r>
+            <w:r>
+              <w:t xml:space="preserve">), điều QC phải kiểm. Kiểm tra nhịp + đa dạng cỡ cảnh + trục 180° + shot/đáp cho thoại. Đơn vị của ảnh, motion, video, giọng, phụ đề,</w:t>
+            </w:r>
+            <w:r>
+              <w:t xml:space="preserve"> </w:t>
+            </w:r>
+            <w:r>
+              <w:t xml:space="preserve">“⚠ cũ”</w:t>
+            </w:r>
+            <w:r>
+              <w:t xml:space="preserve">, timeline chuyển từ</w:t>
+            </w:r>
+            <w:r>
+              <w:t xml:space="preserve"> </w:t>
+            </w:r>
+            <w:r>
+              <w:rPr>
+                <w:b/>
+                <w:bCs/>
+              </w:rPr>
+              <w:t xml:space="preserve">cảnh</w:t>
+            </w:r>
+            <w:r>
+              <w:t xml:space="preserve"> </w:t>
+            </w:r>
+            <w:r>
+              <w:t xml:space="preserve">sang</w:t>
+            </w:r>
+            <w:r>
+              <w:t xml:space="preserve"> </w:t>
+            </w:r>
+            <w:r>
+              <w:rPr>
+                <w:b/>
+                <w:bCs/>
+              </w:rPr>
+              <w:t xml:space="preserve">shot</w:t>
+            </w:r>
+            <w:r>
+              <w:t xml:space="preserve">; Bước 1 thành bảng storyboard theo shot</w:t>
+            </w:r>
+          </w:p>
+        </w:tc>
+        <w:tc>
+          <w:tcPr/>
+          <w:p>
+            <w:pPr>
+              <w:pStyle w:val="Compact"/>
+            </w:pPr>
+            <w:r>
+              <w:t xml:space="preserve">Không</w:t>
+            </w:r>
+          </w:p>
+        </w:tc>
+      </w:tr>
+      <w:tr>
+        <w:tc>
+          <w:tcPr/>
+          <w:p>
+            <w:pPr>
+              <w:pStyle w:val="Compact"/>
+            </w:pPr>
+            <w:r>
+              <w:rPr>
+                <w:b/>
+                <w:bCs/>
+              </w:rPr>
+              <w:t xml:space="preserve">B</w:t>
+            </w:r>
+          </w:p>
+        </w:tc>
+        <w:tc>
+          <w:tcPr/>
+          <w:p>
+            <w:pPr>
+              <w:pStyle w:val="Compact"/>
+            </w:pPr>
+            <w:r>
+              <w:rPr>
+                <w:b/>
+                <w:bCs/>
+              </w:rPr>
+              <w:t xml:space="preserve">Nhất quán ảnh ↔ prompt ↔ video</w:t>
+            </w:r>
+          </w:p>
+        </w:tc>
+        <w:tc>
+          <w:tcPr/>
+          <w:p>
+            <w:pPr>
+              <w:pStyle w:val="Compact"/>
+            </w:pPr>
+            <w:r>
+              <w:t xml:space="preserve">Prompt ảnh và prompt video cùng sinh từ hợp đồng shot; một bảng nhãn tài nguyên dùng chung cho Deepix và Seedance; ảnh khung cuối + Seedance</w:t>
+            </w:r>
+            <w:r>
+              <w:t xml:space="preserve"> </w:t>
+            </w:r>
+            <w:r>
+              <w:rPr>
+                <w:rStyle w:val="VerbatimChar"/>
+              </w:rPr>
+              <w:t xml:space="preserve">last_frame</w:t>
+            </w:r>
+            <w:r>
+              <w:t xml:space="preserve"> </w:t>
+            </w:r>
+            <w:r>
+              <w:t xml:space="preserve">cho shot đổi trạng thái; shot liền mạch cùng nhóm: khung cuối shot trước làm khung đầu shot sau;</w:t>
+            </w:r>
+            <w:r>
+              <w:t xml:space="preserve"> </w:t>
+            </w:r>
+            <w:r>
+              <w:rPr>
+                <w:b/>
+                <w:bCs/>
+              </w:rPr>
+              <w:t xml:space="preserve">cùng model trong một nhóm cảnh</w:t>
+            </w:r>
+            <w:r>
+              <w:t xml:space="preserve">; nhóm cảnh nhiều shot ngắn dùng</w:t>
+            </w:r>
+            <w:r>
+              <w:t xml:space="preserve"> </w:t>
+            </w:r>
+            <w:r>
+              <w:rPr>
+                <w:b/>
+                <w:bCs/>
+              </w:rPr>
+              <w:t xml:space="preserve">Kling multi-shot</w:t>
+            </w:r>
+            <w:r>
+              <w:t xml:space="preserve"> </w:t>
+            </w:r>
+            <w:r>
+              <w:t xml:space="preserve">(1 lần gọi, tránh thời lượng tối thiểu 3–4s mỗi clip); shot cận/trung của nhân vật chính ưu tiên Seedance (có ảnh tham chiếu nhân vật); QC đồng bộ cả bộ clip; cân màu khi dựng</w:t>
+            </w:r>
+          </w:p>
+        </w:tc>
+        <w:tc>
+          <w:tcPr/>
+          <w:p>
+            <w:pPr>
+              <w:pStyle w:val="Compact"/>
+            </w:pPr>
+            <w:r>
+              <w:t xml:space="preserve">Không (code); thử thật ở F</w:t>
+            </w:r>
+          </w:p>
+        </w:tc>
+      </w:tr>
+      <w:tr>
+        <w:tc>
+          <w:tcPr/>
+          <w:p>
+            <w:pPr>
+              <w:pStyle w:val="Compact"/>
+            </w:pPr>
+            <w:r>
+              <w:rPr>
+                <w:b/>
+                <w:bCs/>
+              </w:rPr>
+              <w:t xml:space="preserve">D</w:t>
+            </w:r>
+          </w:p>
+        </w:tc>
+        <w:tc>
+          <w:tcPr/>
+          <w:p>
+            <w:pPr>
+              <w:pStyle w:val="Compact"/>
+            </w:pPr>
+            <w:r>
+              <w:rPr>
+                <w:b/>
+                <w:bCs/>
+              </w:rPr>
+              <w:t xml:space="preserve">Giọng tiếng Việt (chỉ API)</w:t>
+            </w:r>
+          </w:p>
+        </w:tc>
+        <w:tc>
+          <w:tcPr/>
+          <w:p>
+            <w:pPr>
+              <w:pStyle w:val="Compact"/>
+            </w:pPr>
+            <w:r>
+              <w:t xml:space="preserve">Chỉ đề xuất giọng có</w:t>
+            </w:r>
+            <w:r>
+              <w:t xml:space="preserve"> </w:t>
+            </w:r>
+            <w:r>
+              <w:rPr>
+                <w:rStyle w:val="VerbatimChar"/>
+              </w:rPr>
+              <w:t xml:space="preserve">vi</w:t>
+            </w:r>
+            <w:r>
+              <w:t xml:space="preserve">; cảnh báo khi số nhân vật nữ &gt; số giọng nữ; so</w:t>
+            </w:r>
+            <w:r>
+              <w:t xml:space="preserve"> </w:t>
+            </w:r>
+            <w:r>
+              <w:rPr>
+                <w:rStyle w:val="VerbatimChar"/>
+              </w:rPr>
+              <w:t xml:space="preserve">eleven_v3</w:t>
+            </w:r>
+            <w:r>
+              <w:t xml:space="preserve"> </w:t>
+            </w:r>
+            <w:r>
+              <w:t xml:space="preserve">với</w:t>
+            </w:r>
+            <w:r>
+              <w:t xml:space="preserve"> </w:t>
+            </w:r>
+            <w:r>
+              <w:rPr>
+                <w:rStyle w:val="VerbatimChar"/>
+              </w:rPr>
+              <w:t xml:space="preserve">eleven_multilingual_v2</w:t>
+            </w:r>
+            <w:r>
+              <w:t xml:space="preserve">; bảng cách đọc từ game (loot, skill, Booyah, tên nhân vật); nút nghe thử câu mẫu tiếng Việt</w:t>
+            </w:r>
+          </w:p>
+        </w:tc>
+        <w:tc>
+          <w:tcPr/>
+          <w:p>
+            <w:pPr>
+              <w:pStyle w:val="Compact"/>
+            </w:pPr>
+            <w:r>
+              <w:t xml:space="preserve">Rất ít (vài câu TTS)</w:t>
+            </w:r>
+          </w:p>
+        </w:tc>
+      </w:tr>
+      <w:tr>
+        <w:tc>
+          <w:tcPr/>
+          <w:p>
+            <w:pPr>
+              <w:pStyle w:val="Compact"/>
+            </w:pPr>
+            <w:r>
+              <w:rPr>
+                <w:b/>
+                <w:bCs/>
+              </w:rPr>
+              <w:t xml:space="preserve">E1</w:t>
+            </w:r>
+          </w:p>
+        </w:tc>
+        <w:tc>
+          <w:tcPr/>
+          <w:p>
+            <w:pPr>
+              <w:pStyle w:val="Compact"/>
+            </w:pPr>
+            <w:r>
+              <w:rPr>
+                <w:b/>
+                <w:bCs/>
+              </w:rPr>
+              <w:t xml:space="preserve">Storyboard theo shot</w:t>
+            </w:r>
+          </w:p>
+        </w:tc>
+        <w:tc>
+          <w:tcPr/>
+          <w:p>
+            <w:pPr>
+              <w:pStyle w:val="Compact"/>
+            </w:pPr>
+            <w:r>
+              <w:t xml:space="preserve">Ảnh khung đầu từng shot (Deepix, rẻ) chính là storyboard để duyệt trước khi gen video; previz 2D chạy theo từng shot (cỡ người theo cỡ cảnh); Claude tự gắn nhãn góc/cỡ cho ảnh bối cảnh trong kho</w:t>
+            </w:r>
+          </w:p>
+        </w:tc>
+        <w:tc>
+          <w:tcPr/>
+          <w:p>
+            <w:pPr>
+              <w:pStyle w:val="Compact"/>
+            </w:pPr>
+            <w:r>
+              <w:t xml:space="preserve">Ảnh Deepix</w:t>
+            </w:r>
+          </w:p>
+        </w:tc>
+      </w:tr>
+      <w:tr>
+        <w:tc>
+          <w:tcPr/>
+          <w:p>
+            <w:pPr>
+              <w:pStyle w:val="Compact"/>
+            </w:pPr>
+            <w:r>
+              <w:rPr>
+                <w:b/>
+                <w:bCs/>
+              </w:rPr>
+              <w:t xml:space="preserve">F</w:t>
+            </w:r>
+          </w:p>
+        </w:tc>
+        <w:tc>
+          <w:tcPr/>
+          <w:p>
+            <w:pPr>
+              <w:pStyle w:val="Compact"/>
+            </w:pPr>
+            <w:r>
+              <w:rPr>
+                <w:b/>
+                <w:bCs/>
+              </w:rPr>
+              <w:t xml:space="preserve">Kiểm chứng thật</w:t>
+            </w:r>
+            <w:r>
+              <w:t xml:space="preserve"> </w:t>
+            </w:r>
+            <w:r>
+              <w:t xml:space="preserve">(cần duyệt ngân sách)</w:t>
+            </w:r>
+          </w:p>
+        </w:tc>
+        <w:tc>
+          <w:tcPr/>
+          <w:p>
+            <w:pPr>
+              <w:pStyle w:val="Compact"/>
+            </w:pPr>
+            <w:r>
+              <w:t xml:space="preserve">1 dự án 2–3 cảnh (~10–15 shot) ở Đảo Quân Sự: Deepix 9:16, Kling multi-shot + Seedance khung đầu/cuối, TTS tiếng Việt; đo giá thật, nghe giọng, so với bản 3 shot; chạy chế độ tự động qua giao diện; hiệu chỉnh ngưỡng QC</w:t>
+            </w:r>
+          </w:p>
+        </w:tc>
+        <w:tc>
+          <w:tcPr/>
+          <w:p>
+            <w:pPr>
+              <w:pStyle w:val="Compact"/>
+            </w:pPr>
+            <w:r>
+              <w:t xml:space="preserve">Có</w:t>
+            </w:r>
+          </w:p>
+        </w:tc>
+      </w:tr>
+      <w:tr>
+        <w:tc>
+          <w:tcPr/>
+          <w:p>
+            <w:pPr>
+              <w:pStyle w:val="Compact"/>
+            </w:pPr>
+            <w:r>
+              <w:t xml:space="preserve">E2 (nghiên cứu dần)</w:t>
+            </w:r>
+          </w:p>
+        </w:tc>
+        <w:tc>
+          <w:tcPr/>
+          <w:p>
+            <w:pPr>
+              <w:pStyle w:val="Compact"/>
+            </w:pPr>
+            <w:r>
+              <w:t xml:space="preserve">Storyboard 3D kiểu Blender (khung camera trong không gian 3D, nhiều lớp)</w:t>
+            </w:r>
+          </w:p>
+        </w:tc>
+        <w:tc>
+          <w:tcPr/>
+          <w:p>
+            <w:pPr>
+              <w:pStyle w:val="Compact"/>
+            </w:pPr>
+            <w:r>
+              <w:t xml:space="preserve">Vì Director Workspace của ClipAI chỉ có trên web: nghiên cứu Blender chạy nền (bpy) — cần mô hình 3D map/nhân vật; làm sau khi A–F ổn (</w:t>
+            </w:r>
+            <w:r>
+              <w:rPr>
+                <w:rStyle w:val="VerbatimChar"/>
+              </w:rPr>
+              <w:t xml:space="preserve">docs/RESEARCH_3D_PREVIZ.md</w:t>
+            </w:r>
+            <w:r>
+              <w:t xml:space="preserve">)</w:t>
+            </w:r>
+          </w:p>
+        </w:tc>
+        <w:tc>
+          <w:tcPr/>
+          <w:p>
+            <w:pPr>
+              <w:pStyle w:val="Compact"/>
+            </w:pPr>
+            <w:r>
+              <w:t xml:space="preserve">—</w:t>
+            </w:r>
+          </w:p>
+        </w:tc>
+      </w:tr>
+    </w:tbl>
+    <w:p>
+      <w:pPr>
+        <w:pStyle w:val="BodyText"/>
+      </w:pPr>
+      <w:r>
+        <w:rPr>
+          <w:b/>
+          <w:bCs/>
+        </w:rPr>
+        <w:t xml:space="preserve">Chi phí khi chuyển sang nhiều shot:</w:t>
+      </w:r>
+      <w:r>
+        <w:t xml:space="preserve"> </w:t>
+      </w:r>
+      <w:r>
+        <w:t xml:space="preserve">giá tính theo giây nên tổng giây gần như không đổi; phần phát sinh là shot ngắn hơn thời lượng tối thiểu (Kling 3s, Seedance 4s) phải gen dài rồi cắt → dùng Kling multi-shot cho nhóm shot ngắn để tránh.</w:t>
+      </w:r>
+    </w:p>
+    <w:p>
+      <w:pPr>
+        <w:pStyle w:val="BodyText"/>
+      </w:pPr>
+      <w:r>
+        <w:rPr>
+          <w:b/>
+          <w:bCs/>
+        </w:rPr>
+        <w:t xml:space="preserve">Bỏ qua cho tới khi API có:</w:t>
+      </w:r>
+      <w:r>
+        <w:t xml:space="preserve"> </w:t>
+      </w:r>
+      <w:r>
+        <w:t xml:space="preserve">Lip Sync, Kling Elements, Voice Design/Clone, Director Workspace, Motion Control, Storyboard Deepix. Ghi nhận để hỏi team ClipAI mở API.</w:t>
+      </w:r>
+    </w:p>
+    <w:p>
+      <w:pPr>
+        <w:pStyle w:val="BodyText"/>
+      </w:pPr>
+      <w:r>
+        <w:rPr>
+          <w:b/>
+          <w:bCs/>
+        </w:rPr>
+        <w:t xml:space="preserve">Cần người dùng chốt trước khi code:</w:t>
+      </w:r>
+      <w:r>
+        <w:t xml:space="preserve"> </w:t>
+      </w:r>
+      <w:r>
+        <w:t xml:space="preserve">(1) mặc định gen từng shot riêng hay Kling multi-shot theo nhóm cảnh; (2)</w:t>
+      </w:r>
+      <w:r>
+        <w:t xml:space="preserve"> </w:t>
+      </w:r>
+      <w:r>
+        <w:t xml:space="preserve">“look”</w:t>
+      </w:r>
+      <w:r>
+        <w:t xml:space="preserve"> </w:t>
+      </w:r>
+      <w:r>
+        <w:t xml:space="preserve">mặc định cho video Free Fire; (3) nhịp mục tiêu cho video ngắn (đề xuất 2–3s/shot); (4) ngân sách credit cho GĐ F; (5) đồng ý dùng video kênh chính thức làm tư liệu phân tích (chỉ phân tích nội bộ, không dùng lại hình).</w:t>
+      </w:r>
+    </w:p>
+    <w:bookmarkEnd w:id="37"/>
+    <w:bookmarkEnd w:id="38"/>
+    <w:bookmarkStart w:id="39" w:name="rủi-ro-mitigation-tổng-hợp"/>
     <w:p>
       <w:pPr>
         <w:pStyle w:val="Heading2"/>
@@ -6542,8 +7831,8 @@
         </w:tc>
       </w:tr>
     </w:tbl>
-    <w:bookmarkEnd w:id="37"/>
-    <w:bookmarkStart w:id="38" w:name="quyết-định-đã-chốt-còn-mở"/>
+    <w:bookmarkEnd w:id="39"/>
+    <w:bookmarkStart w:id="40" w:name="quyết-định-đã-chốt-còn-mở"/>
     <w:p>
       <w:pPr>
         <w:pStyle w:val="Heading2"/>
@@ -6660,6 +7949,63 @@
       </w:r>
       <w:r>
         <w:t xml:space="preserve">- Không train/fine-tune model; dùng Knowledge Base + eval set — xem 3.6</w:t>
+      </w:r>
+      <w:r>
+        <w:t xml:space="preserve"> </w:t>
+      </w:r>
+      <w:r>
+        <w:t xml:space="preserve">-</w:t>
+      </w:r>
+      <w:r>
+        <w:t xml:space="preserve"> </w:t>
+      </w:r>
+      <w:r>
+        <w:rPr>
+          <w:b/>
+          <w:bCs/>
+        </w:rPr>
+        <w:t xml:space="preserve">Chỉ dùng tính năng có trong API</w:t>
+      </w:r>
+      <w:r>
+        <w:t xml:space="preserve">; tính năng chỉ có trên web ClipAI/Deepix (Lip Sync, Kling Elements, Voice Design/Clone, Director Workspace, Motion Control, Storyboard Deepix) tạm bỏ qua — xem 3.9 (2026-09-23)</w:t>
+      </w:r>
+      <w:r>
+        <w:t xml:space="preserve"> </w:t>
+      </w:r>
+      <w:r>
+        <w:t xml:space="preserve">- Đơn vị sản xuất chuyển từ</w:t>
+      </w:r>
+      <w:r>
+        <w:t xml:space="preserve"> </w:t>
+      </w:r>
+      <w:r>
+        <w:rPr>
+          <w:b/>
+          <w:bCs/>
+        </w:rPr>
+        <w:t xml:space="preserve">cảnh</w:t>
+      </w:r>
+      <w:r>
+        <w:t xml:space="preserve"> </w:t>
+      </w:r>
+      <w:r>
+        <w:t xml:space="preserve">sang</w:t>
+      </w:r>
+      <w:r>
+        <w:t xml:space="preserve"> </w:t>
+      </w:r>
+      <w:r>
+        <w:rPr>
+          <w:b/>
+          <w:bCs/>
+        </w:rPr>
+        <w:t xml:space="preserve">shot</w:t>
+      </w:r>
+      <w:r>
+        <w:t xml:space="preserve"> </w:t>
+      </w:r>
+      <w:r>
+        <w:t xml:space="preserve">(phân shot + hợp đồng shot), Director học ngữ pháp dựng Free Fire từ video kênh chính thức — xem 3.9 (2026-09-23, chờ chốt 5 điểm cuối 3.9)</w:t>
       </w:r>
     </w:p>
     <w:p>
@@ -7710,6 +9056,9 @@
               <w:pStyle w:val="Compact"/>
             </w:pPr>
             <w:r>
+              <w:rPr>
+                <w:strike/>
+              </w:rPr>
               <w:t xml:space="preserve">API Clip AI có cho dùng Bàn đạo diễn không</w:t>
             </w:r>
           </w:p>
@@ -7721,7 +9070,29 @@
               <w:pStyle w:val="Compact"/>
             </w:pPr>
             <w:r>
-              <w:t xml:space="preserve">Hướng 2 — kiểm tra ở lần dùng API tiếp theo; hỏi team Clip AI gói skill mới hơn 1.3.1</w:t>
+              <w:rPr>
+                <w:b/>
+                <w:bCs/>
+              </w:rPr>
+              <w:t xml:space="preserve">Đã kiểm (2026-09-23): không</w:t>
+            </w:r>
+            <w:r>
+              <w:t xml:space="preserve"> </w:t>
+            </w:r>
+            <w:r>
+              <w:t xml:space="preserve">— Director Workspace chỉ có trên web (token bị</w:t>
+            </w:r>
+            <w:r>
+              <w:t xml:space="preserve"> </w:t>
+            </w:r>
+            <w:r>
+              <w:rPr>
+                <w:rStyle w:val="VerbatimChar"/>
+              </w:rPr>
+              <w:t xml:space="preserve">LoginErr</w:t>
+            </w:r>
+            <w:r>
+              <w:t xml:space="preserve">) → bỏ qua theo 3.9; hỏi team Clip AI mở API</w:t>
             </w:r>
           </w:p>
         </w:tc>
@@ -7934,8 +9305,8 @@
         <w:t xml:space="preserve">| Ngân sách credit cho giai đoạn thử nghiệm (Deepix + Clip AI/Kling) | Dry-run + retry loop đều tốn credit thật; cần biết giới hạn trước khi chạy batch | Bạn / người giữ ngân sách |</w:t>
       </w:r>
     </w:p>
-    <w:bookmarkEnd w:id="38"/>
-    <w:bookmarkStart w:id="39" w:name="Xd77c4f47b903719b6fbd5f054853d76240e8579"/>
+    <w:bookmarkEnd w:id="40"/>
+    <w:bookmarkStart w:id="41" w:name="Xd77c4f47b903719b6fbd5f054853d76240e8579"/>
     <w:p>
       <w:pPr>
         <w:pStyle w:val="Heading2"/>
@@ -8368,8 +9739,8 @@
         <w:t xml:space="preserve">- [ ] Người giữ quan hệ với team dev nội bộ cấp API Deepix/Clip AI</w:t>
       </w:r>
     </w:p>
-    <w:bookmarkEnd w:id="39"/>
-    <w:bookmarkStart w:id="43" w:name="lộ-trình-triển-khai-v0-v1"/>
+    <w:bookmarkEnd w:id="41"/>
+    <w:bookmarkStart w:id="45" w:name="lộ-trình-triển-khai-v0-v1"/>
     <w:p>
       <w:pPr>
         <w:pStyle w:val="Heading2"/>
@@ -8378,7 +9749,7 @@
         <w:t xml:space="preserve">7. Lộ trình triển khai: V0 → V1</w:t>
       </w:r>
     </w:p>
-    <w:bookmarkStart w:id="40" w:name="X96af04f5f0dc0fae4ea4bac7edaf06b3f002467"/>
+    <w:bookmarkStart w:id="42" w:name="X96af04f5f0dc0fae4ea4bac7edaf06b3f002467"/>
     <w:p>
       <w:pPr>
         <w:pStyle w:val="Heading3"/>
@@ -8705,8 +10076,8 @@
         <w:t xml:space="preserve">≥1 video hoàn chỉnh end-to-end, threshold đã hiệu chỉnh bằng dữ liệu, prompt/checklist khóa version.</w:t>
       </w:r>
     </w:p>
-    <w:bookmarkEnd w:id="40"/>
-    <w:bookmarkStart w:id="41" w:name="X3d60c8a93cbf48f59874d7f70b2bf9f5f0f0b9b"/>
+    <w:bookmarkEnd w:id="42"/>
+    <w:bookmarkStart w:id="43" w:name="X3d60c8a93cbf48f59874d7f70b2bf9f5f0f0b9b"/>
     <w:p>
       <w:pPr>
         <w:pStyle w:val="Heading3"/>
@@ -8849,8 +10220,8 @@
         <w:t xml:space="preserve">hệ thống bàn giao vận hành được từ 1 giao diện duy nhất, có tài liệu.</w:t>
       </w:r>
     </w:p>
-    <w:bookmarkEnd w:id="41"/>
-    <w:bookmarkStart w:id="42" w:name="Xf17d03e65ff0af0f4b74d160622aac56e61b107"/>
+    <w:bookmarkEnd w:id="43"/>
+    <w:bookmarkStart w:id="44" w:name="Xf17d03e65ff0af0f4b74d160622aac56e61b107"/>
     <w:p>
       <w:pPr>
         <w:pStyle w:val="Heading3"/>
@@ -9217,9 +10588,9 @@
         <w:t xml:space="preserve">Rủi ro kéo dài: chờ API Deepix/Clip AI; Deepix/Clip AI chỉ có Web (Playwright, +1–2 tuần); hiệu chỉnh QC threshold cần nhiều vòng; chất lượng Knowledge Base phụ thuộc chuyên gia miền.</w:t>
       </w:r>
     </w:p>
-    <w:bookmarkEnd w:id="42"/>
-    <w:bookmarkEnd w:id="43"/>
-    <w:bookmarkStart w:id="44" w:name="Xb786808859b2baa89401c26f99cf8f9fff113e4"/>
+    <w:bookmarkEnd w:id="44"/>
+    <w:bookmarkEnd w:id="45"/>
+    <w:bookmarkStart w:id="46" w:name="Xb786808859b2baa89401c26f99cf8f9fff113e4"/>
     <w:p>
       <w:pPr>
         <w:pStyle w:val="Heading2"/>
@@ -9336,8 +10707,8 @@
         <w:t xml:space="preserve">Runbook + Prompt Templates đã bàn giao cho bộ phận sản xuất nội dung</w:t>
       </w:r>
     </w:p>
-    <w:bookmarkEnd w:id="44"/>
-    <w:bookmarkStart w:id="45" w:name="X3d83f13eb288e7e0fe426ee3840d7740f3f3c0e"/>
+    <w:bookmarkEnd w:id="46"/>
+    <w:bookmarkStart w:id="47" w:name="X3d83f13eb288e7e0fe426ee3840d7740f3f3c0e"/>
     <w:p>
       <w:pPr>
         <w:pStyle w:val="Heading2"/>
@@ -11346,8 +12717,8 @@
         <w:t xml:space="preserve">(kèm 4 comment góp ý, đã phân tích ở Mục 2).</w:t>
       </w:r>
     </w:p>
-    <w:bookmarkEnd w:id="45"/>
-    <w:bookmarkEnd w:id="46"/>
+    <w:bookmarkEnd w:id="47"/>
+    <w:bookmarkEnd w:id="48"/>
     <w:sectPr>
       <w:footnotePr>
         <w:numRestart w:val="eachSect"/>

</xml_diff>

<commit_message>
Chốt kế hoạch v3 chính thức (md + docx + pdf) và bàn giao cho phiên thực hiện
- docs/KE_HOACH_V3_CHINH_THUC.{md,docx,pdf}: 6 giai đoạn (thư viện phong cách Free Fire,
  lớp shot + nhịp theo kịch bản, nhất quán + Kling multi-shot, giọng Việt + storyboard,
  trần ngân sách $50 + thử rẻ 720p + so sánh, thử thật 3 phương án) + mục bàn giao
- PLAN.md 3.9 + Mục 5 ghi quyết định người dùng; TODO.md trỏ tới kế hoạch
- samples/kenta_xuyen_tuong_cuop_kill.txt: kịch bản thử
- tools/build_docs.sh build thêm docx/pdf của kế hoạch v3

Co-Authored-By: Claude Opus 5.5 <noreply@anthropic.com>
</commit_message>
<xml_diff>
--- a/PLAN.docx
+++ b/PLAN.docx
@@ -7604,25 +7604,55 @@
           <w:b/>
           <w:bCs/>
         </w:rPr>
-        <w:t xml:space="preserve">Cần người dùng chốt trước khi code:</w:t>
-      </w:r>
-      <w:r>
-        <w:t xml:space="preserve"> </w:t>
-      </w:r>
-      <w:r>
-        <w:t xml:space="preserve">(1) mặc định gen từng shot riêng hay Kling multi-shot theo nhóm cảnh; (2)</w:t>
-      </w:r>
-      <w:r>
-        <w:t xml:space="preserve"> </w:t>
-      </w:r>
-      <w:r>
-        <w:t xml:space="preserve">“look”</w:t>
-      </w:r>
-      <w:r>
-        <w:t xml:space="preserve"> </w:t>
-      </w:r>
-      <w:r>
-        <w:t xml:space="preserve">mặc định cho video Free Fire; (3) nhịp mục tiêu cho video ngắn (đề xuất 2–3s/shot); (4) ngân sách credit cho GĐ F; (5) đồng ý dùng video kênh chính thức làm tư liệu phân tích (chỉ phân tích nội bộ, không dùng lại hình).</w:t>
+        <w:t xml:space="preserve">Đã chốt (2026-09-23) — kế hoạch v3 chính thức:</w:t>
+      </w:r>
+      <w:r>
+        <w:t xml:space="preserve"> </w:t>
+      </w:r>
+      <w:r>
+        <w:rPr>
+          <w:rStyle w:val="VerbatimChar"/>
+        </w:rPr>
+        <w:t xml:space="preserve">docs/KE_HOACH_V3_CHINH_THUC.md</w:t>
+      </w:r>
+      <w:r>
+        <w:t xml:space="preserve"> </w:t>
+      </w:r>
+      <w:r>
+        <w:t xml:space="preserve">(kèm</w:t>
+      </w:r>
+      <w:r>
+        <w:t xml:space="preserve"> </w:t>
+      </w:r>
+      <w:r>
+        <w:rPr>
+          <w:rStyle w:val="VerbatimChar"/>
+        </w:rPr>
+        <w:t xml:space="preserve">.docx</w:t>
+      </w:r>
+      <w:r>
+        <w:t xml:space="preserve">/</w:t>
+      </w:r>
+      <w:r>
+        <w:rPr>
+          <w:rStyle w:val="VerbatimChar"/>
+        </w:rPr>
+        <w:t xml:space="preserve">.pdf</w:t>
+      </w:r>
+      <w:r>
+        <w:t xml:space="preserve">), gồm 6 giai đoạn: GĐ1 thư viện phong cách Free Fire (≥ 6 video mỗi dạng: anime CGI, CGI tả thực/kỹ xảo, gameplay, Kelly Show, phim ngắn, 3D fan viral) → GĐ2 lớp shot + nhịp theo kịch bản → GĐ3 nhất quán ảnh ↔ prompt ↔ video + Kling multi-shot → GĐ4 giọng Việt + storyboard theo shot → GĐ5 trần ngân sách + chế độ thử rẻ + so sánh → GĐ6 thử thật 3 phương án (v2 / từng shot / Kling multi-shot) và đánh giá. Quyết định của người dùng: thử cả hai cách rồi so sánh; nhịp dựng do kịch bản quyết định (không cố định); ngân sách thử ≤ $50, 720p hoặc thấp hơn; được dùng video kênh chính thức làm tư liệu phân tích nội bộ, thêm video 3D fan viral; tính năng không có API thì bỏ qua. Thực hiện trên tài khoản phụ, nhánh</w:t>
+      </w:r>
+      <w:r>
+        <w:t xml:space="preserve"> </w:t>
+      </w:r>
+      <w:r>
+        <w:rPr>
+          <w:rStyle w:val="VerbatimChar"/>
+        </w:rPr>
+        <w:t xml:space="preserve">v3-shots</w:t>
+      </w:r>
+      <w:r>
+        <w:t xml:space="preserve">.</w:t>
       </w:r>
     </w:p>
     <w:bookmarkEnd w:id="37"/>
@@ -8002,10 +8032,22 @@
         <w:t xml:space="preserve">shot</w:t>
       </w:r>
       <w:r>
-        <w:t xml:space="preserve"> </w:t>
-      </w:r>
-      <w:r>
-        <w:t xml:space="preserve">(phân shot + hợp đồng shot), Director học ngữ pháp dựng Free Fire từ video kênh chính thức — xem 3.9 (2026-09-23, chờ chốt 5 điểm cuối 3.9)</w:t>
+        <w:t xml:space="preserve">, Director học ngữ pháp dựng Free Fire từ video kênh chính thức + 3D fan viral; nhịp theo kịch bản; thử thật 3 phương án ≤ $50 ở 720p rồi mới chốt mặc định — kế hoạch v3 chính thức</w:t>
+      </w:r>
+      <w:r>
+        <w:t xml:space="preserve"> </w:t>
+      </w:r>
+      <w:r>
+        <w:rPr>
+          <w:rStyle w:val="VerbatimChar"/>
+        </w:rPr>
+        <w:t xml:space="preserve">docs/KE_HOACH_V3_CHINH_THUC.md</w:t>
+      </w:r>
+      <w:r>
+        <w:t xml:space="preserve"> </w:t>
+      </w:r>
+      <w:r>
+        <w:t xml:space="preserve">(2026-09-23)</w:t>
       </w:r>
     </w:p>
     <w:p>

</xml_diff>

<commit_message>
v3 GĐ1 (dở): công cụ phân tích video tham khảo + 19 video, cập nhật tiến độ kế hoạch
- core/reference_analysis.py: cắt shot bằng ffmpeg, khung giữa shot, bảng khung,
  gắn nhãn qua llm_runner.ask_json (prompts/16_reference_shots.md, MockLlm có
  câu trả lời giả lập), lưu dữ liệu chữ research/ff_styles/<STYLE>/*.json,
  thống kê theo phong cách.
- tools/reference_video.py: sheets / label / save / cuts / stats.
- research/ff_styles: 19 video, 519 shot (INGAME 8, ANIME_CGI 3, REAL_CGI_VFX 4,
  KELLY_SHOW 1, SHORT_FILM 3, FAN_3D 0).
- docs/KE_HOACH_V3_CHINH_THUC.md mục "Tiến độ thực hiện" (việc đã xong, còn lại,
  mã video cần phân tích tiếp, ghi chú thiết kế GĐ2-3); PLAN.md 3.9, TODO.md;
  build lại docx/pdf.

Co-Authored-By: Claude Opus 5.5 <noreply@anthropic.com>
</commit_message>
<xml_diff>
--- a/PLAN.docx
+++ b/PLAN.docx
@@ -7650,6 +7650,60 @@
           <w:rStyle w:val="VerbatimChar"/>
         </w:rPr>
         <w:t xml:space="preserve">v3-shots</w:t>
+      </w:r>
+      <w:r>
+        <w:t xml:space="preserve">.</w:t>
+      </w:r>
+    </w:p>
+    <w:p>
+      <w:pPr>
+        <w:pStyle w:val="BodyText"/>
+      </w:pPr>
+      <w:r>
+        <w:rPr>
+          <w:b/>
+          <w:bCs/>
+        </w:rPr>
+        <w:t xml:space="preserve">Tiến độ (2026-09-24):</w:t>
+      </w:r>
+      <w:r>
+        <w:t xml:space="preserve"> </w:t>
+      </w:r>
+      <w:r>
+        <w:t xml:space="preserve">GĐ1 ~50% — xong công cụ phân tích video tham khảo (cắt shot ffmpeg / quét trong trình duyệt, gắn nhãn, thống kê theo phong cách), đã phân tích 19 video / 519 shot (trung vị 2,0s/shot, 24 shot/phút); còn ~17 video (nhất là Kelly Show và 3D fan), 6 file phong cách và</w:t>
+      </w:r>
+      <w:r>
+        <w:t xml:space="preserve"> </w:t>
+      </w:r>
+      <w:r>
+        <w:rPr>
+          <w:rStyle w:val="VerbatimChar"/>
+        </w:rPr>
+        <w:t xml:space="preserve">knowledge/ff_directing.md</w:t>
+      </w:r>
+      <w:r>
+        <w:t xml:space="preserve">. GĐ2–GĐ6 chưa bắt đầu. Chi tiết: mục</w:t>
+      </w:r>
+      <w:r>
+        <w:t xml:space="preserve"> </w:t>
+      </w:r>
+      <w:r>
+        <w:t xml:space="preserve">“Tiến độ thực hiện”</w:t>
+      </w:r>
+      <w:r>
+        <w:t xml:space="preserve"> </w:t>
+      </w:r>
+      <w:r>
+        <w:t xml:space="preserve">của</w:t>
+      </w:r>
+      <w:r>
+        <w:t xml:space="preserve"> </w:t>
+      </w:r>
+      <w:r>
+        <w:rPr>
+          <w:rStyle w:val="VerbatimChar"/>
+        </w:rPr>
+        <w:t xml:space="preserve">docs/KE_HOACH_V3_CHINH_THUC.md</w:t>
       </w:r>
       <w:r>
         <w:t xml:space="preserve">.</w:t>

</xml_diff>

<commit_message>
v3 GĐ1 khép lại: 6 file phong cách Free Fire + ngữ pháp dựng chung + báo cáo nghiên cứu; phân tích thêm video để sau
- knowledge/ff_styles/<STYLE>.md ×6 (hướng dẫn + số liệu tự sinh từ research/ff_styles, độ tin cậy)
- knowledge/ff_directing.md, docs/FF_STYLE_RESEARCH.md, tools/ff_style_knowledge.py
- tests/test_v3.py: test công cụ phân tích video tham khảo
- Người dùng chốt: tạm dừng phân tích thêm video, ghi vào "Việc để sau"

Co-Authored-By: Claude Opus 5.5 <noreply@anthropic.com>
</commit_message>
<xml_diff>
--- a/PLAN.docx
+++ b/PLAN.docx
@@ -7670,7 +7670,22 @@
         <w:t xml:space="preserve"> </w:t>
       </w:r>
       <w:r>
-        <w:t xml:space="preserve">GĐ1 ~50% — xong công cụ phân tích video tham khảo (cắt shot ffmpeg / quét trong trình duyệt, gắn nhãn, thống kê theo phong cách), đã phân tích 19 video / 519 shot (trung vị 2,0s/shot, 24 shot/phút); còn ~17 video (nhất là Kelly Show và 3D fan), 6 file phong cách và</w:t>
+        <w:t xml:space="preserve">GĐ1 khép lại bằng dữ liệu đang có — công cụ phân tích video tham khảo, 19 video / 519 shot (trung vị 2,0s/shot, 24 shot/phút), 6 file</w:t>
+      </w:r>
+      <w:r>
+        <w:t xml:space="preserve"> </w:t>
+      </w:r>
+      <w:r>
+        <w:rPr>
+          <w:rStyle w:val="VerbatimChar"/>
+        </w:rPr>
+        <w:t xml:space="preserve">knowledge/ff_styles/*.md</w:t>
+      </w:r>
+      <w:r>
+        <w:t xml:space="preserve"> </w:t>
+      </w:r>
+      <w:r>
+        <w:t xml:space="preserve">+</w:t>
       </w:r>
       <w:r>
         <w:t xml:space="preserve"> </w:t>
@@ -7682,7 +7697,38 @@
         <w:t xml:space="preserve">knowledge/ff_directing.md</w:t>
       </w:r>
       <w:r>
-        <w:t xml:space="preserve">. GĐ2–GĐ6 chưa bắt đầu. Chi tiết: mục</w:t>
+        <w:t xml:space="preserve"> </w:t>
+      </w:r>
+      <w:r>
+        <w:t xml:space="preserve">+</w:t>
+      </w:r>
+      <w:r>
+        <w:t xml:space="preserve"> </w:t>
+      </w:r>
+      <w:r>
+        <w:rPr>
+          <w:rStyle w:val="VerbatimChar"/>
+        </w:rPr>
+        <w:t xml:space="preserve">docs/FF_STYLE_RESEARCH.md</w:t>
+      </w:r>
+      <w:r>
+        <w:t xml:space="preserve">.</w:t>
+      </w:r>
+      <w:r>
+        <w:t xml:space="preserve"> </w:t>
+      </w:r>
+      <w:r>
+        <w:rPr>
+          <w:b/>
+          <w:bCs/>
+        </w:rPr>
+        <w:t xml:space="preserve">Phân tích thêm video (~19 video, nhất là Kelly Show và 3D fan) tạm để sau theo quyết định người dùng.</w:t>
+      </w:r>
+      <w:r>
+        <w:t xml:space="preserve"> </w:t>
+      </w:r>
+      <w:r>
+        <w:t xml:space="preserve">Đang làm GĐ2 (lớp shot). Chi tiết: mục</w:t>
       </w:r>
       <w:r>
         <w:t xml:space="preserve"> </w:t>

</xml_diff>

<commit_message>
v3 GĐ2: lớp shot — Director chia cảnh thành shot theo phong cách Free Fire, mỗi shot một dòng, cắt clip theo độ dài shot
- story_scenes + projects.shot_mode/style_profile/test_quality + jobs.group_leader
- core/shots.py: kiểm tra/lưu kế hoạch shot, nhãn S02·3, cảnh báo nhịp, cắt clip (trim_clip)
- prompts/17_director_shots.md + ff_directing + ff_styles nạp vào Director khi chia shot
- thời lượng tối thiểu model (min_sec), làm tròn lên khi gửi, cắt khi tải về, giá theo giây bị tính
- lineage thêm trường shot chỉ khi có (v2 không đổi), giao diện nhóm shot theo cảnh
- tests/test_v3.py (13 test), 645 test pass

Co-Authored-By: Claude Opus 5.5 <noreply@anthropic.com>
</commit_message>
<xml_diff>
--- a/PLAN.docx
+++ b/PLAN.docx
@@ -7728,7 +7728,17 @@
         <w:t xml:space="preserve"> </w:t>
       </w:r>
       <w:r>
-        <w:t xml:space="preserve">Đang làm GĐ2 (lớp shot). Chi tiết: mục</w:t>
+        <w:rPr>
+          <w:b/>
+          <w:bCs/>
+        </w:rPr>
+        <w:t xml:space="preserve">GĐ2 xong</w:t>
+      </w:r>
+      <w:r>
+        <w:t xml:space="preserve"> </w:t>
+      </w:r>
+      <w:r>
+        <w:t xml:space="preserve">(lớp shot: Director chia cảnh thành shot theo phong cách, mỗi shot một dòng, cắt clip theo độ dài shot, nhãn S02·3; 645 test pass). Đang làm GĐ3. Chi tiết: mục</w:t>
       </w:r>
       <w:r>
         <w:t xml:space="preserve"> </w:t>

</xml_diff>

<commit_message>
v3 GĐ3: nhất quán ảnh–prompt–video — Seedance khung đầu+cuối, một model mỗi nhóm, Kling multi-shot theo nhóm, QC đồng bộ cả bộ clip
- ClipAIVideoProvider.submit(last_frame=…) (Seedance first+last frame), mock nhận last_frame
- ImageRunner chờ ảnh shot trước cho shot nối liền; VideoRunner multi-shot trưởng nhóm → cắt clip cho từng shot
- model_router: một model cho một nhóm (per_shot), Kling cho multishot
- claude_tasks.clip_set_consistency + khối Bước 4
- sửa: final_cut.collect_clips không lấy file gốc _raw/_group làm clip thêm
- 648 test pass

Co-Authored-By: Claude Opus 5.5 <noreply@anthropic.com>
</commit_message>
<xml_diff>
--- a/PLAN.docx
+++ b/PLAN.docx
@@ -7738,7 +7738,23 @@
         <w:t xml:space="preserve"> </w:t>
       </w:r>
       <w:r>
-        <w:t xml:space="preserve">(lớp shot: Director chia cảnh thành shot theo phong cách, mỗi shot một dòng, cắt clip theo độ dài shot, nhãn S02·3; 645 test pass). Đang làm GĐ3. Chi tiết: mục</w:t>
+        <w:t xml:space="preserve">(lớp shot: Director chia cảnh thành shot theo phong cách, mỗi shot một dòng, cắt clip theo độ dài shot, nhãn S02·3; 645 test pass).</w:t>
+      </w:r>
+      <w:r>
+        <w:t xml:space="preserve"> </w:t>
+      </w:r>
+      <w:r>
+        <w:rPr>
+          <w:b/>
+          <w:bCs/>
+        </w:rPr>
+        <w:t xml:space="preserve">GĐ3 xong</w:t>
+      </w:r>
+      <w:r>
+        <w:t xml:space="preserve"> </w:t>
+      </w:r>
+      <w:r>
+        <w:t xml:space="preserve">(khung đầu+cuối Seedance, một model mỗi nhóm, Kling multi-shot theo nhóm, QC đồng bộ cả bộ clip; 648 test pass). Đang làm GĐ4. Chi tiết: mục</w:t>
       </w:r>
       <w:r>
         <w:t xml:space="preserve"> </w:t>

</xml_diff>

<commit_message>
v3 GĐ4: giọng Việt chỉ dùng API — giọng có tiếng Việt lên đầu, bảng cách đọc từ game, nghe thử câu mẫu, storyboard theo shot
- core/voice.py: speaks_vi, vietnamese_first, casting_pool, speakable (data/pronunciation_vi.json), preview
- cast_voices chỉ đưa giọng có vi; prompts/15 ghi rõ tiếng Việt + giới tính
- Bước 1: 🇻🇳 giọng Việt, cảnh báo thiếu giọng, nút nghe thử; Bước 2: storyboard theo shot
- so eleven_v3/multilingual_v2 dời sang GĐ6 (tốn credit); 652 test pass

Co-Authored-By: Claude Opus 5.5 <noreply@anthropic.com>
</commit_message>
<xml_diff>
--- a/PLAN.docx
+++ b/PLAN.docx
@@ -7754,7 +7754,35 @@
         <w:t xml:space="preserve"> </w:t>
       </w:r>
       <w:r>
-        <w:t xml:space="preserve">(khung đầu+cuối Seedance, một model mỗi nhóm, Kling multi-shot theo nhóm, QC đồng bộ cả bộ clip; 648 test pass). Đang làm GĐ4. Chi tiết: mục</w:t>
+        <w:t xml:space="preserve">(khung đầu+cuối Seedance, một model mỗi nhóm, Kling multi-shot theo nhóm, QC đồng bộ cả bộ clip; 648 test pass).</w:t>
+      </w:r>
+      <w:r>
+        <w:t xml:space="preserve"> </w:t>
+      </w:r>
+      <w:r>
+        <w:rPr>
+          <w:b/>
+          <w:bCs/>
+        </w:rPr>
+        <w:t xml:space="preserve">GĐ4 xong phần không tốn credit</w:t>
+      </w:r>
+      <w:r>
+        <w:t xml:space="preserve"> </w:t>
+      </w:r>
+      <w:r>
+        <w:t xml:space="preserve">(giọng Việt lọc theo</w:t>
+      </w:r>
+      <w:r>
+        <w:t xml:space="preserve"> </w:t>
+      </w:r>
+      <w:r>
+        <w:rPr>
+          <w:rStyle w:val="VerbatimChar"/>
+        </w:rPr>
+        <w:t xml:space="preserve">vi</w:t>
+      </w:r>
+      <w:r>
+        <w:t xml:space="preserve">, bảng cách đọc, nghe thử, storyboard theo shot; 652 test pass). Đang làm GĐ5. Chi tiết: mục</w:t>
       </w:r>
       <w:r>
         <w:t xml:space="preserve"> </w:t>

</xml_diff>

<commit_message>
v3 GĐ5: trần ngân sách theo đợt thử, chế độ thử rẻ 720p, nhân bản dự án, bảng so sánh + chấm điểm
- core/budget.py: trần chi cứng (mặc định tắt, bật khi bắt đầu đợt thử), chặn trước khi gửi video/ảnh
- test_quality: không 1080p, Kling std, Seedance 2.0 -> Fast
- core/compare.py: nhân bản dự án, chỉ số so sánh, điểm người dùng, bảng Markdown
- multi-shot: shot đi kèm không gen ảnh riêng
- 657 test pass

Co-Authored-By: Claude Opus 5.5 <noreply@anthropic.com>
</commit_message>
<xml_diff>
--- a/PLAN.docx
+++ b/PLAN.docx
@@ -7782,7 +7782,39 @@
         <w:t xml:space="preserve">vi</w:t>
       </w:r>
       <w:r>
-        <w:t xml:space="preserve">, bảng cách đọc, nghe thử, storyboard theo shot; 652 test pass). Đang làm GĐ5. Chi tiết: mục</w:t>
+        <w:t xml:space="preserve">, bảng cách đọc, nghe thử, storyboard theo shot; 652 test pass).</w:t>
+      </w:r>
+      <w:r>
+        <w:t xml:space="preserve"> </w:t>
+      </w:r>
+      <w:r>
+        <w:rPr>
+          <w:b/>
+          <w:bCs/>
+        </w:rPr>
+        <w:t xml:space="preserve">GĐ5 xong</w:t>
+      </w:r>
+      <w:r>
+        <w:t xml:space="preserve"> </w:t>
+      </w:r>
+      <w:r>
+        <w:t xml:space="preserve">(trần ngân sách $50 bật theo đợt thử, chế độ thử rẻ 720p, nhân bản dự án, bảng so sánh + chấm điểm; 657 test pass). Tiếp theo: chạy giả lập 3 phương án qua trình duyệt, rồi</w:t>
+      </w:r>
+      <w:r>
+        <w:t xml:space="preserve"> </w:t>
+      </w:r>
+      <w:r>
+        <w:rPr>
+          <w:b/>
+          <w:bCs/>
+        </w:rPr>
+        <w:t xml:space="preserve">dừng hỏi người dùng trước GĐ6</w:t>
+      </w:r>
+      <w:r>
+        <w:t xml:space="preserve"> </w:t>
+      </w:r>
+      <w:r>
+        <w:t xml:space="preserve">(gen thật). Chi tiết: mục</w:t>
       </w:r>
       <w:r>
         <w:t xml:space="preserve"> </w:t>

</xml_diff>

<commit_message>
v3: chạy giả lập 3 phương án (v2 / từng shot / multi-shot) tới bản giao, sửa 10 lỗi
- multi-shot: chế độ tự động chỉ gen ảnh đầu nhóm; lineage xét shot đi kèm theo ảnh đầu nhóm; ước tính ảnh + storyboard Bước 2
- nhân bản "chạy lại Director" tạo một dòng mỗi cảnh kịch bản
- hộp thoại Ngân sách / Nhân bản mở được; mọi hộp thoại dùng kết nối SQLite riêng (lỗi khác luồng)
- "$" trong markdown, lưu điểm cập nhật bảng, nhãn "3 cảnh · 25 shot", ẩn khối thử nghiệm multi-shot cũ
- chế độ thử rẻ: Seedance 2.0/2.5 -> 2.0 Fast
- 659 test pass

Co-Authored-By: Claude Opus 5.5 <noreply@anthropic.com>
</commit_message>
<xml_diff>
--- a/PLAN.docx
+++ b/PLAN.docx
@@ -7798,23 +7798,39 @@
         <w:t xml:space="preserve"> </w:t>
       </w:r>
       <w:r>
-        <w:t xml:space="preserve">(trần ngân sách $50 bật theo đợt thử, chế độ thử rẻ 720p, nhân bản dự án, bảng so sánh + chấm điểm; 657 test pass). Tiếp theo: chạy giả lập 3 phương án qua trình duyệt, rồi</w:t>
-      </w:r>
-      <w:r>
-        <w:t xml:space="preserve"> </w:t>
-      </w:r>
-      <w:r>
-        <w:rPr>
-          <w:b/>
-          <w:bCs/>
-        </w:rPr>
-        <w:t xml:space="preserve">dừng hỏi người dùng trước GĐ6</w:t>
-      </w:r>
-      <w:r>
-        <w:t xml:space="preserve"> </w:t>
-      </w:r>
-      <w:r>
-        <w:t xml:space="preserve">(gen thật). Chi tiết: mục</w:t>
+        <w:t xml:space="preserve">(trần ngân sách $50 bật theo đợt thử, chế độ thử rẻ 720p, nhân bản dự án, bảng so sánh + chấm điểm; 657 test pass).</w:t>
+      </w:r>
+      <w:r>
+        <w:t xml:space="preserve"> </w:t>
+      </w:r>
+      <w:r>
+        <w:rPr>
+          <w:b/>
+          <w:bCs/>
+        </w:rPr>
+        <w:t xml:space="preserve">Chạy giả lập 3 phương án xong</w:t>
+      </w:r>
+      <w:r>
+        <w:t xml:space="preserve"> </w:t>
+      </w:r>
+      <w:r>
+        <w:t xml:space="preserve">(Kenta ở v2 / từng shot / multi-shot tới bản giao; sửa 10 lỗi; 659 test pass).</w:t>
+      </w:r>
+      <w:r>
+        <w:t xml:space="preserve"> </w:t>
+      </w:r>
+      <w:r>
+        <w:rPr>
+          <w:b/>
+          <w:bCs/>
+        </w:rPr>
+        <w:t xml:space="preserve">GĐ6 đang làm</w:t>
+      </w:r>
+      <w:r>
+        <w:t xml:space="preserve"> </w:t>
+      </w:r>
+      <w:r>
+        <w:t xml:space="preserve">— người dùng duyệt gen thật 2026-09-24 (trần $50, 720p). Chi tiết: mục</w:t>
       </w:r>
       <w:r>
         <w:t xml:space="preserve"> </w:t>

</xml_diff>

<commit_message>
v3 GĐ6: phân tích nguyên nhân gốc của ảnh/clip sai lệch trong đợt gen thật, đề xuất sửa F1–F5
docs/PHAN_TICH_LOI_GD6_2026-09-24.md: lần ngược chuỗi tham chiếu → Bible → ảnh → QC đồng bộ → prompt → video cho từng clip
bị loại; 6 nguyên nhân gốc có bằng chứng (Bible lệch ảnh tham chiếu, xung đột phong cách, QC đồng bộ nhận nhầm Kenta thành
Maxim và tự sửa sai, nhóm multi-shot thiếu nhân vật, clip dài nhiều nhịp, tự gen lại không hội tụ) và phương án sửa theo lớp.

Co-Authored-By: Claude Opus 5.5 <noreply@anthropic.com>
</commit_message>
<xml_diff>
--- a/PLAN.docx
+++ b/PLAN.docx
@@ -7824,13 +7824,25 @@
           <w:b/>
           <w:bCs/>
         </w:rPr>
-        <w:t xml:space="preserve">GĐ6 đang làm</w:t>
-      </w:r>
-      <w:r>
-        <w:t xml:space="preserve"> </w:t>
-      </w:r>
-      <w:r>
-        <w:t xml:space="preserve">— người dùng duyệt gen thật 2026-09-24 (trần $50, 720p). Chi tiết: mục</w:t>
+        <w:t xml:space="preserve">GĐ6 tạm dừng để sửa gốc</w:t>
+      </w:r>
+      <w:r>
+        <w:t xml:space="preserve"> </w:t>
+      </w:r>
+      <w:r>
+        <w:t xml:space="preserve">— gen thật đã chi $42,88/$50, phần lớn cho gen lại; phân tích nguyên nhân gốc và phương án sửa F1–F5 ở</w:t>
+      </w:r>
+      <w:r>
+        <w:t xml:space="preserve"> </w:t>
+      </w:r>
+      <w:r>
+        <w:rPr>
+          <w:rStyle w:val="VerbatimChar"/>
+        </w:rPr>
+        <w:t xml:space="preserve">docs/PHAN_TICH_LOI_GD6_2026-09-24.md</w:t>
+      </w:r>
+      <w:r>
+        <w:t xml:space="preserve">. Chi tiết: mục</w:t>
       </w:r>
       <w:r>
         <w:t xml:space="preserve"> </w:t>

</xml_diff>

<commit_message>
Kế hoạch: ghi nhận chuyển Claude sang API, trần ngân sách Claude $5 và ước tính chi phí Claude mỗi dự án
- PLAN.md 3.9: Dashboard gọi claude-sonnet-5 qua API thay cho Claude Code CLI; tiền Claude vào sổ chi + trần riêng $5;
  2 lỗi chỉ gặp khi gọi API đã sửa; đo prompt thật -> dự án 26 shot đủ QC ~$2,5-3, $5 ~ 2 video chia shot
- Mục 5 thêm quyết định đã chốt; Mục 6 tick khóa API Anthropic; kế hoạch v3 thêm dòng tiến độ
- Build lại PLAN.docx/.pdf và KE_HOACH_V3_CHINH_THUC.docx/.pdf

Co-Authored-By: Claude Opus 5.5 <noreply@anthropic.com>
</commit_message>
<xml_diff>
--- a/PLAN.docx
+++ b/PLAN.docx
@@ -7842,7 +7842,10 @@
         <w:t xml:space="preserve">docs/PHAN_TICH_LOI_GD6_2026-09-24.md</w:t>
       </w:r>
       <w:r>
-        <w:t xml:space="preserve">. Chi tiết: mục</w:t>
+        <w:t xml:space="preserve"> </w:t>
+      </w:r>
+      <w:r>
+        <w:t xml:space="preserve">(người dùng tạm gác kế hoạch sửa này). Chi tiết: mục</w:t>
       </w:r>
       <w:r>
         <w:t xml:space="preserve"> </w:t>
@@ -7867,6 +7870,144 @@
       </w:r>
       <w:r>
         <w:t xml:space="preserve">.</w:t>
+      </w:r>
+    </w:p>
+    <w:p>
+      <w:pPr>
+        <w:pStyle w:val="BodyText"/>
+      </w:pPr>
+      <w:r>
+        <w:rPr>
+          <w:b/>
+          <w:bCs/>
+        </w:rPr>
+        <w:t xml:space="preserve">Chuyển sang Claude API (2026-09-24):</w:t>
+      </w:r>
+      <w:r>
+        <w:t xml:space="preserve"> </w:t>
+      </w:r>
+      <w:r>
+        <w:t xml:space="preserve">người dùng đã có khóa Claude API → Dashboard gọi Claude qua API (</w:t>
+      </w:r>
+      <w:r>
+        <w:rPr>
+          <w:rStyle w:val="VerbatimChar"/>
+        </w:rPr>
+        <w:t xml:space="preserve">LLM_PROVIDER=anthropic</w:t>
+      </w:r>
+      <w:r>
+        <w:t xml:space="preserve"> </w:t>
+      </w:r>
+      <w:r>
+        <w:t xml:space="preserve">trong</w:t>
+      </w:r>
+      <w:r>
+        <w:t xml:space="preserve"> </w:t>
+      </w:r>
+      <w:r>
+        <w:rPr>
+          <w:rStyle w:val="VerbatimChar"/>
+        </w:rPr>
+        <w:t xml:space="preserve">dashboard.env</w:t>
+      </w:r>
+      <w:r>
+        <w:t xml:space="preserve">, khóa ở biến môi trường Windows</w:t>
+      </w:r>
+      <w:r>
+        <w:t xml:space="preserve"> </w:t>
+      </w:r>
+      <w:r>
+        <w:rPr>
+          <w:rStyle w:val="VerbatimChar"/>
+        </w:rPr>
+        <w:t xml:space="preserve">ANTHROPIC_API_KEY</w:t>
+      </w:r>
+      <w:r>
+        <w:t xml:space="preserve">, model</w:t>
+      </w:r>
+      <w:r>
+        <w:t xml:space="preserve"> </w:t>
+      </w:r>
+      <w:r>
+        <w:rPr>
+          <w:rStyle w:val="VerbatimChar"/>
+        </w:rPr>
+        <w:t xml:space="preserve">claude-sonnet-5</w:t>
+      </w:r>
+      <w:r>
+        <w:t xml:space="preserve"> </w:t>
+      </w:r>
+      <w:r>
+        <w:t xml:space="preserve">$2/$10 mỗi triệu token vào/ra) thay cho Claude Code CLI — hết cảnh chạm giới hạn phiên giữa chừng như ở GĐ6. Tiền Claude API ghi vào sổ chi theo token (</w:t>
+      </w:r>
+      <w:r>
+        <w:rPr>
+          <w:rStyle w:val="VerbatimChar"/>
+        </w:rPr>
+        <w:t xml:space="preserve">data/pricing.json</w:t>
+      </w:r>
+      <w:r>
+        <w:t xml:space="preserve"> </w:t>
+      </w:r>
+      <w:r>
+        <w:t xml:space="preserve">→</w:t>
+      </w:r>
+      <w:r>
+        <w:t xml:space="preserve"> </w:t>
+      </w:r>
+      <w:r>
+        <w:rPr>
+          <w:rStyle w:val="VerbatimChar"/>
+        </w:rPr>
+        <w:t xml:space="preserve">per_million_tokens</w:t>
+      </w:r>
+      <w:r>
+        <w:t xml:space="preserve">), cộng vào trần đợt thử và có</w:t>
+      </w:r>
+      <w:r>
+        <w:t xml:space="preserve"> </w:t>
+      </w:r>
+      <w:r>
+        <w:rPr>
+          <w:b/>
+          <w:bCs/>
+        </w:rPr>
+        <w:t xml:space="preserve">trần riêng Claude API (mặc định $5, ⚙ → 💵 Ngân sách thử)</w:t>
+      </w:r>
+      <w:r>
+        <w:t xml:space="preserve">: hết thì dừng gọi Claude và báo. Sửa 2 lỗi chỉ gặp khi gọi qua API: ảnh &gt; 5 MB (tấm ghép QC đồng bộ) tự thu nhỏ; giới hạn câu trả lời 8.000 → 32.000 token (kế hoạch shot 26 shot của Director bị cắt cụt). Đo prompt thật (đếm token miễn phí): Director ~36k token vào, QC 1 ảnh ~12k, motion cả 26 shot ~84k, QC 1 clip ~14k →</w:t>
+      </w:r>
+      <w:r>
+        <w:t xml:space="preserve"> </w:t>
+      </w:r>
+      <w:r>
+        <w:rPr>
+          <w:b/>
+          <w:bCs/>
+        </w:rPr>
+        <w:t xml:space="preserve">một dự án 26 shot chạy tự động đủ QC ≈ $2,5–3</w:t>
+      </w:r>
+      <w:r>
+        <w:t xml:space="preserve"> </w:t>
+      </w:r>
+      <w:r>
+        <w:t xml:space="preserve">(tắt QC clip ≈ $1,5; kiểu v2 3 cảnh ≈ $0,4–0,5) →</w:t>
+      </w:r>
+      <w:r>
+        <w:t xml:space="preserve"> </w:t>
+      </w:r>
+      <w:r>
+        <w:rPr>
+          <w:b/>
+          <w:bCs/>
+        </w:rPr>
+        <w:t xml:space="preserve">$5 ≈ 2 video chia shot</w:t>
+      </w:r>
+      <w:r>
+        <w:t xml:space="preserve"> </w:t>
+      </w:r>
+      <w:r>
+        <w:t xml:space="preserve">hoặc ~10 video v2 ngắn. QC ảnh + QC clip chiếm ~70% chi phí Claude; về sau có thể giảm bằng prompt caching (chưa làm).</w:t>
       </w:r>
     </w:p>
     <w:bookmarkEnd w:id="37"/>
@@ -8263,6 +8404,40 @@
       <w:r>
         <w:t xml:space="preserve">(2026-09-23)</w:t>
       </w:r>
+      <w:r>
+        <w:t xml:space="preserve"> </w:t>
+      </w:r>
+      <w:r>
+        <w:t xml:space="preserve">-</w:t>
+      </w:r>
+      <w:r>
+        <w:t xml:space="preserve"> </w:t>
+      </w:r>
+      <w:r>
+        <w:rPr>
+          <w:b/>
+          <w:bCs/>
+        </w:rPr>
+        <w:t xml:space="preserve">Claude chạy qua Claude API</w:t>
+      </w:r>
+      <w:r>
+        <w:t xml:space="preserve"> </w:t>
+      </w:r>
+      <w:r>
+        <w:t xml:space="preserve">(khóa riêng của người dùng,</w:t>
+      </w:r>
+      <w:r>
+        <w:t xml:space="preserve"> </w:t>
+      </w:r>
+      <w:r>
+        <w:rPr>
+          <w:rStyle w:val="VerbatimChar"/>
+        </w:rPr>
+        <w:t xml:space="preserve">claude-sonnet-5</w:t>
+      </w:r>
+      <w:r>
+        <w:t xml:space="preserve">) thay cho Claude Code CLI; tiền Claude API tính vào sổ chi + trần riêng (mặc định $5, người dùng cập nhật khi nạp tiền) — xem 3.9 (2026-09-24)</w:t>
+      </w:r>
     </w:p>
     <w:p>
       <w:pPr>
@@ -9824,7 +9999,31 @@
         <w:t xml:space="preserve"> </w:t>
       </w:r>
       <w:r>
-        <w:t xml:space="preserve">- [ ] (V1) API key Anthropic Console cho Director/QC gọi bằng code — xem Mục 5</w:t>
+        <w:t xml:space="preserve">- [x] (V1) API key Anthropic Console cho Director/QC gọi bằng code — đã có 2026-09-24 (biến môi trường</w:t>
+      </w:r>
+      <w:r>
+        <w:t xml:space="preserve"> </w:t>
+      </w:r>
+      <w:r>
+        <w:rPr>
+          <w:rStyle w:val="VerbatimChar"/>
+        </w:rPr>
+        <w:t xml:space="preserve">ANTHROPIC_API_KEY</w:t>
+      </w:r>
+      <w:r>
+        <w:t xml:space="preserve">,</w:t>
+      </w:r>
+      <w:r>
+        <w:t xml:space="preserve"> </w:t>
+      </w:r>
+      <w:r>
+        <w:rPr>
+          <w:rStyle w:val="VerbatimChar"/>
+        </w:rPr>
+        <w:t xml:space="preserve">LLM_PROVIDER=anthropic</w:t>
+      </w:r>
+      <w:r>
+        <w:t xml:space="preserve">) — xem 3.9</w:t>
       </w:r>
       <w:r>
         <w:t xml:space="preserve"> </w:t>

</xml_diff>

<commit_message>
Chốt chỉ 2 look hình: anime và giống y hệt mẫu in-game Free Fire; build_docs.sh chạy được trên Linux
Co-Authored-By: Claude Opus 5.5 <noreply@anthropic.com>
Claude-Session: https://claude.ai/code/session_015F9phHWbpb8ZnoiencmpFS
</commit_message>
<xml_diff>
--- a/PLAN.docx
+++ b/PLAN.docx
@@ -8437,6 +8437,112 @@
       </w:r>
       <w:r>
         <w:t xml:space="preserve">) thay cho Claude Code CLI; tiền Claude API tính vào sổ chi + trần riêng (mặc định $5, người dùng cập nhật khi nạp tiền) — xem 3.9 (2026-09-24)</w:t>
+      </w:r>
+      <w:r>
+        <w:t xml:space="preserve"> </w:t>
+      </w:r>
+      <w:r>
+        <w:t xml:space="preserve">-</w:t>
+      </w:r>
+      <w:r>
+        <w:t xml:space="preserve"> </w:t>
+      </w:r>
+      <w:r>
+        <w:rPr>
+          <w:b/>
+          <w:bCs/>
+        </w:rPr>
+        <w:t xml:space="preserve">Chỉ làm 2 phong cách hình (2026-09-24):</w:t>
+      </w:r>
+      <w:r>
+        <w:t xml:space="preserve"> </w:t>
+      </w:r>
+      <w:r>
+        <w:t xml:space="preserve">(1)</w:t>
+      </w:r>
+      <w:r>
+        <w:t xml:space="preserve"> </w:t>
+      </w:r>
+      <w:r>
+        <w:rPr>
+          <w:b/>
+          <w:bCs/>
+        </w:rPr>
+        <w:t xml:space="preserve">anime</w:t>
+      </w:r>
+      <w:r>
+        <w:t xml:space="preserve"> </w:t>
+      </w:r>
+      <w:r>
+        <w:t xml:space="preserve">và (2)</w:t>
+      </w:r>
+      <w:r>
+        <w:t xml:space="preserve"> </w:t>
+      </w:r>
+      <w:r>
+        <w:rPr>
+          <w:b/>
+          <w:bCs/>
+        </w:rPr>
+        <w:t xml:space="preserve">giống y hệt mẫu in-game Free Fire</w:t>
+      </w:r>
+      <w:r>
+        <w:t xml:space="preserve"> </w:t>
+      </w:r>
+      <w:r>
+        <w:t xml:space="preserve">— đúng như các ảnh tài nguyên nhân vật Free Fire trong kho (render 3D của game: mặt, tóc, trang phục, chất liệu, tỉ lệ y như ảnh gốc). Các look khác (CGI tả thực/kỹ xảo, fan 3D, phim ngắn…) không làm; thư viện phong cách dựng (</w:t>
+      </w:r>
+      <w:r>
+        <w:rPr>
+          <w:rStyle w:val="VerbatimChar"/>
+        </w:rPr>
+        <w:t xml:space="preserve">knowledge/ff_styles/</w:t>
+      </w:r>
+      <w:r>
+        <w:t xml:space="preserve">) vẫn dùng cho nhịp/cỡ cảnh, nhưng</w:t>
+      </w:r>
+      <w:r>
+        <w:t xml:space="preserve"> </w:t>
+      </w:r>
+      <w:r>
+        <w:rPr>
+          <w:b/>
+          <w:bCs/>
+        </w:rPr>
+        <w:t xml:space="preserve">look hình</w:t>
+      </w:r>
+      <w:r>
+        <w:t xml:space="preserve"> </w:t>
+      </w:r>
+      <w:r>
+        <w:t xml:space="preserve">chỉ chọn 1 trong 2. Phong cách</w:t>
+      </w:r>
+      <w:r>
+        <w:t xml:space="preserve"> </w:t>
+      </w:r>
+      <w:r>
+        <w:t xml:space="preserve">“giống mẫu in-game”</w:t>
+      </w:r>
+      <w:r>
+        <w:t xml:space="preserve"> </w:t>
+      </w:r>
+      <w:r>
+        <w:t xml:space="preserve">lấy ảnh tài nguyên làm chuẩn tuyệt đối (Bible, Lock, QC đều so với ảnh) — xem</w:t>
+      </w:r>
+      <w:r>
+        <w:t xml:space="preserve"> </w:t>
+      </w:r>
+      <w:r>
+        <w:rPr>
+          <w:rStyle w:val="VerbatimChar"/>
+        </w:rPr>
+        <w:t xml:space="preserve">docs/PHAN_TICH_VONG_DASHBOARD_2026-09-24.md</w:t>
+      </w:r>
+      <w:r>
+        <w:t xml:space="preserve"> </w:t>
+      </w:r>
+      <w:r>
+        <w:t xml:space="preserve">mục 6</w:t>
       </w:r>
     </w:p>
     <w:p>

</xml_diff>

<commit_message>
W1: cổng duyệt storyboard trước khi chi tiền video (bật mặc định) — cờ lỗi từng shot, ảnh tài nguyên đặt cạnh, nút duyệt; ảnh đổi sau khi duyệt thì cổng bật lại
Co-Authored-By: Claude Opus 5.5 <noreply@anthropic.com>
Claude-Session: https://claude.ai/code/session_015F9phHWbpb8ZnoiencmpFS
</commit_message>
<xml_diff>
--- a/PLAN.docx
+++ b/PLAN.docx
@@ -8543,6 +8543,160 @@
       </w:r>
       <w:r>
         <w:t xml:space="preserve">mục 6</w:t>
+      </w:r>
+      <w:r>
+        <w:t xml:space="preserve"> </w:t>
+      </w:r>
+      <w:r>
+        <w:t xml:space="preserve">-</w:t>
+      </w:r>
+      <w:r>
+        <w:t xml:space="preserve"> </w:t>
+      </w:r>
+      <w:r>
+        <w:rPr>
+          <w:b/>
+          <w:bCs/>
+        </w:rPr>
+        <w:t xml:space="preserve">Vòng chạy Dashboard (2026-09-24, sau phân tích số liệu thật GĐ6 —</w:t>
+      </w:r>
+      <w:r>
+        <w:rPr>
+          <w:b/>
+          <w:bCs/>
+        </w:rPr>
+        <w:t xml:space="preserve"> </w:t>
+      </w:r>
+      <w:r>
+        <w:rPr>
+          <w:rStyle w:val="VerbatimChar"/>
+          <w:b/>
+          <w:bCs/>
+        </w:rPr>
+        <w:t xml:space="preserve">docs/PHAN_TICH_VONG_DASHBOARD_2026-09-24.md</w:t>
+      </w:r>
+      <w:r>
+        <w:rPr>
+          <w:b/>
+          <w:bCs/>
+        </w:rPr>
+        <w:t xml:space="preserve">):</w:t>
+      </w:r>
+      <w:r>
+        <w:t xml:space="preserve"> </w:t>
+      </w:r>
+      <w:r>
+        <w:t xml:space="preserve">(1)</w:t>
+      </w:r>
+      <w:r>
+        <w:t xml:space="preserve"> </w:t>
+      </w:r>
+      <w:r>
+        <w:rPr>
+          <w:b/>
+          <w:bCs/>
+        </w:rPr>
+        <w:t xml:space="preserve">cổng duyệt storyboard bật mặc định</w:t>
+      </w:r>
+      <w:r>
+        <w:t xml:space="preserve"> </w:t>
+      </w:r>
+      <w:r>
+        <w:t xml:space="preserve">trước khi chi tiền video (đã làm:</w:t>
+      </w:r>
+      <w:r>
+        <w:t xml:space="preserve"> </w:t>
+      </w:r>
+      <w:r>
+        <w:rPr>
+          <w:rStyle w:val="VerbatimChar"/>
+        </w:rPr>
+        <w:t xml:space="preserve">core/storyboard_gate.py</w:t>
+      </w:r>
+      <w:r>
+        <w:t xml:space="preserve">, Bước 2</w:t>
+      </w:r>
+      <w:r>
+        <w:t xml:space="preserve"> </w:t>
+      </w:r>
+      <w:r>
+        <w:t xml:space="preserve">“🎞 Storyboard”</w:t>
+      </w:r>
+      <w:r>
+        <w:t xml:space="preserve"> </w:t>
+      </w:r>
+      <w:r>
+        <w:t xml:space="preserve">có cờ ⚑ và nút</w:t>
+      </w:r>
+      <w:r>
+        <w:t xml:space="preserve"> </w:t>
+      </w:r>
+      <w:r>
+        <w:t xml:space="preserve">“Duyệt storyboard — gen video”</w:t>
+      </w:r>
+      <w:r>
+        <w:t xml:space="preserve">; sau này tự nới dần khi QC ảnh đồng ý với người ≥ 90%); (2)</w:t>
+      </w:r>
+      <w:r>
+        <w:t xml:space="preserve"> </w:t>
+      </w:r>
+      <w:r>
+        <w:rPr>
+          <w:b/>
+          <w:bCs/>
+        </w:rPr>
+        <w:t xml:space="preserve">tự gen lại tối đa 2 lần</w:t>
+      </w:r>
+      <w:r>
+        <w:t xml:space="preserve"> </w:t>
+      </w:r>
+      <w:r>
+        <w:t xml:space="preserve">mỗi ảnh/clip, mỗi lần phải đổi đầu vào; (3)</w:t>
+      </w:r>
+      <w:r>
+        <w:t xml:space="preserve"> </w:t>
+      </w:r>
+      <w:r>
+        <w:rPr>
+          <w:b/>
+          <w:bCs/>
+        </w:rPr>
+        <w:t xml:space="preserve">bỏ video mẫu theo dự án</w:t>
+      </w:r>
+      <w:r>
+        <w:t xml:space="preserve">, thay bằng</w:t>
+      </w:r>
+      <w:r>
+        <w:t xml:space="preserve"> </w:t>
+      </w:r>
+      <w:r>
+        <w:rPr>
+          <w:b/>
+          <w:bCs/>
+        </w:rPr>
+        <w:t xml:space="preserve">gói look đã kiểm</w:t>
+      </w:r>
+      <w:r>
+        <w:t xml:space="preserve"> </w:t>
+      </w:r>
+      <w:r>
+        <w:t xml:space="preserve">(look × model, kiểm 1 lần) và</w:t>
+      </w:r>
+      <w:r>
+        <w:t xml:space="preserve"> </w:t>
+      </w:r>
+      <w:r>
+        <w:rPr>
+          <w:b/>
+          <w:bCs/>
+        </w:rPr>
+        <w:t xml:space="preserve">thư viện prompt mẫu tự đúc kết từ shot thành công</w:t>
+      </w:r>
+      <w:r>
+        <w:t xml:space="preserve"> </w:t>
+      </w:r>
+      <w:r>
+        <w:t xml:space="preserve">(W17)</w:t>
       </w:r>
     </w:p>
     <w:p>

</xml_diff>

<commit_message>
Kế hoạch tổng 2026-09-24: rà soát toàn Dashboard, danh mục lỗi đầy đủ, đánh giá từng phân đoạn, lộ trình GĐ-A → GĐ-I
Co-Authored-By: Claude Opus 5.5 <noreply@anthropic.com>
Claude-Session: https://claude.ai/code/session_015F9phHWbpb8ZnoiencmpFS
</commit_message>
<xml_diff>
--- a/PLAN.docx
+++ b/PLAN.docx
@@ -10462,6 +10462,33 @@
       </w:pPr>
       <w:r>
         <w:t xml:space="preserve">7. Lộ trình triển khai: V0 → V1</w:t>
+      </w:r>
+    </w:p>
+    <w:p>
+      <w:pPr>
+        <w:pStyle w:val="BlockText"/>
+      </w:pPr>
+      <w:r>
+        <w:rPr>
+          <w:b/>
+          <w:bCs/>
+        </w:rPr>
+        <w:t xml:space="preserve">Cập nhật 2026-09-24 — Kế hoạch tổng (bản mới nhất, thay thế thứ tự việc cũ):</w:t>
+      </w:r>
+      <w:r>
+        <w:t xml:space="preserve"> </w:t>
+      </w:r>
+      <w:r>
+        <w:rPr>
+          <w:rStyle w:val="VerbatimChar"/>
+        </w:rPr>
+        <w:t xml:space="preserve">docs/KE_HOACH_TONG_2026-09-24.md</w:t>
+      </w:r>
+      <w:r>
+        <w:t xml:space="preserve"> </w:t>
+      </w:r>
+      <w:r>
+        <w:t xml:space="preserve">— tổng kết đã làm, đánh giá từng phân đoạn (P0–P8), danh mục lỗi đầy đủ (~130 mã), cách dùng ClipAI (khung đầu/cuối, tham chiếu), kho tài nguyên &amp; bối cảnh (bỏ ghép ảnh map), bản đồ 3D (Blender 5.0.1), giọng tiếng Việt, tối giản giao diện; lộ trình GĐ-A (khẩn) → GĐ-B → C → D → E0 → E → F → G → H (không tốn credit) → GĐ-I kiểm thật theo bậc (xin phép từng bậc).</w:t>
       </w:r>
     </w:p>
     <w:bookmarkStart w:id="42" w:name="X96af04f5f0dc0fae4ea4bac7edaf06b3f002467"/>

</xml_diff>

<commit_message>
Kế hoạch làm tiếp 2026-09-25: đánh giá tổng thể, 6 hướng Director v2 + giảm tiền video (bộ chuẩn hóa shot, Director hai tầng/chạy lại từng cảnh, sổ luật + ngân sách prompt, bàn đo offline, quay theo vị trí máy, bảng chi phí dự kiến), lộ trình Bậc 1–4 + việc người dùng
- docs/KE_HOACH_2026-09-25.md (mới); PLAN.md mục 7 trỏ tới, build lại PLAN.docx/pdf
- TODO: bàn giao trỏ kế hoạch mới; .claude-memory: mục kế hoạch
Không đổi code (822 test pass ở cd3b379).

Co-Authored-By: Claude Opus 5.5 <noreply@anthropic.com>
</commit_message>
<xml_diff>
--- a/PLAN.docx
+++ b/PLAN.docx
@@ -10462,6 +10462,58 @@
       </w:pPr>
       <w:r>
         <w:t xml:space="preserve">7. Lộ trình triển khai: V0 → V1</w:t>
+      </w:r>
+    </w:p>
+    <w:p>
+      <w:pPr>
+        <w:pStyle w:val="BlockText"/>
+      </w:pPr>
+      <w:r>
+        <w:rPr>
+          <w:b/>
+          <w:bCs/>
+        </w:rPr>
+        <w:t xml:space="preserve">Cập nhật 2026-09-25 — Kế hoạch làm tiếp (bản mới nhất, sắp lại thứ tự việc của kế hoạch tổng):</w:t>
+      </w:r>
+      <w:r>
+        <w:t xml:space="preserve"> </w:t>
+      </w:r>
+      <w:r>
+        <w:rPr>
+          <w:rStyle w:val="VerbatimChar"/>
+        </w:rPr>
+        <w:t xml:space="preserve">docs/KE_HOACH_2026-09-25.md</w:t>
+      </w:r>
+      <w:r>
+        <w:t xml:space="preserve"> </w:t>
+      </w:r>
+      <w:r>
+        <w:t xml:space="preserve">— đánh giá tổng thể (code đủ dày; thiếu một video thật chạy hết vòng mới và một Director rẻ, ổn định); bài học 4 lần chạy Director thật cho kịch bản</w:t>
+      </w:r>
+      <w:r>
+        <w:t xml:space="preserve"> </w:t>
+      </w:r>
+      <w:r>
+        <w:t xml:space="preserve">“ANH CHỌN AI?”</w:t>
+      </w:r>
+      <w:r>
+        <w:t xml:space="preserve"> </w:t>
+      </w:r>
+      <w:r>
+        <w:t xml:space="preserve">(~$1,7); 6 hướng: H1 bộ chuẩn hóa shot (code tự sửa thay vì hỏi lại Claude), H2 Director hai tầng + chạy lại từng cảnh + cache, H3 sổ luật ≤ 15 luật có vòng đời + ngân sách prompt, H4 bàn đo Director offline bằng fixture thật,</w:t>
+      </w:r>
+      <w:r>
+        <w:t xml:space="preserve"> </w:t>
+      </w:r>
+      <w:r>
+        <w:rPr>
+          <w:b/>
+          <w:bCs/>
+        </w:rPr>
+        <w:t xml:space="preserve">H5 quay theo vị trí máy (1 clip cho nhiều shot cùng góc — giây trả tiền ≈ giây phim; #6: ~103 s ≈ $8,2 theo từng shot → ước ~60–65 s ≈ $5)</w:t>
+      </w:r>
+      <w:r>
+        <w:t xml:space="preserve">, H6 bảng chi phí dự kiến trước mỗi bậc. Lộ trình: Bậc 1 Director v2 (không tốn credit) → Bậc 2 đưa dự án #6 tới video hoàn chỉnh (xin phép từng bước) → Bậc 3 phần còn lại GĐ-F/E/G/H/T1/I → Bậc 4 việc người dùng. Chờ người dùng chốt Q1–Q4.</w:t>
       </w:r>
     </w:p>
     <w:p>

</xml_diff>

<commit_message>
Kế hoạch 2026-09-25: H7 tổ làm phim (Đạo diễn + Quay phim + Dựng, mỗi vai một nguồn kiến thức, Đạo diễn duyệt chốt); chốt thứ tự ưu tiên; #6 chạy thử 0–20 s đầu tự chạy trong trần (gen lại ≤ 2/shot, $8 + $2 Claude + 32 ảnh + 25 âm thanh); thứ tự 1.1 → 1.2 → 2A → 1.3 → 1.4 → 1.5 → 2B
Co-Authored-By: Claude Opus 5.5 <noreply@anthropic.com>
</commit_message>
<xml_diff>
--- a/PLAN.docx
+++ b/PLAN.docx
@@ -10513,7 +10513,39 @@
         <w:t xml:space="preserve">H5 quay theo vị trí máy (1 clip cho nhiều shot cùng góc — giây trả tiền ≈ giây phim; #6: ~103 s ≈ $8,2 theo từng shot → ước ~60–65 s ≈ $5)</w:t>
       </w:r>
       <w:r>
-        <w:t xml:space="preserve">, H6 bảng chi phí dự kiến trước mỗi bậc. Lộ trình: Bậc 1 Director v2 (không tốn credit) → Bậc 2 đưa dự án #6 tới video hoàn chỉnh (xin phép từng bước) → Bậc 3 phần còn lại GĐ-F/E/G/H/T1/I → Bậc 4 việc người dùng. Chờ người dùng chốt Q1–Q4.</w:t>
+        <w:t xml:space="preserve">, H6 bảng chi phí dự kiến trước mỗi bậc,</w:t>
+      </w:r>
+      <w:r>
+        <w:t xml:space="preserve"> </w:t>
+      </w:r>
+      <w:r>
+        <w:rPr>
+          <w:b/>
+          <w:bCs/>
+        </w:rPr>
+        <w:t xml:space="preserve">H7 tổ làm phim: Đạo diễn (ý đồ, thoại, quan sát tổng, duyệt chốt) + Quay phim (góc máy, bố cục, coverage, prompt hình) + Dựng/Editor (cắt, vùng an toàn đặt chữ theo nền tảng và từng khung, phụ đề, trộn âm, định dạng) — mỗi vai một nguồn kiến thức riêng</w:t>
+      </w:r>
+      <w:r>
+        <w:t xml:space="preserve"> </w:t>
+      </w:r>
+      <w:r>
+        <w:t xml:space="preserve">(người dùng đề xuất). Thứ tự ưu tiên khi luật xung đột đã chốt, chỉnh dần theo các dự án sau. Lộ trình đã chốt: bàn đo + bộ chuẩn hóa →</w:t>
+      </w:r>
+      <w:r>
+        <w:t xml:space="preserve"> </w:t>
+      </w:r>
+      <w:r>
+        <w:rPr>
+          <w:b/>
+          <w:bCs/>
+        </w:rPr>
+        <w:t xml:space="preserve">chạy thử 0–20 s đầu của #6, tự chạy trong trần</w:t>
+      </w:r>
+      <w:r>
+        <w:t xml:space="preserve"> </w:t>
+      </w:r>
+      <w:r>
+        <w:t xml:space="preserve">($8 tiền có giá + $2 Claude + 32 ảnh + 25 lượt âm thanh, gen lại ≤ 2 lần/shot) → tổ làm phim → Director theo vai → quay theo vị trí máy → phần còn lại của #6 → GĐ-F/E/G/H/T1/I.</w:t>
       </w:r>
     </w:p>
     <w:p>

</xml_diff>

<commit_message>
Kế hoạch 2026-09-25: người dùng chốt Q2 (thử nhỏ quay theo vị trí máy ≤ $1), Q3 (giữ lại 2 câu thoại), Q4 (merge PR #1 về main), Q6 (trần Claude API $1 cho chạy thử 0–20 s, chia ngân sách: QC API chỉ mẫu, motion 1 lượt, QC clip theo cảnh)
Co-Authored-By: Claude Opus 5.5 <noreply@anthropic.com>
</commit_message>
<xml_diff>
--- a/PLAN.docx
+++ b/PLAN.docx
@@ -10545,7 +10545,19 @@
         <w:t xml:space="preserve"> </w:t>
       </w:r>
       <w:r>
-        <w:t xml:space="preserve">($8 tiền có giá + $2 Claude + 32 ảnh + 25 lượt âm thanh, gen lại ≤ 2 lần/shot) → tổ làm phim → Director theo vai → quay theo vị trí máy → phần còn lại của #6 → GĐ-F/E/G/H/T1/I.</w:t>
+        <w:t xml:space="preserve">($8 tiền có giá + $1 Claude API tối ưu + 32 ảnh + 25 lượt âm thanh, gen lại ≤ 2 lần/shot; thử nhỏ quay theo vị trí máy; giữ lại 2 câu thoại cho phần sau; PR #1 đã merge về</w:t>
+      </w:r>
+      <w:r>
+        <w:t xml:space="preserve"> </w:t>
+      </w:r>
+      <w:r>
+        <w:rPr>
+          <w:rStyle w:val="VerbatimChar"/>
+        </w:rPr>
+        <w:t xml:space="preserve">main</w:t>
+      </w:r>
+      <w:r>
+        <w:t xml:space="preserve">) → tổ làm phim → Director theo vai → quay theo vị trí máy → phần còn lại của #6 → GĐ-F/E/G/H/T1/I.</w:t>
       </w:r>
     </w:p>
     <w:p>

</xml_diff>

<commit_message>
Kế hoạch V4 + GĐ0: lưu kế hoạch (docs/KE_HOACH_V4_2026-09-25.md — rà soát trước, gói bối cảnh nền pixel thật + thời tiết, khớp môi toàn video, kỹ năng 3 vai + agent chấm, hồ sơ rút gọn, giới hạn hệ thống); TODO.md thành nơi duy nhất ghi tiến độ (bảng GĐ0–9) + sửa chỗ lệch (865 test, PR #1 đã merge, M12 xong, K1/K2 không còn chờ file, hồ sơ 3 nhân vật đã duyệt); PLAN.md mục 5/7/9; ghi chú "đã thay" ở kế hoạch/bàn giao cũ; requirements thêm pillow/numpy/opencv-python; .gitignore data/_plates3d/; memory
Co-Authored-By: Claude Opus 5.5 <noreply@anthropic.com>
</commit_message>
<xml_diff>
--- a/PLAN.docx
+++ b/PLAN.docx
@@ -9698,6 +9698,343 @@
           <w:b/>
           <w:bCs/>
         </w:rPr>
+        <w:t xml:space="preserve">Đã chốt (2026-09-25 tối, kế hoạch V4 —</w:t>
+      </w:r>
+      <w:r>
+        <w:rPr>
+          <w:b/>
+          <w:bCs/>
+        </w:rPr>
+        <w:t xml:space="preserve"> </w:t>
+      </w:r>
+      <w:r>
+        <w:rPr>
+          <w:rStyle w:val="VerbatimChar"/>
+          <w:b/>
+          <w:bCs/>
+        </w:rPr>
+        <w:t xml:space="preserve">docs/KE_HOACH_V4_2026-09-25.md</w:t>
+      </w:r>
+      <w:r>
+        <w:rPr>
+          <w:b/>
+          <w:bCs/>
+        </w:rPr>
+        <w:t xml:space="preserve">):</w:t>
+      </w:r>
+      <w:r>
+        <w:t xml:space="preserve"> </w:t>
+      </w:r>
+      <w:r>
+        <w:t xml:space="preserve">-</w:t>
+      </w:r>
+      <w:r>
+        <w:t xml:space="preserve"> </w:t>
+      </w:r>
+      <w:r>
+        <w:rPr>
+          <w:b/>
+          <w:bCs/>
+        </w:rPr>
+        <w:t xml:space="preserve">Thứ tự:</w:t>
+      </w:r>
+      <w:r>
+        <w:t xml:space="preserve"> </w:t>
+      </w:r>
+      <w:r>
+        <w:t xml:space="preserve">rà soát + hoàn thiện plan/code/dashboard (mục 5 của V4)</w:t>
+      </w:r>
+      <w:r>
+        <w:t xml:space="preserve"> </w:t>
+      </w:r>
+      <w:r>
+        <w:rPr>
+          <w:b/>
+          <w:bCs/>
+        </w:rPr>
+        <w:t xml:space="preserve">trước</w:t>
+      </w:r>
+      <w:r>
+        <w:t xml:space="preserve">; chỉ chạy trọn video #6 khi mọi tính năng đã build xong — khi đó báo người dùng,</w:t>
+      </w:r>
+      <w:r>
+        <w:t xml:space="preserve"> </w:t>
+      </w:r>
+      <w:r>
+        <w:rPr>
+          <w:b/>
+          <w:bCs/>
+        </w:rPr>
+        <w:t xml:space="preserve">người dùng tự chạy thật trên dashboard</w:t>
+      </w:r>
+      <w:r>
+        <w:t xml:space="preserve">. Trước đó chỉ được kiểm chứng nhỏ trong trần còn lại của #7 (≤ ~$2, ≤ 5 ảnh, báo giá trước mỗi lần).</w:t>
+      </w:r>
+      <w:r>
+        <w:t xml:space="preserve"> </w:t>
+      </w:r>
+      <w:r>
+        <w:t xml:space="preserve">-</w:t>
+      </w:r>
+      <w:r>
+        <w:t xml:space="preserve"> </w:t>
+      </w:r>
+      <w:r>
+        <w:rPr>
+          <w:b/>
+          <w:bCs/>
+        </w:rPr>
+        <w:t xml:space="preserve">Nền bối cảnh = pixel thật, AI chỉ vẽ nhân vật (</w:t>
+      </w:r>
+      <w:r>
+        <w:rPr>
+          <w:b/>
+          <w:bCs/>
+        </w:rPr>
+        <w:t xml:space="preserve">“gói bối cảnh”</w:t>
+      </w:r>
+      <w:r>
+        <w:rPr>
+          <w:b/>
+          <w:bCs/>
+        </w:rPr>
+        <w:t xml:space="preserve">)</w:t>
+      </w:r>
+      <w:r>
+        <w:t xml:space="preserve">: 3 cấp nguồn nền — (1)</w:t>
+      </w:r>
+      <w:r>
+        <w:t xml:space="preserve"> </w:t>
+      </w:r>
+      <w:r>
+        <w:rPr>
+          <w:b/>
+          <w:bCs/>
+        </w:rPr>
+        <w:t xml:space="preserve">mô hình 3D chính thức</w:t>
+      </w:r>
+      <w:r>
+        <w:t xml:space="preserve"> </w:t>
+      </w:r>
+      <w:r>
+        <w:t xml:space="preserve">(người dùng xin team game; bổ sung dần vào</w:t>
+      </w:r>
+      <w:r>
+        <w:t xml:space="preserve"> </w:t>
+      </w:r>
+      <w:r>
+        <w:rPr>
+          <w:rStyle w:val="VerbatimChar"/>
+        </w:rPr>
+        <w:t xml:space="preserve">MODEL3D_DIR</w:t>
+      </w:r>
+      <w:r>
+        <w:t xml:space="preserve">) render bằng Blender theo máy ảo suy từ shot, (2) ảnh chụp trong game ở Kho (giữ cách chia thư mục map/khu vực trên Drive), (3) AI vẽ + ảnh mốc (~70%, báo rõ). Nhân vật ăn khớp nhờ cùng máy/cùng nguồn sáng/bóng + vật che từ 3D/hòa ánh sáng; thời gian + thời tiết (mưa, tuyết, băng, sấm chớp, sương, bão cát) theo kịch bản. Việc làm tay tính theo</w:t>
+      </w:r>
+      <w:r>
+        <w:t xml:space="preserve"> </w:t>
+      </w:r>
+      <w:r>
+        <w:rPr>
+          <w:b/>
+          <w:bCs/>
+        </w:rPr>
+        <w:t xml:space="preserve">vị trí</w:t>
+      </w:r>
+      <w:r>
+        <w:t xml:space="preserve">, không theo shot; nhiều dự án dùng chung hàng đợi + bộ nhớ đệm render.</w:t>
+      </w:r>
+      <w:r>
+        <w:t xml:space="preserve"> </w:t>
+      </w:r>
+      <w:r>
+        <w:t xml:space="preserve">-</w:t>
+      </w:r>
+      <w:r>
+        <w:t xml:space="preserve"> </w:t>
+      </w:r>
+      <w:r>
+        <w:rPr>
+          <w:strike/>
+        </w:rPr>
+        <w:t xml:space="preserve">Lip Sync không ưu tiên</w:t>
+      </w:r>
+      <w:r>
+        <w:t xml:space="preserve"> </w:t>
+      </w:r>
+      <w:r>
+        <w:t xml:space="preserve">→</w:t>
+      </w:r>
+      <w:r>
+        <w:t xml:space="preserve"> </w:t>
+      </w:r>
+      <w:r>
+        <w:rPr>
+          <w:b/>
+          <w:bCs/>
+        </w:rPr>
+        <w:t xml:space="preserve">Khớp môi cho toàn bộ video</w:t>
+      </w:r>
+      <w:r>
+        <w:t xml:space="preserve"> </w:t>
+      </w:r>
+      <w:r>
+        <w:t xml:space="preserve">(mọi shot thấy miệng người nói): nghiên cứu các cách (Seedance</w:t>
+      </w:r>
+      <w:r>
+        <w:t xml:space="preserve"> </w:t>
+      </w:r>
+      <w:r>
+        <w:rPr>
+          <w:rStyle w:val="VerbatimChar"/>
+        </w:rPr>
+        <w:t xml:space="preserve">reference_audio</w:t>
+      </w:r>
+      <w:r>
+        <w:t xml:space="preserve">, dịch vụ/mô hình khớp môi sau khi có clip), rồi làm bước</w:t>
+      </w:r>
+      <w:r>
+        <w:t xml:space="preserve"> </w:t>
+      </w:r>
+      <w:r>
+        <w:t xml:space="preserve">“Khớp môi”</w:t>
+      </w:r>
+      <w:r>
+        <w:t xml:space="preserve"> </w:t>
+      </w:r>
+      <w:r>
+        <w:t xml:space="preserve">riêng; luật</w:t>
+      </w:r>
+      <w:r>
+        <w:t xml:space="preserve"> </w:t>
+      </w:r>
+      <w:r>
+        <w:t xml:space="preserve">“né cận mặt”</w:t>
+      </w:r>
+      <w:r>
+        <w:t xml:space="preserve"> </w:t>
+      </w:r>
+      <w:r>
+        <w:t xml:space="preserve">thành tùy chọn.</w:t>
+      </w:r>
+      <w:r>
+        <w:t xml:space="preserve"> </w:t>
+      </w:r>
+      <w:r>
+        <w:t xml:space="preserve">-</w:t>
+      </w:r>
+      <w:r>
+        <w:t xml:space="preserve"> </w:t>
+      </w:r>
+      <w:r>
+        <w:rPr>
+          <w:b/>
+          <w:bCs/>
+        </w:rPr>
+        <w:t xml:space="preserve">3 vai Đạo diễn / Quay phim / Dựng</w:t>
+      </w:r>
+      <w:r>
+        <w:t xml:space="preserve"> </w:t>
+      </w:r>
+      <w:r>
+        <w:t xml:space="preserve">nâng thành bộ kỹ năng nghề đầy đủ (được nghiên cứu nguồn bên ngoài), một agent độc lập chấm điểm + so với bên ngoài, gửi người dùng bảng tổng kết trước khi bật</w:t>
+      </w:r>
+      <w:r>
+        <w:t xml:space="preserve"> </w:t>
+      </w:r>
+      <w:r>
+        <w:rPr>
+          <w:rStyle w:val="VerbatimChar"/>
+        </w:rPr>
+        <w:t xml:space="preserve">film_crew</w:t>
+      </w:r>
+      <w:r>
+        <w:t xml:space="preserve">.</w:t>
+      </w:r>
+      <w:r>
+        <w:t xml:space="preserve"> </w:t>
+      </w:r>
+      <w:r>
+        <w:t xml:space="preserve">-</w:t>
+      </w:r>
+      <w:r>
+        <w:t xml:space="preserve"> </w:t>
+      </w:r>
+      <w:r>
+        <w:rPr>
+          <w:b/>
+          <w:bCs/>
+        </w:rPr>
+        <w:t xml:space="preserve">Hồ sơ chuẩn KELLY / KENTA / MAXIM: người dùng đã duyệt</w:t>
+      </w:r>
+      <w:r>
+        <w:t xml:space="preserve"> </w:t>
+      </w:r>
+      <w:r>
+        <w:t xml:space="preserve">(sửa sau nếu gặp lỗi khi dựng). Không ghi số tuổi dưới 18 (tả</w:t>
+      </w:r>
+      <w:r>
+        <w:t xml:space="preserve"> </w:t>
+      </w:r>
+      <w:r>
+        <w:t xml:space="preserve">“trẻ tuổi, chưa đến 20”</w:t>
+      </w:r>
+      <w:r>
+        <w:t xml:space="preserve">); hồ sơ được tự rút gọn 3 mức cho prompt.</w:t>
+      </w:r>
+      <w:r>
+        <w:t xml:space="preserve"> </w:t>
+      </w:r>
+      <w:r>
+        <w:t xml:space="preserve">-</w:t>
+      </w:r>
+      <w:r>
+        <w:t xml:space="preserve"> </w:t>
+      </w:r>
+      <w:r>
+        <w:rPr>
+          <w:b/>
+          <w:bCs/>
+        </w:rPr>
+        <w:t xml:space="preserve">Dashboard</w:t>
+      </w:r>
+      <w:r>
+        <w:t xml:space="preserve"> </w:t>
+      </w:r>
+      <w:r>
+        <w:t xml:space="preserve">tiếp tục trên Streamlit, làm gọn (công tắc</w:t>
+      </w:r>
+      <w:r>
+        <w:t xml:space="preserve"> </w:t>
+      </w:r>
+      <w:r>
+        <w:t xml:space="preserve">“Chuyên gia”</w:t>
+      </w:r>
+      <w:r>
+        <w:t xml:space="preserve">, bỏ trùng, màn chính 4 thẻ) + tab ⚙</w:t>
+      </w:r>
+      <w:r>
+        <w:t xml:space="preserve"> </w:t>
+      </w:r>
+      <w:r>
+        <w:t xml:space="preserve">“Giới hạn hệ thống”</w:t>
+      </w:r>
+      <w:r>
+        <w:t xml:space="preserve"> </w:t>
+      </w:r>
+      <w:r>
+        <w:t xml:space="preserve">tính từ số đo thật.</w:t>
+      </w:r>
+    </w:p>
+    <w:p>
+      <w:pPr>
+        <w:pStyle w:val="BodyText"/>
+      </w:pPr>
+      <w:r>
+        <w:rPr>
+          <w:b/>
+          <w:bCs/>
+        </w:rPr>
         <w:t xml:space="preserve">Còn mở (2026-09-23):</w:t>
       </w:r>
     </w:p>
@@ -9891,7 +10228,23 @@
         <w:t xml:space="preserve"> </w:t>
       </w:r>
       <w:r>
-        <w:t xml:space="preserve">| Framework Dashboard | Streamlit (mặc định) hay web frontend riêng nếu cần UI sát mockup Figma |</w:t>
+        <w:t xml:space="preserve">| Framework Dashboard | Streamlit (mặc định) hay web frontend riêng nếu cần UI sát mockup Figma —</w:t>
+      </w:r>
+      <w:r>
+        <w:t xml:space="preserve"> </w:t>
+      </w:r>
+      <w:r>
+        <w:rPr>
+          <w:i/>
+          <w:iCs/>
+        </w:rPr>
+        <w:t xml:space="preserve">thực tế đang dùng Streamlit; kế hoạch V4 (2026-09-25) làm gọn trên Streamlit</w:t>
+      </w:r>
+      <w:r>
+        <w:t xml:space="preserve"> </w:t>
+      </w:r>
+      <w:r>
+        <w:t xml:space="preserve">|</w:t>
       </w:r>
     </w:p>
     <w:p>
@@ -10462,6 +10815,277 @@
       </w:pPr>
       <w:r>
         <w:t xml:space="preserve">7. Lộ trình triển khai: V0 → V1</w:t>
+      </w:r>
+    </w:p>
+    <w:p>
+      <w:pPr>
+        <w:pStyle w:val="BlockText"/>
+      </w:pPr>
+      <w:r>
+        <w:rPr>
+          <w:b/>
+          <w:bCs/>
+        </w:rPr>
+        <w:t xml:space="preserve">Cập nhật 2026-09-25 (tối) — Kế hoạch V4 (bản mới nhất, thay thứ tự việc của các kế hoạch trước):</w:t>
+      </w:r>
+      <w:r>
+        <w:t xml:space="preserve"> </w:t>
+      </w:r>
+      <w:r>
+        <w:rPr>
+          <w:rStyle w:val="VerbatimChar"/>
+        </w:rPr>
+        <w:t xml:space="preserve">docs/KE_HOACH_V4_2026-09-25.md</w:t>
+      </w:r>
+      <w:r>
+        <w:t xml:space="preserve">. Thứ tự:</w:t>
+      </w:r>
+      <w:r>
+        <w:t xml:space="preserve"> </w:t>
+      </w:r>
+      <w:r>
+        <w:rPr>
+          <w:b/>
+          <w:bCs/>
+        </w:rPr>
+        <w:t xml:space="preserve">GĐ0</w:t>
+      </w:r>
+      <w:r>
+        <w:t xml:space="preserve"> </w:t>
+      </w:r>
+      <w:r>
+        <w:t xml:space="preserve">dọn tài liệu →</w:t>
+      </w:r>
+      <w:r>
+        <w:t xml:space="preserve"> </w:t>
+      </w:r>
+      <w:r>
+        <w:rPr>
+          <w:b/>
+          <w:bCs/>
+        </w:rPr>
+        <w:t xml:space="preserve">GĐ1 rà soát + hoàn thiện</w:t>
+      </w:r>
+      <w:r>
+        <w:t xml:space="preserve"> </w:t>
+      </w:r>
+      <w:r>
+        <w:t xml:space="preserve">các việc còn dở (Tầng A Director, Editor đặt chữ tránh mặt, W2/W8/W10/O6/M3/M14/M16/M18/M19, T1 hồ sơ mọi nhân vật, K1/K2 khung cuối, nối</w:t>
+      </w:r>
+      <w:r>
+        <w:t xml:space="preserve"> </w:t>
+      </w:r>
+      <w:r>
+        <w:rPr>
+          <w:rStyle w:val="VerbatimChar"/>
+        </w:rPr>
+        <w:t xml:space="preserve">recover_clips</w:t>
+      </w:r>
+      <w:r>
+        <w:t xml:space="preserve"> </w:t>
+      </w:r>
+      <w:r>
+        <w:t xml:space="preserve">+</w:t>
+      </w:r>
+      <w:r>
+        <w:t xml:space="preserve"> </w:t>
+      </w:r>
+      <w:r>
+        <w:rPr>
+          <w:rStyle w:val="VerbatimChar"/>
+        </w:rPr>
+        <w:t xml:space="preserve">music_timing</w:t>
+      </w:r>
+      <w:r>
+        <w:t xml:space="preserve">) và độ bền/giới hạn (giới hạn riêng từng nhà cung cấp, khóa trần tiền, hàng đợi Blender) →</w:t>
+      </w:r>
+      <w:r>
+        <w:t xml:space="preserve"> </w:t>
+      </w:r>
+      <w:r>
+        <w:rPr>
+          <w:b/>
+          <w:bCs/>
+        </w:rPr>
+        <w:t xml:space="preserve">GĐ2</w:t>
+      </w:r>
+      <w:r>
+        <w:t xml:space="preserve"> </w:t>
+      </w:r>
+      <w:r>
+        <w:t xml:space="preserve">gói bối cảnh (nền 3D/ảnh trong game + ghép + thời tiết + kiểm độ giống nền) →</w:t>
+      </w:r>
+      <w:r>
+        <w:t xml:space="preserve"> </w:t>
+      </w:r>
+      <w:r>
+        <w:rPr>
+          <w:b/>
+          <w:bCs/>
+        </w:rPr>
+        <w:t xml:space="preserve">GĐ3</w:t>
+      </w:r>
+      <w:r>
+        <w:t xml:space="preserve"> </w:t>
+      </w:r>
+      <w:r>
+        <w:t xml:space="preserve">khớp môi toàn video →</w:t>
+      </w:r>
+      <w:r>
+        <w:t xml:space="preserve"> </w:t>
+      </w:r>
+      <w:r>
+        <w:rPr>
+          <w:b/>
+          <w:bCs/>
+        </w:rPr>
+        <w:t xml:space="preserve">GĐ4</w:t>
+      </w:r>
+      <w:r>
+        <w:t xml:space="preserve"> </w:t>
+      </w:r>
+      <w:r>
+        <w:t xml:space="preserve">bộ kỹ năng 3 vai + chấm điểm độc lập, hồ sơ rút gọn →</w:t>
+      </w:r>
+      <w:r>
+        <w:t xml:space="preserve"> </w:t>
+      </w:r>
+      <w:r>
+        <w:rPr>
+          <w:b/>
+          <w:bCs/>
+        </w:rPr>
+        <w:t xml:space="preserve">GĐ5</w:t>
+      </w:r>
+      <w:r>
+        <w:t xml:space="preserve"> </w:t>
+      </w:r>
+      <w:r>
+        <w:t xml:space="preserve">Tầng A →</w:t>
+      </w:r>
+      <w:r>
+        <w:t xml:space="preserve"> </w:t>
+      </w:r>
+      <w:r>
+        <w:rPr>
+          <w:b/>
+          <w:bCs/>
+        </w:rPr>
+        <w:t xml:space="preserve">GĐ6</w:t>
+      </w:r>
+      <w:r>
+        <w:t xml:space="preserve"> </w:t>
+      </w:r>
+      <w:r>
+        <w:t xml:space="preserve">dashboard gọn + tab</w:t>
+      </w:r>
+      <w:r>
+        <w:t xml:space="preserve"> </w:t>
+      </w:r>
+      <w:r>
+        <w:t xml:space="preserve">“Giới hạn hệ thống”</w:t>
+      </w:r>
+      <w:r>
+        <w:t xml:space="preserve"> </w:t>
+      </w:r>
+      <w:r>
+        <w:t xml:space="preserve">→</w:t>
+      </w:r>
+      <w:r>
+        <w:t xml:space="preserve"> </w:t>
+      </w:r>
+      <w:r>
+        <w:rPr>
+          <w:b/>
+          <w:bCs/>
+        </w:rPr>
+        <w:t xml:space="preserve">GĐ7</w:t>
+      </w:r>
+      <w:r>
+        <w:t xml:space="preserve"> </w:t>
+      </w:r>
+      <w:r>
+        <w:t xml:space="preserve">test toàn bộ →</w:t>
+      </w:r>
+      <w:r>
+        <w:t xml:space="preserve"> </w:t>
+      </w:r>
+      <w:r>
+        <w:rPr>
+          <w:b/>
+          <w:bCs/>
+        </w:rPr>
+        <w:t xml:space="preserve">GĐ8</w:t>
+      </w:r>
+      <w:r>
+        <w:t xml:space="preserve"> </w:t>
+      </w:r>
+      <w:r>
+        <w:t xml:space="preserve">kiểm chứng nhỏ trong trần #7 →</w:t>
+      </w:r>
+      <w:r>
+        <w:t xml:space="preserve"> </w:t>
+      </w:r>
+      <w:r>
+        <w:rPr>
+          <w:b/>
+          <w:bCs/>
+        </w:rPr>
+        <w:t xml:space="preserve">GĐ9</w:t>
+      </w:r>
+      <w:r>
+        <w:t xml:space="preserve"> </w:t>
+      </w:r>
+      <w:r>
+        <w:t xml:space="preserve">báo</w:t>
+      </w:r>
+      <w:r>
+        <w:t xml:space="preserve"> </w:t>
+      </w:r>
+      <w:r>
+        <w:t xml:space="preserve">“sẵn sàng”</w:t>
+      </w:r>
+      <w:r>
+        <w:t xml:space="preserve">, người dùng chạy trọn #6 trên dashboard. Lộ trình V0/V1 bên dưới là lịch sử (V0/MCP đã tạm gác từ 2026-09-19).</w:t>
+      </w:r>
+      <w:r>
+        <w:t xml:space="preserve"> </w:t>
+      </w:r>
+      <w:r>
+        <w:rPr>
+          <w:b/>
+          <w:bCs/>
+        </w:rPr>
+        <w:t xml:space="preserve">Tiến độ thật:</w:t>
+      </w:r>
+      <w:r>
+        <w:rPr>
+          <w:b/>
+          <w:bCs/>
+        </w:rPr>
+        <w:t xml:space="preserve"> </w:t>
+      </w:r>
+      <w:r>
+        <w:rPr>
+          <w:rStyle w:val="VerbatimChar"/>
+          <w:b/>
+          <w:bCs/>
+        </w:rPr>
+        <w:t xml:space="preserve">TODO.md</w:t>
+      </w:r>
+      <w:r>
+        <w:rPr>
+          <w:b/>
+          <w:bCs/>
+        </w:rPr>
+        <w:t xml:space="preserve"> </w:t>
+      </w:r>
+      <w:r>
+        <w:rPr>
+          <w:b/>
+          <w:bCs/>
+        </w:rPr>
+        <w:t xml:space="preserve">(nơi duy nhất ghi tiến độ).</w:t>
       </w:r>
     </w:p>
     <w:p>
@@ -11553,6 +12177,97 @@
       </w:pPr>
       <w:r>
         <w:t xml:space="preserve">9. Trạng thái triển khai (cập nhật 2026-09-23, khuya)</w:t>
+      </w:r>
+    </w:p>
+    <w:p>
+      <w:pPr>
+        <w:pStyle w:val="BlockText"/>
+      </w:pPr>
+      <w:r>
+        <w:rPr>
+          <w:b/>
+          <w:bCs/>
+        </w:rPr>
+        <w:t xml:space="preserve">Ghi chú 2026-09-25:</w:t>
+      </w:r>
+      <w:r>
+        <w:t xml:space="preserve"> </w:t>
+      </w:r>
+      <w:r>
+        <w:t xml:space="preserve">mục này là ảnh chụp ngày 2026-09-23 (số test,</w:t>
+      </w:r>
+      <w:r>
+        <w:t xml:space="preserve"> </w:t>
+      </w:r>
+      <w:r>
+        <w:t xml:space="preserve">“stepper 7 tab”</w:t>
+      </w:r>
+      <w:r>
+        <w:t xml:space="preserve">… đã cũ). Trạng thái mới nhất ở</w:t>
+      </w:r>
+      <w:r>
+        <w:t xml:space="preserve"> </w:t>
+      </w:r>
+      <w:r>
+        <w:rPr>
+          <w:rStyle w:val="VerbatimChar"/>
+        </w:rPr>
+        <w:t xml:space="preserve">TODO.md</w:t>
+      </w:r>
+      <w:r>
+        <w:t xml:space="preserve"> </w:t>
+      </w:r>
+      <w:r>
+        <w:t xml:space="preserve">(📌 BÀN GIAO đầu file); hiện có</w:t>
+      </w:r>
+      <w:r>
+        <w:t xml:space="preserve"> </w:t>
+      </w:r>
+      <w:r>
+        <w:rPr>
+          <w:b/>
+          <w:bCs/>
+        </w:rPr>
+        <w:t xml:space="preserve">865 test</w:t>
+      </w:r>
+      <w:r>
+        <w:t xml:space="preserve"> </w:t>
+      </w:r>
+      <w:r>
+        <w:t xml:space="preserve">(80 file</w:t>
+      </w:r>
+      <w:r>
+        <w:t xml:space="preserve"> </w:t>
+      </w:r>
+      <w:r>
+        <w:rPr>
+          <w:rStyle w:val="VerbatimChar"/>
+        </w:rPr>
+        <w:t xml:space="preserve">tests/test_*.py</w:t>
+      </w:r>
+      <w:r>
+        <w:t xml:space="preserve">) (</w:t>
+      </w:r>
+      <w:r>
+        <w:rPr>
+          <w:rStyle w:val="VerbatimChar"/>
+        </w:rPr>
+        <w:t xml:space="preserve">py -m unittest discover -s tests -t .</w:t>
+      </w:r>
+      <w:r>
+        <w:t xml:space="preserve">). Kế hoạch mới nhất:</w:t>
+      </w:r>
+      <w:r>
+        <w:t xml:space="preserve"> </w:t>
+      </w:r>
+      <w:r>
+        <w:rPr>
+          <w:rStyle w:val="VerbatimChar"/>
+        </w:rPr>
+        <w:t xml:space="preserve">docs/KE_HOACH_V4_2026-09-25.md</w:t>
+      </w:r>
+      <w:r>
+        <w:t xml:space="preserve">.</w:t>
       </w:r>
     </w:p>
     <w:p>

</xml_diff>

<commit_message>
Sổ sách 30/09: KH8 thêm đợt S10 (kỹ năng + tham chiếu, 12 việc) + sửa trạng thái S0.11–S0.13/S4.6/S5.1/S5.5/K.1–K.2; PLAN.md §5 chốt 30/09; TODO 📌 mới; TON_DONG/README cập nhật; build PLAN.docx/pdf
Co-Authored-By: Claude Opus 5.5 <noreply@anthropic.com>
</commit_message>
<xml_diff>
--- a/PLAN.docx
+++ b/PLAN.docx
@@ -9045,271 +9045,438 @@
       </w:r>
       <w:r>
         <w:rPr>
-          <w:b/>
-          <w:bCs/>
-        </w:rPr>
-        <w:t xml:space="preserve">Không dùng Kho chủ thể Seedance (upload nhân vật riêng lên Subject Library của Clip AI).</w:t>
-      </w:r>
-      <w:r>
-        <w:t xml:space="preserve"> </w:t>
-      </w:r>
-      <w:r>
-        <w:t xml:space="preserve">Chưa thấy hiệu quả rõ rệt so với công sức. Ưu tiên: ảnh tham chiếu lấy thẳng từ</w:t>
-      </w:r>
-      <w:r>
-        <w:t xml:space="preserve"> </w:t>
-      </w:r>
-      <w:r>
-        <w:rPr>
-          <w:b/>
-          <w:bCs/>
-        </w:rPr>
-        <w:t xml:space="preserve">tài nguyên đã gắn cho cảnh trong Kho tài nguyên dự án</w:t>
-      </w:r>
-      <w:r>
-        <w:t xml:space="preserve"> </w:t>
-      </w:r>
-      <w:r>
-        <w:t xml:space="preserve">(</w:t>
-      </w:r>
-      <w:r>
-        <w:rPr>
-          <w:rStyle w:val="VerbatimChar"/>
-        </w:rPr>
-        <w:t xml:space="preserve">assets.scene_references</w:t>
-      </w:r>
-      <w:r>
-        <w:t xml:space="preserve">) — cơ chế này đã dùng cho Deepix (Bước 2) và từ 2026-09-22 cũng dùng cho Clip AI Seedance (Bước 4), không cần bước upload/chờ</w:t>
-      </w:r>
-      <w:r>
-        <w:t xml:space="preserve"> </w:t>
-      </w:r>
-      <w:r>
-        <w:rPr>
-          <w:rStyle w:val="VerbatimChar"/>
-        </w:rPr>
-        <w:t xml:space="preserve">active</w:t>
-      </w:r>
-      <w:r>
-        <w:t xml:space="preserve"> </w:t>
-      </w:r>
-      <w:r>
-        <w:t xml:space="preserve">riêng của Kho chủ thể. Panel</w:t>
-      </w:r>
-      <w:r>
-        <w:t xml:space="preserve"> </w:t>
-      </w:r>
-      <w:r>
-        <w:t xml:space="preserve">“🧩 Kho chủ thể”</w:t>
-      </w:r>
-      <w:r>
-        <w:t xml:space="preserve"> </w:t>
-      </w:r>
-      <w:r>
-        <w:t xml:space="preserve">ở Bước 1 và tuỳ chọn</w:t>
-      </w:r>
-      <w:r>
-        <w:t xml:space="preserve"> </w:t>
-      </w:r>
-      <w:r>
-        <w:t xml:space="preserve">“🧩 Gắn ảnh chủ thể”</w:t>
-      </w:r>
-      <w:r>
-        <w:t xml:space="preserve"> </w:t>
-      </w:r>
-      <w:r>
-        <w:t xml:space="preserve">ở Bước 4 vẫn giữ trong code (không xoá) nhưng không còn là hướng ưu tiên.</w:t>
-      </w:r>
-      <w:r>
-        <w:t xml:space="preserve"> </w:t>
-      </w:r>
-      <w:r>
-        <w:t xml:space="preserve">-</w:t>
-      </w:r>
-      <w:r>
-        <w:t xml:space="preserve"> </w:t>
-      </w:r>
-      <w:r>
-        <w:rPr>
-          <w:b/>
-          <w:bCs/>
-        </w:rPr>
-        <w:t xml:space="preserve">Video tham chiếu chuyển động (</w:t>
-      </w:r>
-      <w:r>
-        <w:rPr>
-          <w:rStyle w:val="VerbatimChar"/>
-          <w:b/>
-          <w:bCs/>
-        </w:rPr>
-        <w:t xml:space="preserve">reference_video</w:t>
-      </w:r>
-      <w:r>
-        <w:rPr>
-          <w:b/>
-          <w:bCs/>
-        </w:rPr>
-        <w:t xml:space="preserve">) — chưa ưu tiên thử nghiệm.</w:t>
-      </w:r>
-      <w:r>
-        <w:t xml:space="preserve"> </w:t>
-      </w:r>
-      <w:r>
-        <w:t xml:space="preserve">Ưu tiên hoàn thiện dictionary</w:t>
-      </w:r>
-      <w:r>
-        <w:t xml:space="preserve"> </w:t>
-      </w:r>
-      <w:r>
-        <w:t xml:space="preserve">“kỹ năng nhân vật → hình ảnh”</w:t>
-      </w:r>
-      <w:r>
-        <w:t xml:space="preserve"> </w:t>
-      </w:r>
-      <w:r>
-        <w:t xml:space="preserve">(</w:t>
-      </w:r>
-      <w:r>
-        <w:rPr>
-          <w:rStyle w:val="VerbatimChar"/>
-        </w:rPr>
-        <w:t xml:space="preserve">knowledge/ff_character_skills_visual.md</w:t>
-      </w:r>
-      <w:r>
-        <w:t xml:space="preserve">) làm nguồn chính mô tả chuyển động skill bằng chữ trong prompt, thay vì cần video mẫu thật. Code đã hỗ trợ gửi ĐỒNG THỜI ảnh tham chiếu nhân vật + video tham chiếu chuyển động trong cùng một lần gen (</w:t>
-      </w:r>
-      <w:r>
-        <w:rPr>
-          <w:rStyle w:val="VerbatimChar"/>
-        </w:rPr>
-        <w:t xml:space="preserve">core/adapters/clipai.py::submit()</w:t>
-      </w:r>
-      <w:r>
-        <w:t xml:space="preserve"> </w:t>
-      </w:r>
-      <w:r>
-        <w:t xml:space="preserve">nhận cả</w:t>
-      </w:r>
-      <w:r>
-        <w:t xml:space="preserve"> </w:t>
-      </w:r>
-      <w:r>
-        <w:rPr>
-          <w:rStyle w:val="VerbatimChar"/>
-        </w:rPr>
-        <w:t xml:space="preserve">image_references</w:t>
-      </w:r>
-      <w:r>
-        <w:t xml:space="preserve"> </w:t>
-      </w:r>
-      <w:r>
-        <w:t xml:space="preserve">và</w:t>
-      </w:r>
-      <w:r>
-        <w:t xml:space="preserve"> </w:t>
-      </w:r>
-      <w:r>
-        <w:rPr>
-          <w:rStyle w:val="VerbatimChar"/>
-        </w:rPr>
-        <w:t xml:space="preserve">reference_video</w:t>
-      </w:r>
-      <w:r>
-        <w:t xml:space="preserve">, không loại trừ nhau trừ khi bật audio sinh trên Kling) — khi nào thật sự cần độ chính xác chuyển động cao hơn chữ mô tả thì kết hợp cả hai, không phải chọn một trong hai.</w:t>
-      </w:r>
-      <w:r>
-        <w:t xml:space="preserve"> </w:t>
-      </w:r>
-      <w:r>
-        <w:t xml:space="preserve">-</w:t>
-      </w:r>
-      <w:r>
-        <w:t xml:space="preserve"> </w:t>
-      </w:r>
-      <w:r>
-        <w:rPr>
-          <w:b/>
-          <w:bCs/>
-          <w:strike/>
-        </w:rPr>
-        <w:t xml:space="preserve">Đồng bộ môi (Lip Sync) trên ClipAI — không ưu tiên vì còn Beta</w:t>
-      </w:r>
-      <w:r>
-        <w:t xml:space="preserve"> </w:t>
-      </w:r>
-      <w:r>
-        <w:rPr>
           <w:i/>
           <w:iCs/>
         </w:rPr>
-        <w:t xml:space="preserve">(</w:t>
-      </w:r>
-      <w:r>
-        <w:rPr>
-          <w:b/>
-          <w:bCs/>
+        <w:t xml:space="preserve">(Cập nhật 2026-09-30: xem</w:t>
+      </w:r>
+      <w:r>
+        <w:rPr>
           <w:i/>
           <w:iCs/>
         </w:rPr>
-        <w:t xml:space="preserve">đã thay</w:t>
+        <w:t xml:space="preserve"> </w:t>
       </w:r>
       <w:r>
         <w:rPr>
           <w:i/>
           <w:iCs/>
         </w:rPr>
-        <w:t xml:space="preserve"> </w:t>
+        <w:t xml:space="preserve">“Đã chốt 2026-09-30”</w:t>
       </w:r>
       <w:r>
         <w:rPr>
           <w:i/>
           <w:iCs/>
         </w:rPr>
-        <w:t xml:space="preserve">2026-09-25 bởi kế hoạch V4: khớp môi cho toàn bộ video — Seedance</w:t>
+        <w:t xml:space="preserve"> </w:t>
       </w:r>
       <w:r>
         <w:rPr>
           <w:i/>
           <w:iCs/>
         </w:rPr>
-        <w:t xml:space="preserve"> </w:t>
-      </w:r>
-      <w:r>
-        <w:rPr>
-          <w:rStyle w:val="VerbatimChar"/>
+        <w:t xml:space="preserve">bên dưới — Seedance 2.5 qua được bộ lọc người thật với ảnh nhân vật in-game không đánh dấu (thử T1); Kho chủ thể chỉ dùng khi bị chặn.)</w:t>
+      </w:r>
+      <w:r>
+        <w:t xml:space="preserve"> </w:t>
+      </w:r>
+      <w:r>
+        <w:t xml:space="preserve">-</w:t>
+      </w:r>
+      <w:r>
+        <w:t xml:space="preserve"> </w:t>
+      </w:r>
+      <w:r>
+        <w:rPr>
+          <w:b/>
+          <w:bCs/>
+        </w:rPr>
+        <w:t xml:space="preserve">Không dùng Kho chủ thể Seedance (upload nhân vật riêng lên Subject Library của Clip AI).</w:t>
+      </w:r>
+      <w:r>
+        <w:t xml:space="preserve"> </w:t>
+      </w:r>
+      <w:r>
+        <w:t xml:space="preserve">Chưa thấy hiệu quả rõ rệt so với công sức. Ưu tiên: ảnh tham chiếu lấy thẳng từ</w:t>
+      </w:r>
+      <w:r>
+        <w:t xml:space="preserve"> </w:t>
+      </w:r>
+      <w:r>
+        <w:rPr>
+          <w:b/>
+          <w:bCs/>
+        </w:rPr>
+        <w:t xml:space="preserve">tài nguyên đã gắn cho cảnh trong Kho tài nguyên dự án</w:t>
+      </w:r>
+      <w:r>
+        <w:t xml:space="preserve"> </w:t>
+      </w:r>
+      <w:r>
+        <w:t xml:space="preserve">(</w:t>
+      </w:r>
+      <w:r>
+        <w:rPr>
+          <w:rStyle w:val="VerbatimChar"/>
+        </w:rPr>
+        <w:t xml:space="preserve">assets.scene_references</w:t>
+      </w:r>
+      <w:r>
+        <w:t xml:space="preserve">) — cơ chế này đã dùng cho Deepix (Bước 2) và từ 2026-09-22 cũng dùng cho Clip AI Seedance (Bước 4), không cần bước upload/chờ</w:t>
+      </w:r>
+      <w:r>
+        <w:t xml:space="preserve"> </w:t>
+      </w:r>
+      <w:r>
+        <w:rPr>
+          <w:rStyle w:val="VerbatimChar"/>
+        </w:rPr>
+        <w:t xml:space="preserve">active</w:t>
+      </w:r>
+      <w:r>
+        <w:t xml:space="preserve"> </w:t>
+      </w:r>
+      <w:r>
+        <w:t xml:space="preserve">riêng của Kho chủ thể. Panel</w:t>
+      </w:r>
+      <w:r>
+        <w:t xml:space="preserve"> </w:t>
+      </w:r>
+      <w:r>
+        <w:t xml:space="preserve">“🧩 Kho chủ thể”</w:t>
+      </w:r>
+      <w:r>
+        <w:t xml:space="preserve"> </w:t>
+      </w:r>
+      <w:r>
+        <w:t xml:space="preserve">ở Bước 1 và tuỳ chọn</w:t>
+      </w:r>
+      <w:r>
+        <w:t xml:space="preserve"> </w:t>
+      </w:r>
+      <w:r>
+        <w:t xml:space="preserve">“🧩 Gắn ảnh chủ thể”</w:t>
+      </w:r>
+      <w:r>
+        <w:t xml:space="preserve"> </w:t>
+      </w:r>
+      <w:r>
+        <w:t xml:space="preserve">ở Bước 4 vẫn giữ trong code (không xoá) nhưng không còn là hướng ưu tiên.</w:t>
+      </w:r>
+      <w:r>
+        <w:t xml:space="preserve"> </w:t>
+      </w:r>
+      <w:r>
+        <w:t xml:space="preserve">-</w:t>
+      </w:r>
+      <w:r>
+        <w:t xml:space="preserve"> </w:t>
+      </w:r>
+      <w:r>
+        <w:rPr>
+          <w:b/>
+          <w:bCs/>
+          <w:strike/>
+        </w:rPr>
+        <w:t xml:space="preserve">Video tham chiếu chuyển động (</w:t>
+      </w:r>
+      <w:r>
+        <w:rPr>
+          <w:rStyle w:val="VerbatimChar"/>
+          <w:b/>
+          <w:bCs/>
+          <w:strike/>
+        </w:rPr>
+        <w:t xml:space="preserve">reference_video</w:t>
+      </w:r>
+      <w:r>
+        <w:rPr>
+          <w:b/>
+          <w:bCs/>
+          <w:strike/>
+        </w:rPr>
+        <w:t xml:space="preserve">) — chưa ưu tiên thử nghiệm.</w:t>
+      </w:r>
+      <w:r>
+        <w:t xml:space="preserve"> </w:t>
+      </w:r>
+      <w:r>
+        <w:rPr>
           <w:i/>
           <w:iCs/>
         </w:rPr>
-        <w:t xml:space="preserve">reference_audio</w:t>
-      </w:r>
-      <w:r>
-        <w:rPr>
+        <w:t xml:space="preserve">(</w:t>
+      </w:r>
+      <w:r>
+        <w:rPr>
+          <w:b/>
+          <w:bCs/>
           <w:i/>
           <w:iCs/>
         </w:rPr>
-        <w:t xml:space="preserve"> </w:t>
+        <w:t xml:space="preserve">đã thay</w:t>
       </w:r>
       <w:r>
         <w:rPr>
           <w:i/>
           <w:iCs/>
         </w:rPr>
-        <w:t xml:space="preserve">+ sync.so sau khi có clip, cờ</w:t>
+        <w:t xml:space="preserve"> </w:t>
       </w:r>
       <w:r>
         <w:rPr>
           <w:i/>
           <w:iCs/>
         </w:rPr>
-        <w:t xml:space="preserve"> </w:t>
-      </w:r>
-      <w:r>
-        <w:rPr>
-          <w:rStyle w:val="VerbatimChar"/>
+        <w:t xml:space="preserve">2026-09-30: video kỹ năng thật làm tham chiếu là</w:t>
+      </w:r>
+      <w:r>
+        <w:rPr>
           <w:i/>
           <w:iCs/>
         </w:rPr>
+        <w:t xml:space="preserve"> </w:t>
+      </w:r>
+      <w:r>
+        <w:rPr>
+          <w:b/>
+          <w:bCs/>
+          <w:i/>
+          <w:iCs/>
+        </w:rPr>
+        <w:t xml:space="preserve">cách chuẩn</w:t>
+      </w:r>
+      <w:r>
+        <w:rPr>
+          <w:i/>
+          <w:iCs/>
+        </w:rPr>
+        <w:t xml:space="preserve"> </w:t>
+      </w:r>
+      <w:r>
+        <w:rPr>
+          <w:i/>
+          <w:iCs/>
+        </w:rPr>
+        <w:t xml:space="preserve">cho shot kỹ năng — xem</w:t>
+      </w:r>
+      <w:r>
+        <w:rPr>
+          <w:i/>
+          <w:iCs/>
+        </w:rPr>
+        <w:t xml:space="preserve"> </w:t>
+      </w:r>
+      <w:r>
+        <w:rPr>
+          <w:i/>
+          <w:iCs/>
+        </w:rPr>
+        <w:t xml:space="preserve">“Đã chốt 2026-09-30”</w:t>
+      </w:r>
+      <w:r>
+        <w:rPr>
+          <w:i/>
+          <w:iCs/>
+        </w:rPr>
+        <w:t xml:space="preserve">. Đoạn cũ giữ làm lịch sử:)</w:t>
+      </w:r>
+      <w:r>
+        <w:t xml:space="preserve"> </w:t>
+      </w:r>
+      <w:r>
+        <w:t xml:space="preserve">Ưu tiên hoàn thiện dictionary</w:t>
+      </w:r>
+      <w:r>
+        <w:t xml:space="preserve"> </w:t>
+      </w:r>
+      <w:r>
+        <w:t xml:space="preserve">“kỹ năng nhân vật → hình ảnh”</w:t>
+      </w:r>
+      <w:r>
+        <w:t xml:space="preserve"> </w:t>
+      </w:r>
+      <w:r>
+        <w:t xml:space="preserve">(</w:t>
+      </w:r>
+      <w:r>
+        <w:rPr>
+          <w:rStyle w:val="VerbatimChar"/>
+        </w:rPr>
+        <w:t xml:space="preserve">knowledge/ff_character_skills_visual.md</w:t>
+      </w:r>
+      <w:r>
+        <w:t xml:space="preserve">) làm nguồn chính mô tả chuyển động skill bằng chữ trong prompt, thay vì cần video mẫu thật. Code đã hỗ trợ gửi ĐỒNG THỜI ảnh tham chiếu nhân vật + video tham chiếu chuyển động trong cùng một lần gen (</w:t>
+      </w:r>
+      <w:r>
+        <w:rPr>
+          <w:rStyle w:val="VerbatimChar"/>
+        </w:rPr>
+        <w:t xml:space="preserve">core/adapters/clipai.py::submit()</w:t>
+      </w:r>
+      <w:r>
+        <w:t xml:space="preserve"> </w:t>
+      </w:r>
+      <w:r>
+        <w:t xml:space="preserve">nhận cả</w:t>
+      </w:r>
+      <w:r>
+        <w:t xml:space="preserve"> </w:t>
+      </w:r>
+      <w:r>
+        <w:rPr>
+          <w:rStyle w:val="VerbatimChar"/>
+        </w:rPr>
+        <w:t xml:space="preserve">image_references</w:t>
+      </w:r>
+      <w:r>
+        <w:t xml:space="preserve"> </w:t>
+      </w:r>
+      <w:r>
+        <w:t xml:space="preserve">và</w:t>
+      </w:r>
+      <w:r>
+        <w:t xml:space="preserve"> </w:t>
+      </w:r>
+      <w:r>
+        <w:rPr>
+          <w:rStyle w:val="VerbatimChar"/>
+        </w:rPr>
+        <w:t xml:space="preserve">reference_video</w:t>
+      </w:r>
+      <w:r>
+        <w:t xml:space="preserve">, không loại trừ nhau trừ khi bật audio sinh trên Kling) — khi nào thật sự cần độ chính xác chuyển động cao hơn chữ mô tả thì kết hợp cả hai, không phải chọn một trong hai.</w:t>
+      </w:r>
+      <w:r>
+        <w:t xml:space="preserve"> </w:t>
+      </w:r>
+      <w:r>
+        <w:t xml:space="preserve">-</w:t>
+      </w:r>
+      <w:r>
+        <w:t xml:space="preserve"> </w:t>
+      </w:r>
+      <w:r>
+        <w:rPr>
+          <w:b/>
+          <w:bCs/>
+          <w:strike/>
+        </w:rPr>
+        <w:t xml:space="preserve">Đồng bộ môi (Lip Sync) trên ClipAI — không ưu tiên vì còn Beta</w:t>
+      </w:r>
+      <w:r>
+        <w:t xml:space="preserve"> </w:t>
+      </w:r>
+      <w:r>
+        <w:rPr>
+          <w:i/>
+          <w:iCs/>
+        </w:rPr>
+        <w:t xml:space="preserve">(</w:t>
+      </w:r>
+      <w:r>
+        <w:rPr>
+          <w:b/>
+          <w:bCs/>
+          <w:i/>
+          <w:iCs/>
+        </w:rPr>
+        <w:t xml:space="preserve">đã thay</w:t>
+      </w:r>
+      <w:r>
+        <w:rPr>
+          <w:i/>
+          <w:iCs/>
+        </w:rPr>
+        <w:t xml:space="preserve"> </w:t>
+      </w:r>
+      <w:r>
+        <w:rPr>
+          <w:i/>
+          <w:iCs/>
+        </w:rPr>
+        <w:t xml:space="preserve">2026-09-25 bởi kế hoạch V4: khớp môi cho toàn bộ video — Seedance</w:t>
+      </w:r>
+      <w:r>
+        <w:rPr>
+          <w:i/>
+          <w:iCs/>
+        </w:rPr>
+        <w:t xml:space="preserve"> </w:t>
+      </w:r>
+      <w:r>
+        <w:rPr>
+          <w:rStyle w:val="VerbatimChar"/>
+          <w:i/>
+          <w:iCs/>
+        </w:rPr>
+        <w:t xml:space="preserve">reference_audio</w:t>
+      </w:r>
+      <w:r>
+        <w:rPr>
+          <w:i/>
+          <w:iCs/>
+        </w:rPr>
+        <w:t xml:space="preserve"> </w:t>
+      </w:r>
+      <w:r>
+        <w:rPr>
+          <w:i/>
+          <w:iCs/>
+        </w:rPr>
+        <w:t xml:space="preserve">+ sync.so sau khi có clip, cờ</w:t>
+      </w:r>
+      <w:r>
+        <w:rPr>
+          <w:i/>
+          <w:iCs/>
+        </w:rPr>
+        <w:t xml:space="preserve"> </w:t>
+      </w:r>
+      <w:r>
+        <w:rPr>
+          <w:rStyle w:val="VerbatimChar"/>
+          <w:i/>
+          <w:iCs/>
+        </w:rPr>
         <w:t xml:space="preserve">lip_sync</w:t>
+      </w:r>
+      <w:r>
+        <w:rPr>
+          <w:i/>
+          <w:iCs/>
+        </w:rPr>
+        <w:t xml:space="preserve"> </w:t>
+      </w:r>
+      <w:r>
+        <w:rPr>
+          <w:i/>
+          <w:iCs/>
+        </w:rPr>
+        <w:t xml:space="preserve">—</w:t>
+      </w:r>
+      <w:r>
+        <w:rPr>
+          <w:i/>
+          <w:iCs/>
+        </w:rPr>
+        <w:t xml:space="preserve"> </w:t>
+      </w:r>
+      <w:r>
+        <w:t xml:space="preserve">2026-09-29: người dùng chọn cách (c) một clip cả đoạn thoại, cờ</w:t>
+      </w:r>
+      <w:r>
+        <w:t xml:space="preserve"> </w:t>
+      </w:r>
+      <w:r>
+        <w:rPr>
+          <w:rStyle w:val="VerbatimChar"/>
+        </w:rPr>
+        <w:t xml:space="preserve">dialogue_take</w:t>
+      </w:r>
+      <w:r>
+        <w:t xml:space="preserve">; sync.so bỏ</w:t>
       </w:r>
       <w:r>
         <w:rPr>
@@ -10255,6 +10422,294 @@
       </w:r>
       <w:r>
         <w:t xml:space="preserve">tính từ số đo thật.</w:t>
+      </w:r>
+    </w:p>
+    <w:p>
+      <w:pPr>
+        <w:pStyle w:val="BodyText"/>
+      </w:pPr>
+      <w:r>
+        <w:rPr>
+          <w:b/>
+          <w:bCs/>
+        </w:rPr>
+        <w:t xml:space="preserve">Đã chốt (2026-09-30 — kỹ năng nhân vật &amp; tài sản tham chiếu;</w:t>
+      </w:r>
+      <w:r>
+        <w:rPr>
+          <w:b/>
+          <w:bCs/>
+        </w:rPr>
+        <w:t xml:space="preserve"> </w:t>
+      </w:r>
+      <w:r>
+        <w:rPr>
+          <w:rStyle w:val="VerbatimChar"/>
+          <w:b/>
+          <w:bCs/>
+        </w:rPr>
+        <w:t xml:space="preserve">docs/NGHIEN_CUU_PROMPT_THAM_CHIEU_2026-09-30.md</w:t>
+      </w:r>
+      <w:r>
+        <w:rPr>
+          <w:b/>
+          <w:bCs/>
+        </w:rPr>
+        <w:t xml:space="preserve">):</w:t>
+      </w:r>
+      <w:r>
+        <w:t xml:space="preserve"> </w:t>
+      </w:r>
+      <w:r>
+        <w:t xml:space="preserve">-</w:t>
+      </w:r>
+      <w:r>
+        <w:t xml:space="preserve"> </w:t>
+      </w:r>
+      <w:r>
+        <w:rPr>
+          <w:b/>
+          <w:bCs/>
+        </w:rPr>
+        <w:t xml:space="preserve">Hồ sơ kỹ năng</w:t>
+      </w:r>
+      <w:r>
+        <w:t xml:space="preserve"> </w:t>
+      </w:r>
+      <w:r>
+        <w:t xml:space="preserve">cho mỗi nhân vật có kỹ năng chủ động:</w:t>
+      </w:r>
+      <w:r>
+        <w:t xml:space="preserve"> </w:t>
+      </w:r>
+      <w:r>
+        <w:rPr>
+          <w:rStyle w:val="VerbatimChar"/>
+        </w:rPr>
+        <w:t xml:space="preserve">data/skills/&lt;TÊN&gt;/</w:t>
+      </w:r>
+      <w:r>
+        <w:t xml:space="preserve"> </w:t>
+      </w:r>
+      <w:r>
+        <w:t xml:space="preserve">(khung trích 30 khung/giây từ video chính thức, storyboard,</w:t>
+      </w:r>
+      <w:r>
+        <w:t xml:space="preserve"> </w:t>
+      </w:r>
+      <w:r>
+        <w:rPr>
+          <w:rStyle w:val="VerbatimChar"/>
+        </w:rPr>
+        <w:t xml:space="preserve">skill.json</w:t>
+      </w:r>
+      <w:r>
+        <w:t xml:space="preserve">,</w:t>
+      </w:r>
+      <w:r>
+        <w:t xml:space="preserve"> </w:t>
+      </w:r>
+      <w:r>
+        <w:rPr>
+          <w:rStyle w:val="VerbatimChar"/>
+        </w:rPr>
+        <w:t xml:space="preserve">video_ref</w:t>
+      </w:r>
+      <w:r>
+        <w:t xml:space="preserve">), cờ</w:t>
+      </w:r>
+      <w:r>
+        <w:t xml:space="preserve"> </w:t>
+      </w:r>
+      <w:r>
+        <w:rPr>
+          <w:rStyle w:val="VerbatimChar"/>
+        </w:rPr>
+        <w:t xml:space="preserve">skill_dossier</w:t>
+      </w:r>
+      <w:r>
+        <w:t xml:space="preserve">. Kenta xong; Orion kế tiếp (người dùng cung cấp video + bảng thiết kế).</w:t>
+      </w:r>
+      <w:r>
+        <w:t xml:space="preserve"> </w:t>
+      </w:r>
+      <w:r>
+        <w:t xml:space="preserve">-</w:t>
+      </w:r>
+      <w:r>
+        <w:t xml:space="preserve"> </w:t>
+      </w:r>
+      <w:r>
+        <w:rPr>
+          <w:b/>
+          <w:bCs/>
+        </w:rPr>
+        <w:t xml:space="preserve">Shot kỹ năng = Seedance 2.5 + khung đầu + ảnh nhân vật + video kỹ năng thật (chỉ lấy hiệu ứng)</w:t>
+      </w:r>
+      <w:r>
+        <w:t xml:space="preserve"> </w:t>
+      </w:r>
+      <w:r>
+        <w:t xml:space="preserve">— thử T1 cho hiệu ứng gần game nhất; prompt</w:t>
+      </w:r>
+      <w:r>
+        <w:t xml:space="preserve"> </w:t>
+      </w:r>
+      <w:r>
+        <w:t xml:space="preserve">theo mẫu chính thức (mỗi tài sản một vai, ghi rõ không lấy gì, không tả lại chi tiết khi đã có video). Kling chỉ để chép động tác / máy quay,</w:t>
+      </w:r>
+      <w:r>
+        <w:t xml:space="preserve"> </w:t>
+      </w:r>
+      <w:r>
+        <w:t xml:space="preserve">prompt gọi tên</w:t>
+      </w:r>
+      <w:r>
+        <w:t xml:space="preserve"> </w:t>
+      </w:r>
+      <w:r>
+        <w:rPr>
+          <w:rStyle w:val="VerbatimChar"/>
+        </w:rPr>
+        <w:t xml:space="preserve">&lt;&lt;&lt;image_N&gt;&gt;&gt;</w:t>
+      </w:r>
+      <w:r>
+        <w:t xml:space="preserve"> </w:t>
+      </w:r>
+      <w:r>
+        <w:t xml:space="preserve">/</w:t>
+      </w:r>
+      <w:r>
+        <w:t xml:space="preserve"> </w:t>
+      </w:r>
+      <w:r>
+        <w:rPr>
+          <w:rStyle w:val="VerbatimChar"/>
+        </w:rPr>
+        <w:t xml:space="preserve">&lt;&lt;&lt;video_1&gt;&gt;&gt;</w:t>
+      </w:r>
+      <w:r>
+        <w:t xml:space="preserve">.</w:t>
+      </w:r>
+      <w:r>
+        <w:t xml:space="preserve"> </w:t>
+      </w:r>
+      <w:r>
+        <w:t xml:space="preserve">-</w:t>
+      </w:r>
+      <w:r>
+        <w:t xml:space="preserve"> </w:t>
+      </w:r>
+      <w:r>
+        <w:rPr>
+          <w:b/>
+          <w:bCs/>
+        </w:rPr>
+        <w:t xml:space="preserve">Nhiều nhân vật:</w:t>
+      </w:r>
+      <w:r>
+        <w:t xml:space="preserve"> </w:t>
+      </w:r>
+      <w:r>
+        <w:t xml:space="preserve">mỗi người một dòng ánh xạ; ≥ 3 người → khung đầu vẽ đủ người hoặc white-model thô xếp chỗ đứng; 2 người có kỹ năng → chia</w:t>
+      </w:r>
+      <w:r>
+        <w:t xml:space="preserve"> </w:t>
+      </w:r>
+      <w:r>
+        <w:t xml:space="preserve">nhịp A tung → B đáp → kết quả, chỉ vẽ va chạm đã thấy trong video chính thức (trường</w:t>
+      </w:r>
+      <w:r>
+        <w:t xml:space="preserve"> </w:t>
+      </w:r>
+      <w:r>
+        <w:rPr>
+          <w:rStyle w:val="VerbatimChar"/>
+        </w:rPr>
+        <w:t xml:space="preserve">interactions</w:t>
+      </w:r>
+      <w:r>
+        <w:t xml:space="preserve">). Luật cho Director:</w:t>
+      </w:r>
+      <w:r>
+        <w:t xml:space="preserve"> </w:t>
+      </w:r>
+      <w:r>
+        <w:rPr>
+          <w:rStyle w:val="VerbatimChar"/>
+        </w:rPr>
+        <w:t xml:space="preserve">knowledge/reference_assets_prompting.md</w:t>
+      </w:r>
+      <w:r>
+        <w:t xml:space="preserve">.</w:t>
+      </w:r>
+      <w:r>
+        <w:t xml:space="preserve"> </w:t>
+      </w:r>
+      <w:r>
+        <w:t xml:space="preserve">-</w:t>
+      </w:r>
+      <w:r>
+        <w:t xml:space="preserve"> </w:t>
+      </w:r>
+      <w:r>
+        <w:rPr>
+          <w:b/>
+          <w:bCs/>
+        </w:rPr>
+        <w:t xml:space="preserve">Trần tiền mới (người dùng):</w:t>
+      </w:r>
+      <w:r>
+        <w:t xml:space="preserve"> </w:t>
+      </w:r>
+      <w:r>
+        <w:t xml:space="preserve">15 USD cho các bài thử (hỏi từng bài) + 25 USD cho lượt chạy trọn K.2; kịch bản K có Kenta + Orion cùng dùng kỹ năng.</w:t>
+      </w:r>
+      <w:r>
+        <w:t xml:space="preserve"> </w:t>
+      </w:r>
+      <w:r>
+        <w:t xml:space="preserve">-</w:t>
+      </w:r>
+      <w:r>
+        <w:t xml:space="preserve"> </w:t>
+      </w:r>
+      <w:r>
+        <w:rPr>
+          <w:b/>
+          <w:bCs/>
+        </w:rPr>
+        <w:t xml:space="preserve">Bàn đạo diễn ClipAI:</w:t>
+      </w:r>
+      <w:r>
+        <w:t xml:space="preserve"> </w:t>
+      </w:r>
+      <w:r>
+        <w:t xml:space="preserve">vẫn chỉ có trên web; phần</w:t>
+      </w:r>
+      <w:r>
+        <w:t xml:space="preserve"> </w:t>
+      </w:r>
+      <w:r>
+        <w:t xml:space="preserve">“video white-model làm</w:t>
+      </w:r>
+      <w:r>
+        <w:t xml:space="preserve"> </w:t>
+      </w:r>
+      <w:r>
+        <w:rPr>
+          <w:rStyle w:val="VerbatimChar"/>
+        </w:rPr>
+        <w:t xml:space="preserve">reference_video</w:t>
+      </w:r>
+      <w:r>
+        <w:t xml:space="preserve">”</w:t>
+      </w:r>
+      <w:r>
+        <w:t xml:space="preserve"> </w:t>
+      </w:r>
+      <w:r>
+        <w:t xml:space="preserve">nay làm bằng Blender của dự án (đợt S10.6).</w:t>
       </w:r>
     </w:p>
     <w:p>
@@ -10451,6 +10906,46 @@
             <w:pPr>
               <w:pStyle w:val="Compact"/>
             </w:pPr>
+            <w:r>
+              <w:rPr>
+                <w:i/>
+                <w:iCs/>
+              </w:rPr>
+              <w:t xml:space="preserve">2026-09-29: đã có</w:t>
+            </w:r>
+            <w:r>
+              <w:rPr>
+                <w:i/>
+                <w:iCs/>
+              </w:rPr>
+              <w:t xml:space="preserve"> </w:t>
+            </w:r>
+            <w:r>
+              <w:rPr>
+                <w:b/>
+                <w:bCs/>
+                <w:i/>
+                <w:iCs/>
+              </w:rPr>
+              <w:t xml:space="preserve">file 3D chính thức</w:t>
+            </w:r>
+            <w:r>
+              <w:rPr>
+                <w:i/>
+                <w:iCs/>
+              </w:rPr>
+              <w:t xml:space="preserve"> </w:t>
+            </w:r>
+            <w:r>
+              <w:rPr>
+                <w:i/>
+                <w:iCs/>
+              </w:rPr>
+              <w:t xml:space="preserve">ClockTower + Cổng Trời (Đảo Quân Sự) — thay bản FFXN; các nơi khác + model nhân vật vẫn mở.</w:t>
+            </w:r>
+            <w:r>
+              <w:t xml:space="preserve"> </w:t>
+            </w:r>
             <w:r>
               <w:t xml:space="preserve">Vẫn mở:</w:t>
             </w:r>
@@ -11658,7 +12153,55 @@
           <w:b/>
           <w:bCs/>
         </w:rPr>
-        <w:t xml:space="preserve">Trạng thái 2026-09-26 (đọc trước):</w:t>
+        <w:t xml:space="preserve">Trạng thái 2026-09-30 (đọc trước):</w:t>
+      </w:r>
+      <w:r>
+        <w:t xml:space="preserve"> </w:t>
+      </w:r>
+      <w:r>
+        <w:t xml:space="preserve">tiến độ duy nhất ở</w:t>
+      </w:r>
+      <w:r>
+        <w:t xml:space="preserve"> </w:t>
+      </w:r>
+      <w:r>
+        <w:rPr>
+          <w:rStyle w:val="VerbatimChar"/>
+        </w:rPr>
+        <w:t xml:space="preserve">docs/KE_HOACH_SUA_SAU_DU_AN_8.md</w:t>
+      </w:r>
+      <w:r>
+        <w:t xml:space="preserve"> </w:t>
+      </w:r>
+      <w:r>
+        <w:t xml:space="preserve">(đợt S0–S10, K, S8); 📌 đầu</w:t>
+      </w:r>
+      <w:r>
+        <w:t xml:space="preserve"> </w:t>
+      </w:r>
+      <w:r>
+        <w:rPr>
+          <w:rStyle w:val="VerbatimChar"/>
+        </w:rPr>
+        <w:t xml:space="preserve">TODO.md</w:t>
+      </w:r>
+      <w:r>
+        <w:t xml:space="preserve"> </w:t>
+      </w:r>
+      <w:r>
+        <w:t xml:space="preserve">tóm tắt kế hoạch làm nốt. Đoạn dưới là trạng thái 2026-09-26 (lịch sử).</w:t>
+      </w:r>
+    </w:p>
+    <w:p>
+      <w:pPr>
+        <w:pStyle w:val="BlockText"/>
+      </w:pPr>
+      <w:r>
+        <w:rPr>
+          <w:b/>
+          <w:bCs/>
+        </w:rPr>
+        <w:t xml:space="preserve">Trạng thái 2026-09-26:</w:t>
       </w:r>
       <w:r>
         <w:t xml:space="preserve"> </w:t>
@@ -13315,17 +13858,17 @@
         <w:t xml:space="preserve"> </w:t>
       </w:r>
       <w:r>
-        <w:t xml:space="preserve">(số 2026-09-25) —</w:t>
-      </w:r>
-      <w:r>
-        <w:t xml:space="preserve"> </w:t>
-      </w:r>
-      <w:r>
-        <w:rPr>
-          <w:b/>
-          <w:bCs/>
-        </w:rPr>
-        <w:t xml:space="preserve">2026-09-26: 1056 test (1054 qua, 2 bỏ qua)</w:t>
+        <w:t xml:space="preserve">(số 2026-09-25) — 2026-09-26: 1056 test;</w:t>
+      </w:r>
+      <w:r>
+        <w:t xml:space="preserve"> </w:t>
+      </w:r>
+      <w:r>
+        <w:rPr>
+          <w:b/>
+          <w:bCs/>
+        </w:rPr>
+        <w:t xml:space="preserve">2026-09-30: 1456 test (1454 qua, 2 bỏ qua)</w:t>
       </w:r>
       <w:r>
         <w:t xml:space="preserve">, chạy</w:t>

</xml_diff>

<commit_message>
Kế hoạch S11 Director mở rộng: ý tưởng thô → kịch bản, cover video ref (kịch bản + nhảy), học trending TikTok/FB qua Apify (chi phí, điều khoản, quyền nhạc, nguồn dẫn); PLAN 3.10 + câu hỏi mở, build lại PLAN.docx/pdf, TODO
Co-Authored-By: Claude Opus 5.5 <noreply@anthropic.com>
Claude-Session: https://claude.ai/code/session_0199VQqnF6CAfLBQHaMV8TDF
</commit_message>
<xml_diff>
--- a/PLAN.docx
+++ b/PLAN.docx
@@ -2,7 +2,7 @@
 <file path=word/document.xml><?xml version="1.0" encoding="utf-8"?>
 <w:document xmlns:w="http://schemas.openxmlformats.org/wordprocessingml/2006/main" xmlns:m="http://schemas.openxmlformats.org/officeDocument/2006/math" xmlns:r="http://schemas.openxmlformats.org/officeDocument/2006/relationships" xmlns:o="urn:schemas-microsoft-com:office:office" xmlns:v="urn:schemas-microsoft-com:vml" xmlns:w10="urn:schemas-microsoft-com:office:word" xmlns:a="http://schemas.openxmlformats.org/drawingml/2006/main" xmlns:pic="http://schemas.openxmlformats.org/drawingml/2006/picture" xmlns:wp="http://schemas.openxmlformats.org/drawingml/2006/wordprocessingDrawing">
   <w:body>
-    <w:bookmarkStart w:id="48" w:name="X9c8c830ec4a0bd58ad601261317abf6bbfd8ccb"/>
+    <w:bookmarkStart w:id="49" w:name="X9c8c830ec4a0bd58ad601261317abf6bbfd8ccb"/>
     <w:p>
       <w:pPr>
         <w:pStyle w:val="Heading1"/>
@@ -1293,7 +1293,7 @@
     </w:p>
     <w:bookmarkEnd w:id="13"/>
     <w:bookmarkEnd w:id="14"/>
-    <w:bookmarkStart w:id="38" w:name="Xcd7cd861a7bec2f7c480708ab31acaf54a69d9b"/>
+    <w:bookmarkStart w:id="39" w:name="Xcd7cd861a7bec2f7c480708ab31acaf54a69d9b"/>
     <w:p>
       <w:pPr>
         <w:pStyle w:val="Heading2"/>
@@ -8011,8 +8011,607 @@
       </w:r>
     </w:p>
     <w:bookmarkEnd w:id="37"/>
+    <w:bookmarkStart w:id="38" w:name="X0270a926fd572ab02e9e15ce2e4e6f686cb133d"/>
+    <w:p>
+      <w:pPr>
+        <w:pStyle w:val="Heading3"/>
+      </w:pPr>
+      <w:r>
+        <w:t xml:space="preserve">3.10 Director mở rộng — ý tưởng → kịch bản, cover video ref, học trending (kế hoạch 2026-10-01, chưa code)</w:t>
+      </w:r>
+    </w:p>
+    <w:p>
+      <w:pPr>
+        <w:pStyle w:val="FirstParagraph"/>
+      </w:pPr>
+      <w:r>
+        <w:t xml:space="preserve">Chi tiết + bằng chứng + nguồn:</w:t>
+      </w:r>
+      <w:r>
+        <w:t xml:space="preserve"> </w:t>
+      </w:r>
+      <w:r>
+        <w:rPr>
+          <w:rStyle w:val="VerbatimChar"/>
+        </w:rPr>
+        <w:t xml:space="preserve">docs/KE_HOACH_TINH_NANG_DIRECTOR_2026-10-01.md</w:t>
+      </w:r>
+      <w:r>
+        <w:t xml:space="preserve">; việc ở đợt</w:t>
+      </w:r>
+      <w:r>
+        <w:t xml:space="preserve"> </w:t>
+      </w:r>
+      <w:r>
+        <w:rPr>
+          <w:b/>
+          <w:bCs/>
+        </w:rPr>
+        <w:t xml:space="preserve">S11</w:t>
+      </w:r>
+      <w:r>
+        <w:t xml:space="preserve"> </w:t>
+      </w:r>
+      <w:r>
+        <w:t xml:space="preserve">của</w:t>
+      </w:r>
+      <w:r>
+        <w:t xml:space="preserve"> </w:t>
+      </w:r>
+      <w:r>
+        <w:rPr>
+          <w:rStyle w:val="VerbatimChar"/>
+        </w:rPr>
+        <w:t xml:space="preserve">docs/KE_HOACH_SUA_SAU_DU_AN_8.md</w:t>
+      </w:r>
+      <w:r>
+        <w:t xml:space="preserve">.</w:t>
+      </w:r>
+    </w:p>
+    <w:tbl>
+      <w:tblPr>
+        <w:tblStyle w:val="Table"/>
+        <w:tblW w:type="pct" w:w="5000"/>
+        <w:tblLayout w:type="fixed"/>
+        <w:tblLook w:firstRow="1" w:lastRow="0" w:firstColumn="0" w:lastColumn="0" w:noHBand="0" w:noVBand="0" w:val="0020"/>
+      </w:tblPr>
+      <w:tblGrid>
+        <w:gridCol w:w="1980"/>
+        <w:gridCol w:w="1980"/>
+        <w:gridCol w:w="1980"/>
+        <w:gridCol w:w="1980"/>
+      </w:tblGrid>
+      <w:tr>
+        <w:trPr>
+          <w:tblHeader w:val="on"/>
+        </w:trPr>
+        <w:tc>
+          <w:tcPr/>
+          <w:p>
+            <w:pPr>
+              <w:pStyle w:val="Compact"/>
+            </w:pPr>
+            <w:r>
+              <w:t xml:space="preserve">Tính năng</w:t>
+            </w:r>
+          </w:p>
+        </w:tc>
+        <w:tc>
+          <w:tcPr/>
+          <w:p>
+            <w:pPr>
+              <w:pStyle w:val="Compact"/>
+            </w:pPr>
+            <w:r>
+              <w:t xml:space="preserve">Cách làm</w:t>
+            </w:r>
+          </w:p>
+        </w:tc>
+        <w:tc>
+          <w:tcPr/>
+          <w:p>
+            <w:pPr>
+              <w:pStyle w:val="Compact"/>
+            </w:pPr>
+            <w:r>
+              <w:t xml:space="preserve">Tiền chạy</w:t>
+            </w:r>
+          </w:p>
+        </w:tc>
+        <w:tc>
+          <w:tcPr/>
+          <w:p>
+            <w:pPr>
+              <w:pStyle w:val="Compact"/>
+            </w:pPr>
+            <w:r>
+              <w:t xml:space="preserve">Rủi ro chính</w:t>
+            </w:r>
+          </w:p>
+        </w:tc>
+      </w:tr>
+      <w:tr>
+        <w:tc>
+          <w:tcPr/>
+          <w:p>
+            <w:pPr>
+              <w:pStyle w:val="Compact"/>
+            </w:pPr>
+            <w:r>
+              <w:t xml:space="preserve">💡</w:t>
+            </w:r>
+            <w:r>
+              <w:t xml:space="preserve"> </w:t>
+            </w:r>
+            <w:r>
+              <w:rPr>
+                <w:b/>
+                <w:bCs/>
+              </w:rPr>
+              <w:t xml:space="preserve">Ý tưởng thô → kịch bản</w:t>
+            </w:r>
+            <w:r>
+              <w:t xml:space="preserve"> </w:t>
+            </w:r>
+            <w:r>
+              <w:t xml:space="preserve">(tab mới ở Bước 1)</w:t>
+            </w:r>
+          </w:p>
+        </w:tc>
+        <w:tc>
+          <w:tcPr/>
+          <w:p>
+            <w:pPr>
+              <w:pStyle w:val="Compact"/>
+            </w:pPr>
+            <w:r>
+              <w:t xml:space="preserve">Director (vai mới</w:t>
+            </w:r>
+            <w:r>
+              <w:t xml:space="preserve"> </w:t>
+            </w:r>
+            <w:r>
+              <w:rPr>
+                <w:b/>
+                <w:bCs/>
+              </w:rPr>
+              <w:t xml:space="preserve">Biên kịch</w:t>
+            </w:r>
+            <w:r>
+              <w:t xml:space="preserve">) hỏi ≤ 5 câu có mặc định → 3 hướng hook → dàn ý theo giây (thoại 2,86 âm tiết/s đo thật) → kịch bản đúng khuôn</w:t>
+            </w:r>
+            <w:r>
+              <w:t xml:space="preserve"> </w:t>
+            </w:r>
+            <w:r>
+              <w:rPr>
+                <w:rStyle w:val="VerbatimChar"/>
+              </w:rPr>
+              <w:t xml:space="preserve">script_reader</w:t>
+            </w:r>
+            <w:r>
+              <w:t xml:space="preserve">; màn 2 cột tô phần Director thêm</w:t>
+            </w:r>
+          </w:p>
+        </w:tc>
+        <w:tc>
+          <w:tcPr/>
+          <w:p>
+            <w:pPr>
+              <w:pStyle w:val="Compact"/>
+            </w:pPr>
+            <w:r>
+              <w:t xml:space="preserve">≈ 0,1 USD Claude / kịch bản</w:t>
+            </w:r>
+          </w:p>
+        </w:tc>
+        <w:tc>
+          <w:tcPr/>
+          <w:p>
+            <w:pPr>
+              <w:pStyle w:val="Compact"/>
+            </w:pPr>
+            <w:r>
+              <w:t xml:space="preserve">bịa quá tay → tô màu + người duyệt</w:t>
+            </w:r>
+          </w:p>
+        </w:tc>
+      </w:tr>
+      <w:tr>
+        <w:tc>
+          <w:tcPr/>
+          <w:p>
+            <w:pPr>
+              <w:pStyle w:val="Compact"/>
+            </w:pPr>
+            <w:r>
+              <w:t xml:space="preserve">📈</w:t>
+            </w:r>
+            <w:r>
+              <w:t xml:space="preserve"> </w:t>
+            </w:r>
+            <w:r>
+              <w:rPr>
+                <w:b/>
+                <w:bCs/>
+              </w:rPr>
+              <w:t xml:space="preserve">Học trending</w:t>
+            </w:r>
+            <w:r>
+              <w:t xml:space="preserve"> </w:t>
+            </w:r>
+            <w:r>
+              <w:t xml:space="preserve">(TikTok chính, FB phụ)</w:t>
+            </w:r>
+          </w:p>
+        </w:tc>
+        <w:tc>
+          <w:tcPr/>
+          <w:p>
+            <w:pPr>
+              <w:pStyle w:val="Compact"/>
+            </w:pPr>
+            <w:r>
+              <w:t xml:space="preserve">Lịch 1–3 ngày: TikTok Creative Center VN (qua Apify), video theo hashtag (Apify</w:t>
+            </w:r>
+            <w:r>
+              <w:t xml:space="preserve"> </w:t>
+            </w:r>
+            <w:r>
+              <w:rPr>
+                <w:rStyle w:val="VerbatimChar"/>
+              </w:rPr>
+              <w:t xml:space="preserve">tiktok-scraper</w:t>
+            </w:r>
+            <w:r>
+              <w:t xml:space="preserve">), 5–10 trang FB, Claude web search (nghĩa, nguồn gốc, phản ứng báo chí), nhập tay → lọc bằng code → Claude chắt thành</w:t>
+            </w:r>
+            <w:r>
+              <w:t xml:space="preserve"> </w:t>
+            </w:r>
+            <w:r>
+              <w:rPr>
+                <w:b/>
+                <w:bCs/>
+              </w:rPr>
+              <w:t xml:space="preserve">thẻ trend</w:t>
+            </w:r>
+            <w:r>
+              <w:t xml:space="preserve"> </w:t>
+            </w:r>
+            <w:r>
+              <w:t xml:space="preserve">(nghĩa, ví dụ, độ hợp FF, cờ rủi ro, quyền nhạc, vòng đời, hạn) →</w:t>
+            </w:r>
+            <w:r>
+              <w:t xml:space="preserve"> </w:t>
+            </w:r>
+            <w:r>
+              <w:rPr>
+                <w:b/>
+                <w:bCs/>
+              </w:rPr>
+              <w:t xml:space="preserve">người duyệt</w:t>
+            </w:r>
+            <w:r>
+              <w:t xml:space="preserve"> </w:t>
+            </w:r>
+            <w:r>
+              <w:t xml:space="preserve">→ Director đọc ≤ 8 thẻ đã duyệt, còn hạn (không fine-tune) + luật dùng (≤ 2 trend / 60 s, đặt ở hook / câu chốt, hợp tính cách) + trường</w:t>
+            </w:r>
+            <w:r>
+              <w:t xml:space="preserve"> </w:t>
+            </w:r>
+            <w:r>
+              <w:rPr>
+                <w:rStyle w:val="VerbatimChar"/>
+              </w:rPr>
+              <w:t xml:space="preserve">trend_refs</w:t>
+            </w:r>
+          </w:p>
+        </w:tc>
+        <w:tc>
+          <w:tcPr/>
+          <w:p>
+            <w:pPr>
+              <w:pStyle w:val="Compact"/>
+            </w:pPr>
+            <w:r>
+              <w:t xml:space="preserve">Apify ≈ 3,6 USD/tháng (vừa gói Free 5 USD, quét video mỗi 3 ngày) + Claude ≈ 1,4 USD/tháng</w:t>
+            </w:r>
+          </w:p>
+        </w:tc>
+        <w:tc>
+          <w:tcPr/>
+          <w:p>
+            <w:pPr>
+              <w:pStyle w:val="Compact"/>
+            </w:pPr>
+            <w:r>
+              <w:rPr>
+                <w:b/>
+                <w:bCs/>
+              </w:rPr>
+              <w:t xml:space="preserve">nhạc trend không được dùng thương mại</w:t>
+            </w:r>
+            <w:r>
+              <w:t xml:space="preserve"> </w:t>
+            </w:r>
+            <w:r>
+              <w:t xml:space="preserve">trên tài khoản doanh nghiệp (chỉ Commercial Music Library); trend có thể bị dư luận chê (ví dụ</w:t>
+            </w:r>
+            <w:r>
+              <w:t xml:space="preserve"> </w:t>
+            </w:r>
+            <w:r>
+              <w:t xml:space="preserve">“ăm chã húi”</w:t>
+            </w:r>
+            <w:r>
+              <w:t xml:space="preserve"> </w:t>
+            </w:r>
+            <w:r>
+              <w:t xml:space="preserve">bị báo gọi</w:t>
+            </w:r>
+            <w:r>
+              <w:t xml:space="preserve"> </w:t>
+            </w:r>
+            <w:r>
+              <w:t xml:space="preserve">“thảm họa nhạc Việt”</w:t>
+            </w:r>
+            <w:r>
+              <w:t xml:space="preserve"> </w:t>
+            </w:r>
+            <w:r>
+              <w:t xml:space="preserve">20/09)</w:t>
+            </w:r>
+          </w:p>
+        </w:tc>
+      </w:tr>
+      <w:tr>
+        <w:tc>
+          <w:tcPr/>
+          <w:p>
+            <w:pPr>
+              <w:pStyle w:val="Compact"/>
+            </w:pPr>
+            <w:r>
+              <w:t xml:space="preserve">🎬</w:t>
+            </w:r>
+            <w:r>
+              <w:t xml:space="preserve"> </w:t>
+            </w:r>
+            <w:r>
+              <w:rPr>
+                <w:b/>
+                <w:bCs/>
+              </w:rPr>
+              <w:t xml:space="preserve">Cover kịch bản từ video ref</w:t>
+            </w:r>
+          </w:p>
+        </w:tc>
+        <w:tc>
+          <w:tcPr/>
+          <w:p>
+            <w:pPr>
+              <w:pStyle w:val="Compact"/>
+            </w:pPr>
+            <w:r>
+              <w:t xml:space="preserve">cắt shot + tờ khung (</w:t>
+            </w:r>
+            <w:r>
+              <w:rPr>
+                <w:rStyle w:val="VerbatimChar"/>
+              </w:rPr>
+              <w:t xml:space="preserve">reference_analysis</w:t>
+            </w:r>
+            <w:r>
+              <w:t xml:space="preserve"> </w:t>
+            </w:r>
+            <w:r>
+              <w:t xml:space="preserve">có sẵn) + nghe thoại offline (faster-whisper) → Claude bóc cấu trúc (hook, điểm xoay, cú chốt, nhịp từng shot) → ghép vai / nơi / đạo cụ FF (người duyệt) → viết lại lời, giữ cấu trúc +</w:t>
+            </w:r>
+            <w:r>
+              <w:t xml:space="preserve"> </w:t>
+            </w:r>
+            <w:r>
+              <w:rPr>
+                <w:rStyle w:val="VerbatimChar"/>
+              </w:rPr>
+              <w:t xml:space="preserve">ref_shots</w:t>
+            </w:r>
+            <w:r>
+              <w:t xml:space="preserve"> </w:t>
+            </w:r>
+            <w:r>
+              <w:t xml:space="preserve">cho Quay phim bám</w:t>
+            </w:r>
+          </w:p>
+        </w:tc>
+        <w:tc>
+          <w:tcPr/>
+          <w:p>
+            <w:pPr>
+              <w:pStyle w:val="Compact"/>
+            </w:pPr>
+            <w:r>
+              <w:t xml:space="preserve">≈ 0,1–0,2 USD Claude / video ref</w:t>
+            </w:r>
+          </w:p>
+        </w:tc>
+        <w:tc>
+          <w:tcPr/>
+          <w:p>
+            <w:pPr>
+              <w:pStyle w:val="Compact"/>
+            </w:pPr>
+            <w:r>
+              <w:t xml:space="preserve">chép lời người khác → cờ trùng &gt; 70 %</w:t>
+            </w:r>
+          </w:p>
+        </w:tc>
+      </w:tr>
+      <w:tr>
+        <w:tc>
+          <w:tcPr/>
+          <w:p>
+            <w:pPr>
+              <w:pStyle w:val="Compact"/>
+            </w:pPr>
+            <w:r>
+              <w:t xml:space="preserve">💃</w:t>
+            </w:r>
+            <w:r>
+              <w:t xml:space="preserve"> </w:t>
+            </w:r>
+            <w:r>
+              <w:rPr>
+                <w:b/>
+                <w:bCs/>
+              </w:rPr>
+              <w:t xml:space="preserve">Cover nhảy</w:t>
+            </w:r>
+          </w:p>
+        </w:tc>
+        <w:tc>
+          <w:tcPr/>
+          <w:p>
+            <w:pPr>
+              <w:pStyle w:val="Compact"/>
+            </w:pPr>
+            <w:r>
+              <w:t xml:space="preserve">kiểm video ref (1 người, toàn thân, fps, cạnh) → đo BPM, cắt đoạn tại phách → khung đầu nhân vật FF đúng tư thế → chép động tác: Kling</w:t>
+            </w:r>
+            <w:r>
+              <w:t xml:space="preserve"> </w:t>
+            </w:r>
+            <w:r>
+              <w:rPr>
+                <w:rStyle w:val="VerbatimChar"/>
+              </w:rPr>
+              <w:t xml:space="preserve">feature</w:t>
+            </w:r>
+            <w:r>
+              <w:t xml:space="preserve"> </w:t>
+            </w:r>
+            <w:r>
+              <w:t xml:space="preserve">/ Seedance 2.5</w:t>
+            </w:r>
+            <w:r>
+              <w:t xml:space="preserve"> </w:t>
+            </w:r>
+            <w:r>
+              <w:rPr>
+                <w:rStyle w:val="VerbatimChar"/>
+              </w:rPr>
+              <w:t xml:space="preserve">reference_video</w:t>
+            </w:r>
+            <w:r>
+              <w:t xml:space="preserve"> </w:t>
+            </w:r>
+            <w:r>
+              <w:t xml:space="preserve">(đều có API) hoặc Kling Motion Control (chỉ web ClipAI) → nối đoạn bằng khung cuối thật → QC lệch nhịp + mặt; nhạc cùng BPM thay nhạc gốc</w:t>
+            </w:r>
+          </w:p>
+        </w:tc>
+        <w:tc>
+          <w:tcPr/>
+          <w:p>
+            <w:pPr>
+              <w:pStyle w:val="Compact"/>
+            </w:pPr>
+            <w:r>
+              <w:t xml:space="preserve">A/B 5 s ≈ 2,5 USD; bài 30 s ≈ 3,6 (Kling) – 11 USD (Seedance 2.5)</w:t>
+            </w:r>
+          </w:p>
+        </w:tc>
+        <w:tc>
+          <w:tcPr/>
+          <w:p>
+            <w:pPr>
+              <w:pStyle w:val="Compact"/>
+            </w:pPr>
+            <w:r>
+              <w:t xml:space="preserve">người thật trong video ref có thể bị bộ lọc chặn; tay chân biến dạng</w:t>
+            </w:r>
+          </w:p>
+        </w:tc>
+      </w:tr>
+    </w:tbl>
+    <w:p>
+      <w:pPr>
+        <w:pStyle w:val="BodyText"/>
+      </w:pPr>
+      <w:r>
+        <w:rPr>
+          <w:b/>
+          <w:bCs/>
+        </w:rPr>
+        <w:t xml:space="preserve">Apify:</w:t>
+      </w:r>
+      <w:r>
+        <w:t xml:space="preserve"> </w:t>
+      </w:r>
+      <w:r>
+        <w:t xml:space="preserve">dùng được và hợp lệ (dữ liệu công khai, không cần tài khoản TikTok); TikTok Research API cấm dùng thương mại nên loại.</w:t>
+      </w:r>
+      <w:r>
+        <w:t xml:space="preserve"> </w:t>
+      </w:r>
+      <w:r>
+        <w:rPr>
+          <w:b/>
+          <w:bCs/>
+        </w:rPr>
+        <w:t xml:space="preserve">Không lập 1–5 tài khoản Apify free</w:t>
+      </w:r>
+      <w:r>
+        <w:t xml:space="preserve"> </w:t>
+      </w:r>
+      <w:r>
+        <w:t xml:space="preserve">— điều khoản Apify cấm một người dùng nhiều tài khoản cá nhân; thay bằng 1 tài khoản Free + các</w:t>
+      </w:r>
+      <w:r>
+        <w:t xml:space="preserve"> </w:t>
+      </w:r>
+      <w:r>
+        <w:t xml:space="preserve">nguồn free hợp lệ khác (Creative Center, Claude web search, kworb, nhập tay). Nâng Starter (29 hoặc 19 USD — kiểm console) khi đạt cả 3</w:t>
+      </w:r>
+      <w:r>
+        <w:t xml:space="preserve"> </w:t>
+      </w:r>
+      <w:r>
+        <w:t xml:space="preserve">chỉ số sau 4–6 tuần: ≥ 5 thẻ duyệt/tuần · ≥ 40 % kịch bản giữ</w:t>
+      </w:r>
+      <w:r>
+        <w:t xml:space="preserve"> </w:t>
+      </w:r>
+      <w:r>
+        <w:rPr>
+          <w:rStyle w:val="VerbatimChar"/>
+        </w:rPr>
+        <w:t xml:space="preserve">trend_refs</w:t>
+      </w:r>
+      <w:r>
+        <w:t xml:space="preserve"> </w:t>
+      </w:r>
+      <w:r>
+        <w:t xml:space="preserve">· Free hết trần ≥ 2 tháng hoặc cần quét hằng ngày.</w:t>
+      </w:r>
+      <w:r>
+        <w:t xml:space="preserve"> </w:t>
+      </w:r>
+      <w:r>
+        <w:t xml:space="preserve">Thứ tự đề xuất: Ý tưởng → Trend (nguồn free) → Trend (Apify) → Cover kịch bản → Cover nhảy (sau A/B). Tổng tiền thử ≈ 5 USD; mọi cờ</w:t>
+      </w:r>
+      <w:r>
+        <w:t xml:space="preserve"> </w:t>
+      </w:r>
+      <w:r>
+        <w:t xml:space="preserve">mới TẮT tới khi qua bộ đo.</w:t>
+      </w:r>
+    </w:p>
     <w:bookmarkEnd w:id="38"/>
-    <w:bookmarkStart w:id="39" w:name="rủi-ro-mitigation-tổng-hợp"/>
+    <w:bookmarkEnd w:id="39"/>
+    <w:bookmarkStart w:id="40" w:name="rủi-ro-mitigation-tổng-hợp"/>
     <w:p>
       <w:pPr>
         <w:pStyle w:val="Heading2"/>
@@ -8216,8 +8815,8 @@
         </w:tc>
       </w:tr>
     </w:tbl>
-    <w:bookmarkEnd w:id="39"/>
-    <w:bookmarkStart w:id="40" w:name="quyết-định-đã-chốt-còn-mở"/>
+    <w:bookmarkEnd w:id="40"/>
+    <w:bookmarkStart w:id="41" w:name="quyết-định-đã-chốt-còn-mở"/>
     <w:p>
       <w:pPr>
         <w:pStyle w:val="Heading2"/>
@@ -10712,6 +11311,225 @@
         <w:t xml:space="preserve">nay làm bằng Blender của dự án (đợt S10.6).</w:t>
       </w:r>
     </w:p>
+    <w:p>
+      <w:pPr>
+        <w:pStyle w:val="BodyText"/>
+      </w:pPr>
+      <w:r>
+        <w:rPr>
+          <w:b/>
+          <w:bCs/>
+        </w:rPr>
+        <w:t xml:space="preserve">Còn mở (2026-10-01) — kế hoạch Director mở rộng (3.10, câu hỏi Q1–Q7 ở mục 8 của tài liệu):</w:t>
+      </w:r>
+    </w:p>
+    <w:tbl>
+      <w:tblPr>
+        <w:tblStyle w:val="Table"/>
+        <w:tblW w:type="pct" w:w="5000"/>
+        <w:tblLayout w:type="fixed"/>
+        <w:tblLook w:firstRow="1" w:lastRow="0" w:firstColumn="0" w:lastColumn="0" w:noHBand="0" w:noVBand="0" w:val="0020"/>
+      </w:tblPr>
+      <w:tblGrid>
+        <w:gridCol w:w="3960"/>
+        <w:gridCol w:w="3960"/>
+      </w:tblGrid>
+      <w:tr>
+        <w:trPr>
+          <w:tblHeader w:val="on"/>
+        </w:trPr>
+        <w:tc>
+          <w:tcPr/>
+          <w:p>
+            <w:pPr>
+              <w:pStyle w:val="Compact"/>
+            </w:pPr>
+            <w:r>
+              <w:t xml:space="preserve">Quyết định</w:t>
+            </w:r>
+          </w:p>
+        </w:tc>
+        <w:tc>
+          <w:tcPr/>
+          <w:p>
+            <w:pPr>
+              <w:pStyle w:val="Compact"/>
+            </w:pPr>
+            <w:r>
+              <w:t xml:space="preserve">Đề xuất</w:t>
+            </w:r>
+          </w:p>
+        </w:tc>
+      </w:tr>
+      <w:tr>
+        <w:tc>
+          <w:tcPr/>
+          <w:p>
+            <w:pPr>
+              <w:pStyle w:val="Compact"/>
+            </w:pPr>
+            <w:r>
+              <w:t xml:space="preserve">Thứ tự làm</w:t>
+            </w:r>
+          </w:p>
+        </w:tc>
+        <w:tc>
+          <w:tcPr/>
+          <w:p>
+            <w:pPr>
+              <w:pStyle w:val="Compact"/>
+            </w:pPr>
+            <w:r>
+              <w:t xml:space="preserve">Ý tưởng → Trend free → Trend Apify → Cover kịch bản → Cover nhảy</w:t>
+            </w:r>
+          </w:p>
+        </w:tc>
+      </w:tr>
+      <w:tr>
+        <w:tc>
+          <w:tcPr/>
+          <w:p>
+            <w:pPr>
+              <w:pStyle w:val="Compact"/>
+            </w:pPr>
+            <w:r>
+              <w:t xml:space="preserve">Apify: 1 tài khoản Free thay cho 1–5 tài khoản free</w:t>
+            </w:r>
+          </w:p>
+        </w:tc>
+        <w:tc>
+          <w:tcPr/>
+          <w:p>
+            <w:pPr>
+              <w:pStyle w:val="Compact"/>
+            </w:pPr>
+            <w:r>
+              <w:t xml:space="preserve">Đồng ý 1 Free (điều khoản cấm nhiều tài khoản) + nguồn free khác</w:t>
+            </w:r>
+          </w:p>
+        </w:tc>
+      </w:tr>
+      <w:tr>
+        <w:tc>
+          <w:tcPr/>
+          <w:p>
+            <w:pPr>
+              <w:pStyle w:val="Compact"/>
+            </w:pPr>
+            <w:r>
+              <w:t xml:space="preserve">Pháp chế Garena cho phép scraper dữ liệu công khai TikTok/FB</w:t>
+            </w:r>
+          </w:p>
+        </w:tc>
+        <w:tc>
+          <w:tcPr/>
+          <w:p>
+            <w:pPr>
+              <w:pStyle w:val="Compact"/>
+            </w:pPr>
+            <w:r>
+              <w:t xml:space="preserve">Hỏi trước khi làm adapter Apify; phần nguồn free làm được ngay</w:t>
+            </w:r>
+          </w:p>
+        </w:tc>
+      </w:tr>
+      <w:tr>
+        <w:tc>
+          <w:tcPr/>
+          <w:p>
+            <w:pPr>
+              <w:pStyle w:val="Compact"/>
+            </w:pPr>
+            <w:r>
+              <w:t xml:space="preserve">Nhạc trend trong bản giao</w:t>
+            </w:r>
+          </w:p>
+        </w:tc>
+        <w:tc>
+          <w:tcPr/>
+          <w:p>
+            <w:pPr>
+              <w:pStyle w:val="Compact"/>
+            </w:pPr>
+            <w:r>
+              <w:t xml:space="preserve">Mặc định không; chỉ Commercial Music Library / nhạc Garena có quyền; còn lại tạo nhạc cùng BPM</w:t>
+            </w:r>
+          </w:p>
+        </w:tc>
+      </w:tr>
+      <w:tr>
+        <w:tc>
+          <w:tcPr/>
+          <w:p>
+            <w:pPr>
+              <w:pStyle w:val="Compact"/>
+            </w:pPr>
+            <w:r>
+              <w:t xml:space="preserve">Clip nhảy cho bài thử A/B (≈ 2,5 USD)</w:t>
+            </w:r>
+          </w:p>
+        </w:tc>
+        <w:tc>
+          <w:tcPr/>
+          <w:p>
+            <w:pPr>
+              <w:pStyle w:val="Compact"/>
+            </w:pPr>
+            <w:r>
+              <w:t xml:space="preserve">Clip nội bộ tự quay (có quyền + thử luôn bộ lọc người thật)</w:t>
+            </w:r>
+          </w:p>
+        </w:tc>
+      </w:tr>
+      <w:tr>
+        <w:tc>
+          <w:tcPr/>
+          <w:p>
+            <w:pPr>
+              <w:pStyle w:val="Compact"/>
+            </w:pPr>
+            <w:r>
+              <w:t xml:space="preserve">Hỏi ClipAI mở API Motion Control</w:t>
+            </w:r>
+          </w:p>
+        </w:tc>
+        <w:tc>
+          <w:tcPr/>
+          <w:p>
+            <w:pPr>
+              <w:pStyle w:val="Compact"/>
+            </w:pPr>
+            <w:r>
+              <w:t xml:space="preserve">Có, gửi kèm câu hỏi Bàn đạo diễn</w:t>
+            </w:r>
+          </w:p>
+        </w:tc>
+      </w:tr>
+      <w:tr>
+        <w:tc>
+          <w:tcPr/>
+          <w:p>
+            <w:pPr>
+              <w:pStyle w:val="Compact"/>
+            </w:pPr>
+            <w:r>
+              <w:t xml:space="preserve">Tần suất quét TikTok</w:t>
+            </w:r>
+          </w:p>
+        </w:tc>
+        <w:tc>
+          <w:tcPr/>
+          <w:p>
+            <w:pPr>
+              <w:pStyle w:val="Compact"/>
+            </w:pPr>
+            <w:r>
+              <w:t xml:space="preserve">3 ngày ở gói Free; hằng ngày khi lên Starter</w:t>
+            </w:r>
+          </w:p>
+        </w:tc>
+      </w:tr>
+    </w:tbl>
     <w:p>
       <w:pPr>
         <w:pStyle w:val="BodyText"/>
@@ -11664,8 +12482,8 @@
         </w:tc>
       </w:tr>
     </w:tbl>
-    <w:bookmarkEnd w:id="40"/>
-    <w:bookmarkStart w:id="41" w:name="Xd77c4f47b903719b6fbd5f054853d76240e8579"/>
+    <w:bookmarkEnd w:id="41"/>
+    <w:bookmarkStart w:id="42" w:name="Xd77c4f47b903719b6fbd5f054853d76240e8579"/>
     <w:p>
       <w:pPr>
         <w:pStyle w:val="Heading2"/>
@@ -12122,8 +12940,8 @@
         <w:t xml:space="preserve">- [ ] Người giữ quan hệ với team dev nội bộ cấp API Deepix/Clip AI</w:t>
       </w:r>
     </w:p>
-    <w:bookmarkEnd w:id="41"/>
-    <w:bookmarkStart w:id="45" w:name="Xcfc382bff294894e92158c63c24ccbf316ae9e1"/>
+    <w:bookmarkEnd w:id="42"/>
+    <w:bookmarkStart w:id="46" w:name="Xcfc382bff294894e92158c63c24ccbf316ae9e1"/>
     <w:p>
       <w:pPr>
         <w:pStyle w:val="Heading2"/>
@@ -12153,43 +12971,41 @@
           <w:b/>
           <w:bCs/>
         </w:rPr>
-        <w:t xml:space="preserve">Trạng thái 2026-09-30 (đọc trước):</w:t>
-      </w:r>
-      <w:r>
-        <w:t xml:space="preserve"> </w:t>
-      </w:r>
-      <w:r>
-        <w:t xml:space="preserve">tiến độ duy nhất ở</w:t>
-      </w:r>
-      <w:r>
-        <w:t xml:space="preserve"> </w:t>
-      </w:r>
-      <w:r>
-        <w:rPr>
-          <w:rStyle w:val="VerbatimChar"/>
-        </w:rPr>
-        <w:t xml:space="preserve">docs/KE_HOACH_SUA_SAU_DU_AN_8.md</w:t>
-      </w:r>
-      <w:r>
-        <w:t xml:space="preserve"> </w:t>
-      </w:r>
-      <w:r>
-        <w:t xml:space="preserve">(đợt S0–S10, K, S8); 📌 đầu</w:t>
-      </w:r>
-      <w:r>
-        <w:t xml:space="preserve"> </w:t>
-      </w:r>
-      <w:r>
-        <w:rPr>
-          <w:rStyle w:val="VerbatimChar"/>
-        </w:rPr>
-        <w:t xml:space="preserve">TODO.md</w:t>
-      </w:r>
-      <w:r>
-        <w:t xml:space="preserve"> </w:t>
-      </w:r>
-      <w:r>
-        <w:t xml:space="preserve">tóm tắt kế hoạch làm nốt. Đoạn dưới là trạng thái 2026-09-26 (lịch sử).</w:t>
+        <w:t xml:space="preserve">2026-10-01:</w:t>
+      </w:r>
+      <w:r>
+        <w:t xml:space="preserve"> </w:t>
+      </w:r>
+      <w:r>
+        <w:t xml:space="preserve">thêm đợt</w:t>
+      </w:r>
+      <w:r>
+        <w:t xml:space="preserve"> </w:t>
+      </w:r>
+      <w:r>
+        <w:rPr>
+          <w:b/>
+          <w:bCs/>
+        </w:rPr>
+        <w:t xml:space="preserve">S11</w:t>
+      </w:r>
+      <w:r>
+        <w:t xml:space="preserve"> </w:t>
+      </w:r>
+      <w:r>
+        <w:t xml:space="preserve">(Director mở rộng — mục 3.10,</w:t>
+      </w:r>
+      <w:r>
+        <w:t xml:space="preserve"> </w:t>
+      </w:r>
+      <w:r>
+        <w:rPr>
+          <w:rStyle w:val="VerbatimChar"/>
+        </w:rPr>
+        <w:t xml:space="preserve">docs/KE_HOACH_TINH_NANG_DIRECTOR_2026-10-01.md</w:t>
+      </w:r>
+      <w:r>
+        <w:t xml:space="preserve">), chờ người dùng chốt Q1–Q7.</w:t>
       </w:r>
     </w:p>
     <w:p>
@@ -12201,57 +13017,28 @@
           <w:b/>
           <w:bCs/>
         </w:rPr>
-        <w:t xml:space="preserve">Trạng thái 2026-09-26:</w:t>
-      </w:r>
-      <w:r>
-        <w:t xml:space="preserve"> </w:t>
-      </w:r>
-      <w:r>
-        <w:t xml:space="preserve">lộ trình đang theo là</w:t>
-      </w:r>
-      <w:r>
-        <w:t xml:space="preserve"> </w:t>
-      </w:r>
-      <w:r>
-        <w:rPr>
-          <w:b/>
-          <w:bCs/>
-        </w:rPr>
-        <w:t xml:space="preserve">kế hoạch V4</w:t>
-      </w:r>
-      <w:r>
-        <w:t xml:space="preserve"> </w:t>
-      </w:r>
-      <w:r>
-        <w:rPr>
-          <w:rStyle w:val="VerbatimChar"/>
-        </w:rPr>
-        <w:t xml:space="preserve">docs/KE_HOACH_V4_2026-09-25.md</w:t>
-      </w:r>
-      <w:r>
-        <w:t xml:space="preserve">; tiến độ ghi</w:t>
-      </w:r>
-      <w:r>
-        <w:t xml:space="preserve"> </w:t>
-      </w:r>
-      <w:r>
-        <w:rPr>
-          <w:b/>
-          <w:bCs/>
-        </w:rPr>
-        <w:t xml:space="preserve">duy nhất</w:t>
-      </w:r>
-      <w:r>
-        <w:t xml:space="preserve"> </w:t>
-      </w:r>
-      <w:r>
-        <w:t xml:space="preserve">ở</w:t>
-      </w:r>
-      <w:r>
-        <w:t xml:space="preserve"> </w:t>
-      </w:r>
-      <w:r>
-        <w:t xml:space="preserve">📌 đầu</w:t>
+        <w:t xml:space="preserve">Trạng thái 2026-09-30 (đọc trước):</w:t>
+      </w:r>
+      <w:r>
+        <w:t xml:space="preserve"> </w:t>
+      </w:r>
+      <w:r>
+        <w:t xml:space="preserve">tiến độ duy nhất ở</w:t>
+      </w:r>
+      <w:r>
+        <w:t xml:space="preserve"> </w:t>
+      </w:r>
+      <w:r>
+        <w:rPr>
+          <w:rStyle w:val="VerbatimChar"/>
+        </w:rPr>
+        <w:t xml:space="preserve">docs/KE_HOACH_SUA_SAU_DU_AN_8.md</w:t>
+      </w:r>
+      <w:r>
+        <w:t xml:space="preserve"> </w:t>
+      </w:r>
+      <w:r>
+        <w:t xml:space="preserve">(đợt S0–S10, K, S8); 📌 đầu</w:t>
       </w:r>
       <w:r>
         <w:t xml:space="preserve"> </w:t>
@@ -12263,139 +13050,10 @@
         <w:t xml:space="preserve">TODO.md</w:t>
       </w:r>
       <w:r>
-        <w:t xml:space="preserve">. Đã xong: GĐ0–GĐ4, GĐ6, GĐ7 và các đợt tự chạy 1–9 (D/V của bộ kỹ năng 3 vai, âm thanh cùng cảm xúc, tư liệu gameplay</w:t>
-      </w:r>
-      <w:r>
-        <w:t xml:space="preserve"> </w:t>
-      </w:r>
-      <w:r>
-        <w:t xml:space="preserve">FF). Đang làm: sửa lỗi do rà soát tìm ra, GĐ5 (Tầng A Director), app web</w:t>
-      </w:r>
-      <w:r>
-        <w:t xml:space="preserve"> </w:t>
-      </w:r>
-      <w:r>
-        <w:rPr>
-          <w:rStyle w:val="VerbatimChar"/>
-        </w:rPr>
-        <w:t xml:space="preserve">devsys/</w:t>
-      </w:r>
-      <w:r>
-        <w:t xml:space="preserve">. Sau đó:</w:t>
-      </w:r>
-      <w:r>
-        <w:t xml:space="preserve"> </w:t>
-      </w:r>
-      <w:r>
-        <w:rPr>
-          <w:b/>
-          <w:bCs/>
-        </w:rPr>
-        <w:t xml:space="preserve">một dự án thử mới, rẻ</w:t>
-      </w:r>
-      <w:r>
-        <w:t xml:space="preserve"> </w:t>
-      </w:r>
-      <w:r>
-        <w:t xml:space="preserve">(trần $10, mọi</w:t>
-      </w:r>
-      <w:r>
-        <w:t xml:space="preserve"> </w:t>
-      </w:r>
-      <w:r>
-        <w:t xml:space="preserve">tính năng bật trừ</w:t>
-      </w:r>
-      <w:r>
-        <w:t xml:space="preserve"> </w:t>
-      </w:r>
-      <w:r>
-        <w:rPr>
-          <w:rStyle w:val="VerbatimChar"/>
-        </w:rPr>
-        <w:t xml:space="preserve">layout_to_model</w:t>
-      </w:r>
-      <w:r>
-        <w:t xml:space="preserve">,</w:t>
-      </w:r>
-      <w:r>
-        <w:t xml:space="preserve"> </w:t>
-      </w:r>
-      <w:r>
-        <w:rPr>
-          <w:rStyle w:val="VerbatimChar"/>
-        </w:rPr>
-        <w:t xml:space="preserve">chain_previous_auto</w:t>
-      </w:r>
-      <w:r>
-        <w:t xml:space="preserve">,</w:t>
-      </w:r>
-      <w:r>
-        <w:t xml:space="preserve"> </w:t>
-      </w:r>
-      <w:r>
-        <w:rPr>
-          <w:rStyle w:val="VerbatimChar"/>
-        </w:rPr>
-        <w:t xml:space="preserve">setcheck_autofix</w:t>
-      </w:r>
-      <w:r>
-        <w:t xml:space="preserve">); các dự án cũ #1–#7</w:t>
-      </w:r>
-      <w:r>
-        <w:t xml:space="preserve"> </w:t>
-      </w:r>
-      <w:r>
-        <w:rPr>
-          <w:b/>
-          <w:bCs/>
-        </w:rPr>
-        <w:t xml:space="preserve">cất đi</w:t>
-      </w:r>
-      <w:r>
-        <w:t xml:space="preserve"> </w:t>
-      </w:r>
-      <w:r>
-        <w:t xml:space="preserve">(📦 ⚙ →</w:t>
-      </w:r>
-      <w:r>
-        <w:t xml:space="preserve"> </w:t>
-      </w:r>
-      <w:r>
-        <w:t xml:space="preserve">“Dự án đã cất”</w:t>
-      </w:r>
-      <w:r>
-        <w:t xml:space="preserve">,</w:t>
-      </w:r>
-      <w:r>
-        <w:t xml:space="preserve"> </w:t>
-      </w:r>
-      <w:r>
-        <w:t xml:space="preserve">không xóa dữ liệu). Các mục</w:t>
-      </w:r>
-      <w:r>
-        <w:t xml:space="preserve"> </w:t>
-      </w:r>
-      <w:r>
-        <w:t xml:space="preserve">“Cập nhật”</w:t>
-      </w:r>
-      <w:r>
-        <w:t xml:space="preserve"> </w:t>
-      </w:r>
-      <w:r>
-        <w:t xml:space="preserve">dưới đây và Giai đoạn V0/V1 được giữ làm lịch sử (</w:t>
-      </w:r>
-      <w:r>
-        <w:rPr>
-          <w:b/>
-          <w:bCs/>
-        </w:rPr>
-        <w:t xml:space="preserve">đã thay bởi</w:t>
-      </w:r>
-      <w:r>
-        <w:t xml:space="preserve"> </w:t>
-      </w:r>
-      <w:r>
-        <w:t xml:space="preserve">các kế hoạch sau, mới nhất V4).</w:t>
+        <w:t xml:space="preserve"> </w:t>
+      </w:r>
+      <w:r>
+        <w:t xml:space="preserve">tóm tắt kế hoạch làm nốt. Đoạn dưới là trạng thái 2026-09-26 (lịch sử).</w:t>
       </w:r>
     </w:p>
     <w:p>
@@ -12407,7 +13065,23 @@
           <w:b/>
           <w:bCs/>
         </w:rPr>
-        <w:t xml:space="preserve">Cập nhật 2026-09-25 (tối) — Kế hoạch V4 (bản mới nhất, thay thứ tự việc của các kế hoạch trước):</w:t>
+        <w:t xml:space="preserve">Trạng thái 2026-09-26:</w:t>
+      </w:r>
+      <w:r>
+        <w:t xml:space="preserve"> </w:t>
+      </w:r>
+      <w:r>
+        <w:t xml:space="preserve">lộ trình đang theo là</w:t>
+      </w:r>
+      <w:r>
+        <w:t xml:space="preserve"> </w:t>
+      </w:r>
+      <w:r>
+        <w:rPr>
+          <w:b/>
+          <w:bCs/>
+        </w:rPr>
+        <w:t xml:space="preserve">kế hoạch V4</w:t>
       </w:r>
       <w:r>
         <w:t xml:space="preserve"> </w:t>
@@ -12419,254 +13093,173 @@
         <w:t xml:space="preserve">docs/KE_HOACH_V4_2026-09-25.md</w:t>
       </w:r>
       <w:r>
-        <w:t xml:space="preserve">. Thứ tự:</w:t>
-      </w:r>
-      <w:r>
-        <w:t xml:space="preserve"> </w:t>
-      </w:r>
-      <w:r>
-        <w:rPr>
-          <w:b/>
-          <w:bCs/>
-        </w:rPr>
-        <w:t xml:space="preserve">GĐ0</w:t>
-      </w:r>
-      <w:r>
-        <w:t xml:space="preserve"> </w:t>
-      </w:r>
-      <w:r>
-        <w:t xml:space="preserve">dọn tài liệu →</w:t>
-      </w:r>
-      <w:r>
-        <w:t xml:space="preserve"> </w:t>
-      </w:r>
-      <w:r>
-        <w:rPr>
-          <w:b/>
-          <w:bCs/>
-        </w:rPr>
-        <w:t xml:space="preserve">GĐ1 rà soát + hoàn thiện</w:t>
-      </w:r>
-      <w:r>
-        <w:t xml:space="preserve"> </w:t>
-      </w:r>
-      <w:r>
-        <w:t xml:space="preserve">các việc còn dở (Tầng A Director, Editor đặt chữ tránh mặt, W2/W8/W10/O6/M3/M14/M16/M18/M19, T1 hồ sơ mọi nhân vật, K1/K2 khung cuối, nối</w:t>
-      </w:r>
-      <w:r>
-        <w:t xml:space="preserve"> </w:t>
-      </w:r>
-      <w:r>
-        <w:rPr>
-          <w:rStyle w:val="VerbatimChar"/>
-        </w:rPr>
-        <w:t xml:space="preserve">recover_clips</w:t>
-      </w:r>
-      <w:r>
-        <w:t xml:space="preserve"> </w:t>
-      </w:r>
-      <w:r>
-        <w:t xml:space="preserve">+</w:t>
-      </w:r>
-      <w:r>
-        <w:t xml:space="preserve"> </w:t>
-      </w:r>
-      <w:r>
-        <w:rPr>
-          <w:rStyle w:val="VerbatimChar"/>
-        </w:rPr>
-        <w:t xml:space="preserve">music_timing</w:t>
-      </w:r>
-      <w:r>
-        <w:t xml:space="preserve">) và độ bền/giới hạn (giới hạn riêng từng nhà cung cấp, khóa trần tiền, hàng đợi Blender) →</w:t>
-      </w:r>
-      <w:r>
-        <w:t xml:space="preserve"> </w:t>
-      </w:r>
-      <w:r>
-        <w:rPr>
-          <w:b/>
-          <w:bCs/>
-        </w:rPr>
-        <w:t xml:space="preserve">GĐ2</w:t>
-      </w:r>
-      <w:r>
-        <w:t xml:space="preserve"> </w:t>
-      </w:r>
-      <w:r>
-        <w:t xml:space="preserve">gói bối cảnh (nền 3D/ảnh trong game + ghép + thời tiết + kiểm độ giống nền) →</w:t>
-      </w:r>
-      <w:r>
-        <w:t xml:space="preserve"> </w:t>
-      </w:r>
-      <w:r>
-        <w:rPr>
-          <w:b/>
-          <w:bCs/>
-        </w:rPr>
-        <w:t xml:space="preserve">GĐ3</w:t>
-      </w:r>
-      <w:r>
-        <w:t xml:space="preserve"> </w:t>
-      </w:r>
-      <w:r>
-        <w:t xml:space="preserve">khớp môi toàn video →</w:t>
-      </w:r>
-      <w:r>
-        <w:t xml:space="preserve"> </w:t>
-      </w:r>
-      <w:r>
-        <w:rPr>
-          <w:b/>
-          <w:bCs/>
-        </w:rPr>
-        <w:t xml:space="preserve">GĐ4</w:t>
-      </w:r>
-      <w:r>
-        <w:t xml:space="preserve"> </w:t>
-      </w:r>
-      <w:r>
-        <w:t xml:space="preserve">bộ kỹ năng 3 vai + chấm điểm độc lập, hồ sơ rút gọn →</w:t>
-      </w:r>
-      <w:r>
-        <w:t xml:space="preserve"> </w:t>
-      </w:r>
-      <w:r>
-        <w:rPr>
-          <w:b/>
-          <w:bCs/>
-        </w:rPr>
-        <w:t xml:space="preserve">GĐ5</w:t>
-      </w:r>
-      <w:r>
-        <w:t xml:space="preserve"> </w:t>
-      </w:r>
-      <w:r>
-        <w:t xml:space="preserve">Tầng A →</w:t>
-      </w:r>
-      <w:r>
-        <w:t xml:space="preserve"> </w:t>
-      </w:r>
-      <w:r>
-        <w:rPr>
-          <w:b/>
-          <w:bCs/>
-        </w:rPr>
-        <w:t xml:space="preserve">GĐ6</w:t>
-      </w:r>
-      <w:r>
-        <w:t xml:space="preserve"> </w:t>
-      </w:r>
-      <w:r>
-        <w:t xml:space="preserve">dashboard gọn + tab</w:t>
-      </w:r>
-      <w:r>
-        <w:t xml:space="preserve"> </w:t>
-      </w:r>
-      <w:r>
-        <w:t xml:space="preserve">“Giới hạn hệ thống”</w:t>
-      </w:r>
-      <w:r>
-        <w:t xml:space="preserve"> </w:t>
-      </w:r>
-      <w:r>
-        <w:t xml:space="preserve">→</w:t>
-      </w:r>
-      <w:r>
-        <w:t xml:space="preserve"> </w:t>
-      </w:r>
-      <w:r>
-        <w:rPr>
-          <w:b/>
-          <w:bCs/>
-        </w:rPr>
-        <w:t xml:space="preserve">GĐ7</w:t>
-      </w:r>
-      <w:r>
-        <w:t xml:space="preserve"> </w:t>
-      </w:r>
-      <w:r>
-        <w:t xml:space="preserve">test toàn bộ →</w:t>
-      </w:r>
-      <w:r>
-        <w:t xml:space="preserve"> </w:t>
-      </w:r>
-      <w:r>
-        <w:rPr>
-          <w:b/>
-          <w:bCs/>
-        </w:rPr>
-        <w:t xml:space="preserve">GĐ8</w:t>
-      </w:r>
-      <w:r>
-        <w:t xml:space="preserve"> </w:t>
-      </w:r>
-      <w:r>
-        <w:t xml:space="preserve">kiểm chứng nhỏ trong trần #7 →</w:t>
-      </w:r>
-      <w:r>
-        <w:t xml:space="preserve"> </w:t>
-      </w:r>
-      <w:r>
-        <w:rPr>
-          <w:b/>
-          <w:bCs/>
-        </w:rPr>
-        <w:t xml:space="preserve">GĐ9</w:t>
-      </w:r>
-      <w:r>
-        <w:t xml:space="preserve"> </w:t>
-      </w:r>
-      <w:r>
-        <w:t xml:space="preserve">báo</w:t>
-      </w:r>
-      <w:r>
-        <w:t xml:space="preserve"> </w:t>
-      </w:r>
-      <w:r>
-        <w:t xml:space="preserve">“sẵn sàng”</w:t>
-      </w:r>
-      <w:r>
-        <w:t xml:space="preserve">, người dùng chạy trọn #6 trên dashboard. Lộ trình V0/V1 bên dưới là lịch sử (V0/MCP đã tạm gác từ 2026-09-19).</w:t>
-      </w:r>
-      <w:r>
-        <w:t xml:space="preserve"> </w:t>
-      </w:r>
-      <w:r>
-        <w:rPr>
-          <w:b/>
-          <w:bCs/>
-        </w:rPr>
-        <w:t xml:space="preserve">Tiến độ thật:</w:t>
-      </w:r>
-      <w:r>
-        <w:rPr>
-          <w:b/>
-          <w:bCs/>
-        </w:rPr>
-        <w:t xml:space="preserve"> </w:t>
-      </w:r>
-      <w:r>
-        <w:rPr>
-          <w:rStyle w:val="VerbatimChar"/>
-          <w:b/>
-          <w:bCs/>
+        <w:t xml:space="preserve">; tiến độ ghi</w:t>
+      </w:r>
+      <w:r>
+        <w:t xml:space="preserve"> </w:t>
+      </w:r>
+      <w:r>
+        <w:rPr>
+          <w:b/>
+          <w:bCs/>
+        </w:rPr>
+        <w:t xml:space="preserve">duy nhất</w:t>
+      </w:r>
+      <w:r>
+        <w:t xml:space="preserve"> </w:t>
+      </w:r>
+      <w:r>
+        <w:t xml:space="preserve">ở</w:t>
+      </w:r>
+      <w:r>
+        <w:t xml:space="preserve"> </w:t>
+      </w:r>
+      <w:r>
+        <w:t xml:space="preserve">📌 đầu</w:t>
+      </w:r>
+      <w:r>
+        <w:t xml:space="preserve"> </w:t>
+      </w:r>
+      <w:r>
+        <w:rPr>
+          <w:rStyle w:val="VerbatimChar"/>
         </w:rPr>
         <w:t xml:space="preserve">TODO.md</w:t>
       </w:r>
       <w:r>
-        <w:rPr>
-          <w:b/>
-          <w:bCs/>
-        </w:rPr>
-        <w:t xml:space="preserve"> </w:t>
-      </w:r>
-      <w:r>
-        <w:rPr>
-          <w:b/>
-          <w:bCs/>
-        </w:rPr>
-        <w:t xml:space="preserve">(nơi duy nhất ghi tiến độ).</w:t>
+        <w:t xml:space="preserve">. Đã xong: GĐ0–GĐ4, GĐ6, GĐ7 và các đợt tự chạy 1–9 (D/V của bộ kỹ năng 3 vai, âm thanh cùng cảm xúc, tư liệu gameplay</w:t>
+      </w:r>
+      <w:r>
+        <w:t xml:space="preserve"> </w:t>
+      </w:r>
+      <w:r>
+        <w:t xml:space="preserve">FF). Đang làm: sửa lỗi do rà soát tìm ra, GĐ5 (Tầng A Director), app web</w:t>
+      </w:r>
+      <w:r>
+        <w:t xml:space="preserve"> </w:t>
+      </w:r>
+      <w:r>
+        <w:rPr>
+          <w:rStyle w:val="VerbatimChar"/>
+        </w:rPr>
+        <w:t xml:space="preserve">devsys/</w:t>
+      </w:r>
+      <w:r>
+        <w:t xml:space="preserve">. Sau đó:</w:t>
+      </w:r>
+      <w:r>
+        <w:t xml:space="preserve"> </w:t>
+      </w:r>
+      <w:r>
+        <w:rPr>
+          <w:b/>
+          <w:bCs/>
+        </w:rPr>
+        <w:t xml:space="preserve">một dự án thử mới, rẻ</w:t>
+      </w:r>
+      <w:r>
+        <w:t xml:space="preserve"> </w:t>
+      </w:r>
+      <w:r>
+        <w:t xml:space="preserve">(trần $10, mọi</w:t>
+      </w:r>
+      <w:r>
+        <w:t xml:space="preserve"> </w:t>
+      </w:r>
+      <w:r>
+        <w:t xml:space="preserve">tính năng bật trừ</w:t>
+      </w:r>
+      <w:r>
+        <w:t xml:space="preserve"> </w:t>
+      </w:r>
+      <w:r>
+        <w:rPr>
+          <w:rStyle w:val="VerbatimChar"/>
+        </w:rPr>
+        <w:t xml:space="preserve">layout_to_model</w:t>
+      </w:r>
+      <w:r>
+        <w:t xml:space="preserve">,</w:t>
+      </w:r>
+      <w:r>
+        <w:t xml:space="preserve"> </w:t>
+      </w:r>
+      <w:r>
+        <w:rPr>
+          <w:rStyle w:val="VerbatimChar"/>
+        </w:rPr>
+        <w:t xml:space="preserve">chain_previous_auto</w:t>
+      </w:r>
+      <w:r>
+        <w:t xml:space="preserve">,</w:t>
+      </w:r>
+      <w:r>
+        <w:t xml:space="preserve"> </w:t>
+      </w:r>
+      <w:r>
+        <w:rPr>
+          <w:rStyle w:val="VerbatimChar"/>
+        </w:rPr>
+        <w:t xml:space="preserve">setcheck_autofix</w:t>
+      </w:r>
+      <w:r>
+        <w:t xml:space="preserve">); các dự án cũ #1–#7</w:t>
+      </w:r>
+      <w:r>
+        <w:t xml:space="preserve"> </w:t>
+      </w:r>
+      <w:r>
+        <w:rPr>
+          <w:b/>
+          <w:bCs/>
+        </w:rPr>
+        <w:t xml:space="preserve">cất đi</w:t>
+      </w:r>
+      <w:r>
+        <w:t xml:space="preserve"> </w:t>
+      </w:r>
+      <w:r>
+        <w:t xml:space="preserve">(📦 ⚙ →</w:t>
+      </w:r>
+      <w:r>
+        <w:t xml:space="preserve"> </w:t>
+      </w:r>
+      <w:r>
+        <w:t xml:space="preserve">“Dự án đã cất”</w:t>
+      </w:r>
+      <w:r>
+        <w:t xml:space="preserve">,</w:t>
+      </w:r>
+      <w:r>
+        <w:t xml:space="preserve"> </w:t>
+      </w:r>
+      <w:r>
+        <w:t xml:space="preserve">không xóa dữ liệu). Các mục</w:t>
+      </w:r>
+      <w:r>
+        <w:t xml:space="preserve"> </w:t>
+      </w:r>
+      <w:r>
+        <w:t xml:space="preserve">“Cập nhật”</w:t>
+      </w:r>
+      <w:r>
+        <w:t xml:space="preserve"> </w:t>
+      </w:r>
+      <w:r>
+        <w:t xml:space="preserve">dưới đây và Giai đoạn V0/V1 được giữ làm lịch sử (</w:t>
+      </w:r>
+      <w:r>
+        <w:rPr>
+          <w:b/>
+          <w:bCs/>
+        </w:rPr>
+        <w:t xml:space="preserve">đã thay bởi</w:t>
+      </w:r>
+      <w:r>
+        <w:t xml:space="preserve"> </w:t>
+      </w:r>
+      <w:r>
+        <w:t xml:space="preserve">các kế hoạch sau, mới nhất V4).</w:t>
       </w:r>
     </w:p>
     <w:p>
@@ -12678,91 +13271,266 @@
           <w:b/>
           <w:bCs/>
         </w:rPr>
-        <w:t xml:space="preserve">Cập nhật 2026-09-25 — Kế hoạch làm tiếp (bản mới nhất, sắp lại thứ tự việc của kế hoạch tổng):</w:t>
-      </w:r>
-      <w:r>
-        <w:t xml:space="preserve"> </w:t>
-      </w:r>
-      <w:r>
-        <w:rPr>
-          <w:rStyle w:val="VerbatimChar"/>
-        </w:rPr>
-        <w:t xml:space="preserve">docs/KE_HOACH_2026-09-25.md</w:t>
-      </w:r>
-      <w:r>
-        <w:t xml:space="preserve"> </w:t>
-      </w:r>
-      <w:r>
-        <w:t xml:space="preserve">— đánh giá tổng thể (code đủ dày; thiếu một video thật chạy hết vòng mới và một Director rẻ, ổn định); bài học 4 lần chạy Director thật cho kịch bản</w:t>
-      </w:r>
-      <w:r>
-        <w:t xml:space="preserve"> </w:t>
-      </w:r>
-      <w:r>
-        <w:t xml:space="preserve">“ANH CHỌN AI?”</w:t>
-      </w:r>
-      <w:r>
-        <w:t xml:space="preserve"> </w:t>
-      </w:r>
-      <w:r>
-        <w:t xml:space="preserve">(~$1,7); 6 hướng: H1 bộ chuẩn hóa shot (code tự sửa thay vì hỏi lại Claude), H2 Director hai tầng + chạy lại từng cảnh + cache, H3 bộ nguyên tắc đạo diễn 5 tầng (mục đích → cách nghĩ → nguyên tắc/luật có lý do + căn cứ → thứ tự ưu tiên khi xung đột → tự rà; không trần số luật — người dùng bổ sung), H4 bàn đo Director offline bằng fixture thật,</w:t>
-      </w:r>
-      <w:r>
-        <w:t xml:space="preserve"> </w:t>
-      </w:r>
-      <w:r>
-        <w:rPr>
-          <w:b/>
-          <w:bCs/>
-        </w:rPr>
-        <w:t xml:space="preserve">H5 quay theo vị trí máy (1 clip cho nhiều shot cùng góc — giây trả tiền ≈ giây phim; #6: ~103 s ≈ $8,2 theo từng shot → ước ~60–65 s ≈ $5)</w:t>
-      </w:r>
-      <w:r>
-        <w:t xml:space="preserve">, H6 bảng chi phí dự kiến trước mỗi bậc,</w:t>
-      </w:r>
-      <w:r>
-        <w:t xml:space="preserve"> </w:t>
-      </w:r>
-      <w:r>
-        <w:rPr>
-          <w:b/>
-          <w:bCs/>
-        </w:rPr>
-        <w:t xml:space="preserve">H7 tổ làm phim: Đạo diễn (ý đồ, thoại, quan sát tổng, duyệt chốt) + Quay phim (góc máy, bố cục, coverage, prompt hình) + Dựng/Editor (cắt, vùng an toàn đặt chữ theo nền tảng và từng khung, phụ đề, trộn âm, định dạng) — mỗi vai một nguồn kiến thức riêng</w:t>
-      </w:r>
-      <w:r>
-        <w:t xml:space="preserve"> </w:t>
-      </w:r>
-      <w:r>
-        <w:t xml:space="preserve">(người dùng đề xuất). Thứ tự ưu tiên khi luật xung đột đã chốt, chỉnh dần theo các dự án sau. Lộ trình đã chốt: bàn đo + bộ chuẩn hóa →</w:t>
-      </w:r>
-      <w:r>
-        <w:t xml:space="preserve"> </w:t>
-      </w:r>
-      <w:r>
-        <w:rPr>
-          <w:b/>
-          <w:bCs/>
-        </w:rPr>
-        <w:t xml:space="preserve">chạy thử 0–20 s đầu của #6, tự chạy trong trần</w:t>
-      </w:r>
-      <w:r>
-        <w:t xml:space="preserve"> </w:t>
-      </w:r>
-      <w:r>
-        <w:t xml:space="preserve">($8 tiền có giá + $1 Claude API tối ưu + 32 ảnh + 25 lượt âm thanh, gen lại ≤ 2 lần/shot; thử nhỏ quay theo vị trí máy; giữ lại 2 câu thoại cho phần sau; PR #1 đã merge về</w:t>
-      </w:r>
-      <w:r>
-        <w:t xml:space="preserve"> </w:t>
-      </w:r>
-      <w:r>
-        <w:rPr>
-          <w:rStyle w:val="VerbatimChar"/>
-        </w:rPr>
-        <w:t xml:space="preserve">main</w:t>
-      </w:r>
-      <w:r>
-        <w:t xml:space="preserve">) → tổ làm phim → Director theo vai → quay theo vị trí máy → phần còn lại của #6 → GĐ-F/E/G/H/T1/I.</w:t>
+        <w:t xml:space="preserve">Cập nhật 2026-09-25 (tối) — Kế hoạch V4 (bản mới nhất, thay thứ tự việc của các kế hoạch trước):</w:t>
+      </w:r>
+      <w:r>
+        <w:t xml:space="preserve"> </w:t>
+      </w:r>
+      <w:r>
+        <w:rPr>
+          <w:rStyle w:val="VerbatimChar"/>
+        </w:rPr>
+        <w:t xml:space="preserve">docs/KE_HOACH_V4_2026-09-25.md</w:t>
+      </w:r>
+      <w:r>
+        <w:t xml:space="preserve">. Thứ tự:</w:t>
+      </w:r>
+      <w:r>
+        <w:t xml:space="preserve"> </w:t>
+      </w:r>
+      <w:r>
+        <w:rPr>
+          <w:b/>
+          <w:bCs/>
+        </w:rPr>
+        <w:t xml:space="preserve">GĐ0</w:t>
+      </w:r>
+      <w:r>
+        <w:t xml:space="preserve"> </w:t>
+      </w:r>
+      <w:r>
+        <w:t xml:space="preserve">dọn tài liệu →</w:t>
+      </w:r>
+      <w:r>
+        <w:t xml:space="preserve"> </w:t>
+      </w:r>
+      <w:r>
+        <w:rPr>
+          <w:b/>
+          <w:bCs/>
+        </w:rPr>
+        <w:t xml:space="preserve">GĐ1 rà soát + hoàn thiện</w:t>
+      </w:r>
+      <w:r>
+        <w:t xml:space="preserve"> </w:t>
+      </w:r>
+      <w:r>
+        <w:t xml:space="preserve">các việc còn dở (Tầng A Director, Editor đặt chữ tránh mặt, W2/W8/W10/O6/M3/M14/M16/M18/M19, T1 hồ sơ mọi nhân vật, K1/K2 khung cuối, nối</w:t>
+      </w:r>
+      <w:r>
+        <w:t xml:space="preserve"> </w:t>
+      </w:r>
+      <w:r>
+        <w:rPr>
+          <w:rStyle w:val="VerbatimChar"/>
+        </w:rPr>
+        <w:t xml:space="preserve">recover_clips</w:t>
+      </w:r>
+      <w:r>
+        <w:t xml:space="preserve"> </w:t>
+      </w:r>
+      <w:r>
+        <w:t xml:space="preserve">+</w:t>
+      </w:r>
+      <w:r>
+        <w:t xml:space="preserve"> </w:t>
+      </w:r>
+      <w:r>
+        <w:rPr>
+          <w:rStyle w:val="VerbatimChar"/>
+        </w:rPr>
+        <w:t xml:space="preserve">music_timing</w:t>
+      </w:r>
+      <w:r>
+        <w:t xml:space="preserve">) và độ bền/giới hạn (giới hạn riêng từng nhà cung cấp, khóa trần tiền, hàng đợi Blender) →</w:t>
+      </w:r>
+      <w:r>
+        <w:t xml:space="preserve"> </w:t>
+      </w:r>
+      <w:r>
+        <w:rPr>
+          <w:b/>
+          <w:bCs/>
+        </w:rPr>
+        <w:t xml:space="preserve">GĐ2</w:t>
+      </w:r>
+      <w:r>
+        <w:t xml:space="preserve"> </w:t>
+      </w:r>
+      <w:r>
+        <w:t xml:space="preserve">gói bối cảnh (nền 3D/ảnh trong game + ghép + thời tiết + kiểm độ giống nền) →</w:t>
+      </w:r>
+      <w:r>
+        <w:t xml:space="preserve"> </w:t>
+      </w:r>
+      <w:r>
+        <w:rPr>
+          <w:b/>
+          <w:bCs/>
+        </w:rPr>
+        <w:t xml:space="preserve">GĐ3</w:t>
+      </w:r>
+      <w:r>
+        <w:t xml:space="preserve"> </w:t>
+      </w:r>
+      <w:r>
+        <w:t xml:space="preserve">khớp môi toàn video →</w:t>
+      </w:r>
+      <w:r>
+        <w:t xml:space="preserve"> </w:t>
+      </w:r>
+      <w:r>
+        <w:rPr>
+          <w:b/>
+          <w:bCs/>
+        </w:rPr>
+        <w:t xml:space="preserve">GĐ4</w:t>
+      </w:r>
+      <w:r>
+        <w:t xml:space="preserve"> </w:t>
+      </w:r>
+      <w:r>
+        <w:t xml:space="preserve">bộ kỹ năng 3 vai + chấm điểm độc lập, hồ sơ rút gọn →</w:t>
+      </w:r>
+      <w:r>
+        <w:t xml:space="preserve"> </w:t>
+      </w:r>
+      <w:r>
+        <w:rPr>
+          <w:b/>
+          <w:bCs/>
+        </w:rPr>
+        <w:t xml:space="preserve">GĐ5</w:t>
+      </w:r>
+      <w:r>
+        <w:t xml:space="preserve"> </w:t>
+      </w:r>
+      <w:r>
+        <w:t xml:space="preserve">Tầng A →</w:t>
+      </w:r>
+      <w:r>
+        <w:t xml:space="preserve"> </w:t>
+      </w:r>
+      <w:r>
+        <w:rPr>
+          <w:b/>
+          <w:bCs/>
+        </w:rPr>
+        <w:t xml:space="preserve">GĐ6</w:t>
+      </w:r>
+      <w:r>
+        <w:t xml:space="preserve"> </w:t>
+      </w:r>
+      <w:r>
+        <w:t xml:space="preserve">dashboard gọn + tab</w:t>
+      </w:r>
+      <w:r>
+        <w:t xml:space="preserve"> </w:t>
+      </w:r>
+      <w:r>
+        <w:t xml:space="preserve">“Giới hạn hệ thống”</w:t>
+      </w:r>
+      <w:r>
+        <w:t xml:space="preserve"> </w:t>
+      </w:r>
+      <w:r>
+        <w:t xml:space="preserve">→</w:t>
+      </w:r>
+      <w:r>
+        <w:t xml:space="preserve"> </w:t>
+      </w:r>
+      <w:r>
+        <w:rPr>
+          <w:b/>
+          <w:bCs/>
+        </w:rPr>
+        <w:t xml:space="preserve">GĐ7</w:t>
+      </w:r>
+      <w:r>
+        <w:t xml:space="preserve"> </w:t>
+      </w:r>
+      <w:r>
+        <w:t xml:space="preserve">test toàn bộ →</w:t>
+      </w:r>
+      <w:r>
+        <w:t xml:space="preserve"> </w:t>
+      </w:r>
+      <w:r>
+        <w:rPr>
+          <w:b/>
+          <w:bCs/>
+        </w:rPr>
+        <w:t xml:space="preserve">GĐ8</w:t>
+      </w:r>
+      <w:r>
+        <w:t xml:space="preserve"> </w:t>
+      </w:r>
+      <w:r>
+        <w:t xml:space="preserve">kiểm chứng nhỏ trong trần #7 →</w:t>
+      </w:r>
+      <w:r>
+        <w:t xml:space="preserve"> </w:t>
+      </w:r>
+      <w:r>
+        <w:rPr>
+          <w:b/>
+          <w:bCs/>
+        </w:rPr>
+        <w:t xml:space="preserve">GĐ9</w:t>
+      </w:r>
+      <w:r>
+        <w:t xml:space="preserve"> </w:t>
+      </w:r>
+      <w:r>
+        <w:t xml:space="preserve">báo</w:t>
+      </w:r>
+      <w:r>
+        <w:t xml:space="preserve"> </w:t>
+      </w:r>
+      <w:r>
+        <w:t xml:space="preserve">“sẵn sàng”</w:t>
+      </w:r>
+      <w:r>
+        <w:t xml:space="preserve">, người dùng chạy trọn #6 trên dashboard. Lộ trình V0/V1 bên dưới là lịch sử (V0/MCP đã tạm gác từ 2026-09-19).</w:t>
+      </w:r>
+      <w:r>
+        <w:t xml:space="preserve"> </w:t>
+      </w:r>
+      <w:r>
+        <w:rPr>
+          <w:b/>
+          <w:bCs/>
+        </w:rPr>
+        <w:t xml:space="preserve">Tiến độ thật:</w:t>
+      </w:r>
+      <w:r>
+        <w:rPr>
+          <w:b/>
+          <w:bCs/>
+        </w:rPr>
+        <w:t xml:space="preserve"> </w:t>
+      </w:r>
+      <w:r>
+        <w:rPr>
+          <w:rStyle w:val="VerbatimChar"/>
+          <w:b/>
+          <w:bCs/>
+        </w:rPr>
+        <w:t xml:space="preserve">TODO.md</w:t>
+      </w:r>
+      <w:r>
+        <w:rPr>
+          <w:b/>
+          <w:bCs/>
+        </w:rPr>
+        <w:t xml:space="preserve"> </w:t>
+      </w:r>
+      <w:r>
+        <w:rPr>
+          <w:b/>
+          <w:bCs/>
+        </w:rPr>
+        <w:t xml:space="preserve">(nơi duy nhất ghi tiến độ).</w:t>
       </w:r>
     </w:p>
     <w:p>
@@ -12774,6 +13542,102 @@
           <w:b/>
           <w:bCs/>
         </w:rPr>
+        <w:t xml:space="preserve">Cập nhật 2026-09-25 — Kế hoạch làm tiếp (bản mới nhất, sắp lại thứ tự việc của kế hoạch tổng):</w:t>
+      </w:r>
+      <w:r>
+        <w:t xml:space="preserve"> </w:t>
+      </w:r>
+      <w:r>
+        <w:rPr>
+          <w:rStyle w:val="VerbatimChar"/>
+        </w:rPr>
+        <w:t xml:space="preserve">docs/KE_HOACH_2026-09-25.md</w:t>
+      </w:r>
+      <w:r>
+        <w:t xml:space="preserve"> </w:t>
+      </w:r>
+      <w:r>
+        <w:t xml:space="preserve">— đánh giá tổng thể (code đủ dày; thiếu một video thật chạy hết vòng mới và một Director rẻ, ổn định); bài học 4 lần chạy Director thật cho kịch bản</w:t>
+      </w:r>
+      <w:r>
+        <w:t xml:space="preserve"> </w:t>
+      </w:r>
+      <w:r>
+        <w:t xml:space="preserve">“ANH CHỌN AI?”</w:t>
+      </w:r>
+      <w:r>
+        <w:t xml:space="preserve"> </w:t>
+      </w:r>
+      <w:r>
+        <w:t xml:space="preserve">(~$1,7); 6 hướng: H1 bộ chuẩn hóa shot (code tự sửa thay vì hỏi lại Claude), H2 Director hai tầng + chạy lại từng cảnh + cache, H3 bộ nguyên tắc đạo diễn 5 tầng (mục đích → cách nghĩ → nguyên tắc/luật có lý do + căn cứ → thứ tự ưu tiên khi xung đột → tự rà; không trần số luật — người dùng bổ sung), H4 bàn đo Director offline bằng fixture thật,</w:t>
+      </w:r>
+      <w:r>
+        <w:t xml:space="preserve"> </w:t>
+      </w:r>
+      <w:r>
+        <w:rPr>
+          <w:b/>
+          <w:bCs/>
+        </w:rPr>
+        <w:t xml:space="preserve">H5 quay theo vị trí máy (1 clip cho nhiều shot cùng góc — giây trả tiền ≈ giây phim; #6: ~103 s ≈ $8,2 theo từng shot → ước ~60–65 s ≈ $5)</w:t>
+      </w:r>
+      <w:r>
+        <w:t xml:space="preserve">, H6 bảng chi phí dự kiến trước mỗi bậc,</w:t>
+      </w:r>
+      <w:r>
+        <w:t xml:space="preserve"> </w:t>
+      </w:r>
+      <w:r>
+        <w:rPr>
+          <w:b/>
+          <w:bCs/>
+        </w:rPr>
+        <w:t xml:space="preserve">H7 tổ làm phim: Đạo diễn (ý đồ, thoại, quan sát tổng, duyệt chốt) + Quay phim (góc máy, bố cục, coverage, prompt hình) + Dựng/Editor (cắt, vùng an toàn đặt chữ theo nền tảng và từng khung, phụ đề, trộn âm, định dạng) — mỗi vai một nguồn kiến thức riêng</w:t>
+      </w:r>
+      <w:r>
+        <w:t xml:space="preserve"> </w:t>
+      </w:r>
+      <w:r>
+        <w:t xml:space="preserve">(người dùng đề xuất). Thứ tự ưu tiên khi luật xung đột đã chốt, chỉnh dần theo các dự án sau. Lộ trình đã chốt: bàn đo + bộ chuẩn hóa →</w:t>
+      </w:r>
+      <w:r>
+        <w:t xml:space="preserve"> </w:t>
+      </w:r>
+      <w:r>
+        <w:rPr>
+          <w:b/>
+          <w:bCs/>
+        </w:rPr>
+        <w:t xml:space="preserve">chạy thử 0–20 s đầu của #6, tự chạy trong trần</w:t>
+      </w:r>
+      <w:r>
+        <w:t xml:space="preserve"> </w:t>
+      </w:r>
+      <w:r>
+        <w:t xml:space="preserve">($8 tiền có giá + $1 Claude API tối ưu + 32 ảnh + 25 lượt âm thanh, gen lại ≤ 2 lần/shot; thử nhỏ quay theo vị trí máy; giữ lại 2 câu thoại cho phần sau; PR #1 đã merge về</w:t>
+      </w:r>
+      <w:r>
+        <w:t xml:space="preserve"> </w:t>
+      </w:r>
+      <w:r>
+        <w:rPr>
+          <w:rStyle w:val="VerbatimChar"/>
+        </w:rPr>
+        <w:t xml:space="preserve">main</w:t>
+      </w:r>
+      <w:r>
+        <w:t xml:space="preserve">) → tổ làm phim → Director theo vai → quay theo vị trí máy → phần còn lại của #6 → GĐ-F/E/G/H/T1/I.</w:t>
+      </w:r>
+    </w:p>
+    <w:p>
+      <w:pPr>
+        <w:pStyle w:val="BlockText"/>
+      </w:pPr>
+      <w:r>
+        <w:rPr>
+          <w:b/>
+          <w:bCs/>
+        </w:rPr>
         <w:t xml:space="preserve">Cập nhật 2026-09-24 — Kế hoạch tổng (bản mới nhất, thay thế thứ tự việc cũ):</w:t>
       </w:r>
       <w:r>
@@ -12792,7 +13656,7 @@
         <w:t xml:space="preserve">— tổng kết đã làm, đánh giá từng phân đoạn (P0–P8), danh mục lỗi đầy đủ (~130 mã), cách dùng ClipAI (khung đầu/cuối, tham chiếu), kho tài nguyên &amp; bối cảnh (bỏ ghép ảnh map), bản đồ 3D (Blender 5.0.1), giọng tiếng Việt, tối giản giao diện; lộ trình GĐ-A (khẩn) → GĐ-B → C → D → E0 → E → F → G → H (không tốn credit) → GĐ-I kiểm thật theo bậc (xin phép từng bậc).</w:t>
       </w:r>
     </w:p>
-    <w:bookmarkStart w:id="42" w:name="X8b83ff9d1362e92bd4f25dfa5690ff1427cf5ea"/>
+    <w:bookmarkStart w:id="43" w:name="X8b83ff9d1362e92bd4f25dfa5690ff1427cf5ea"/>
     <w:p>
       <w:pPr>
         <w:pStyle w:val="Heading3"/>
@@ -13129,8 +13993,8 @@
         <w:t xml:space="preserve">≥1 video hoàn chỉnh end-to-end, threshold đã hiệu chỉnh bằng dữ liệu, prompt/checklist khóa version.</w:t>
       </w:r>
     </w:p>
-    <w:bookmarkEnd w:id="42"/>
-    <w:bookmarkStart w:id="43" w:name="X6b8b3c13b665a3392c9b167e147fc644a30ca50"/>
+    <w:bookmarkEnd w:id="43"/>
+    <w:bookmarkStart w:id="44" w:name="X6b8b3c13b665a3392c9b167e147fc644a30ca50"/>
     <w:p>
       <w:pPr>
         <w:pStyle w:val="Heading3"/>
@@ -13283,8 +14147,8 @@
         <w:t xml:space="preserve">hệ thống bàn giao vận hành được từ 1 giao diện duy nhất, có tài liệu.</w:t>
       </w:r>
     </w:p>
-    <w:bookmarkEnd w:id="43"/>
-    <w:bookmarkStart w:id="44" w:name="X0f1e4e18b5ff6c25ed9860882817e3c6af38d44"/>
+    <w:bookmarkEnd w:id="44"/>
+    <w:bookmarkStart w:id="45" w:name="X0f1e4e18b5ff6c25ed9860882817e3c6af38d44"/>
     <w:p>
       <w:pPr>
         <w:pStyle w:val="Heading3"/>
@@ -13661,9 +14525,9 @@
         <w:t xml:space="preserve">Rủi ro kéo dài: chờ API Deepix/Clip AI; Deepix/Clip AI chỉ có Web (Playwright, +1–2 tuần); hiệu chỉnh QC threshold cần nhiều vòng; chất lượng Knowledge Base phụ thuộc chuyên gia miền.</w:t>
       </w:r>
     </w:p>
-    <w:bookmarkEnd w:id="44"/>
     <w:bookmarkEnd w:id="45"/>
-    <w:bookmarkStart w:id="46" w:name="Xb786808859b2baa89401c26f99cf8f9fff113e4"/>
+    <w:bookmarkEnd w:id="46"/>
+    <w:bookmarkStart w:id="47" w:name="Xb786808859b2baa89401c26f99cf8f9fff113e4"/>
     <w:p>
       <w:pPr>
         <w:pStyle w:val="Heading2"/>
@@ -13780,8 +14644,8 @@
         <w:t xml:space="preserve">Runbook + Prompt Templates đã bàn giao cho bộ phận sản xuất nội dung</w:t>
       </w:r>
     </w:p>
-    <w:bookmarkEnd w:id="46"/>
-    <w:bookmarkStart w:id="47" w:name="X3d83f13eb288e7e0fe426ee3840d7740f3f3c0e"/>
+    <w:bookmarkEnd w:id="47"/>
+    <w:bookmarkStart w:id="48" w:name="X3d83f13eb288e7e0fe426ee3840d7740f3f3c0e"/>
     <w:p>
       <w:pPr>
         <w:pStyle w:val="Heading2"/>
@@ -15916,8 +16780,8 @@
         <w:t xml:space="preserve">(kèm 4 comment góp ý, đã phân tích ở Mục 2).</w:t>
       </w:r>
     </w:p>
-    <w:bookmarkEnd w:id="47"/>
     <w:bookmarkEnd w:id="48"/>
+    <w:bookmarkEnd w:id="49"/>
     <w:sectPr>
       <w:footnotePr>
         <w:numRestart w:val="eachSect"/>

</xml_diff>

<commit_message>
Kế hoạch S11 v2: chốt Q1–Q7 (trend không bắt buộc, mức bản quyền cao/vừa/thấp, Apify Free có sẵn quét 3 ngày, Suno để sau), video ref nhảy chuyển không mặt (AE Instant Depth Map / Video Depth Anything Small / mannequin MediaPipe+Blender), bài học từ Antigravity; S11 15 việc, PLAN 3.10 + Mục 5, build lại PLAN.docx/pdf, TODO
Co-Authored-By: Claude Opus 5.5 <noreply@anthropic.com>
Claude-Session: https://claude.ai/code/session_0199VQqnF6CAfLBQHaMV8TDF
</commit_message>
<xml_diff>
--- a/PLAN.docx
+++ b/PLAN.docx
@@ -8011,13 +8011,13 @@
       </w:r>
     </w:p>
     <w:bookmarkEnd w:id="37"/>
-    <w:bookmarkStart w:id="38" w:name="X0270a926fd572ab02e9e15ce2e4e6f686cb133d"/>
+    <w:bookmarkStart w:id="38" w:name="X6fad4714526f5110c0412a8a4bf59536328fa9a"/>
     <w:p>
       <w:pPr>
         <w:pStyle w:val="Heading3"/>
       </w:pPr>
       <w:r>
-        <w:t xml:space="preserve">3.10 Director mở rộng — ý tưởng → kịch bản, cover video ref, học trending (kế hoạch 2026-10-01, chưa code)</w:t>
+        <w:t xml:space="preserve">3.10 Director mở rộng — ý tưởng → kịch bản, cover video ref, học trending (kế hoạch v2 2026-10-01, chưa code)</w:t>
       </w:r>
     </w:p>
     <w:p>
@@ -8037,7 +8037,10 @@
         <w:t xml:space="preserve">docs/KE_HOACH_TINH_NANG_DIRECTOR_2026-10-01.md</w:t>
       </w:r>
       <w:r>
-        <w:t xml:space="preserve">; việc ở đợt</w:t>
+        <w:t xml:space="preserve"> </w:t>
+      </w:r>
+      <w:r>
+        <w:t xml:space="preserve">(v2, sau khi người dùng chốt Q1–Q7); việc ở đợt</w:t>
       </w:r>
       <w:r>
         <w:t xml:space="preserve"> </w:t>
@@ -8190,7 +8193,17 @@
               <w:t xml:space="preserve">script_reader</w:t>
             </w:r>
             <w:r>
-              <w:t xml:space="preserve">; màn 2 cột tô phần Director thêm</w:t>
+              <w:t xml:space="preserve">; màn 2 cột tô phần Director thêm; ô</w:t>
+            </w:r>
+            <w:r>
+              <w:t xml:space="preserve"> </w:t>
+            </w:r>
+            <w:r>
+              <w:rPr>
+                <w:b/>
+                <w:bCs/>
+              </w:rPr>
+              <w:t xml:space="preserve">“Dùng trend: Tắt (mặc định) / Gợi ý / Ưu tiên”</w:t>
             </w:r>
           </w:p>
         </w:tc>
@@ -8252,19 +8265,33 @@
               <w:pStyle w:val="Compact"/>
             </w:pPr>
             <w:r>
-              <w:t xml:space="preserve">Lịch 1–3 ngày: TikTok Creative Center VN (qua Apify), video theo hashtag (Apify</w:t>
+              <w:t xml:space="preserve">Lịch</w:t>
             </w:r>
             <w:r>
               <w:t xml:space="preserve"> </w:t>
             </w:r>
             <w:r>
               <w:rPr>
-                <w:rStyle w:val="VerbatimChar"/>
+                <w:b/>
+                <w:bCs/>
               </w:rPr>
-              <w:t xml:space="preserve">tiktok-scraper</w:t>
-            </w:r>
-            <w:r>
-              <w:t xml:space="preserve">), 5–10 trang FB, Claude web search (nghĩa, nguồn gốc, phản ứng báo chí), nhập tay → lọc bằng code → Claude chắt thành</w:t>
+              <w:t xml:space="preserve">3 ngày</w:t>
+            </w:r>
+            <w:r>
+              <w:t xml:space="preserve">: TikTok Creative Center VN + video theo hashtag (Apify,</w:t>
+            </w:r>
+            <w:r>
+              <w:t xml:space="preserve"> </w:t>
+            </w:r>
+            <w:r>
+              <w:rPr>
+                <w:b/>
+                <w:bCs/>
+              </w:rPr>
+              <w:t xml:space="preserve">1 tài khoản Free có sẵn, để thử hiệu quả</w:t>
+            </w:r>
+            <w:r>
+              <w:t xml:space="preserve">), 5 trang FB, Claude web search, nhập tay → lọc bằng code → Claude chắt thành</w:t>
             </w:r>
             <w:r>
               <w:t xml:space="preserve"> </w:t>
@@ -8280,7 +8307,7 @@
               <w:t xml:space="preserve"> </w:t>
             </w:r>
             <w:r>
-              <w:t xml:space="preserve">(nghĩa, ví dụ, độ hợp FF, cờ rủi ro, quyền nhạc, vòng đời, hạn) →</w:t>
+              <w:t xml:space="preserve">(nghĩa, ví dụ, độ hợp FF,</w:t>
             </w:r>
             <w:r>
               <w:t xml:space="preserve"> </w:t>
@@ -8290,57 +8317,45 @@
                 <w:b/>
                 <w:bCs/>
               </w:rPr>
-              <w:t xml:space="preserve">người duyệt</w:t>
+              <w:t xml:space="preserve">mức bản quyền cao / vừa / thấp</w:t>
+            </w:r>
+            <w:r>
+              <w:t xml:space="preserve">, vòng đời, hạn) → người duyệt → Director đọc ≤ 8 thẻ đã duyệt, còn hạn,</w:t>
             </w:r>
             <w:r>
               <w:t xml:space="preserve"> </w:t>
             </w:r>
-            <w:r>
-              <w:t xml:space="preserve">→ Director đọc ≤ 8 thẻ đã duyệt, còn hạn (không fine-tune) + luật dùng (≤ 2 trend / 60 s, đặt ở hook / câu chốt, hợp tính cách) + trường</w:t>
-            </w:r>
-            <w:r>
-              <w:t xml:space="preserve"> </w:t>
-            </w:r>
-            <w:r>
-              <w:rPr>
-                <w:rStyle w:val="VerbatimChar"/>
-              </w:rPr>
-              <w:t xml:space="preserve">trend_refs</w:t>
-            </w:r>
-          </w:p>
-        </w:tc>
-        <w:tc>
-          <w:tcPr/>
-          <w:p>
-            <w:pPr>
-              <w:pStyle w:val="Compact"/>
-            </w:pPr>
-            <w:r>
-              <w:t xml:space="preserve">Apify ≈ 3,6 USD/tháng (vừa gói Free 5 USD, quét video mỗi 3 ngày) + Claude ≈ 1,4 USD/tháng</w:t>
-            </w:r>
-          </w:p>
-        </w:tc>
-        <w:tc>
-          <w:tcPr/>
-          <w:p>
-            <w:pPr>
-              <w:pStyle w:val="Compact"/>
-            </w:pPr>
             <w:r>
               <w:rPr>
                 <w:b/>
                 <w:bCs/>
               </w:rPr>
-              <w:t xml:space="preserve">nhạc trend không được dùng thương mại</w:t>
-            </w:r>
-            <w:r>
-              <w:t xml:space="preserve"> </w:t>
-            </w:r>
-            <w:r>
-              <w:t xml:space="preserve">trên tài khoản doanh nghiệp (chỉ Commercial Music Library); trend có thể bị dư luận chê (ví dụ</w:t>
-            </w:r>
-            <w:r>
-              <w:t xml:space="preserve"> </w:t>
+              <w:t xml:space="preserve">không mức cao</w:t>
+            </w:r>
+            <w:r>
+              <w:t xml:space="preserve">, chỉ khi dự án bật trend (không fine-tune)</w:t>
+            </w:r>
+          </w:p>
+        </w:tc>
+        <w:tc>
+          <w:tcPr/>
+          <w:p>
+            <w:pPr>
+              <w:pStyle w:val="Compact"/>
+            </w:pPr>
+            <w:r>
+              <w:t xml:space="preserve">Apify ≈ 3,6 USD/tháng (trần 4,5) + Claude ≈ 1,4 USD/tháng</w:t>
+            </w:r>
+          </w:p>
+        </w:tc>
+        <w:tc>
+          <w:tcPr/>
+          <w:p>
+            <w:pPr>
+              <w:pStyle w:val="Compact"/>
+            </w:pPr>
+            <w:r>
+              <w:t xml:space="preserve">nhạc trend không dùng thương mại (Commercial Music Library); trend có thể bị dư luận chê (</w:t>
             </w:r>
             <w:r>
               <w:t xml:space="preserve">“ăm chã húi”</w:t>
@@ -8404,25 +8419,46 @@
               <w:t xml:space="preserve">reference_analysis</w:t>
             </w:r>
             <w:r>
-              <w:t xml:space="preserve"> </w:t>
-            </w:r>
-            <w:r>
-              <w:t xml:space="preserve">có sẵn) + nghe thoại offline (faster-whisper) → Claude bóc cấu trúc (hook, điểm xoay, cú chốt, nhịp từng shot) → ghép vai / nơi / đạo cụ FF (người duyệt) → viết lại lời, giữ cấu trúc +</w:t>
-            </w:r>
-            <w:r>
-              <w:t xml:space="preserve"> </w:t>
+              <w:t xml:space="preserve">) + nghe thoại offline → Claude bóc cấu trúc theo mốc giây (</w:t>
             </w:r>
             <w:r>
               <w:rPr>
                 <w:rStyle w:val="VerbatimChar"/>
               </w:rPr>
-              <w:t xml:space="preserve">ref_shots</w:t>
+              <w:t xml:space="preserve">segments</w:t>
+            </w:r>
+            <w:r>
+              <w:t xml:space="preserve">,</w:t>
             </w:r>
             <w:r>
               <w:t xml:space="preserve"> </w:t>
             </w:r>
             <w:r>
-              <w:t xml:space="preserve">cho Quay phim bám</w:t>
+              <w:rPr>
+                <w:rStyle w:val="VerbatimChar"/>
+              </w:rPr>
+              <w:t xml:space="preserve">cast</w:t>
+            </w:r>
+            <w:r>
+              <w:t xml:space="preserve"> </w:t>
+            </w:r>
+            <w:r>
+              <w:t xml:space="preserve">có thời điểm xuất hiện,</w:t>
+            </w:r>
+            <w:r>
+              <w:t xml:space="preserve"> </w:t>
+            </w:r>
+            <w:r>
+              <w:rPr>
+                <w:rStyle w:val="VerbatimChar"/>
+              </w:rPr>
+              <w:t xml:space="preserve">beats</w:t>
+            </w:r>
+            <w:r>
+              <w:t xml:space="preserve"> </w:t>
+            </w:r>
+            <w:r>
+              <w:t xml:space="preserve">có điểm chạm cảm xúc — khuôn học từ phân tích của Antigravity) → ghép vai / nơi / đạo cụ FF → viết lại lời, giữ cấu trúc</w:t>
             </w:r>
           </w:p>
         </w:tc>
@@ -8478,7 +8514,45 @@
               <w:pStyle w:val="Compact"/>
             </w:pPr>
             <w:r>
-              <w:t xml:space="preserve">kiểm video ref (1 người, toàn thân, fps, cạnh) → đo BPM, cắt đoạn tại phách → khung đầu nhân vật FF đúng tư thế → chép động tác: Kling</w:t>
+              <w:rPr>
+                <w:b/>
+                <w:bCs/>
+              </w:rPr>
+              <w:t xml:space="preserve">chuyển video ref sang dạng không mặt</w:t>
+            </w:r>
+            <w:r>
+              <w:t xml:space="preserve"> </w:t>
+            </w:r>
+            <w:r>
+              <w:t xml:space="preserve">(Seedance báo lỗi khi có mặt người): depth map bằng</w:t>
+            </w:r>
+            <w:r>
+              <w:t xml:space="preserve"> </w:t>
+            </w:r>
+            <w:r>
+              <w:rPr>
+                <w:b/>
+                <w:bCs/>
+              </w:rPr>
+              <w:t xml:space="preserve">AE Instant Depth Map</w:t>
+            </w:r>
+            <w:r>
+              <w:t xml:space="preserve"> </w:t>
+            </w:r>
+            <w:r>
+              <w:t xml:space="preserve">(script ExtendScript +</w:t>
+            </w:r>
+            <w:r>
+              <w:t xml:space="preserve"> </w:t>
+            </w:r>
+            <w:r>
+              <w:rPr>
+                <w:rStyle w:val="VerbatimChar"/>
+              </w:rPr>
+              <w:t xml:space="preserve">aerender</w:t>
+            </w:r>
+            <w:r>
+              <w:t xml:space="preserve">) hoặc Video Depth Anything Small (Apache-2.0, local), hoặc mannequin MediaPipe + Blender (màu = nhân vật, như white-model); YuNet kiểm 0 mặt → đo BPM, cắt đoạn tại phách → khung đầu nhân vật FF đúng tư thế → Seedance 2.5 / Kling</w:t>
             </w:r>
             <w:r>
               <w:t xml:space="preserve"> </w:t>
@@ -8493,44 +8567,35 @@
               <w:t xml:space="preserve"> </w:t>
             </w:r>
             <w:r>
-              <w:t xml:space="preserve">/ Seedance 2.5</w:t>
+              <w:t xml:space="preserve">→ nối đoạn bằng khung cuối thật → QC lệch nhịp + mặt</w:t>
+            </w:r>
+          </w:p>
+        </w:tc>
+        <w:tc>
+          <w:tcPr/>
+          <w:p>
+            <w:pPr>
+              <w:pStyle w:val="Compact"/>
+            </w:pPr>
+            <w:r>
+              <w:t xml:space="preserve">A/B 5 s ≈ 2,5–3 USD (clip mẫu người dùng); bài 30 s ≈ 3,6 (Kling) – 11 USD (Seedance 2.5)</w:t>
+            </w:r>
+          </w:p>
+        </w:tc>
+        <w:tc>
+          <w:tcPr/>
+          <w:p>
+            <w:pPr>
+              <w:pStyle w:val="Compact"/>
+            </w:pPr>
+            <w:r>
+              <w:t xml:space="preserve">tay chân biến dạng; nền xanh / da mannequin lọt vào clip nếu prompt không nói</w:t>
             </w:r>
             <w:r>
               <w:t xml:space="preserve"> </w:t>
             </w:r>
             <w:r>
-              <w:rPr>
-                <w:rStyle w:val="VerbatimChar"/>
-              </w:rPr>
-              <w:t xml:space="preserve">reference_video</w:t>
-            </w:r>
-            <w:r>
-              <w:t xml:space="preserve"> </w:t>
-            </w:r>
-            <w:r>
-              <w:t xml:space="preserve">(đều có API) hoặc Kling Motion Control (chỉ web ClipAI) → nối đoạn bằng khung cuối thật → QC lệch nhịp + mặt; nhạc cùng BPM thay nhạc gốc</w:t>
-            </w:r>
-          </w:p>
-        </w:tc>
-        <w:tc>
-          <w:tcPr/>
-          <w:p>
-            <w:pPr>
-              <w:pStyle w:val="Compact"/>
-            </w:pPr>
-            <w:r>
-              <w:t xml:space="preserve">A/B 5 s ≈ 2,5 USD; bài 30 s ≈ 3,6 (Kling) – 11 USD (Seedance 2.5)</w:t>
-            </w:r>
-          </w:p>
-        </w:tc>
-        <w:tc>
-          <w:tcPr/>
-          <w:p>
-            <w:pPr>
-              <w:pStyle w:val="Compact"/>
-            </w:pPr>
-            <w:r>
-              <w:t xml:space="preserve">người thật trong video ref có thể bị bộ lọc chặn; tay chân biến dạng</w:t>
+              <w:t xml:space="preserve">“không lấy”</w:t>
             </w:r>
           </w:p>
         </w:tc>
@@ -8545,41 +8610,66 @@
           <w:b/>
           <w:bCs/>
         </w:rPr>
+        <w:t xml:space="preserve">Nhạc:</w:t>
+      </w:r>
+      <w:r>
+        <w:t xml:space="preserve"> </w:t>
+      </w:r>
+      <w:r>
+        <w:t xml:space="preserve">không chèn nhạc trend vào bản giao; giữ Clip AI</w:t>
+      </w:r>
+      <w:r>
+        <w:t xml:space="preserve"> </w:t>
+      </w:r>
+      <w:r>
+        <w:rPr>
+          <w:rStyle w:val="VerbatimChar"/>
+        </w:rPr>
+        <w:t xml:space="preserve">music_v2</w:t>
+      </w:r>
+      <w:r>
+        <w:t xml:space="preserve"> </w:t>
+      </w:r>
+      <w:r>
+        <w:t xml:space="preserve">cùng BPM;</w:t>
+      </w:r>
+      <w:r>
+        <w:t xml:space="preserve"> </w:t>
+      </w:r>
+      <w:r>
+        <w:rPr>
+          <w:b/>
+          <w:bCs/>
+        </w:rPr>
+        <w:t xml:space="preserve">Suno Pro tạm gác</w:t>
+      </w:r>
+      <w:r>
+        <w:t xml:space="preserve"> </w:t>
+      </w:r>
+      <w:r>
+        <w:t xml:space="preserve">(bán tự động chưa cần).</w:t>
+      </w:r>
+      <w:r>
+        <w:t xml:space="preserve"> </w:t>
+      </w:r>
+      <w:r>
+        <w:rPr>
+          <w:b/>
+          <w:bCs/>
+        </w:rPr>
         <w:t xml:space="preserve">Apify:</w:t>
       </w:r>
       <w:r>
         <w:t xml:space="preserve"> </w:t>
       </w:r>
       <w:r>
-        <w:t xml:space="preserve">dùng được và hợp lệ (dữ liệu công khai, không cần tài khoản TikTok); TikTok Research API cấm dùng thương mại nên loại.</w:t>
-      </w:r>
-      <w:r>
-        <w:t xml:space="preserve"> </w:t>
-      </w:r>
-      <w:r>
-        <w:rPr>
-          <w:b/>
-          <w:bCs/>
-        </w:rPr>
-        <w:t xml:space="preserve">Không lập 1–5 tài khoản Apify free</w:t>
-      </w:r>
-      <w:r>
-        <w:t xml:space="preserve"> </w:t>
-      </w:r>
-      <w:r>
-        <w:t xml:space="preserve">— điều khoản Apify cấm một người dùng nhiều tài khoản cá nhân; thay bằng 1 tài khoản Free + các</w:t>
-      </w:r>
-      <w:r>
-        <w:t xml:space="preserve"> </w:t>
-      </w:r>
-      <w:r>
-        <w:t xml:space="preserve">nguồn free hợp lệ khác (Creative Center, Claude web search, kworb, nhập tay). Nâng Starter (29 hoặc 19 USD — kiểm console) khi đạt cả 3</w:t>
-      </w:r>
-      <w:r>
-        <w:t xml:space="preserve"> </w:t>
-      </w:r>
-      <w:r>
-        <w:t xml:space="preserve">chỉ số sau 4–6 tuần: ≥ 5 thẻ duyệt/tuần · ≥ 40 % kịch bản giữ</w:t>
+        <w:t xml:space="preserve">dùng tài khoản Free người dùng đã có; không lập thêm (điều khoản cấm nhiều tài khoản cá nhân); TikTok Research API cấm thương mại → loại.</w:t>
+      </w:r>
+      <w:r>
+        <w:t xml:space="preserve"> </w:t>
+      </w:r>
+      <w:r>
+        <w:t xml:space="preserve">Nâng Starter khi đạt cả 3 chỉ số sau 4–6 tuần (≥ 5 thẻ duyệt/tuần · ≥ 40 % kịch bản bật trend giữ</w:t>
       </w:r>
       <w:r>
         <w:t xml:space="preserve"> </w:t>
@@ -8594,19 +8684,13 @@
         <w:t xml:space="preserve"> </w:t>
       </w:r>
       <w:r>
-        <w:t xml:space="preserve">· Free hết trần ≥ 2 tháng hoặc cần quét hằng ngày.</w:t>
-      </w:r>
-      <w:r>
-        <w:t xml:space="preserve"> </w:t>
-      </w:r>
-      <w:r>
-        <w:t xml:space="preserve">Thứ tự đề xuất: Ý tưởng → Trend (nguồn free) → Trend (Apify) → Cover kịch bản → Cover nhảy (sau A/B). Tổng tiền thử ≈ 5 USD; mọi cờ</w:t>
-      </w:r>
-      <w:r>
-        <w:t xml:space="preserve"> </w:t>
-      </w:r>
-      <w:r>
-        <w:t xml:space="preserve">mới TẮT tới khi qua bộ đo.</w:t>
+        <w:t xml:space="preserve">· Free hết trần ≥ 2 tháng hoặc cần quét hằng ngày).</w:t>
+      </w:r>
+      <w:r>
+        <w:t xml:space="preserve"> </w:t>
+      </w:r>
+      <w:r>
+        <w:t xml:space="preserve">Thứ tự: Ý tưởng → Trend free → Trend Apify → Cover kịch bản → Cover nhảy (sau A/B). Tổng tiền thử ≈ 5–6 USD; mọi cờ mới TẮT tới khi qua bộ đo.</w:t>
       </w:r>
     </w:p>
     <w:bookmarkEnd w:id="38"/>
@@ -11320,216 +11404,201 @@
           <w:b/>
           <w:bCs/>
         </w:rPr>
-        <w:t xml:space="preserve">Còn mở (2026-10-01) — kế hoạch Director mở rộng (3.10, câu hỏi Q1–Q7 ở mục 8 của tài liệu):</w:t>
+        <w:t xml:space="preserve">Đã chốt (2026-10-01, người dùng — kế hoạch Director mở rộng 3.10):</w:t>
+      </w:r>
+      <w:r>
+        <w:t xml:space="preserve"> </w:t>
+      </w:r>
+      <w:r>
+        <w:t xml:space="preserve">- Trend</w:t>
+      </w:r>
+      <w:r>
+        <w:t xml:space="preserve"> </w:t>
+      </w:r>
+      <w:r>
+        <w:rPr>
+          <w:b/>
+          <w:bCs/>
+        </w:rPr>
+        <w:t xml:space="preserve">không bắt buộc</w:t>
+      </w:r>
+      <w:r>
+        <w:t xml:space="preserve">: mỗi dự án chọn Tắt (mặc định) / Gợi ý / Ưu tiên.</w:t>
+      </w:r>
+      <w:r>
+        <w:t xml:space="preserve"> </w:t>
+      </w:r>
+      <w:r>
+        <w:t xml:space="preserve">- Apify:</w:t>
+      </w:r>
+      <w:r>
+        <w:t xml:space="preserve"> </w:t>
+      </w:r>
+      <w:r>
+        <w:rPr>
+          <w:b/>
+          <w:bCs/>
+        </w:rPr>
+        <w:t xml:space="preserve">1 tài khoản Free có sẵn</w:t>
+      </w:r>
+      <w:r>
+        <w:t xml:space="preserve">, dùng để</w:t>
+      </w:r>
+      <w:r>
+        <w:t xml:space="preserve"> </w:t>
+      </w:r>
+      <w:r>
+        <w:rPr>
+          <w:b/>
+          <w:bCs/>
+        </w:rPr>
+        <w:t xml:space="preserve">thử hiệu quả</w:t>
+      </w:r>
+      <w:r>
+        <w:t xml:space="preserve">; quét TikTok</w:t>
+      </w:r>
+      <w:r>
+        <w:t xml:space="preserve"> </w:t>
+      </w:r>
+      <w:r>
+        <w:rPr>
+          <w:b/>
+          <w:bCs/>
+        </w:rPr>
+        <w:t xml:space="preserve">mỗi 3 ngày</w:t>
+      </w:r>
+      <w:r>
+        <w:t xml:space="preserve">.</w:t>
+      </w:r>
+      <w:r>
+        <w:t xml:space="preserve"> </w:t>
+      </w:r>
+      <w:r>
+        <w:t xml:space="preserve">-</w:t>
+      </w:r>
+      <w:r>
+        <w:t xml:space="preserve"> </w:t>
+      </w:r>
+      <w:r>
+        <w:rPr>
+          <w:b/>
+          <w:bCs/>
+        </w:rPr>
+        <w:t xml:space="preserve">Được dùng trend vào sản phẩm</w:t>
+      </w:r>
+      <w:r>
+        <w:t xml:space="preserve">, chỉ tránh thứ có</w:t>
+      </w:r>
+      <w:r>
+        <w:t xml:space="preserve"> </w:t>
+      </w:r>
+      <w:r>
+        <w:rPr>
+          <w:b/>
+          <w:bCs/>
+        </w:rPr>
+        <w:t xml:space="preserve">mức bản quyền cao</w:t>
+      </w:r>
+      <w:r>
+        <w:t xml:space="preserve"> </w:t>
+      </w:r>
+      <w:r>
+        <w:t xml:space="preserve">(bài hát của hãng/ca sĩ, phim/show có bản quyền, IP khác).</w:t>
+      </w:r>
+      <w:r>
+        <w:t xml:space="preserve"> </w:t>
+      </w:r>
+      <w:r>
+        <w:t xml:space="preserve">- Nhạc trend không vào bản giao; Suno Pro</w:t>
+      </w:r>
+      <w:r>
+        <w:t xml:space="preserve"> </w:t>
+      </w:r>
+      <w:r>
+        <w:rPr>
+          <w:b/>
+          <w:bCs/>
+        </w:rPr>
+        <w:t xml:space="preserve">để sau</w:t>
+      </w:r>
+      <w:r>
+        <w:t xml:space="preserve"> </w:t>
+      </w:r>
+      <w:r>
+        <w:t xml:space="preserve">(chưa cần luồng bán tự động).</w:t>
+      </w:r>
+      <w:r>
+        <w:t xml:space="preserve"> </w:t>
+      </w:r>
+      <w:r>
+        <w:t xml:space="preserve">- Clip nhảy mẫu đã có (Drive</w:t>
+      </w:r>
+      <w:r>
+        <w:t xml:space="preserve"> </w:t>
+      </w:r>
+      <w:r>
+        <w:rPr>
+          <w:rStyle w:val="VerbatimChar"/>
+        </w:rPr>
+        <w:t xml:space="preserve">SeaTalk_VDO_20261001_111440.mp4</w:t>
+      </w:r>
+      <w:r>
+        <w:t xml:space="preserve">); video ref nhảy phải chuyển</w:t>
+      </w:r>
+      <w:r>
+        <w:t xml:space="preserve"> </w:t>
+      </w:r>
+      <w:r>
+        <w:rPr>
+          <w:b/>
+          <w:bCs/>
+        </w:rPr>
+        <w:t xml:space="preserve">không mặt</w:t>
+      </w:r>
+      <w:r>
+        <w:t xml:space="preserve"> </w:t>
+      </w:r>
+      <w:r>
+        <w:t xml:space="preserve">(mannequin hoặc depth — AE Instant Depth Map) vì Seedance báo lỗi khi có mặt người.</w:t>
+      </w:r>
+      <w:r>
+        <w:t xml:space="preserve"> </w:t>
+      </w:r>
+      <w:r>
+        <w:t xml:space="preserve">-</w:t>
+      </w:r>
+      <w:r>
+        <w:t xml:space="preserve"> </w:t>
+      </w:r>
+      <w:r>
+        <w:rPr>
+          <w:b/>
+          <w:bCs/>
+        </w:rPr>
+        <w:t xml:space="preserve">Còn mở:</w:t>
+      </w:r>
+      <w:r>
+        <w:t xml:space="preserve"> </w:t>
+      </w:r>
+      <w:r>
+        <w:t xml:space="preserve">hỏi ClipAI mở API Motion Control (người dùng chưa hỏi); gửi</w:t>
+      </w:r>
+      <w:r>
+        <w:t xml:space="preserve"> </w:t>
+      </w:r>
+      <w:r>
+        <w:rPr>
+          <w:rStyle w:val="VerbatimChar"/>
+        </w:rPr>
+        <w:t xml:space="preserve">Video ref3.mp4</w:t>
+      </w:r>
+      <w:r>
+        <w:t xml:space="preserve"> </w:t>
+      </w:r>
+      <w:r>
+        <w:t xml:space="preserve">+ prompt đầy đủ của Antigravity để làm ví dụ mẫu.</w:t>
       </w:r>
     </w:p>
-    <w:tbl>
-      <w:tblPr>
-        <w:tblStyle w:val="Table"/>
-        <w:tblW w:type="pct" w:w="5000"/>
-        <w:tblLayout w:type="fixed"/>
-        <w:tblLook w:firstRow="1" w:lastRow="0" w:firstColumn="0" w:lastColumn="0" w:noHBand="0" w:noVBand="0" w:val="0020"/>
-      </w:tblPr>
-      <w:tblGrid>
-        <w:gridCol w:w="3960"/>
-        <w:gridCol w:w="3960"/>
-      </w:tblGrid>
-      <w:tr>
-        <w:trPr>
-          <w:tblHeader w:val="on"/>
-        </w:trPr>
-        <w:tc>
-          <w:tcPr/>
-          <w:p>
-            <w:pPr>
-              <w:pStyle w:val="Compact"/>
-            </w:pPr>
-            <w:r>
-              <w:t xml:space="preserve">Quyết định</w:t>
-            </w:r>
-          </w:p>
-        </w:tc>
-        <w:tc>
-          <w:tcPr/>
-          <w:p>
-            <w:pPr>
-              <w:pStyle w:val="Compact"/>
-            </w:pPr>
-            <w:r>
-              <w:t xml:space="preserve">Đề xuất</w:t>
-            </w:r>
-          </w:p>
-        </w:tc>
-      </w:tr>
-      <w:tr>
-        <w:tc>
-          <w:tcPr/>
-          <w:p>
-            <w:pPr>
-              <w:pStyle w:val="Compact"/>
-            </w:pPr>
-            <w:r>
-              <w:t xml:space="preserve">Thứ tự làm</w:t>
-            </w:r>
-          </w:p>
-        </w:tc>
-        <w:tc>
-          <w:tcPr/>
-          <w:p>
-            <w:pPr>
-              <w:pStyle w:val="Compact"/>
-            </w:pPr>
-            <w:r>
-              <w:t xml:space="preserve">Ý tưởng → Trend free → Trend Apify → Cover kịch bản → Cover nhảy</w:t>
-            </w:r>
-          </w:p>
-        </w:tc>
-      </w:tr>
-      <w:tr>
-        <w:tc>
-          <w:tcPr/>
-          <w:p>
-            <w:pPr>
-              <w:pStyle w:val="Compact"/>
-            </w:pPr>
-            <w:r>
-              <w:t xml:space="preserve">Apify: 1 tài khoản Free thay cho 1–5 tài khoản free</w:t>
-            </w:r>
-          </w:p>
-        </w:tc>
-        <w:tc>
-          <w:tcPr/>
-          <w:p>
-            <w:pPr>
-              <w:pStyle w:val="Compact"/>
-            </w:pPr>
-            <w:r>
-              <w:t xml:space="preserve">Đồng ý 1 Free (điều khoản cấm nhiều tài khoản) + nguồn free khác</w:t>
-            </w:r>
-          </w:p>
-        </w:tc>
-      </w:tr>
-      <w:tr>
-        <w:tc>
-          <w:tcPr/>
-          <w:p>
-            <w:pPr>
-              <w:pStyle w:val="Compact"/>
-            </w:pPr>
-            <w:r>
-              <w:t xml:space="preserve">Pháp chế Garena cho phép scraper dữ liệu công khai TikTok/FB</w:t>
-            </w:r>
-          </w:p>
-        </w:tc>
-        <w:tc>
-          <w:tcPr/>
-          <w:p>
-            <w:pPr>
-              <w:pStyle w:val="Compact"/>
-            </w:pPr>
-            <w:r>
-              <w:t xml:space="preserve">Hỏi trước khi làm adapter Apify; phần nguồn free làm được ngay</w:t>
-            </w:r>
-          </w:p>
-        </w:tc>
-      </w:tr>
-      <w:tr>
-        <w:tc>
-          <w:tcPr/>
-          <w:p>
-            <w:pPr>
-              <w:pStyle w:val="Compact"/>
-            </w:pPr>
-            <w:r>
-              <w:t xml:space="preserve">Nhạc trend trong bản giao</w:t>
-            </w:r>
-          </w:p>
-        </w:tc>
-        <w:tc>
-          <w:tcPr/>
-          <w:p>
-            <w:pPr>
-              <w:pStyle w:val="Compact"/>
-            </w:pPr>
-            <w:r>
-              <w:t xml:space="preserve">Mặc định không; chỉ Commercial Music Library / nhạc Garena có quyền; còn lại tạo nhạc cùng BPM</w:t>
-            </w:r>
-          </w:p>
-        </w:tc>
-      </w:tr>
-      <w:tr>
-        <w:tc>
-          <w:tcPr/>
-          <w:p>
-            <w:pPr>
-              <w:pStyle w:val="Compact"/>
-            </w:pPr>
-            <w:r>
-              <w:t xml:space="preserve">Clip nhảy cho bài thử A/B (≈ 2,5 USD)</w:t>
-            </w:r>
-          </w:p>
-        </w:tc>
-        <w:tc>
-          <w:tcPr/>
-          <w:p>
-            <w:pPr>
-              <w:pStyle w:val="Compact"/>
-            </w:pPr>
-            <w:r>
-              <w:t xml:space="preserve">Clip nội bộ tự quay (có quyền + thử luôn bộ lọc người thật)</w:t>
-            </w:r>
-          </w:p>
-        </w:tc>
-      </w:tr>
-      <w:tr>
-        <w:tc>
-          <w:tcPr/>
-          <w:p>
-            <w:pPr>
-              <w:pStyle w:val="Compact"/>
-            </w:pPr>
-            <w:r>
-              <w:t xml:space="preserve">Hỏi ClipAI mở API Motion Control</w:t>
-            </w:r>
-          </w:p>
-        </w:tc>
-        <w:tc>
-          <w:tcPr/>
-          <w:p>
-            <w:pPr>
-              <w:pStyle w:val="Compact"/>
-            </w:pPr>
-            <w:r>
-              <w:t xml:space="preserve">Có, gửi kèm câu hỏi Bàn đạo diễn</w:t>
-            </w:r>
-          </w:p>
-        </w:tc>
-      </w:tr>
-      <w:tr>
-        <w:tc>
-          <w:tcPr/>
-          <w:p>
-            <w:pPr>
-              <w:pStyle w:val="Compact"/>
-            </w:pPr>
-            <w:r>
-              <w:t xml:space="preserve">Tần suất quét TikTok</w:t>
-            </w:r>
-          </w:p>
-        </w:tc>
-        <w:tc>
-          <w:tcPr/>
-          <w:p>
-            <w:pPr>
-              <w:pStyle w:val="Compact"/>
-            </w:pPr>
-            <w:r>
-              <w:t xml:space="preserve">3 ngày ở gói Free; hằng ngày khi lên Starter</w:t>
-            </w:r>
-          </w:p>
-        </w:tc>
-      </w:tr>
-    </w:tbl>
     <w:p>
       <w:pPr>
         <w:pStyle w:val="BodyText"/>
@@ -13005,7 +13074,10 @@
         <w:t xml:space="preserve">docs/KE_HOACH_TINH_NANG_DIRECTOR_2026-10-01.md</w:t>
       </w:r>
       <w:r>
-        <w:t xml:space="preserve">), chờ người dùng chốt Q1–Q7.</w:t>
+        <w:t xml:space="preserve"> </w:t>
+      </w:r>
+      <w:r>
+        <w:t xml:space="preserve">v2); người dùng đã chốt Q1–Q7, việc kế S11.1.</w:t>
       </w:r>
     </w:p>
     <w:p>

</xml_diff>